<commit_message>
change in documentation diagrams and code
</commit_message>
<xml_diff>
--- a/final project report.docx
+++ b/final project report.docx
@@ -110,7 +110,7 @@
         </w:rPr>
         <w:tab/>
       </w:r>
-      <w:proofErr w:type="spellStart"/>
+      <w:proofErr w:type="gramStart"/>
       <w:r>
         <w:rPr>
           <w:rFonts w:cs="Times New Roman"/>
@@ -121,7 +121,6 @@
         </w:rPr>
         <w:t>Simalchaur</w:t>
       </w:r>
-      <w:proofErr w:type="spellEnd"/>
       <w:r>
         <w:rPr>
           <w:rFonts w:cs="Times New Roman"/>
@@ -130,7 +129,7 @@
           <w:sz w:val="28"/>
           <w:szCs w:val="28"/>
         </w:rPr>
-        <w:t>, Pokhara</w:t>
+        <w:t xml:space="preserve"> </w:t>
       </w:r>
       <w:r>
         <w:rPr>
@@ -140,8 +139,9 @@
           <w:sz w:val="28"/>
           <w:szCs w:val="28"/>
         </w:rPr>
-        <w:t xml:space="preserve"> </w:t>
-      </w:r>
+        <w:t>,</w:t>
+      </w:r>
+      <w:proofErr w:type="gramEnd"/>
       <w:r>
         <w:rPr>
           <w:rFonts w:cs="Times New Roman"/>
@@ -150,7 +150,7 @@
           <w:sz w:val="28"/>
           <w:szCs w:val="28"/>
         </w:rPr>
-        <w:t>Nepal</w:t>
+        <w:t xml:space="preserve"> Pokhara</w:t>
       </w:r>
       <w:r>
         <w:rPr>
@@ -160,6 +160,26 @@
           <w:sz w:val="28"/>
           <w:szCs w:val="28"/>
         </w:rPr>
+        <w:t xml:space="preserve"> </w:t>
+      </w:r>
+      <w:r>
+        <w:rPr>
+          <w:rFonts w:cs="Times New Roman"/>
+          <w:b/>
+          <w:bCs/>
+          <w:sz w:val="28"/>
+          <w:szCs w:val="28"/>
+        </w:rPr>
+        <w:t>Nepal</w:t>
+      </w:r>
+      <w:r>
+        <w:rPr>
+          <w:rFonts w:cs="Times New Roman"/>
+          <w:b/>
+          <w:bCs/>
+          <w:sz w:val="28"/>
+          <w:szCs w:val="28"/>
+        </w:rPr>
         <w:tab/>
       </w:r>
     </w:p>
@@ -175,7 +195,13 @@
         <w:rPr>
           <w:rFonts w:cs="Times New Roman"/>
         </w:rPr>
-        <w:t>A Project Proposal</w:t>
+        <w:t xml:space="preserve">A Project </w:t>
+      </w:r>
+      <w:r>
+        <w:rPr>
+          <w:rFonts w:cs="Times New Roman"/>
+        </w:rPr>
+        <w:t>Report</w:t>
       </w:r>
     </w:p>
     <w:p>
@@ -947,7 +973,7 @@
           <w:noProof/>
           <w:szCs w:val="24"/>
         </w:rPr>
-        <w:t>17</w:t>
+        <w:t>18</w:t>
       </w:r>
       <w:proofErr w:type="spellEnd"/>
       <w:r>
@@ -3417,7 +3443,7 @@
         </w:rPr>
         <w:fldChar w:fldCharType="separate"/>
       </w:r>
-      <w:hyperlink w:anchor="_Toc232571316" w:history="1">
+      <w:hyperlink w:anchor="_Toc232590305" w:history="1">
         <w:r>
           <w:rPr>
             <w:rStyle w:val="Hyperlink"/>
@@ -3444,7 +3470,7 @@
             <w:noProof/>
             <w:webHidden/>
           </w:rPr>
-          <w:instrText xml:space="preserve"> PAGEREF _Toc232571316 \h </w:instrText>
+          <w:instrText xml:space="preserve"> PAGEREF _Toc232590305 \h </w:instrText>
         </w:r>
         <w:r>
           <w:rPr>
@@ -3490,7 +3516,7 @@
           <w14:ligatures w14:val="standardContextual"/>
         </w:rPr>
       </w:pPr>
-      <w:hyperlink w:anchor="_Toc232571317" w:history="1">
+      <w:hyperlink w:anchor="_Toc232590306" w:history="1">
         <w:r>
           <w:rPr>
             <w:rStyle w:val="Hyperlink"/>
@@ -3517,7 +3543,7 @@
             <w:noProof/>
             <w:webHidden/>
           </w:rPr>
-          <w:instrText xml:space="preserve"> PAGEREF _Toc232571317 \h </w:instrText>
+          <w:instrText xml:space="preserve"> PAGEREF _Toc232590306 \h </w:instrText>
         </w:r>
         <w:r>
           <w:rPr>
@@ -3563,7 +3589,7 @@
           <w14:ligatures w14:val="standardContextual"/>
         </w:rPr>
       </w:pPr>
-      <w:hyperlink w:anchor="_Toc232571318" w:history="1">
+      <w:hyperlink w:anchor="_Toc232590307" w:history="1">
         <w:r>
           <w:rPr>
             <w:rStyle w:val="Hyperlink"/>
@@ -3590,7 +3616,7 @@
             <w:noProof/>
             <w:webHidden/>
           </w:rPr>
-          <w:instrText xml:space="preserve"> PAGEREF _Toc232571318 \h </w:instrText>
+          <w:instrText xml:space="preserve"> PAGEREF _Toc232590307 \h </w:instrText>
         </w:r>
         <w:r>
           <w:rPr>
@@ -3636,7 +3662,7 @@
           <w14:ligatures w14:val="standardContextual"/>
         </w:rPr>
       </w:pPr>
-      <w:hyperlink w:anchor="_Toc232571319" w:history="1">
+      <w:hyperlink w:anchor="_Toc232590308" w:history="1">
         <w:r>
           <w:rPr>
             <w:rStyle w:val="Hyperlink"/>
@@ -3663,7 +3689,7 @@
             <w:noProof/>
             <w:webHidden/>
           </w:rPr>
-          <w:instrText xml:space="preserve"> PAGEREF _Toc232571319 \h </w:instrText>
+          <w:instrText xml:space="preserve"> PAGEREF _Toc232590308 \h </w:instrText>
         </w:r>
         <w:r>
           <w:rPr>
@@ -3709,13 +3735,13 @@
           <w14:ligatures w14:val="standardContextual"/>
         </w:rPr>
       </w:pPr>
-      <w:hyperlink w:anchor="_Toc232571320" w:history="1">
+      <w:hyperlink w:anchor="_Toc232590309" w:history="1">
         <w:r>
           <w:rPr>
             <w:rStyle w:val="Hyperlink"/>
             <w:noProof/>
           </w:rPr>
-          <w:t>Figure 5 Waterfall model</w:t>
+          <w:t>Figure 5 Use case diagram</w:t>
         </w:r>
         <w:r>
           <w:rPr>
@@ -3736,7 +3762,7 @@
             <w:noProof/>
             <w:webHidden/>
           </w:rPr>
-          <w:instrText xml:space="preserve"> PAGEREF _Toc232571320 \h </w:instrText>
+          <w:instrText xml:space="preserve"> PAGEREF _Toc232590309 \h </w:instrText>
         </w:r>
         <w:r>
           <w:rPr>
@@ -3782,13 +3808,13 @@
           <w14:ligatures w14:val="standardContextual"/>
         </w:rPr>
       </w:pPr>
-      <w:hyperlink w:anchor="_Toc232571321" w:history="1">
+      <w:hyperlink w:anchor="_Toc232590310" w:history="1">
         <w:r>
           <w:rPr>
             <w:rStyle w:val="Hyperlink"/>
             <w:noProof/>
           </w:rPr>
-          <w:t>Figure 6 Gantt Chart</w:t>
+          <w:t>Figure 6 Waterfall model</w:t>
         </w:r>
         <w:r>
           <w:rPr>
@@ -3809,7 +3835,7 @@
             <w:noProof/>
             <w:webHidden/>
           </w:rPr>
-          <w:instrText xml:space="preserve"> PAGEREF _Toc232571321 \h </w:instrText>
+          <w:instrText xml:space="preserve"> PAGEREF _Toc232590310 \h </w:instrText>
         </w:r>
         <w:r>
           <w:rPr>
@@ -3842,6 +3868,79 @@
     </w:p>
     <w:p>
       <w:pPr>
+        <w:pStyle w:val="TableofFigures"/>
+        <w:tabs>
+          <w:tab w:val="right" w:leader="dot" w:pos="8296"/>
+        </w:tabs>
+        <w:rPr>
+          <w:rFonts w:asciiTheme="minorHAnsi" w:eastAsiaTheme="minorEastAsia" w:hAnsiTheme="minorHAnsi"/>
+          <w:noProof/>
+          <w:kern w:val="2"/>
+          <w:szCs w:val="24"/>
+          <w:lang w:val="en-US"/>
+          <w14:ligatures w14:val="standardContextual"/>
+        </w:rPr>
+      </w:pPr>
+      <w:hyperlink w:anchor="_Toc232590311" w:history="1">
+        <w:r>
+          <w:rPr>
+            <w:rStyle w:val="Hyperlink"/>
+            <w:noProof/>
+          </w:rPr>
+          <w:t>Figure 7 Gantt Chart</w:t>
+        </w:r>
+        <w:r>
+          <w:rPr>
+            <w:noProof/>
+            <w:webHidden/>
+          </w:rPr>
+          <w:tab/>
+        </w:r>
+        <w:r>
+          <w:rPr>
+            <w:noProof/>
+            <w:webHidden/>
+          </w:rPr>
+          <w:fldChar w:fldCharType="begin"/>
+        </w:r>
+        <w:r>
+          <w:rPr>
+            <w:noProof/>
+            <w:webHidden/>
+          </w:rPr>
+          <w:instrText xml:space="preserve"> PAGEREF _Toc232590311 \h </w:instrText>
+        </w:r>
+        <w:r>
+          <w:rPr>
+            <w:noProof/>
+            <w:webHidden/>
+          </w:rPr>
+        </w:r>
+        <w:r>
+          <w:rPr>
+            <w:noProof/>
+            <w:webHidden/>
+          </w:rPr>
+          <w:fldChar w:fldCharType="separate"/>
+        </w:r>
+        <w:r>
+          <w:rPr>
+            <w:noProof/>
+            <w:webHidden/>
+          </w:rPr>
+          <w:t>22</w:t>
+        </w:r>
+        <w:r>
+          <w:rPr>
+            <w:noProof/>
+            <w:webHidden/>
+          </w:rPr>
+          <w:fldChar w:fldCharType="end"/>
+        </w:r>
+      </w:hyperlink>
+    </w:p>
+    <w:p>
+      <w:pPr>
         <w:spacing w:after="0" w:line="360" w:lineRule="auto"/>
         <w:jc w:val="center"/>
         <w:rPr>
@@ -3966,7 +4065,7 @@
         <w:rPr>
           <w:szCs w:val="24"/>
         </w:rPr>
-        <w:t xml:space="preserve">This project focuses on developing an advanced Rock Paper Scissors game using C programming language with several advanced features such as login system, registration system, CRUD operations, score management, multiplayer gameplay, account deletion, tournament mode, leaderboard system, match history, and file handling. The project is designed to simulate a real real-world gaming </w:t>
+        <w:t xml:space="preserve">This project focuses on developing an advanced Rock Paper Scissors game using C programming language with several advanced features such as login system, registration system, CRUD operations, score management, multiplayer gameplay, account deletion, leaderboard system, match history, and file handling. The project is designed to simulate a real real-world gaming </w:t>
       </w:r>
       <w:r>
         <w:rPr>
@@ -4090,8 +4189,11 @@
         <w:jc w:val="both"/>
       </w:pPr>
       <w:r>
+        <w:t xml:space="preserve">This project also includes additional innovative feature such as tournament mode and streak bonus system. Tournament mode allows users to compete in multiple rounds </w:t>
+      </w:r>
+      <w:r>
         <w:lastRenderedPageBreak/>
-        <w:t>This project also includes additional innovative feature such as tournament mode and streak bonus system. Tournament mode allows users to compete in multiple rounds continuously, while the streak bonus system reward users for consecutive wins. These features increase excitement and provide better gaming experience.</w:t>
+        <w:t>continuously, while the streak bonus system reward users for consecutive wins. These features increase excitement and provide better gaming experience.</w:t>
       </w:r>
     </w:p>
     <w:p>
@@ -4159,6 +4261,7 @@
           <w:numId w:val="44"/>
         </w:numPr>
         <w:spacing w:after="0" w:line="360" w:lineRule="auto"/>
+        <w:ind w:left="360"/>
         <w:jc w:val="both"/>
         <w:rPr>
           <w:sz w:val="32"/>
@@ -4215,6 +4318,7 @@
           <w:numId w:val="44"/>
         </w:numPr>
         <w:spacing w:after="0" w:line="360" w:lineRule="auto"/>
+        <w:ind w:left="360"/>
         <w:jc w:val="both"/>
         <w:rPr>
           <w:sz w:val="32"/>
@@ -4259,17 +4363,13 @@
           <w:numId w:val="18"/>
         </w:numPr>
         <w:spacing w:after="0" w:line="360" w:lineRule="auto"/>
-        <w:ind w:left="180" w:hanging="180"/>
-        <w:jc w:val="both"/>
+        <w:ind w:left="360"/>
         <w:rPr>
           <w:rFonts w:eastAsia="Times New Roman" w:cs="Times New Roman"/>
           <w:szCs w:val="24"/>
         </w:rPr>
       </w:pPr>
       <w:r>
-        <w:rPr>
-          <w:szCs w:val="24"/>
-        </w:rPr>
         <w:t>To implement multiple gameplay modes including player versus computer and multiplayer functionality.</w:t>
       </w:r>
     </w:p>
@@ -4281,8 +4381,7 @@
           <w:numId w:val="18"/>
         </w:numPr>
         <w:spacing w:after="0" w:line="360" w:lineRule="auto"/>
-        <w:ind w:left="180" w:hanging="180"/>
-        <w:jc w:val="both"/>
+        <w:ind w:left="360"/>
         <w:rPr>
           <w:rFonts w:eastAsia="Times New Roman" w:cs="Times New Roman"/>
           <w:szCs w:val="24"/>
@@ -4293,14 +4392,7 @@
           <w:rFonts w:eastAsia="Times New Roman" w:cs="Times New Roman"/>
           <w:szCs w:val="24"/>
         </w:rPr>
-        <w:t>To create a das</w:t>
-      </w:r>
-      <w:r>
-        <w:rPr>
-          <w:rFonts w:eastAsia="Times New Roman" w:cs="Times New Roman"/>
-          <w:szCs w:val="24"/>
-        </w:rPr>
-        <w:t>hboard that provides easy access to gameplay, match history, leaderboard and user options.</w:t>
+        <w:t>To use file handling for storing player records, maintaining match history, and displaying scoreboards.</w:t>
       </w:r>
     </w:p>
     <w:p>
@@ -4311,117 +4403,36 @@
           <w:numId w:val="18"/>
         </w:numPr>
         <w:spacing w:after="0" w:line="360" w:lineRule="auto"/>
-        <w:ind w:left="180" w:hanging="180"/>
+        <w:ind w:left="360"/>
+        <w:rPr>
+          <w:rFonts w:eastAsia="Times New Roman" w:cs="Times New Roman"/>
+          <w:szCs w:val="24"/>
+        </w:rPr>
+      </w:pPr>
+      <w:r>
+        <w:rPr>
+          <w:rFonts w:eastAsia="Times New Roman" w:cs="Times New Roman"/>
+          <w:szCs w:val="24"/>
+        </w:rPr>
+        <w:t>Dashboard that provides easy access to gameplay</w:t>
+      </w:r>
+      <w:r>
+        <w:rPr>
+          <w:rFonts w:eastAsia="Times New Roman" w:cs="Times New Roman"/>
+          <w:szCs w:val="24"/>
+        </w:rPr>
+        <w:t>, match history, leaderboard and user options.</w:t>
+      </w:r>
+    </w:p>
+    <w:p>
+      <w:pPr>
+        <w:spacing w:after="0" w:line="360" w:lineRule="auto"/>
         <w:jc w:val="both"/>
         <w:rPr>
           <w:rFonts w:eastAsia="Times New Roman" w:cs="Times New Roman"/>
           <w:szCs w:val="24"/>
         </w:rPr>
       </w:pPr>
-      <w:r>
-        <w:rPr>
-          <w:rFonts w:eastAsia="Times New Roman" w:cs="Times New Roman"/>
-          <w:szCs w:val="24"/>
-        </w:rPr>
-        <w:t xml:space="preserve"> To implement user registration and login functionality</w:t>
-      </w:r>
-      <w:r>
-        <w:rPr>
-          <w:rFonts w:eastAsia="Times New Roman" w:cs="Times New Roman"/>
-          <w:szCs w:val="24"/>
-        </w:rPr>
-        <w:t>.</w:t>
-      </w:r>
-    </w:p>
-    <w:p>
-      <w:pPr>
-        <w:pStyle w:val="ListParagraph"/>
-        <w:numPr>
-          <w:ilvl w:val="0"/>
-          <w:numId w:val="18"/>
-        </w:numPr>
-        <w:spacing w:line="360" w:lineRule="auto"/>
-        <w:ind w:left="180" w:hanging="180"/>
-        <w:jc w:val="both"/>
-        <w:rPr>
-          <w:rFonts w:eastAsia="Times New Roman" w:cs="Times New Roman"/>
-          <w:szCs w:val="24"/>
-          <w:lang w:val="en-US"/>
-        </w:rPr>
-      </w:pPr>
-      <w:r>
-        <w:rPr>
-          <w:rFonts w:eastAsia="Times New Roman" w:cs="Times New Roman"/>
-          <w:szCs w:val="24"/>
-          <w:lang w:val="en-US"/>
-        </w:rPr>
-        <w:t>T</w:t>
-      </w:r>
-      <w:r>
-        <w:rPr>
-          <w:rFonts w:eastAsia="Times New Roman" w:cs="Times New Roman"/>
-          <w:szCs w:val="24"/>
-          <w:lang w:val="en-US"/>
-        </w:rPr>
-        <w:t xml:space="preserve">o ensure accurate game result calculation. </w:t>
-      </w:r>
-    </w:p>
-    <w:p>
-      <w:pPr>
-        <w:pStyle w:val="ListParagraph"/>
-        <w:numPr>
-          <w:ilvl w:val="0"/>
-          <w:numId w:val="18"/>
-        </w:numPr>
-        <w:spacing w:after="0" w:line="360" w:lineRule="auto"/>
-        <w:ind w:left="180" w:hanging="180"/>
-        <w:jc w:val="both"/>
-        <w:rPr>
-          <w:rFonts w:eastAsia="Times New Roman" w:cs="Times New Roman"/>
-          <w:szCs w:val="24"/>
-        </w:rPr>
-      </w:pPr>
-      <w:r>
-        <w:rPr>
-          <w:rFonts w:eastAsia="Times New Roman" w:cs="Times New Roman"/>
-          <w:szCs w:val="24"/>
-          <w:lang w:val="en-US"/>
-        </w:rPr>
-        <w:t>To provide a simple and user-friendly interface.</w:t>
-      </w:r>
-    </w:p>
-    <w:p>
-      <w:pPr>
-        <w:pStyle w:val="ListParagraph"/>
-        <w:numPr>
-          <w:ilvl w:val="0"/>
-          <w:numId w:val="18"/>
-        </w:numPr>
-        <w:tabs>
-          <w:tab w:val="left" w:pos="180"/>
-        </w:tabs>
-        <w:spacing w:after="0" w:line="360" w:lineRule="auto"/>
-        <w:ind w:left="360"/>
-        <w:jc w:val="both"/>
-        <w:rPr>
-          <w:rFonts w:eastAsia="Times New Roman" w:cs="Times New Roman"/>
-          <w:szCs w:val="24"/>
-        </w:rPr>
-      </w:pPr>
-      <w:r>
-        <w:rPr>
-          <w:rFonts w:eastAsia="Times New Roman" w:cs="Times New Roman"/>
-          <w:szCs w:val="24"/>
-        </w:rPr>
-        <w:t>To use file handling for storing player records, maintaining match history</w:t>
-      </w:r>
-      <w:r>
-        <w:rPr>
-          <w:rFonts w:eastAsia="Times New Roman" w:cs="Times New Roman"/>
-          <w:szCs w:val="24"/>
-        </w:rPr>
-        <w:t>.</w:t>
-      </w:r>
     </w:p>
     <w:p>
       <w:r>
@@ -4449,6 +4460,7 @@
           <w:numId w:val="44"/>
         </w:numPr>
         <w:spacing w:after="0" w:line="360" w:lineRule="auto"/>
+        <w:ind w:left="360"/>
         <w:jc w:val="both"/>
       </w:pPr>
       <w:bookmarkStart w:id="6" w:name="_Toc232570757"/>
@@ -4545,6 +4557,7 @@
           <w:numId w:val="44"/>
         </w:numPr>
         <w:spacing w:before="0" w:after="0" w:line="360" w:lineRule="auto"/>
+        <w:ind w:left="360"/>
         <w:jc w:val="both"/>
       </w:pPr>
       <w:bookmarkStart w:id="7" w:name="_Toc232570758"/>
@@ -6551,6 +6564,7 @@
           <w:numId w:val="44"/>
         </w:numPr>
         <w:spacing w:after="0" w:line="360" w:lineRule="auto"/>
+        <w:ind w:left="360"/>
         <w:jc w:val="both"/>
       </w:pPr>
       <w:bookmarkStart w:id="13" w:name="_Toc232570764"/>
@@ -6631,7 +6645,7 @@
           <w:szCs w:val="24"/>
         </w:rPr>
       </w:pPr>
-      <w:bookmarkStart w:id="14" w:name="_Toc232571316"/>
+      <w:bookmarkStart w:id="14" w:name="_Toc232590305"/>
       <w:r>
         <w:rPr>
           <w:i w:val="0"/>
@@ -6823,7 +6837,7 @@
           <w:szCs w:val="24"/>
         </w:rPr>
       </w:pPr>
-      <w:bookmarkStart w:id="15" w:name="_Toc232571317"/>
+      <w:bookmarkStart w:id="15" w:name="_Toc232590306"/>
       <w:r>
         <w:rPr>
           <w:i w:val="0"/>
@@ -6969,7 +6983,7 @@
           <w:szCs w:val="24"/>
         </w:rPr>
       </w:pPr>
-      <w:bookmarkStart w:id="16" w:name="_Toc232571318"/>
+      <w:bookmarkStart w:id="16" w:name="_Toc232590307"/>
       <w:r>
         <w:rPr>
           <w:i w:val="0"/>
@@ -7133,7 +7147,7 @@
           <w:szCs w:val="24"/>
         </w:rPr>
       </w:pPr>
-      <w:bookmarkStart w:id="17" w:name="_Toc232571319"/>
+      <w:bookmarkStart w:id="17" w:name="_Toc232590308"/>
       <w:r>
         <w:rPr>
           <w:i w:val="0"/>
@@ -7195,7 +7209,6 @@
         </w:rPr>
         <w:fldChar w:fldCharType="end"/>
       </w:r>
-      <w:proofErr w:type="spellStart"/>
       <w:r>
         <w:rPr>
           <w:i w:val="0"/>
@@ -7204,10 +7217,77 @@
           <w:sz w:val="24"/>
           <w:szCs w:val="24"/>
         </w:rPr>
-        <w:t>Multiplayer</w:t>
-      </w:r>
-      <w:proofErr w:type="spellEnd"/>
-      <w:r>
+        <w:t>Multiplayer Gameplay Flowchart</w:t>
+      </w:r>
+      <w:bookmarkEnd w:id="17"/>
+    </w:p>
+    <w:p>
+      <w:pPr>
+        <w:pStyle w:val="Caption"/>
+        <w:rPr>
+          <w:i w:val="0"/>
+          <w:color w:val="auto"/>
+          <w:sz w:val="24"/>
+          <w:szCs w:val="24"/>
+        </w:rPr>
+      </w:pPr>
+    </w:p>
+    <w:p>
+      <w:pPr>
+        <w:keepNext/>
+      </w:pPr>
+      <w:r>
+        <w:rPr>
+          <w:noProof/>
+        </w:rPr>
+        <w:lastRenderedPageBreak/>
+        <w:drawing>
+          <wp:inline distT="0" distB="0" distL="0" distR="0" wp14:anchorId="119B8F6E" wp14:editId="4C521896">
+            <wp:extent cx="3721100" cy="5136543"/>
+            <wp:effectExtent l="0" t="0" r="0" b="6985"/>
+            <wp:docPr id="1927568087" name="Picture 4"/>
+            <wp:cNvGraphicFramePr>
+              <a:graphicFrameLocks xmlns:a="http://schemas.openxmlformats.org/drawingml/2006/main" noChangeAspect="1"/>
+            </wp:cNvGraphicFramePr>
+            <a:graphic xmlns:a="http://schemas.openxmlformats.org/drawingml/2006/main">
+              <a:graphicData uri="http://schemas.openxmlformats.org/drawingml/2006/picture">
+                <pic:pic xmlns:pic="http://schemas.openxmlformats.org/drawingml/2006/picture">
+                  <pic:nvPicPr>
+                    <pic:cNvPr id="1927568087" name="Picture 1927568087"/>
+                    <pic:cNvPicPr/>
+                  </pic:nvPicPr>
+                  <pic:blipFill>
+                    <a:blip r:embed="rId16">
+                      <a:extLst>
+                        <a:ext uri="{28A0092B-C50C-407E-A947-70E740481C1C}">
+                          <a14:useLocalDpi xmlns:a14="http://schemas.microsoft.com/office/drawing/2010/main" val="0"/>
+                        </a:ext>
+                      </a:extLst>
+                    </a:blip>
+                    <a:stretch>
+                      <a:fillRect/>
+                    </a:stretch>
+                  </pic:blipFill>
+                  <pic:spPr>
+                    <a:xfrm>
+                      <a:off x="0" y="0"/>
+                      <a:ext cx="3721676" cy="5137338"/>
+                    </a:xfrm>
+                    <a:prstGeom prst="rect">
+                      <a:avLst/>
+                    </a:prstGeom>
+                  </pic:spPr>
+                </pic:pic>
+              </a:graphicData>
+            </a:graphic>
+          </wp:inline>
+        </w:drawing>
+      </w:r>
+    </w:p>
+    <w:p>
+      <w:pPr>
+        <w:pStyle w:val="Caption"/>
+        <w:jc w:val="center"/>
         <w:rPr>
           <w:i w:val="0"/>
           <w:iCs w:val="0"/>
@@ -7215,20 +7295,80 @@
           <w:sz w:val="24"/>
           <w:szCs w:val="24"/>
         </w:rPr>
-        <w:t xml:space="preserve"> Gameplay Flowchart</w:t>
-      </w:r>
-      <w:bookmarkEnd w:id="17"/>
-    </w:p>
-    <w:p>
-      <w:pPr>
-        <w:pStyle w:val="Caption"/>
+      </w:pPr>
+      <w:bookmarkStart w:id="18" w:name="_Toc232590309"/>
+      <w:r>
         <w:rPr>
           <w:i w:val="0"/>
-          <w:color w:val="auto"/>
+          <w:iCs w:val="0"/>
+          <w:color w:val="000000" w:themeColor="text1"/>
           <w:sz w:val="24"/>
           <w:szCs w:val="24"/>
         </w:rPr>
-      </w:pPr>
+        <w:t xml:space="preserve">Figure </w:t>
+      </w:r>
+      <w:r>
+        <w:rPr>
+          <w:i w:val="0"/>
+          <w:iCs w:val="0"/>
+          <w:color w:val="000000" w:themeColor="text1"/>
+          <w:sz w:val="24"/>
+          <w:szCs w:val="24"/>
+        </w:rPr>
+        <w:fldChar w:fldCharType="begin"/>
+      </w:r>
+      <w:r>
+        <w:rPr>
+          <w:i w:val="0"/>
+          <w:iCs w:val="0"/>
+          <w:color w:val="000000" w:themeColor="text1"/>
+          <w:sz w:val="24"/>
+          <w:szCs w:val="24"/>
+        </w:rPr>
+        <w:instrText xml:space="preserve"> SEQ Figure \* ARABIC </w:instrText>
+      </w:r>
+      <w:r>
+        <w:rPr>
+          <w:i w:val="0"/>
+          <w:iCs w:val="0"/>
+          <w:color w:val="000000" w:themeColor="text1"/>
+          <w:sz w:val="24"/>
+          <w:szCs w:val="24"/>
+        </w:rPr>
+        <w:fldChar w:fldCharType="separate"/>
+      </w:r>
+      <w:r>
+        <w:rPr>
+          <w:i w:val="0"/>
+          <w:iCs w:val="0"/>
+          <w:noProof/>
+          <w:color w:val="000000" w:themeColor="text1"/>
+          <w:sz w:val="24"/>
+          <w:szCs w:val="24"/>
+        </w:rPr>
+        <w:t>5</w:t>
+      </w:r>
+      <w:r>
+        <w:rPr>
+          <w:i w:val="0"/>
+          <w:iCs w:val="0"/>
+          <w:color w:val="000000" w:themeColor="text1"/>
+          <w:sz w:val="24"/>
+          <w:szCs w:val="24"/>
+        </w:rPr>
+        <w:fldChar w:fldCharType="end"/>
+      </w:r>
+      <w:r>
+        <w:rPr>
+          <w:i w:val="0"/>
+          <w:iCs w:val="0"/>
+          <w:color w:val="000000" w:themeColor="text1"/>
+          <w:sz w:val="24"/>
+          <w:szCs w:val="24"/>
+        </w:rPr>
+        <w:t xml:space="preserve"> Use case diagram</w:t>
+      </w:r>
+      <w:bookmarkEnd w:id="18"/>
     </w:p>
     <w:p>
       <w:r>
@@ -7243,14 +7383,15 @@
           <w:numId w:val="44"/>
         </w:numPr>
         <w:spacing w:before="0" w:after="0" w:line="360" w:lineRule="auto"/>
+        <w:ind w:left="360"/>
         <w:jc w:val="both"/>
       </w:pPr>
-      <w:bookmarkStart w:id="18" w:name="_Toc232570765"/>
+      <w:bookmarkStart w:id="19" w:name="_Toc232570765"/>
       <w:r>
         <w:lastRenderedPageBreak/>
         <w:t>Development</w:t>
       </w:r>
-      <w:bookmarkEnd w:id="18"/>
+      <w:bookmarkEnd w:id="19"/>
     </w:p>
     <w:p>
       <w:pPr>
@@ -7585,7 +7726,7 @@
                     </pic:cNvPicPr>
                   </pic:nvPicPr>
                   <pic:blipFill>
-                    <a:blip r:embed="rId16">
+                    <a:blip r:embed="rId17">
                       <a:extLst>
                         <a:ext uri="{28A0092B-C50C-407E-A947-70E740481C1C}">
                           <a14:useLocalDpi xmlns:a14="http://schemas.microsoft.com/office/drawing/2010/main" val="0"/>
@@ -7629,7 +7770,7 @@
           <w:szCs w:val="24"/>
         </w:rPr>
       </w:pPr>
-      <w:bookmarkStart w:id="19" w:name="_Toc232571320"/>
+      <w:bookmarkStart w:id="20" w:name="_Toc232590310"/>
       <w:r>
         <w:rPr>
           <w:i w:val="0"/>
@@ -7679,7 +7820,7 @@
           <w:sz w:val="24"/>
           <w:szCs w:val="24"/>
         </w:rPr>
-        <w:t>5</w:t>
+        <w:t>6</w:t>
       </w:r>
       <w:r>
         <w:rPr>
@@ -7701,7 +7842,7 @@
         </w:rPr>
         <w:t xml:space="preserve"> Waterfall model</w:t>
       </w:r>
-      <w:bookmarkEnd w:id="19"/>
+      <w:bookmarkEnd w:id="20"/>
     </w:p>
     <w:p>
       <w:pPr>
@@ -7769,7 +7910,7 @@
                     <pic:cNvPicPr/>
                   </pic:nvPicPr>
                   <pic:blipFill>
-                    <a:blip r:embed="rId17">
+                    <a:blip r:embed="rId18">
                       <a:extLst>
                         <a:ext uri="{28A0092B-C50C-407E-A947-70E740481C1C}">
                           <a14:useLocalDpi xmlns:a14="http://schemas.microsoft.com/office/drawing/2010/main" val="0"/>
@@ -7808,7 +7949,7 @@
           <w:szCs w:val="24"/>
         </w:rPr>
       </w:pPr>
-      <w:bookmarkStart w:id="20" w:name="_Toc232571321"/>
+      <w:bookmarkStart w:id="21" w:name="_Toc232590311"/>
       <w:r>
         <w:rPr>
           <w:i w:val="0"/>
@@ -7858,7 +7999,7 @@
           <w:sz w:val="24"/>
           <w:szCs w:val="24"/>
         </w:rPr>
-        <w:t>6</w:t>
+        <w:t>7</w:t>
       </w:r>
       <w:r>
         <w:rPr>
@@ -7880,7 +8021,7 @@
         </w:rPr>
         <w:t xml:space="preserve"> Gantt Chart</w:t>
       </w:r>
-      <w:bookmarkEnd w:id="20"/>
+      <w:bookmarkEnd w:id="21"/>
     </w:p>
     <w:p>
       <w:r>
@@ -8067,7 +8208,7 @@
       </w:pPr>
     </w:p>
     <w:sectPr>
-      <w:footerReference w:type="default" r:id="rId18"/>
+      <w:footerReference w:type="default" r:id="rId19"/>
       <w:pgSz w:w="11906" w:h="16838" w:code="9"/>
       <w:pgMar w:top="1440" w:right="1440" w:bottom="1440" w:left="2160" w:header="720" w:footer="720" w:gutter="0"/>
       <w:cols w:space="720"/>
@@ -14389,6 +14530,7 @@
     <w:rsid w:val="003212F4"/>
     <w:rsid w:val="0035202E"/>
     <w:rsid w:val="003708ED"/>
+    <w:rsid w:val="003A7737"/>
     <w:rsid w:val="005047B6"/>
     <w:rsid w:val="00572B42"/>
     <w:rsid w:val="00586AAF"/>
@@ -14399,6 +14541,7 @@
     <w:rsid w:val="00806FB8"/>
     <w:rsid w:val="008A5352"/>
     <w:rsid w:val="009308D6"/>
+    <w:rsid w:val="00931747"/>
     <w:rsid w:val="00A65D08"/>
     <w:rsid w:val="00A65DB8"/>
     <w:rsid w:val="00B43994"/>
@@ -14412,6 +14555,8 @@
     <w:rsid w:val="00DA309B"/>
     <w:rsid w:val="00DD3B45"/>
     <w:rsid w:val="00DF390D"/>
+    <w:rsid w:val="00E64B65"/>
+    <w:rsid w:val="00E7419B"/>
     <w:rsid w:val="00ED5739"/>
     <w:rsid w:val="00F530A9"/>
     <w:rsid w:val="00F97161"/>

</xml_diff>

<commit_message>
change in document testing
</commit_message>
<xml_diff>
--- a/final project report.docx
+++ b/final project report.docx
@@ -1,6 +1,6 @@
 
 <file path=word/document.xml><?xml version="1.0" encoding="utf-8"?>
-<w:document xmlns:wpc="http://schemas.microsoft.com/office/word/2010/wordprocessingCanvas" xmlns:mc="http://schemas.openxmlformats.org/markup-compatibility/2006" xmlns:o="urn:schemas-microsoft-com:office:office" xmlns:r="http://schemas.openxmlformats.org/officeDocument/2006/relationships" xmlns:m="http://schemas.openxmlformats.org/officeDocument/2006/math" xmlns:v="urn:schemas-microsoft-com:vml" xmlns:wp14="http://schemas.microsoft.com/office/word/2010/wordprocessingDrawing" xmlns:wp="http://schemas.openxmlformats.org/drawingml/2006/wordprocessingDrawing" xmlns:w10="urn:schemas-microsoft-com:office:word" xmlns:w="http://schemas.openxmlformats.org/wordprocessingml/2006/main" xmlns:w14="http://schemas.microsoft.com/office/word/2010/wordml" xmlns:w15="http://schemas.microsoft.com/office/word/2012/wordml" xmlns:wpg="http://schemas.microsoft.com/office/word/2010/wordprocessingGroup" xmlns:wpi="http://schemas.microsoft.com/office/word/2010/wordprocessingInk" xmlns:wne="http://schemas.microsoft.com/office/word/2006/wordml" xmlns:wps="http://schemas.microsoft.com/office/word/2010/wordprocessingShape" mc:Ignorable="w14 w15 wp14">
+<w:document xmlns:wpc="http://schemas.microsoft.com/office/word/2010/wordprocessingCanvas" xmlns:cx="http://schemas.microsoft.com/office/drawing/2014/chartex" xmlns:cx1="http://schemas.microsoft.com/office/drawing/2015/9/8/chartex" xmlns:cx2="http://schemas.microsoft.com/office/drawing/2015/10/21/chartex" xmlns:cx3="http://schemas.microsoft.com/office/drawing/2016/5/9/chartex" xmlns:cx4="http://schemas.microsoft.com/office/drawing/2016/5/10/chartex" xmlns:cx5="http://schemas.microsoft.com/office/drawing/2016/5/11/chartex" xmlns:cx6="http://schemas.microsoft.com/office/drawing/2016/5/12/chartex" xmlns:cx7="http://schemas.microsoft.com/office/drawing/2016/5/13/chartex" xmlns:cx8="http://schemas.microsoft.com/office/drawing/2016/5/14/chartex" xmlns:mc="http://schemas.openxmlformats.org/markup-compatibility/2006" xmlns:aink="http://schemas.microsoft.com/office/drawing/2016/ink" xmlns:am3d="http://schemas.microsoft.com/office/drawing/2017/model3d" xmlns:o="urn:schemas-microsoft-com:office:office" xmlns:oel="http://schemas.microsoft.com/office/2019/extlst" xmlns:r="http://schemas.openxmlformats.org/officeDocument/2006/relationships" xmlns:m="http://schemas.openxmlformats.org/officeDocument/2006/math" xmlns:v="urn:schemas-microsoft-com:vml" xmlns:wp14="http://schemas.microsoft.com/office/word/2010/wordprocessingDrawing" xmlns:wp="http://schemas.openxmlformats.org/drawingml/2006/wordprocessingDrawing" xmlns:w10="urn:schemas-microsoft-com:office:word" xmlns:w="http://schemas.openxmlformats.org/wordprocessingml/2006/main" xmlns:w14="http://schemas.microsoft.com/office/word/2010/wordml" xmlns:w15="http://schemas.microsoft.com/office/word/2012/wordml" xmlns:w16cex="http://schemas.microsoft.com/office/word/2018/wordml/cex" xmlns:w16cid="http://schemas.microsoft.com/office/word/2016/wordml/cid" xmlns:w16="http://schemas.microsoft.com/office/word/2018/wordml" xmlns:w16du="http://schemas.microsoft.com/office/word/2023/wordml/word16du" xmlns:w16sdtdh="http://schemas.microsoft.com/office/word/2020/wordml/sdtdatahash" xmlns:w16sdtfl="http://schemas.microsoft.com/office/word/2024/wordml/sdtformatlock" xmlns:w16se="http://schemas.microsoft.com/office/word/2015/wordml/symex" xmlns:wpg="http://schemas.microsoft.com/office/word/2010/wordprocessingGroup" xmlns:wpi="http://schemas.microsoft.com/office/word/2010/wordprocessingInk" xmlns:wne="http://schemas.microsoft.com/office/word/2006/wordml" xmlns:wps="http://schemas.microsoft.com/office/word/2010/wordprocessingShape" mc:Ignorable="w14 w15 w16se w16cid w16 w16cex w16sdtdh w16sdtfl w16du wp14">
   <w:body>
     <w:p>
       <w:pPr>
@@ -110,6 +110,8 @@
         </w:rPr>
         <w:tab/>
       </w:r>
+      <w:proofErr w:type="spellStart"/>
+      <w:proofErr w:type="gramStart"/>
       <w:r>
         <w:rPr>
           <w:rFonts w:cs="Times New Roman"/>
@@ -120,6 +122,7 @@
         </w:rPr>
         <w:t>Simalchaur</w:t>
       </w:r>
+      <w:proofErr w:type="spellEnd"/>
       <w:r>
         <w:rPr>
           <w:rFonts w:cs="Times New Roman"/>
@@ -138,7 +141,18 @@
           <w:sz w:val="28"/>
           <w:szCs w:val="28"/>
         </w:rPr>
-        <w:t>, Pokhara</w:t>
+        <w:t>,</w:t>
+      </w:r>
+      <w:proofErr w:type="gramEnd"/>
+      <w:r>
+        <w:rPr>
+          <w:rFonts w:cs="Times New Roman"/>
+          <w:b/>
+          <w:bCs/>
+          <w:sz w:val="28"/>
+          <w:szCs w:val="28"/>
+        </w:rPr>
+        <w:t xml:space="preserve"> Pokhara</w:t>
       </w:r>
       <w:r>
         <w:rPr>
@@ -260,7 +274,6 @@
           <w:dataBinding w:prefixMappings="xmlns:ns0='http://purl.org/dc/elements/1.1/' xmlns:ns1='http://schemas.openxmlformats.org/package/2006/metadata/core-properties' " w:xpath="/ns1:coreProperties[1]/ns0:title[1]" w:storeItemID="{6C3C8BC8-F283-45AE-878A-BAB7291924A1}"/>
           <w:text/>
         </w:sdtPr>
-        <w:sdtEndPr/>
         <w:sdtContent>
           <w:r>
             <w:rPr>
@@ -424,7 +437,7 @@
               </wp:inline>
             </w:drawing>
           </mc:Choice>
-          <mc:Fallback xmlns:w16se="http://schemas.microsoft.com/office/word/2015/wordml/symex" xmlns:w16sdtfl="http://schemas.microsoft.com/office/word/2024/wordml/sdtformatlock" xmlns:w16sdtdh="http://schemas.microsoft.com/office/word/2020/wordml/sdtdatahash" xmlns:w16du="http://schemas.microsoft.com/office/word/2023/wordml/word16du" xmlns:w16="http://schemas.microsoft.com/office/word/2018/wordml" xmlns:w16cid="http://schemas.microsoft.com/office/word/2016/wordml/cid" xmlns:w16cex="http://schemas.microsoft.com/office/word/2018/wordml/cex" xmlns:oel="http://schemas.microsoft.com/office/2019/extlst" xmlns:am3d="http://schemas.microsoft.com/office/drawing/2017/model3d" xmlns:aink="http://schemas.microsoft.com/office/drawing/2016/ink" xmlns:cx8="http://schemas.microsoft.com/office/drawing/2016/5/14/chartex" xmlns:cx7="http://schemas.microsoft.com/office/drawing/2016/5/13/chartex" xmlns:cx6="http://schemas.microsoft.com/office/drawing/2016/5/12/chartex" xmlns:cx5="http://schemas.microsoft.com/office/drawing/2016/5/11/chartex" xmlns:cx4="http://schemas.microsoft.com/office/drawing/2016/5/10/chartex" xmlns:cx3="http://schemas.microsoft.com/office/drawing/2016/5/9/chartex" xmlns:cx2="http://schemas.microsoft.com/office/drawing/2015/10/21/chartex" xmlns:cx1="http://schemas.microsoft.com/office/drawing/2015/9/8/chartex" xmlns:cx="http://schemas.microsoft.com/office/drawing/2014/chartex">
+          <mc:Fallback>
             <w:pict>
               <v:group w14:anchorId="5F28FB87" id="Group 5" o:spid="_x0000_s1026" style="width:43.55pt;height:123.05pt;mso-position-horizontal-relative:char;mso-position-vertical-relative:line" coordsize="6762,16097" o:gfxdata="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">
                 <v:line id="Straight Connector 2" o:spid="_x0000_s1027" style="position:absolute;visibility:visible;mso-wrap-style:square" from="3333,0" to="3333,16097" o:connectortype="straight" o:gfxdata="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" strokecolor="black [3200]" strokeweight="2.5pt">
@@ -684,6 +697,7 @@
                 <w:szCs w:val="24"/>
               </w:rPr>
             </w:pPr>
+            <w:proofErr w:type="spellStart"/>
             <w:r>
               <w:rPr>
                 <w:rFonts w:cs="Times New Roman"/>
@@ -691,7 +705,17 @@
                 <w:bCs/>
                 <w:szCs w:val="24"/>
               </w:rPr>
-              <w:t>P.U. Registration Number</w:t>
+              <w:t>P.U</w:t>
+            </w:r>
+            <w:proofErr w:type="spellEnd"/>
+            <w:r>
+              <w:rPr>
+                <w:rFonts w:cs="Times New Roman"/>
+                <w:b/>
+                <w:bCs/>
+                <w:szCs w:val="24"/>
+              </w:rPr>
+              <w:t>. Registration Number</w:t>
             </w:r>
           </w:p>
         </w:tc>
@@ -906,6 +930,7 @@
           <w:szCs w:val="24"/>
         </w:rPr>
       </w:pPr>
+      <w:proofErr w:type="spellStart"/>
       <w:r>
         <w:rPr>
           <w:rFonts w:cs="Times New Roman"/>
@@ -950,7 +975,18 @@
           <w:noProof/>
           <w:szCs w:val="24"/>
         </w:rPr>
-        <w:t>06/07/2026</w:t>
+        <w:t>08</w:t>
+      </w:r>
+      <w:proofErr w:type="spellEnd"/>
+      <w:r>
+        <w:rPr>
+          <w:rFonts w:cs="Times New Roman"/>
+          <w:b/>
+          <w:bCs/>
+          <w:noProof/>
+          <w:szCs w:val="24"/>
+        </w:rPr>
+        <w:t>/07/2026</w:t>
       </w:r>
       <w:r>
         <w:rPr>
@@ -1135,6 +1171,7 @@
           <w:sz w:val="32"/>
           <w:szCs w:val="32"/>
         </w:rPr>
+        <w:lastRenderedPageBreak/>
         <w:t>Declaration for</w:t>
       </w:r>
     </w:p>
@@ -1158,6 +1195,8 @@
         </w:rPr>
         <w:t>“</w:t>
       </w:r>
+      <w:proofErr w:type="spellStart"/>
+      <w:proofErr w:type="gramStart"/>
       <w:r>
         <w:rPr>
           <w:rFonts w:cs="Times New Roman"/>
@@ -1165,8 +1204,9 @@
           <w:sz w:val="32"/>
           <w:szCs w:val="32"/>
         </w:rPr>
-        <w:t>Rock,Paper,Scissor</w:t>
-      </w:r>
+        <w:t>Rock,Paper</w:t>
+      </w:r>
+      <w:proofErr w:type="gramEnd"/>
       <w:r>
         <w:rPr>
           <w:rFonts w:cs="Times New Roman"/>
@@ -1174,6 +1214,16 @@
           <w:sz w:val="32"/>
           <w:szCs w:val="32"/>
         </w:rPr>
+        <w:t>,Scissor</w:t>
+      </w:r>
+      <w:proofErr w:type="spellEnd"/>
+      <w:r>
+        <w:rPr>
+          <w:rFonts w:cs="Times New Roman"/>
+          <w:b/>
+          <w:sz w:val="32"/>
+          <w:szCs w:val="32"/>
+        </w:rPr>
         <w:t>”</w:t>
       </w:r>
     </w:p>
@@ -1336,12 +1386,21 @@
           <w:szCs w:val="24"/>
         </w:rPr>
       </w:pPr>
+      <w:proofErr w:type="gramStart"/>
       <w:r>
         <w:rPr>
           <w:rFonts w:cs="Times New Roman"/>
           <w:szCs w:val="24"/>
         </w:rPr>
-        <w:t>Date:____ / ____ / ________</w:t>
+        <w:t>Date:_</w:t>
+      </w:r>
+      <w:proofErr w:type="gramEnd"/>
+      <w:r>
+        <w:rPr>
+          <w:rFonts w:cs="Times New Roman"/>
+          <w:szCs w:val="24"/>
+        </w:rPr>
+        <w:t>___ / ____ / ________</w:t>
       </w:r>
     </w:p>
     <w:p>
@@ -1371,6 +1430,7 @@
           <w:sz w:val="28"/>
           <w:szCs w:val="24"/>
         </w:rPr>
+        <w:lastRenderedPageBreak/>
         <w:t>Supervisor</w:t>
       </w:r>
       <w:r>
@@ -1408,28 +1468,32 @@
         </w:rPr>
         <w:t>I hereby recommend that this project entitled “</w:t>
       </w:r>
+      <w:proofErr w:type="spellStart"/>
+      <w:proofErr w:type="gramStart"/>
       <w:r>
         <w:rPr>
           <w:rFonts w:cs="Times New Roman"/>
           <w:b/>
           <w:szCs w:val="24"/>
         </w:rPr>
-        <w:t>Rock,Paper,Scissor</w:t>
-      </w:r>
-      <w:r>
-        <w:rPr>
-          <w:rFonts w:cs="Times New Roman"/>
-          <w:szCs w:val="24"/>
-        </w:rPr>
-        <w:t xml:space="preserve">” is done under my supervision by </w:t>
-      </w:r>
+        <w:t>Rock,Paper</w:t>
+      </w:r>
+      <w:proofErr w:type="gramEnd"/>
       <w:r>
         <w:rPr>
           <w:rFonts w:cs="Times New Roman"/>
           <w:b/>
           <w:szCs w:val="24"/>
         </w:rPr>
-        <w:t xml:space="preserve">Divya Sharma </w:t>
+        <w:t>,Scissor</w:t>
+      </w:r>
+      <w:proofErr w:type="spellEnd"/>
+      <w:r>
+        <w:rPr>
+          <w:rFonts w:cs="Times New Roman"/>
+          <w:szCs w:val="24"/>
+        </w:rPr>
+        <w:t xml:space="preserve">” is done under my supervision by </w:t>
       </w:r>
       <w:r>
         <w:rPr>
@@ -1437,7 +1501,7 @@
           <w:b/>
           <w:szCs w:val="24"/>
         </w:rPr>
-        <w:t>and</w:t>
+        <w:t xml:space="preserve">Divya Sharma </w:t>
       </w:r>
       <w:r>
         <w:rPr>
@@ -1445,7 +1509,7 @@
           <w:b/>
           <w:szCs w:val="24"/>
         </w:rPr>
-        <w:t xml:space="preserve"> S</w:t>
+        <w:t>and</w:t>
       </w:r>
       <w:r>
         <w:rPr>
@@ -1453,21 +1517,7 @@
           <w:b/>
           <w:szCs w:val="24"/>
         </w:rPr>
-        <w:t xml:space="preserve">abina Puwanli </w:t>
-      </w:r>
-      <w:r>
-        <w:rPr>
-          <w:rFonts w:cs="Times New Roman"/>
-          <w:szCs w:val="24"/>
-        </w:rPr>
-        <w:t xml:space="preserve">during their </w:t>
-      </w:r>
-      <w:r>
-        <w:rPr>
-          <w:rFonts w:cs="Times New Roman"/>
-          <w:szCs w:val="24"/>
-        </w:rPr>
-        <w:t>2nd</w:t>
+        <w:t xml:space="preserve"> S</w:t>
       </w:r>
       <w:r>
         <w:rPr>
@@ -1475,56 +1525,21 @@
           <w:b/>
           <w:szCs w:val="24"/>
         </w:rPr>
-        <w:t xml:space="preserve"> </w:t>
+        <w:t xml:space="preserve">abina Puwanli </w:t>
       </w:r>
       <w:r>
         <w:rPr>
           <w:rFonts w:cs="Times New Roman"/>
           <w:szCs w:val="24"/>
         </w:rPr>
-        <w:t xml:space="preserve">Semester in partial </w:t>
+        <w:t xml:space="preserve">during their </w:t>
       </w:r>
       <w:r>
         <w:rPr>
           <w:rFonts w:cs="Times New Roman"/>
           <w:szCs w:val="24"/>
         </w:rPr>
-        <w:t>fulfilment</w:t>
-      </w:r>
-      <w:r>
-        <w:rPr>
-          <w:rFonts w:cs="Times New Roman"/>
-          <w:szCs w:val="24"/>
-        </w:rPr>
-        <w:t xml:space="preserve"> of the requirements for the degree of</w:t>
-      </w:r>
-      <w:r>
-        <w:rPr>
-          <w:rFonts w:cs="Times New Roman"/>
-          <w:szCs w:val="24"/>
-        </w:rPr>
-        <w:t xml:space="preserve"> Bachelor of Computer Application</w:t>
-      </w:r>
-      <w:r>
-        <w:rPr>
-          <w:rFonts w:cs="Times New Roman"/>
-          <w:szCs w:val="24"/>
-        </w:rPr>
-        <w:t xml:space="preserve"> (BCA)</w:t>
-      </w:r>
-      <w:r>
-        <w:rPr>
-          <w:rFonts w:cs="Times New Roman"/>
-          <w:szCs w:val="24"/>
-        </w:rPr>
-        <w:t xml:space="preserve"> </w:t>
-      </w:r>
-      <w:r>
-        <w:rPr>
-          <w:rFonts w:cs="Times New Roman"/>
-          <w:szCs w:val="24"/>
-        </w:rPr>
-        <w:t xml:space="preserve"> under </w:t>
+        <w:t>2nd</w:t>
       </w:r>
       <w:r>
         <w:rPr>
@@ -1532,6 +1547,79 @@
           <w:b/>
           <w:szCs w:val="24"/>
         </w:rPr>
+        <w:t xml:space="preserve"> </w:t>
+      </w:r>
+      <w:r>
+        <w:rPr>
+          <w:rFonts w:cs="Times New Roman"/>
+          <w:szCs w:val="24"/>
+        </w:rPr>
+        <w:t xml:space="preserve">Semester in partial </w:t>
+      </w:r>
+      <w:r>
+        <w:rPr>
+          <w:rFonts w:cs="Times New Roman"/>
+          <w:szCs w:val="24"/>
+        </w:rPr>
+        <w:t>fulfilment</w:t>
+      </w:r>
+      <w:r>
+        <w:rPr>
+          <w:rFonts w:cs="Times New Roman"/>
+          <w:szCs w:val="24"/>
+        </w:rPr>
+        <w:t xml:space="preserve"> of the requirements for the degree of</w:t>
+      </w:r>
+      <w:r>
+        <w:rPr>
+          <w:rFonts w:cs="Times New Roman"/>
+          <w:szCs w:val="24"/>
+        </w:rPr>
+        <w:t xml:space="preserve"> Bachelor of Computer Application</w:t>
+      </w:r>
+      <w:r>
+        <w:rPr>
+          <w:rFonts w:cs="Times New Roman"/>
+          <w:szCs w:val="24"/>
+        </w:rPr>
+        <w:t xml:space="preserve"> (</w:t>
+      </w:r>
+      <w:proofErr w:type="gramStart"/>
+      <w:r>
+        <w:rPr>
+          <w:rFonts w:cs="Times New Roman"/>
+          <w:szCs w:val="24"/>
+        </w:rPr>
+        <w:t>BCA)</w:t>
+      </w:r>
+      <w:r>
+        <w:rPr>
+          <w:rFonts w:cs="Times New Roman"/>
+          <w:szCs w:val="24"/>
+        </w:rPr>
+        <w:t xml:space="preserve"> </w:t>
+      </w:r>
+      <w:r>
+        <w:rPr>
+          <w:rFonts w:cs="Times New Roman"/>
+          <w:szCs w:val="24"/>
+        </w:rPr>
+        <w:t xml:space="preserve"> under</w:t>
+      </w:r>
+      <w:proofErr w:type="gramEnd"/>
+      <w:r>
+        <w:rPr>
+          <w:rFonts w:cs="Times New Roman"/>
+          <w:szCs w:val="24"/>
+        </w:rPr>
+        <w:t xml:space="preserve"> </w:t>
+      </w:r>
+      <w:r>
+        <w:rPr>
+          <w:rFonts w:cs="Times New Roman"/>
+          <w:b/>
+          <w:szCs w:val="24"/>
+        </w:rPr>
         <w:t>Pokhara University</w:t>
       </w:r>
       <w:r>
@@ -1579,13 +1667,25 @@
           <w:szCs w:val="24"/>
         </w:rPr>
       </w:pPr>
+      <w:proofErr w:type="spellStart"/>
+      <w:proofErr w:type="gramStart"/>
       <w:r>
         <w:rPr>
           <w:rFonts w:cs="Times New Roman"/>
           <w:b/>
           <w:szCs w:val="24"/>
         </w:rPr>
-        <w:t>Mr.Arpan Pokhrel</w:t>
+        <w:t>Mr.Arpan</w:t>
+      </w:r>
+      <w:proofErr w:type="spellEnd"/>
+      <w:proofErr w:type="gramEnd"/>
+      <w:r>
+        <w:rPr>
+          <w:rFonts w:cs="Times New Roman"/>
+          <w:b/>
+          <w:szCs w:val="24"/>
+        </w:rPr>
+        <w:t xml:space="preserve"> Pokhrel</w:t>
       </w:r>
     </w:p>
     <w:p>
@@ -1638,12 +1738,21 @@
           <w:szCs w:val="24"/>
         </w:rPr>
       </w:pPr>
+      <w:proofErr w:type="gramStart"/>
       <w:r>
         <w:rPr>
           <w:rFonts w:cs="Times New Roman"/>
           <w:szCs w:val="24"/>
         </w:rPr>
-        <w:t>Date:____ / ____ / ________</w:t>
+        <w:t>Date:_</w:t>
+      </w:r>
+      <w:proofErr w:type="gramEnd"/>
+      <w:r>
+        <w:rPr>
+          <w:rFonts w:cs="Times New Roman"/>
+          <w:szCs w:val="24"/>
+        </w:rPr>
+        <w:t>___ / ____ / ________</w:t>
       </w:r>
     </w:p>
     <w:p>
@@ -1681,6 +1790,7 @@
           <w:sz w:val="32"/>
           <w:szCs w:val="24"/>
         </w:rPr>
+        <w:lastRenderedPageBreak/>
         <w:t>Letter of Approval</w:t>
       </w:r>
     </w:p>
@@ -1751,13 +1861,23 @@
         </w:rPr>
         <w:t xml:space="preserve"> of the requirements for the degree of </w:t>
       </w:r>
+      <w:proofErr w:type="spellStart"/>
       <w:r>
         <w:rPr>
           <w:rFonts w:cs="Times New Roman"/>
           <w:b/>
           <w:szCs w:val="24"/>
         </w:rPr>
-        <w:t xml:space="preserve">Bachleor of Computer Application </w:t>
+        <w:t>Bachleor</w:t>
+      </w:r>
+      <w:proofErr w:type="spellEnd"/>
+      <w:r>
+        <w:rPr>
+          <w:rFonts w:cs="Times New Roman"/>
+          <w:b/>
+          <w:szCs w:val="24"/>
+        </w:rPr>
+        <w:t xml:space="preserve"> of Computer Application </w:t>
       </w:r>
       <w:r>
         <w:rPr>
@@ -1991,12 +2111,21 @@
                 <w:szCs w:val="24"/>
               </w:rPr>
             </w:pPr>
+            <w:proofErr w:type="gramStart"/>
             <w:r>
               <w:rPr>
                 <w:rFonts w:cs="Times New Roman"/>
                 <w:szCs w:val="24"/>
               </w:rPr>
-              <w:t>Date:____ / ____ / ________</w:t>
+              <w:t>Date:_</w:t>
+            </w:r>
+            <w:proofErr w:type="gramEnd"/>
+            <w:r>
+              <w:rPr>
+                <w:rFonts w:cs="Times New Roman"/>
+                <w:szCs w:val="24"/>
+              </w:rPr>
+              <w:t>___ / ____ / ________</w:t>
             </w:r>
           </w:p>
           <w:p>
@@ -3259,8 +3388,20 @@
           <w:sz w:val="32"/>
           <w:szCs w:val="32"/>
         </w:rPr>
-        <w:t>LIST OF FIGURE</w:t>
-      </w:r>
+        <w:lastRenderedPageBreak/>
+        <w:t xml:space="preserve">LIST OF </w:t>
+      </w:r>
+      <w:proofErr w:type="gramStart"/>
+      <w:r>
+        <w:rPr>
+          <w:rFonts w:cs="Times New Roman"/>
+          <w:b/>
+          <w:sz w:val="32"/>
+          <w:szCs w:val="32"/>
+        </w:rPr>
+        <w:t>FIGURE</w:t>
+      </w:r>
+      <w:proofErr w:type="gramEnd"/>
     </w:p>
     <w:p>
       <w:pPr>
@@ -3844,6 +3985,7 @@
         <w:rPr>
           <w:sz w:val="32"/>
         </w:rPr>
+        <w:lastRenderedPageBreak/>
         <w:t>Introduction</w:t>
       </w:r>
       <w:bookmarkEnd w:id="3"/>
@@ -4049,7 +4191,11 @@
         <w:jc w:val="both"/>
       </w:pPr>
       <w:r>
-        <w:t>This project also includes additional innovative feature such as tournament mode and streak bonus system. Tournament mode allows users to compete in multiple rounds continuously, while the streak bonus system reward users for consecutive wins. These features increase excitement and provide better gaming experience.</w:t>
+        <w:t xml:space="preserve">This project also includes additional innovative feature such as tournament mode and streak bonus system. Tournament mode allows users to compete in multiple rounds </w:t>
+      </w:r>
+      <w:r>
+        <w:lastRenderedPageBreak/>
+        <w:t>continuously, while the streak bonus system reward users for consecutive wins. These features increase excitement and provide better gaming experience.</w:t>
       </w:r>
     </w:p>
     <w:p>
@@ -4128,6 +4274,7 @@
         <w:rPr>
           <w:sz w:val="32"/>
         </w:rPr>
+        <w:lastRenderedPageBreak/>
         <w:t>Problem Statement</w:t>
       </w:r>
       <w:bookmarkEnd w:id="4"/>
@@ -4184,6 +4331,7 @@
         <w:rPr>
           <w:sz w:val="32"/>
         </w:rPr>
+        <w:lastRenderedPageBreak/>
         <w:t>Objective</w:t>
       </w:r>
       <w:bookmarkEnd w:id="5"/>
@@ -4319,6 +4467,7 @@
       </w:pPr>
       <w:bookmarkStart w:id="6" w:name="_Toc232570757"/>
       <w:r>
+        <w:lastRenderedPageBreak/>
         <w:t>Background Study</w:t>
       </w:r>
       <w:bookmarkEnd w:id="6"/>
@@ -4363,10 +4512,28 @@
         </w:rPr>
       </w:pPr>
       <w:r>
-        <w:t xml:space="preserve"> Many existing systems do not support multiplayer functionality, which limits social interaction. Additionally, traditional game systems often do not include comprehensive dashboards or real-time leaderboards, which are critical for motivating players.This project aims to address these gaps by implementing a multi-mode Rock-Paper-Scissors game with robust data management, multiplayer capabilities, and an intuitive user interface. The motivation stems from the need to create an engaging online game platform that is accessible to users with varying levels of technical expertise, and to explore how traditional games can be adapted to modern digital environments.</w:t>
-      </w:r>
-      <w:r>
-        <w:t xml:space="preserve"> The development process involves analyzing existing systems, identifying missing features, and designing an integrated system that combines game logic with user management, data persistence, and interactive interfaces.</w:t>
+        <w:t xml:space="preserve"> Many existing systems do not support multiplayer functionality, which limits social interaction. Additionally, traditional game systems often do not include comprehensive dashboards or real-time leaderboards, which are critical for motivating </w:t>
+      </w:r>
+      <w:proofErr w:type="spellStart"/>
+      <w:proofErr w:type="gramStart"/>
+      <w:r>
+        <w:t>players.This</w:t>
+      </w:r>
+      <w:proofErr w:type="spellEnd"/>
+      <w:proofErr w:type="gramEnd"/>
+      <w:r>
+        <w:t xml:space="preserve"> project aims to address these gaps by implementing a multi-mode Rock-Paper-Scissors game with robust data management, multiplayer capabilities, and an intuitive user interface. The motivation stems from the need to create an engaging online game platform that is accessible to users with varying levels of technical expertise, and to explore how traditional games can be adapted to modern digital environments.</w:t>
+      </w:r>
+      <w:r>
+        <w:t xml:space="preserve"> The development process involves </w:t>
+      </w:r>
+      <w:proofErr w:type="spellStart"/>
+      <w:r>
+        <w:t>analyzing</w:t>
+      </w:r>
+      <w:proofErr w:type="spellEnd"/>
+      <w:r>
+        <w:t xml:space="preserve"> existing systems, identifying missing features, and designing an integrated system that combines game logic with user management, data persistence, and interactive interfaces.</w:t>
       </w:r>
       <w:r>
         <w:rPr>
@@ -4397,6 +4564,7 @@
       </w:pPr>
       <w:bookmarkStart w:id="7" w:name="_Toc232570758"/>
       <w:r>
+        <w:lastRenderedPageBreak/>
         <w:t>Requirement Document</w:t>
       </w:r>
       <w:bookmarkEnd w:id="7"/>
@@ -4716,14 +4884,22 @@
               <w:rPr>
                 <w:lang w:val="en-GB"/>
               </w:rPr>
-              <w:t xml:space="preserve">d and  </w:t>
-            </w:r>
+              <w:t xml:space="preserve">d </w:t>
+            </w:r>
+            <w:proofErr w:type="gramStart"/>
             <w:r>
               <w:rPr>
                 <w:lang w:val="en-GB"/>
               </w:rPr>
+              <w:t xml:space="preserve">and  </w:t>
+            </w:r>
+            <w:r>
+              <w:rPr>
+                <w:lang w:val="en-GB"/>
+              </w:rPr>
               <w:t>Authenticates</w:t>
             </w:r>
+            <w:proofErr w:type="gramEnd"/>
             <w:r>
               <w:rPr>
                 <w:lang w:val="en-GB"/>
@@ -4787,8 +4963,16 @@
               <w:rPr>
                 <w:lang w:val="en-GB"/>
               </w:rPr>
-              <w:t xml:space="preserve"> and security feature .</w:t>
-            </w:r>
+              <w:t xml:space="preserve"> and security </w:t>
+            </w:r>
+            <w:proofErr w:type="gramStart"/>
+            <w:r>
+              <w:rPr>
+                <w:lang w:val="en-GB"/>
+              </w:rPr>
+              <w:t>feature .</w:t>
+            </w:r>
+            <w:proofErr w:type="gramEnd"/>
           </w:p>
         </w:tc>
       </w:tr>
@@ -5009,6 +5193,7 @@
               <w:jc w:val="both"/>
             </w:pPr>
             <w:r>
+              <w:lastRenderedPageBreak/>
               <w:t>4.</w:t>
             </w:r>
           </w:p>
@@ -5343,13 +5528,27 @@
               <w:rPr>
                 <w:lang w:val="en-GB"/>
               </w:rPr>
-              <w:t xml:space="preserve"> and  </w:t>
-            </w:r>
+              <w:t xml:space="preserve"> </w:t>
+            </w:r>
+            <w:proofErr w:type="gramStart"/>
             <w:r>
               <w:rPr>
                 <w:lang w:val="en-GB"/>
               </w:rPr>
-              <w:t>Score Management System</w:t>
+              <w:t xml:space="preserve">and  </w:t>
+            </w:r>
+            <w:r>
+              <w:rPr>
+                <w:lang w:val="en-GB"/>
+              </w:rPr>
+              <w:t>Score</w:t>
+            </w:r>
+            <w:proofErr w:type="gramEnd"/>
+            <w:r>
+              <w:rPr>
+                <w:lang w:val="en-GB"/>
+              </w:rPr>
+              <w:t xml:space="preserve"> Management System</w:t>
             </w:r>
           </w:p>
         </w:tc>
@@ -5750,11 +5949,19 @@
               </w:rPr>
               <w:t xml:space="preserve"> and </w:t>
             </w:r>
+            <w:proofErr w:type="gramStart"/>
             <w:r>
               <w:rPr>
                 <w:lang w:val="en-GB"/>
               </w:rPr>
-              <w:t>Closes the application safely.</w:t>
+              <w:t>Closes</w:t>
+            </w:r>
+            <w:proofErr w:type="gramEnd"/>
+            <w:r>
+              <w:rPr>
+                <w:lang w:val="en-GB"/>
+              </w:rPr>
+              <w:t xml:space="preserve"> the application safely.</w:t>
             </w:r>
           </w:p>
         </w:tc>
@@ -5817,6 +6024,7 @@
       </w:pPr>
       <w:bookmarkStart w:id="9" w:name="_Toc232570760"/>
       <w:r>
+        <w:lastRenderedPageBreak/>
         <w:t xml:space="preserve">5.2 </w:t>
       </w:r>
       <w:r>
@@ -5857,11 +6065,19 @@
           <w:lang w:val="en-US"/>
         </w:rPr>
       </w:pPr>
-      <w:r>
-        <w:rPr>
-          <w:lang w:val="en-US"/>
-        </w:rPr>
-        <w:t xml:space="preserve">.Reduce manual score keeping </w:t>
+      <w:proofErr w:type="gramStart"/>
+      <w:r>
+        <w:rPr>
+          <w:lang w:val="en-US"/>
+        </w:rPr>
+        <w:t>.Reduce</w:t>
+      </w:r>
+      <w:proofErr w:type="gramEnd"/>
+      <w:r>
+        <w:rPr>
+          <w:lang w:val="en-US"/>
+        </w:rPr>
+        <w:t xml:space="preserve"> manual score keeping </w:t>
       </w:r>
     </w:p>
     <w:p>
@@ -6223,11 +6439,19 @@
           <w:lang w:val="en-US"/>
         </w:rPr>
       </w:pPr>
-      <w:r>
-        <w:rPr>
-          <w:lang w:val="en-US"/>
-        </w:rPr>
-        <w:t xml:space="preserve">PerformanceReliability  </w:t>
+      <w:proofErr w:type="spellStart"/>
+      <w:r>
+        <w:rPr>
+          <w:lang w:val="en-US"/>
+        </w:rPr>
+        <w:t>PerformanceReliability</w:t>
+      </w:r>
+      <w:proofErr w:type="spellEnd"/>
+      <w:r>
+        <w:rPr>
+          <w:lang w:val="en-US"/>
+        </w:rPr>
+        <w:t xml:space="preserve">  </w:t>
       </w:r>
     </w:p>
     <w:p>
@@ -6347,6 +6571,7 @@
       </w:pPr>
       <w:bookmarkStart w:id="13" w:name="_Toc232570764"/>
       <w:r>
+        <w:lastRenderedPageBreak/>
         <w:t>System</w:t>
       </w:r>
       <w:r>
@@ -6469,7 +6694,23 @@
           <w:color w:val="000000" w:themeColor="text1"/>
           <w:szCs w:val="24"/>
         </w:rPr>
-        <w:t xml:space="preserve"> Level 1 DFD of Rock Paper Scissor</w:t>
+        <w:t xml:space="preserve"> Level 1 </w:t>
+      </w:r>
+      <w:proofErr w:type="spellStart"/>
+      <w:r>
+        <w:rPr>
+          <w:color w:val="000000" w:themeColor="text1"/>
+          <w:szCs w:val="24"/>
+        </w:rPr>
+        <w:t>DFD</w:t>
+      </w:r>
+      <w:proofErr w:type="spellEnd"/>
+      <w:r>
+        <w:rPr>
+          <w:color w:val="000000" w:themeColor="text1"/>
+          <w:szCs w:val="24"/>
+        </w:rPr>
+        <w:t xml:space="preserve"> of Rock Paper Scissor</w:t>
       </w:r>
       <w:bookmarkEnd w:id="14"/>
     </w:p>
@@ -6499,6 +6740,7 @@
           <w:szCs w:val="24"/>
           <w:lang w:val="en-US"/>
         </w:rPr>
+        <w:lastRenderedPageBreak/>
         <w:drawing>
           <wp:inline distT="0" distB="0" distL="0" distR="0" wp14:anchorId="396530F8" wp14:editId="41FD6FC5">
             <wp:extent cx="4685289" cy="5854638"/>
@@ -6637,6 +6879,7 @@
           <w:szCs w:val="24"/>
           <w:lang w:val="en-US"/>
         </w:rPr>
+        <w:lastRenderedPageBreak/>
         <w:drawing>
           <wp:inline distT="0" distB="0" distL="0" distR="0" wp14:anchorId="6F218E08" wp14:editId="7552BCAB">
             <wp:extent cx="4458712" cy="4961163"/>
@@ -6679,8 +6922,6 @@
           </wp:inline>
         </w:drawing>
       </w:r>
-      <w:bookmarkStart w:id="15" w:name="_GoBack"/>
-      <w:bookmarkEnd w:id="15"/>
     </w:p>
     <w:p>
       <w:pPr>
@@ -6810,6 +7051,7 @@
           <w:szCs w:val="24"/>
           <w:lang w:val="en-US"/>
         </w:rPr>
+        <w:lastRenderedPageBreak/>
         <w:drawing>
           <wp:inline distT="0" distB="0" distL="0" distR="0" wp14:anchorId="78C41E9D" wp14:editId="5FFE4C43">
             <wp:extent cx="5274310" cy="6285230"/>
@@ -6865,7 +7107,7 @@
           <w:szCs w:val="24"/>
         </w:rPr>
       </w:pPr>
-      <w:bookmarkStart w:id="16" w:name="_Toc232590307"/>
+      <w:bookmarkStart w:id="15" w:name="_Toc232590307"/>
       <w:r>
         <w:rPr>
           <w:i w:val="0"/>
@@ -6937,7 +7179,7 @@
         </w:rPr>
         <w:t xml:space="preserve"> Single Gameplay Flowchart</w:t>
       </w:r>
-      <w:bookmarkEnd w:id="16"/>
+      <w:bookmarkEnd w:id="15"/>
     </w:p>
     <w:p>
       <w:pPr>
@@ -6973,6 +7215,7 @@
           <w:szCs w:val="24"/>
           <w:lang w:val="en-US"/>
         </w:rPr>
+        <w:lastRenderedPageBreak/>
         <w:drawing>
           <wp:inline distT="0" distB="0" distL="0" distR="0" wp14:anchorId="0C47A2B4" wp14:editId="33916B23">
             <wp:extent cx="5274310" cy="5942965"/>
@@ -7028,7 +7271,7 @@
           <w:szCs w:val="24"/>
         </w:rPr>
       </w:pPr>
-      <w:bookmarkStart w:id="17" w:name="_Toc232590308"/>
+      <w:bookmarkStart w:id="16" w:name="_Toc232590308"/>
       <w:r>
         <w:rPr>
           <w:i w:val="0"/>
@@ -7100,7 +7343,7 @@
         </w:rPr>
         <w:t>Multiplayer Gameplay Flowchart</w:t>
       </w:r>
-      <w:bookmarkEnd w:id="17"/>
+      <w:bookmarkEnd w:id="16"/>
     </w:p>
     <w:p>
       <w:pPr>
@@ -7122,6 +7365,7 @@
           <w:noProof/>
           <w:lang w:val="en-US"/>
         </w:rPr>
+        <w:lastRenderedPageBreak/>
         <w:drawing>
           <wp:inline distT="0" distB="0" distL="0" distR="0" wp14:anchorId="35581872" wp14:editId="2FD39BE4">
             <wp:extent cx="3830955" cy="4398579"/>
@@ -7181,7 +7425,7 @@
           <w:szCs w:val="24"/>
         </w:rPr>
       </w:pPr>
-      <w:bookmarkStart w:id="18" w:name="_Toc232590309"/>
+      <w:bookmarkStart w:id="17" w:name="_Toc232590309"/>
       <w:r>
         <w:rPr>
           <w:i w:val="0"/>
@@ -7253,7 +7497,7 @@
         </w:rPr>
         <w:t xml:space="preserve"> Use case diagram</w:t>
       </w:r>
-      <w:bookmarkEnd w:id="18"/>
+      <w:bookmarkEnd w:id="17"/>
     </w:p>
     <w:p>
       <w:r>
@@ -7271,11 +7515,12 @@
         <w:ind w:left="360"/>
         <w:jc w:val="both"/>
       </w:pPr>
-      <w:bookmarkStart w:id="19" w:name="_Toc232570765"/>
-      <w:r>
+      <w:bookmarkStart w:id="18" w:name="_Toc232570765"/>
+      <w:r>
+        <w:lastRenderedPageBreak/>
         <w:t>Development</w:t>
       </w:r>
-      <w:bookmarkEnd w:id="19"/>
+      <w:bookmarkEnd w:id="18"/>
     </w:p>
     <w:p>
       <w:pPr>
@@ -7300,7 +7545,21 @@
         <w:rPr>
           <w:szCs w:val="24"/>
         </w:rPr>
-        <w:t xml:space="preserve"> chosen for the development of the Rock Paper Scissor game because it is suitable for small and well defined projects. The project re</w:t>
+        <w:t xml:space="preserve"> chosen for the development of the Rock Paper Scissor game because it is suitable for small and </w:t>
+      </w:r>
+      <w:proofErr w:type="gramStart"/>
+      <w:r>
+        <w:rPr>
+          <w:szCs w:val="24"/>
+        </w:rPr>
+        <w:t>well defined</w:t>
+      </w:r>
+      <w:proofErr w:type="gramEnd"/>
+      <w:r>
+        <w:rPr>
+          <w:szCs w:val="24"/>
+        </w:rPr>
+        <w:t xml:space="preserve"> projects. The project re</w:t>
       </w:r>
       <w:r>
         <w:rPr>
@@ -7640,7 +7899,7 @@
           <w:szCs w:val="24"/>
         </w:rPr>
       </w:pPr>
-      <w:bookmarkStart w:id="20" w:name="_Toc232590310"/>
+      <w:bookmarkStart w:id="19" w:name="_Toc232590310"/>
       <w:r>
         <w:rPr>
           <w:i w:val="0"/>
@@ -7712,7 +7971,466 @@
         </w:rPr>
         <w:t xml:space="preserve"> Waterfall model</w:t>
       </w:r>
-      <w:bookmarkEnd w:id="20"/>
+      <w:bookmarkEnd w:id="19"/>
+    </w:p>
+    <w:p>
+      <w:pPr>
+        <w:rPr>
+          <w:szCs w:val="24"/>
+        </w:rPr>
+      </w:pPr>
+    </w:p>
+    <w:p>
+      <w:pPr>
+        <w:pStyle w:val="NormalWeb"/>
+        <w:shd w:val="clear" w:color="auto" w:fill="FFFFFF"/>
+        <w:spacing w:before="0" w:beforeAutospacing="0" w:after="0" w:afterAutospacing="0" w:line="360" w:lineRule="auto"/>
+        <w:jc w:val="both"/>
+      </w:pPr>
+      <w:r>
+        <w:lastRenderedPageBreak/>
+        <w:t>Finally, most importantly, the chart of work assignment.</w:t>
+      </w:r>
+    </w:p>
+    <w:tbl>
+      <w:tblPr>
+        <w:tblStyle w:val="TableGrid"/>
+        <w:tblW w:w="0" w:type="auto"/>
+        <w:tblLook w:val="04A0" w:firstRow="1" w:lastRow="0" w:firstColumn="1" w:lastColumn="0" w:noHBand="0" w:noVBand="1"/>
+      </w:tblPr>
+      <w:tblGrid>
+        <w:gridCol w:w="643"/>
+        <w:gridCol w:w="2502"/>
+        <w:gridCol w:w="3100"/>
+        <w:gridCol w:w="2051"/>
+      </w:tblGrid>
+      <w:tr>
+        <w:tc>
+          <w:tcPr>
+            <w:tcW w:w="643" w:type="dxa"/>
+          </w:tcPr>
+          <w:p>
+            <w:pPr>
+              <w:pStyle w:val="NormalWeb"/>
+              <w:spacing w:before="0" w:beforeAutospacing="0" w:after="0" w:afterAutospacing="0" w:line="360" w:lineRule="auto"/>
+              <w:jc w:val="both"/>
+            </w:pPr>
+            <w:proofErr w:type="spellStart"/>
+            <w:r>
+              <w:t>S.N</w:t>
+            </w:r>
+            <w:proofErr w:type="spellEnd"/>
+            <w:r>
+              <w:t>.</w:t>
+            </w:r>
+          </w:p>
+        </w:tc>
+        <w:tc>
+          <w:tcPr>
+            <w:tcW w:w="2502" w:type="dxa"/>
+          </w:tcPr>
+          <w:p>
+            <w:pPr>
+              <w:pStyle w:val="NormalWeb"/>
+              <w:spacing w:before="0" w:beforeAutospacing="0" w:after="0" w:afterAutospacing="0" w:line="360" w:lineRule="auto"/>
+              <w:jc w:val="both"/>
+            </w:pPr>
+            <w:r>
+              <w:t>Name of the member</w:t>
+            </w:r>
+          </w:p>
+        </w:tc>
+        <w:tc>
+          <w:tcPr>
+            <w:tcW w:w="3100" w:type="dxa"/>
+          </w:tcPr>
+          <w:p>
+            <w:pPr>
+              <w:pStyle w:val="NormalWeb"/>
+              <w:spacing w:before="0" w:beforeAutospacing="0" w:after="0" w:afterAutospacing="0" w:line="360" w:lineRule="auto"/>
+              <w:jc w:val="both"/>
+            </w:pPr>
+            <w:r>
+              <w:t xml:space="preserve">Work assigned </w:t>
+            </w:r>
+          </w:p>
+        </w:tc>
+        <w:tc>
+          <w:tcPr>
+            <w:tcW w:w="2051" w:type="dxa"/>
+          </w:tcPr>
+          <w:p>
+            <w:pPr>
+              <w:pStyle w:val="NormalWeb"/>
+              <w:spacing w:before="0" w:beforeAutospacing="0" w:after="0" w:afterAutospacing="0" w:line="360" w:lineRule="auto"/>
+              <w:jc w:val="both"/>
+            </w:pPr>
+            <w:r>
+              <w:t>Remarks</w:t>
+            </w:r>
+          </w:p>
+        </w:tc>
+      </w:tr>
+      <w:tr>
+        <w:tc>
+          <w:tcPr>
+            <w:tcW w:w="643" w:type="dxa"/>
+          </w:tcPr>
+          <w:p>
+            <w:pPr>
+              <w:pStyle w:val="NormalWeb"/>
+              <w:spacing w:before="0" w:beforeAutospacing="0" w:after="0" w:afterAutospacing="0" w:line="360" w:lineRule="auto"/>
+              <w:jc w:val="both"/>
+            </w:pPr>
+            <w:r>
+              <w:t>1.</w:t>
+            </w:r>
+          </w:p>
+        </w:tc>
+        <w:tc>
+          <w:tcPr>
+            <w:tcW w:w="2502" w:type="dxa"/>
+          </w:tcPr>
+          <w:p>
+            <w:pPr>
+              <w:pStyle w:val="NormalWeb"/>
+              <w:spacing w:before="0" w:beforeAutospacing="0" w:after="0" w:afterAutospacing="0" w:line="360" w:lineRule="auto"/>
+              <w:jc w:val="both"/>
+            </w:pPr>
+            <w:r>
+              <w:t>Divya Sharma</w:t>
+            </w:r>
+          </w:p>
+        </w:tc>
+        <w:tc>
+          <w:tcPr>
+            <w:tcW w:w="3100" w:type="dxa"/>
+          </w:tcPr>
+          <w:p>
+            <w:pPr>
+              <w:pStyle w:val="NormalWeb"/>
+              <w:spacing w:before="0" w:beforeAutospacing="0" w:after="0" w:afterAutospacing="0" w:line="360" w:lineRule="auto"/>
+              <w:jc w:val="both"/>
+            </w:pPr>
+            <w:r>
+              <w:t>Documentation and coding.</w:t>
+            </w:r>
+          </w:p>
+          <w:p>
+            <w:pPr>
+              <w:pStyle w:val="NormalWeb"/>
+              <w:numPr>
+                <w:ilvl w:val="0"/>
+                <w:numId w:val="6"/>
+              </w:numPr>
+              <w:spacing w:before="0" w:beforeAutospacing="0" w:after="0" w:afterAutospacing="0" w:line="360" w:lineRule="auto"/>
+              <w:ind w:left="346"/>
+              <w:jc w:val="both"/>
+            </w:pPr>
+            <w:r>
+              <w:t>Flowchart</w:t>
+            </w:r>
+          </w:p>
+          <w:p>
+            <w:pPr>
+              <w:pStyle w:val="NormalWeb"/>
+              <w:numPr>
+                <w:ilvl w:val="0"/>
+                <w:numId w:val="6"/>
+              </w:numPr>
+              <w:spacing w:before="0" w:beforeAutospacing="0" w:after="0" w:afterAutospacing="0" w:line="360" w:lineRule="auto"/>
+              <w:ind w:left="346"/>
+              <w:jc w:val="both"/>
+            </w:pPr>
+            <w:r>
+              <w:t>Problem Identification</w:t>
+            </w:r>
+          </w:p>
+          <w:p>
+            <w:pPr>
+              <w:pStyle w:val="NormalWeb"/>
+              <w:numPr>
+                <w:ilvl w:val="0"/>
+                <w:numId w:val="6"/>
+              </w:numPr>
+              <w:spacing w:before="0" w:beforeAutospacing="0" w:after="0" w:afterAutospacing="0" w:line="360" w:lineRule="auto"/>
+              <w:ind w:left="346"/>
+              <w:jc w:val="both"/>
+            </w:pPr>
+            <w:r>
+              <w:t>Coding</w:t>
+            </w:r>
+          </w:p>
+          <w:p>
+            <w:pPr>
+              <w:pStyle w:val="NormalWeb"/>
+              <w:numPr>
+                <w:ilvl w:val="0"/>
+                <w:numId w:val="6"/>
+              </w:numPr>
+              <w:spacing w:before="0" w:beforeAutospacing="0" w:after="0" w:afterAutospacing="0" w:line="360" w:lineRule="auto"/>
+              <w:ind w:left="346"/>
+              <w:jc w:val="both"/>
+            </w:pPr>
+            <w:r>
+              <w:t>Support in system design.</w:t>
+            </w:r>
+          </w:p>
+        </w:tc>
+        <w:tc>
+          <w:tcPr>
+            <w:tcW w:w="2051" w:type="dxa"/>
+          </w:tcPr>
+          <w:p>
+            <w:pPr>
+              <w:pStyle w:val="NormalWeb"/>
+              <w:spacing w:before="0" w:beforeAutospacing="0" w:after="0" w:afterAutospacing="0" w:line="360" w:lineRule="auto"/>
+              <w:jc w:val="both"/>
+            </w:pPr>
+          </w:p>
+        </w:tc>
+      </w:tr>
+      <w:tr>
+        <w:tc>
+          <w:tcPr>
+            <w:tcW w:w="643" w:type="dxa"/>
+          </w:tcPr>
+          <w:p>
+            <w:pPr>
+              <w:pStyle w:val="NormalWeb"/>
+              <w:spacing w:before="0" w:beforeAutospacing="0" w:after="0" w:afterAutospacing="0" w:line="360" w:lineRule="auto"/>
+              <w:jc w:val="both"/>
+            </w:pPr>
+            <w:r>
+              <w:t>2.</w:t>
+            </w:r>
+          </w:p>
+        </w:tc>
+        <w:tc>
+          <w:tcPr>
+            <w:tcW w:w="2502" w:type="dxa"/>
+          </w:tcPr>
+          <w:p>
+            <w:pPr>
+              <w:pStyle w:val="NormalWeb"/>
+              <w:spacing w:before="0" w:beforeAutospacing="0" w:after="0" w:afterAutospacing="0" w:line="360" w:lineRule="auto"/>
+              <w:jc w:val="both"/>
+            </w:pPr>
+            <w:r>
+              <w:t>Sabina Puwanli</w:t>
+            </w:r>
+          </w:p>
+        </w:tc>
+        <w:tc>
+          <w:tcPr>
+            <w:tcW w:w="3100" w:type="dxa"/>
+          </w:tcPr>
+          <w:p>
+            <w:pPr>
+              <w:pStyle w:val="NormalWeb"/>
+              <w:spacing w:before="0" w:beforeAutospacing="0" w:after="0" w:afterAutospacing="0" w:line="360" w:lineRule="auto"/>
+              <w:jc w:val="both"/>
+            </w:pPr>
+            <w:r>
+              <w:t>Documentation and coding.</w:t>
+            </w:r>
+          </w:p>
+          <w:p>
+            <w:pPr>
+              <w:pStyle w:val="NormalWeb"/>
+              <w:numPr>
+                <w:ilvl w:val="0"/>
+                <w:numId w:val="6"/>
+              </w:numPr>
+              <w:spacing w:before="0" w:beforeAutospacing="0" w:after="0" w:afterAutospacing="0" w:line="360" w:lineRule="auto"/>
+              <w:ind w:left="346"/>
+              <w:jc w:val="both"/>
+            </w:pPr>
+            <w:proofErr w:type="spellStart"/>
+            <w:r>
+              <w:t>Dfd</w:t>
+            </w:r>
+            <w:proofErr w:type="spellEnd"/>
+          </w:p>
+          <w:p>
+            <w:pPr>
+              <w:pStyle w:val="NormalWeb"/>
+              <w:numPr>
+                <w:ilvl w:val="0"/>
+                <w:numId w:val="6"/>
+              </w:numPr>
+              <w:spacing w:before="0" w:beforeAutospacing="0" w:after="0" w:afterAutospacing="0" w:line="360" w:lineRule="auto"/>
+              <w:ind w:left="346"/>
+              <w:jc w:val="both"/>
+            </w:pPr>
+            <w:r>
+              <w:t xml:space="preserve">Coding </w:t>
+            </w:r>
+          </w:p>
+          <w:p>
+            <w:pPr>
+              <w:pStyle w:val="NormalWeb"/>
+              <w:numPr>
+                <w:ilvl w:val="0"/>
+                <w:numId w:val="6"/>
+              </w:numPr>
+              <w:spacing w:before="0" w:beforeAutospacing="0" w:after="0" w:afterAutospacing="0" w:line="360" w:lineRule="auto"/>
+              <w:ind w:left="346"/>
+              <w:jc w:val="both"/>
+            </w:pPr>
+            <w:r>
+              <w:t>Gantt chart</w:t>
+            </w:r>
+          </w:p>
+          <w:p>
+            <w:pPr>
+              <w:pStyle w:val="NormalWeb"/>
+              <w:numPr>
+                <w:ilvl w:val="0"/>
+                <w:numId w:val="6"/>
+              </w:numPr>
+              <w:spacing w:before="0" w:beforeAutospacing="0" w:after="0" w:afterAutospacing="0" w:line="360" w:lineRule="auto"/>
+              <w:ind w:left="346"/>
+              <w:jc w:val="both"/>
+            </w:pPr>
+            <w:r>
+              <w:t>Feasibility analysis.</w:t>
+            </w:r>
+          </w:p>
+        </w:tc>
+        <w:tc>
+          <w:tcPr>
+            <w:tcW w:w="2051" w:type="dxa"/>
+          </w:tcPr>
+          <w:p>
+            <w:pPr>
+              <w:pStyle w:val="NormalWeb"/>
+              <w:spacing w:before="0" w:beforeAutospacing="0" w:after="0" w:afterAutospacing="0" w:line="360" w:lineRule="auto"/>
+              <w:jc w:val="both"/>
+            </w:pPr>
+          </w:p>
+        </w:tc>
+      </w:tr>
+    </w:tbl>
+    <w:p>
+      <w:pPr>
+        <w:pStyle w:val="NormalWeb"/>
+        <w:shd w:val="clear" w:color="auto" w:fill="FFFFFF"/>
+        <w:spacing w:before="0" w:beforeAutospacing="0" w:after="0" w:afterAutospacing="0" w:line="360" w:lineRule="auto"/>
+        <w:jc w:val="both"/>
+      </w:pPr>
+    </w:p>
+    <w:p>
+      <w:pPr>
+        <w:rPr>
+          <w:szCs w:val="24"/>
+        </w:rPr>
+      </w:pPr>
+    </w:p>
+    <w:p>
+      <w:pPr>
+        <w:rPr>
+          <w:szCs w:val="24"/>
+        </w:rPr>
+      </w:pPr>
+    </w:p>
+    <w:p>
+      <w:pPr>
+        <w:rPr>
+          <w:szCs w:val="24"/>
+        </w:rPr>
+      </w:pPr>
+    </w:p>
+    <w:p>
+      <w:pPr>
+        <w:rPr>
+          <w:szCs w:val="24"/>
+        </w:rPr>
+      </w:pPr>
+    </w:p>
+    <w:p>
+      <w:pPr>
+        <w:rPr>
+          <w:szCs w:val="24"/>
+        </w:rPr>
+      </w:pPr>
+    </w:p>
+    <w:p>
+      <w:pPr>
+        <w:rPr>
+          <w:szCs w:val="24"/>
+        </w:rPr>
+      </w:pPr>
+    </w:p>
+    <w:p>
+      <w:pPr>
+        <w:rPr>
+          <w:szCs w:val="24"/>
+        </w:rPr>
+      </w:pPr>
+    </w:p>
+    <w:p>
+      <w:pPr>
+        <w:rPr>
+          <w:szCs w:val="24"/>
+        </w:rPr>
+      </w:pPr>
+    </w:p>
+    <w:p>
+      <w:pPr>
+        <w:rPr>
+          <w:szCs w:val="24"/>
+        </w:rPr>
+      </w:pPr>
+    </w:p>
+    <w:p>
+      <w:pPr>
+        <w:rPr>
+          <w:szCs w:val="24"/>
+        </w:rPr>
+      </w:pPr>
+    </w:p>
+    <w:p>
+      <w:pPr>
+        <w:rPr>
+          <w:szCs w:val="24"/>
+        </w:rPr>
+      </w:pPr>
+    </w:p>
+    <w:p>
+      <w:pPr>
+        <w:rPr>
+          <w:szCs w:val="24"/>
+        </w:rPr>
+      </w:pPr>
+    </w:p>
+    <w:p>
+      <w:pPr>
+        <w:rPr>
+          <w:szCs w:val="24"/>
+        </w:rPr>
+      </w:pPr>
+    </w:p>
+    <w:p>
+      <w:pPr>
+        <w:rPr>
+          <w:szCs w:val="24"/>
+        </w:rPr>
+      </w:pPr>
+    </w:p>
+    <w:p>
+      <w:pPr>
+        <w:rPr>
+          <w:szCs w:val="24"/>
+        </w:rPr>
+      </w:pPr>
+    </w:p>
+    <w:p>
+      <w:pPr>
+        <w:rPr>
+          <w:szCs w:val="24"/>
+        </w:rPr>
+      </w:pPr>
     </w:p>
     <w:p>
       <w:pPr>
@@ -7742,6 +8460,7 @@
           <w:b/>
           <w:szCs w:val="24"/>
         </w:rPr>
+        <w:lastRenderedPageBreak/>
         <w:t>Gantt Chart</w:t>
       </w:r>
     </w:p>
@@ -7825,7 +8544,7 @@
           <w:szCs w:val="24"/>
         </w:rPr>
       </w:pPr>
-      <w:bookmarkStart w:id="21" w:name="_Toc232590311"/>
+      <w:bookmarkStart w:id="20" w:name="_Toc232590311"/>
       <w:r>
         <w:rPr>
           <w:i w:val="0"/>
@@ -7897,7 +8616,7 @@
         </w:rPr>
         <w:t xml:space="preserve"> Gantt Chart</w:t>
       </w:r>
-      <w:bookmarkEnd w:id="21"/>
+      <w:bookmarkEnd w:id="20"/>
     </w:p>
     <w:p>
       <w:r>
@@ -7906,12 +8625,2519 @@
     </w:p>
     <w:p>
       <w:pPr>
-        <w:pStyle w:val="ListParagraph"/>
+        <w:pStyle w:val="Heading1"/>
+        <w:numPr>
+          <w:ilvl w:val="0"/>
+          <w:numId w:val="44"/>
+        </w:numPr>
         <w:ind w:left="360"/>
+      </w:pPr>
+      <w:r>
+        <w:lastRenderedPageBreak/>
+        <w:t>Testing</w:t>
+      </w:r>
+    </w:p>
+    <w:p>
+      <w:r>
+        <w:t>Testing was performed according to the Software Testing Life Cycle (</w:t>
+      </w:r>
+      <w:proofErr w:type="spellStart"/>
+      <w:r>
+        <w:t>STLC</w:t>
+      </w:r>
+      <w:proofErr w:type="spellEnd"/>
+      <w:r>
+        <w:t>) to ensure that all modules functioned correctly.</w:t>
+      </w:r>
+    </w:p>
+    <w:p>
+      <w:pPr>
         <w:rPr>
           <w:b/>
-          <w:sz w:val="32"/>
-          <w:szCs w:val="32"/>
+          <w:bCs/>
+          <w:lang w:val="en-US"/>
+        </w:rPr>
+      </w:pPr>
+      <w:r>
+        <w:rPr>
+          <w:b/>
+          <w:bCs/>
+          <w:lang w:val="en-US"/>
+        </w:rPr>
+        <w:t>8.1 Software Testing Life Cycle (</w:t>
+      </w:r>
+      <w:proofErr w:type="spellStart"/>
+      <w:r>
+        <w:rPr>
+          <w:b/>
+          <w:bCs/>
+          <w:lang w:val="en-US"/>
+        </w:rPr>
+        <w:t>STLC</w:t>
+      </w:r>
+      <w:proofErr w:type="spellEnd"/>
+      <w:r>
+        <w:rPr>
+          <w:b/>
+          <w:bCs/>
+          <w:lang w:val="en-US"/>
+        </w:rPr>
+        <w:t>)</w:t>
+      </w:r>
+    </w:p>
+    <w:p>
+      <w:pPr>
+        <w:rPr>
+          <w:lang w:val="en-US"/>
+        </w:rPr>
+      </w:pPr>
+      <w:r>
+        <w:rPr>
+          <w:lang w:val="en-US"/>
+        </w:rPr>
+        <w:t>The following phases were followed:</w:t>
+      </w:r>
+    </w:p>
+    <w:p>
+      <w:pPr>
+        <w:rPr>
+          <w:b/>
+          <w:bCs/>
+          <w:lang w:val="en-US"/>
+        </w:rPr>
+      </w:pPr>
+      <w:r>
+        <w:rPr>
+          <w:b/>
+          <w:bCs/>
+          <w:lang w:val="en-US"/>
+        </w:rPr>
+        <w:t>1.</w:t>
+      </w:r>
+      <w:r>
+        <w:rPr>
+          <w:b/>
+          <w:bCs/>
+          <w:lang w:val="en-US"/>
+        </w:rPr>
+        <w:t xml:space="preserve"> </w:t>
+      </w:r>
+      <w:r>
+        <w:rPr>
+          <w:b/>
+          <w:bCs/>
+          <w:lang w:val="en-US"/>
+        </w:rPr>
+        <w:t>Requirement Analysis</w:t>
+      </w:r>
+    </w:p>
+    <w:p>
+      <w:pPr>
+        <w:rPr>
+          <w:lang w:val="en-US"/>
+        </w:rPr>
+      </w:pPr>
+      <w:r>
+        <w:rPr>
+          <w:lang w:val="en-US"/>
+        </w:rPr>
+        <w:t>Project requirements were analyzed.</w:t>
+      </w:r>
+    </w:p>
+    <w:p>
+      <w:pPr>
+        <w:rPr>
+          <w:b/>
+          <w:bCs/>
+          <w:lang w:val="en-US"/>
+        </w:rPr>
+      </w:pPr>
+      <w:r>
+        <w:rPr>
+          <w:b/>
+          <w:bCs/>
+          <w:lang w:val="en-US"/>
+        </w:rPr>
+        <w:t>2.</w:t>
+      </w:r>
+      <w:r>
+        <w:rPr>
+          <w:b/>
+          <w:bCs/>
+          <w:lang w:val="en-US"/>
+        </w:rPr>
+        <w:t>Test Planning</w:t>
+      </w:r>
+    </w:p>
+    <w:p>
+      <w:pPr>
+        <w:rPr>
+          <w:lang w:val="en-US"/>
+        </w:rPr>
+      </w:pPr>
+      <w:r>
+        <w:rPr>
+          <w:lang w:val="en-US"/>
+        </w:rPr>
+        <w:t>Testing strategies and objectives were prepared</w:t>
+      </w:r>
+    </w:p>
+    <w:p>
+      <w:pPr>
+        <w:rPr>
+          <w:b/>
+          <w:bCs/>
+          <w:lang w:val="en-US"/>
+        </w:rPr>
+      </w:pPr>
+      <w:r>
+        <w:rPr>
+          <w:b/>
+          <w:bCs/>
+          <w:lang w:val="en-US"/>
+        </w:rPr>
+        <w:t>3.</w:t>
+      </w:r>
+      <w:r>
+        <w:rPr>
+          <w:b/>
+          <w:bCs/>
+          <w:lang w:val="en-US"/>
+        </w:rPr>
+        <w:t>Test Case Design</w:t>
+      </w:r>
+    </w:p>
+    <w:p>
+      <w:pPr>
+        <w:rPr>
+          <w:lang w:val="en-US"/>
+        </w:rPr>
+      </w:pPr>
+      <w:r>
+        <w:rPr>
+          <w:lang w:val="en-US"/>
+        </w:rPr>
+        <w:t>Positive and negative test cases were created.</w:t>
+      </w:r>
+    </w:p>
+    <w:p>
+      <w:pPr>
+        <w:rPr>
+          <w:b/>
+          <w:bCs/>
+          <w:lang w:val="en-US"/>
+        </w:rPr>
+      </w:pPr>
+      <w:r>
+        <w:rPr>
+          <w:b/>
+          <w:bCs/>
+          <w:lang w:val="en-US"/>
+        </w:rPr>
+        <w:t>4.</w:t>
+      </w:r>
+      <w:r>
+        <w:rPr>
+          <w:b/>
+          <w:bCs/>
+          <w:lang w:val="en-US"/>
+        </w:rPr>
+        <w:t>Test Environment Setup</w:t>
+      </w:r>
+    </w:p>
+    <w:p>
+      <w:pPr>
+        <w:rPr>
+          <w:lang w:val="en-US"/>
+        </w:rPr>
+      </w:pPr>
+      <w:r>
+        <w:rPr>
+          <w:lang w:val="en-US"/>
+        </w:rPr>
+        <w:t>Program execution environment was prepared.</w:t>
+      </w:r>
+    </w:p>
+    <w:p>
+      <w:pPr>
+        <w:rPr>
+          <w:b/>
+          <w:bCs/>
+          <w:lang w:val="en-US"/>
+        </w:rPr>
+      </w:pPr>
+      <w:r>
+        <w:rPr>
+          <w:b/>
+          <w:bCs/>
+          <w:lang w:val="en-US"/>
+        </w:rPr>
+        <w:t>5.</w:t>
+      </w:r>
+      <w:r>
+        <w:rPr>
+          <w:b/>
+          <w:bCs/>
+          <w:lang w:val="en-US"/>
+        </w:rPr>
+        <w:t>Test Execution</w:t>
+      </w:r>
+    </w:p>
+    <w:p>
+      <w:pPr>
+        <w:rPr>
+          <w:lang w:val="en-US"/>
+        </w:rPr>
+      </w:pPr>
+      <w:r>
+        <w:rPr>
+          <w:lang w:val="en-US"/>
+        </w:rPr>
+        <w:t>Modules were executed and validated.</w:t>
+      </w:r>
+    </w:p>
+    <w:p>
+      <w:pPr>
+        <w:rPr>
+          <w:b/>
+          <w:bCs/>
+          <w:lang w:val="en-US"/>
+        </w:rPr>
+      </w:pPr>
+      <w:proofErr w:type="spellStart"/>
+      <w:r>
+        <w:rPr>
+          <w:b/>
+          <w:bCs/>
+          <w:lang w:val="en-US"/>
+        </w:rPr>
+        <w:t>6.</w:t>
+      </w:r>
+      <w:r>
+        <w:rPr>
+          <w:b/>
+          <w:bCs/>
+          <w:lang w:val="en-US"/>
+        </w:rPr>
+        <w:t>Test</w:t>
+      </w:r>
+      <w:proofErr w:type="spellEnd"/>
+      <w:r>
+        <w:rPr>
+          <w:b/>
+          <w:bCs/>
+          <w:lang w:val="en-US"/>
+        </w:rPr>
+        <w:t xml:space="preserve"> Closure</w:t>
+      </w:r>
+    </w:p>
+    <w:p>
+      <w:pPr>
+        <w:rPr>
+          <w:lang w:val="en-US"/>
+        </w:rPr>
+      </w:pPr>
+      <w:r>
+        <w:rPr>
+          <w:lang w:val="en-US"/>
+        </w:rPr>
+        <w:t>Results were documented.</w:t>
+      </w:r>
+    </w:p>
+    <w:p>
+      <w:pPr>
+        <w:rPr>
+          <w:b/>
+          <w:bCs/>
+          <w:lang w:val="en-US"/>
+        </w:rPr>
+      </w:pPr>
+      <w:r>
+        <w:rPr>
+          <w:b/>
+          <w:bCs/>
+          <w:lang w:val="en-US"/>
+        </w:rPr>
+        <w:t>8.2 Test Cases</w:t>
+      </w:r>
+    </w:p>
+    <w:p>
+      <w:pPr>
+        <w:rPr>
+          <w:b/>
+          <w:bCs/>
+          <w:lang w:val="en-US"/>
+        </w:rPr>
+      </w:pPr>
+      <w:r>
+        <w:rPr>
+          <w:b/>
+          <w:bCs/>
+          <w:lang w:val="en-US"/>
+        </w:rPr>
+        <w:t>Test Case 1</w:t>
+      </w:r>
+    </w:p>
+    <w:p>
+      <w:pPr>
+        <w:rPr>
+          <w:lang w:val="en-US"/>
+        </w:rPr>
+      </w:pPr>
+      <w:r>
+        <w:rPr>
+          <w:lang w:val="en-US"/>
+        </w:rPr>
+        <w:t>Title: Login Authentication</w:t>
+      </w:r>
+    </w:p>
+    <w:p>
+      <w:pPr>
+        <w:rPr>
+          <w:lang w:val="en-US"/>
+        </w:rPr>
+      </w:pPr>
+      <w:r>
+        <w:rPr>
+          <w:lang w:val="en-US"/>
+        </w:rPr>
+        <w:t xml:space="preserve">Test ID: </w:t>
+      </w:r>
+      <w:proofErr w:type="spellStart"/>
+      <w:r>
+        <w:rPr>
+          <w:lang w:val="en-US"/>
+        </w:rPr>
+        <w:t>TC01</w:t>
+      </w:r>
+      <w:proofErr w:type="spellEnd"/>
+    </w:p>
+    <w:p>
+      <w:pPr>
+        <w:rPr>
+          <w:lang w:val="en-US"/>
+        </w:rPr>
+      </w:pPr>
+      <w:r>
+        <w:rPr>
+          <w:lang w:val="en-US"/>
+        </w:rPr>
+        <w:t>Description:</w:t>
+      </w:r>
+      <w:r>
+        <w:rPr>
+          <w:lang w:val="en-US"/>
+        </w:rPr>
+        <w:br/>
+        <w:t>User should be able to login with valid credentials.</w:t>
+      </w:r>
+    </w:p>
+    <w:p>
+      <w:pPr>
+        <w:rPr>
+          <w:lang w:val="en-US"/>
+        </w:rPr>
+      </w:pPr>
+      <w:r>
+        <w:rPr>
+          <w:lang w:val="en-US"/>
+        </w:rPr>
+        <w:t>Precondition:</w:t>
+      </w:r>
+      <w:r>
+        <w:rPr>
+          <w:lang w:val="en-US"/>
+        </w:rPr>
+        <w:br/>
+        <w:t>User account must exist.</w:t>
+      </w:r>
+    </w:p>
+    <w:p>
+      <w:pPr>
+        <w:rPr>
+          <w:lang w:val="en-US"/>
+        </w:rPr>
+      </w:pPr>
+      <w:r>
+        <w:rPr>
+          <w:lang w:val="en-US"/>
+        </w:rPr>
+        <w:t>Expected Result:</w:t>
+      </w:r>
+    </w:p>
+    <w:p>
+      <w:pPr>
+        <w:rPr>
+          <w:lang w:val="en-US"/>
+        </w:rPr>
+      </w:pPr>
+      <w:r>
+        <w:rPr>
+          <w:lang w:val="en-US"/>
+        </w:rPr>
+        <w:t>Login Successful.</w:t>
+      </w:r>
+    </w:p>
+    <w:p>
+      <w:pPr>
+        <w:rPr>
+          <w:lang w:val="en-US"/>
+        </w:rPr>
+      </w:pPr>
+      <w:r>
+        <w:rPr>
+          <w:lang w:val="en-US"/>
+        </w:rPr>
+        <w:t>Status:</w:t>
+      </w:r>
+      <w:r>
+        <w:rPr>
+          <w:lang w:val="en-US"/>
+        </w:rPr>
+        <w:br/>
+        <w:t>Pass</w:t>
+      </w:r>
+    </w:p>
+    <w:p>
+      <w:pPr>
+        <w:rPr>
+          <w:b/>
+          <w:bCs/>
+          <w:lang w:val="en-US"/>
+        </w:rPr>
+      </w:pPr>
+      <w:r>
+        <w:rPr>
+          <w:b/>
+          <w:bCs/>
+          <w:lang w:val="en-US"/>
+        </w:rPr>
+        <w:t>Test Case 2</w:t>
+      </w:r>
+    </w:p>
+    <w:p>
+      <w:pPr>
+        <w:rPr>
+          <w:lang w:val="en-US"/>
+        </w:rPr>
+      </w:pPr>
+      <w:r>
+        <w:rPr>
+          <w:lang w:val="en-US"/>
+        </w:rPr>
+        <w:t>Title: Registration System</w:t>
+      </w:r>
+    </w:p>
+    <w:p>
+      <w:pPr>
+        <w:rPr>
+          <w:lang w:val="en-US"/>
+        </w:rPr>
+      </w:pPr>
+      <w:r>
+        <w:rPr>
+          <w:lang w:val="en-US"/>
+        </w:rPr>
+        <w:t xml:space="preserve">Test ID: </w:t>
+      </w:r>
+      <w:proofErr w:type="spellStart"/>
+      <w:r>
+        <w:rPr>
+          <w:lang w:val="en-US"/>
+        </w:rPr>
+        <w:t>TC02</w:t>
+      </w:r>
+      <w:proofErr w:type="spellEnd"/>
+    </w:p>
+    <w:p>
+      <w:pPr>
+        <w:rPr>
+          <w:lang w:val="en-US"/>
+        </w:rPr>
+      </w:pPr>
+      <w:r>
+        <w:rPr>
+          <w:lang w:val="en-US"/>
+        </w:rPr>
+        <w:lastRenderedPageBreak/>
+        <w:t>Description:</w:t>
+      </w:r>
+      <w:r>
+        <w:rPr>
+          <w:lang w:val="en-US"/>
+        </w:rPr>
+        <w:br/>
+        <w:t>User should be able to create a new account.</w:t>
+      </w:r>
+    </w:p>
+    <w:p>
+      <w:pPr>
+        <w:rPr>
+          <w:lang w:val="en-US"/>
+        </w:rPr>
+      </w:pPr>
+      <w:r>
+        <w:rPr>
+          <w:lang w:val="en-US"/>
+        </w:rPr>
+        <w:t>Expected Result:</w:t>
+      </w:r>
+    </w:p>
+    <w:p>
+      <w:pPr>
+        <w:rPr>
+          <w:lang w:val="en-US"/>
+        </w:rPr>
+      </w:pPr>
+      <w:r>
+        <w:rPr>
+          <w:lang w:val="en-US"/>
+        </w:rPr>
+        <w:t>Account Created Successfully.</w:t>
+      </w:r>
+    </w:p>
+    <w:p>
+      <w:pPr>
+        <w:rPr>
+          <w:lang w:val="en-US"/>
+        </w:rPr>
+      </w:pPr>
+      <w:r>
+        <w:rPr>
+          <w:lang w:val="en-US"/>
+        </w:rPr>
+        <w:t>Status:</w:t>
+      </w:r>
+      <w:r>
+        <w:rPr>
+          <w:lang w:val="en-US"/>
+        </w:rPr>
+        <w:br/>
+        <w:t>Pass</w:t>
+      </w:r>
+    </w:p>
+    <w:p>
+      <w:pPr>
+        <w:rPr>
+          <w:b/>
+          <w:bCs/>
+          <w:lang w:val="en-US"/>
+        </w:rPr>
+      </w:pPr>
+      <w:r>
+        <w:rPr>
+          <w:b/>
+          <w:bCs/>
+          <w:lang w:val="en-US"/>
+        </w:rPr>
+        <w:t>Test Case 3</w:t>
+      </w:r>
+    </w:p>
+    <w:p>
+      <w:pPr>
+        <w:rPr>
+          <w:lang w:val="en-US"/>
+        </w:rPr>
+      </w:pPr>
+      <w:r>
+        <w:rPr>
+          <w:lang w:val="en-US"/>
+        </w:rPr>
+        <w:t>Title: Winner Determination</w:t>
+      </w:r>
+    </w:p>
+    <w:p>
+      <w:pPr>
+        <w:rPr>
+          <w:lang w:val="en-US"/>
+        </w:rPr>
+      </w:pPr>
+      <w:r>
+        <w:rPr>
+          <w:lang w:val="en-US"/>
+        </w:rPr>
+        <w:t xml:space="preserve">Test ID: </w:t>
+      </w:r>
+      <w:proofErr w:type="spellStart"/>
+      <w:r>
+        <w:rPr>
+          <w:lang w:val="en-US"/>
+        </w:rPr>
+        <w:t>TC03</w:t>
+      </w:r>
+      <w:proofErr w:type="spellEnd"/>
+    </w:p>
+    <w:p>
+      <w:pPr>
+        <w:rPr>
+          <w:lang w:val="en-US"/>
+        </w:rPr>
+      </w:pPr>
+      <w:r>
+        <w:rPr>
+          <w:lang w:val="en-US"/>
+        </w:rPr>
+        <w:t>Description:</w:t>
+      </w:r>
+      <w:r>
+        <w:rPr>
+          <w:lang w:val="en-US"/>
+        </w:rPr>
+        <w:br/>
+        <w:t>Rock vs Scissors</w:t>
+      </w:r>
+    </w:p>
+    <w:p>
+      <w:pPr>
+        <w:rPr>
+          <w:lang w:val="en-US"/>
+        </w:rPr>
+      </w:pPr>
+      <w:r>
+        <w:rPr>
+          <w:lang w:val="en-US"/>
+        </w:rPr>
+        <w:t>Expected Result:</w:t>
+      </w:r>
+      <w:r>
+        <w:rPr>
+          <w:lang w:val="en-US"/>
+        </w:rPr>
+        <w:br/>
+        <w:t>Rock Wins</w:t>
+      </w:r>
+    </w:p>
+    <w:p>
+      <w:pPr>
+        <w:rPr>
+          <w:lang w:val="en-US"/>
+        </w:rPr>
+      </w:pPr>
+      <w:r>
+        <w:rPr>
+          <w:lang w:val="en-US"/>
+        </w:rPr>
+        <w:t>Status:</w:t>
+      </w:r>
+      <w:r>
+        <w:rPr>
+          <w:lang w:val="en-US"/>
+        </w:rPr>
+        <w:br/>
+        <w:t>Pass</w:t>
+      </w:r>
+    </w:p>
+    <w:p>
+      <w:pPr>
+        <w:rPr>
+          <w:b/>
+          <w:bCs/>
+          <w:lang w:val="en-US"/>
+        </w:rPr>
+      </w:pPr>
+      <w:r>
+        <w:rPr>
+          <w:b/>
+          <w:bCs/>
+          <w:lang w:val="en-US"/>
+        </w:rPr>
+        <w:t>Test Case 4</w:t>
+      </w:r>
+    </w:p>
+    <w:p>
+      <w:pPr>
+        <w:rPr>
+          <w:lang w:val="en-US"/>
+        </w:rPr>
+      </w:pPr>
+      <w:r>
+        <w:rPr>
+          <w:lang w:val="en-US"/>
+        </w:rPr>
+        <w:t>Title: Score Storage</w:t>
+      </w:r>
+    </w:p>
+    <w:p>
+      <w:pPr>
+        <w:rPr>
+          <w:lang w:val="en-US"/>
+        </w:rPr>
+      </w:pPr>
+      <w:r>
+        <w:rPr>
+          <w:lang w:val="en-US"/>
+        </w:rPr>
+        <w:t xml:space="preserve">Test ID: </w:t>
+      </w:r>
+      <w:proofErr w:type="spellStart"/>
+      <w:r>
+        <w:rPr>
+          <w:lang w:val="en-US"/>
+        </w:rPr>
+        <w:t>TC04</w:t>
+      </w:r>
+      <w:proofErr w:type="spellEnd"/>
+    </w:p>
+    <w:p>
+      <w:pPr>
+        <w:rPr>
+          <w:lang w:val="en-US"/>
+        </w:rPr>
+      </w:pPr>
+      <w:r>
+        <w:rPr>
+          <w:lang w:val="en-US"/>
+        </w:rPr>
+        <w:t>Description:</w:t>
+      </w:r>
+      <w:r>
+        <w:rPr>
+          <w:lang w:val="en-US"/>
+        </w:rPr>
+        <w:br/>
+        <w:t>Score should be stored after gameplay.</w:t>
+      </w:r>
+    </w:p>
+    <w:p>
+      <w:pPr>
+        <w:rPr>
+          <w:lang w:val="en-US"/>
+        </w:rPr>
+      </w:pPr>
+      <w:r>
+        <w:rPr>
+          <w:lang w:val="en-US"/>
+        </w:rPr>
+        <w:t>Expected Result:</w:t>
+      </w:r>
+      <w:r>
+        <w:rPr>
+          <w:lang w:val="en-US"/>
+        </w:rPr>
+        <w:br/>
+        <w:t>Score saved successfully.</w:t>
+      </w:r>
+    </w:p>
+    <w:p>
+      <w:pPr>
+        <w:rPr>
+          <w:lang w:val="en-US"/>
+        </w:rPr>
+      </w:pPr>
+      <w:r>
+        <w:rPr>
+          <w:lang w:val="en-US"/>
+        </w:rPr>
+        <w:t>Status:</w:t>
+      </w:r>
+      <w:r>
+        <w:rPr>
+          <w:lang w:val="en-US"/>
+        </w:rPr>
+        <w:br/>
+        <w:t>Pass</w:t>
+      </w:r>
+    </w:p>
+    <w:p>
+      <w:pPr>
+        <w:rPr>
+          <w:b/>
+          <w:bCs/>
+          <w:lang w:val="en-US"/>
+        </w:rPr>
+      </w:pPr>
+      <w:r>
+        <w:rPr>
+          <w:b/>
+          <w:bCs/>
+          <w:lang w:val="en-US"/>
+        </w:rPr>
+        <w:t>8.3 Requirement Traceability Matrix (RTM)</w:t>
+      </w:r>
+    </w:p>
+    <w:tbl>
+      <w:tblPr>
+        <w:tblStyle w:val="TableGrid"/>
+        <w:tblW w:w="0" w:type="auto"/>
+        <w:tblLook w:val="04A0" w:firstRow="1" w:lastRow="0" w:firstColumn="1" w:lastColumn="0" w:noHBand="0" w:noVBand="1"/>
+      </w:tblPr>
+      <w:tblGrid>
+        <w:gridCol w:w="583"/>
+        <w:gridCol w:w="2742"/>
+        <w:gridCol w:w="1350"/>
+        <w:gridCol w:w="1963"/>
+        <w:gridCol w:w="1658"/>
+      </w:tblGrid>
+      <w:tr>
+        <w:tc>
+          <w:tcPr>
+            <w:tcW w:w="583" w:type="dxa"/>
+          </w:tcPr>
+          <w:p>
+            <w:pPr>
+              <w:spacing w:line="360" w:lineRule="auto"/>
+              <w:jc w:val="both"/>
+              <w:rPr>
+                <w:rFonts w:cs="Times New Roman"/>
+              </w:rPr>
+            </w:pPr>
+            <w:proofErr w:type="spellStart"/>
+            <w:proofErr w:type="gramStart"/>
+            <w:r>
+              <w:rPr>
+                <w:rFonts w:cs="Times New Roman"/>
+              </w:rPr>
+              <w:t>S.N</w:t>
+            </w:r>
+            <w:proofErr w:type="spellEnd"/>
+            <w:proofErr w:type="gramEnd"/>
+          </w:p>
+        </w:tc>
+        <w:tc>
+          <w:tcPr>
+            <w:tcW w:w="2742" w:type="dxa"/>
+          </w:tcPr>
+          <w:p>
+            <w:pPr>
+              <w:spacing w:line="360" w:lineRule="auto"/>
+              <w:jc w:val="both"/>
+              <w:rPr>
+                <w:rFonts w:cs="Times New Roman"/>
+              </w:rPr>
+            </w:pPr>
+            <w:r>
+              <w:rPr>
+                <w:rFonts w:cs="Times New Roman"/>
+              </w:rPr>
+              <w:t>Requirement Description</w:t>
+            </w:r>
+          </w:p>
+        </w:tc>
+        <w:tc>
+          <w:tcPr>
+            <w:tcW w:w="1350" w:type="dxa"/>
+          </w:tcPr>
+          <w:p>
+            <w:pPr>
+              <w:spacing w:line="360" w:lineRule="auto"/>
+              <w:jc w:val="both"/>
+              <w:rPr>
+                <w:rFonts w:cs="Times New Roman"/>
+              </w:rPr>
+            </w:pPr>
+            <w:r>
+              <w:rPr>
+                <w:rFonts w:cs="Times New Roman"/>
+              </w:rPr>
+              <w:t>Testcase ID</w:t>
+            </w:r>
+          </w:p>
+        </w:tc>
+        <w:tc>
+          <w:tcPr>
+            <w:tcW w:w="1963" w:type="dxa"/>
+          </w:tcPr>
+          <w:p>
+            <w:pPr>
+              <w:spacing w:line="360" w:lineRule="auto"/>
+              <w:jc w:val="both"/>
+              <w:rPr>
+                <w:rFonts w:cs="Times New Roman"/>
+              </w:rPr>
+            </w:pPr>
+            <w:r>
+              <w:rPr>
+                <w:rFonts w:cs="Times New Roman"/>
+              </w:rPr>
+              <w:t>Status</w:t>
+            </w:r>
+          </w:p>
+        </w:tc>
+        <w:tc>
+          <w:tcPr>
+            <w:tcW w:w="1658" w:type="dxa"/>
+          </w:tcPr>
+          <w:p>
+            <w:pPr>
+              <w:spacing w:line="360" w:lineRule="auto"/>
+              <w:jc w:val="both"/>
+              <w:rPr>
+                <w:rFonts w:cs="Times New Roman"/>
+              </w:rPr>
+            </w:pPr>
+            <w:r>
+              <w:rPr>
+                <w:rFonts w:cs="Times New Roman"/>
+              </w:rPr>
+              <w:t>Remarks if any:</w:t>
+            </w:r>
+          </w:p>
+        </w:tc>
+      </w:tr>
+      <w:tr>
+        <w:tc>
+          <w:tcPr>
+            <w:tcW w:w="583" w:type="dxa"/>
+          </w:tcPr>
+          <w:p>
+            <w:pPr>
+              <w:spacing w:line="360" w:lineRule="auto"/>
+              <w:jc w:val="both"/>
+              <w:rPr>
+                <w:rFonts w:cs="Times New Roman"/>
+              </w:rPr>
+            </w:pPr>
+            <w:r>
+              <w:rPr>
+                <w:rFonts w:cs="Times New Roman"/>
+              </w:rPr>
+              <w:t>101</w:t>
+            </w:r>
+          </w:p>
+        </w:tc>
+        <w:tc>
+          <w:tcPr>
+            <w:tcW w:w="2742" w:type="dxa"/>
+          </w:tcPr>
+          <w:p>
+            <w:pPr>
+              <w:spacing w:line="360" w:lineRule="auto"/>
+              <w:jc w:val="both"/>
+              <w:rPr>
+                <w:rFonts w:cs="Times New Roman"/>
+              </w:rPr>
+            </w:pPr>
+            <w:r>
+              <w:rPr>
+                <w:rFonts w:cs="Times New Roman"/>
+              </w:rPr>
+              <w:t xml:space="preserve">Login </w:t>
+            </w:r>
+          </w:p>
+        </w:tc>
+        <w:tc>
+          <w:tcPr>
+            <w:tcW w:w="1350" w:type="dxa"/>
+          </w:tcPr>
+          <w:p>
+            <w:pPr>
+              <w:spacing w:line="360" w:lineRule="auto"/>
+              <w:jc w:val="both"/>
+              <w:rPr>
+                <w:rFonts w:cs="Times New Roman"/>
+              </w:rPr>
+            </w:pPr>
+            <w:proofErr w:type="spellStart"/>
+            <w:r>
+              <w:rPr>
+                <w:rFonts w:cs="Times New Roman"/>
+              </w:rPr>
+              <w:t>TC01</w:t>
+            </w:r>
+            <w:proofErr w:type="spellEnd"/>
+          </w:p>
+        </w:tc>
+        <w:tc>
+          <w:tcPr>
+            <w:tcW w:w="1963" w:type="dxa"/>
+          </w:tcPr>
+          <w:p>
+            <w:pPr>
+              <w:spacing w:line="360" w:lineRule="auto"/>
+              <w:jc w:val="both"/>
+              <w:rPr>
+                <w:rFonts w:cs="Times New Roman"/>
+              </w:rPr>
+            </w:pPr>
+            <w:proofErr w:type="spellStart"/>
+            <w:r>
+              <w:rPr>
+                <w:rFonts w:cs="Times New Roman"/>
+              </w:rPr>
+              <w:t>TC01</w:t>
+            </w:r>
+            <w:proofErr w:type="spellEnd"/>
+            <w:r>
+              <w:rPr>
+                <w:rFonts w:cs="Times New Roman"/>
+              </w:rPr>
+              <w:t>- Pass</w:t>
+            </w:r>
+          </w:p>
+          <w:p>
+            <w:pPr>
+              <w:spacing w:line="360" w:lineRule="auto"/>
+              <w:jc w:val="both"/>
+              <w:rPr>
+                <w:rFonts w:cs="Times New Roman"/>
+              </w:rPr>
+            </w:pPr>
+          </w:p>
+        </w:tc>
+        <w:tc>
+          <w:tcPr>
+            <w:tcW w:w="1658" w:type="dxa"/>
+          </w:tcPr>
+          <w:p>
+            <w:pPr>
+              <w:spacing w:line="360" w:lineRule="auto"/>
+              <w:jc w:val="both"/>
+              <w:rPr>
+                <w:rFonts w:cs="Times New Roman"/>
+              </w:rPr>
+            </w:pPr>
+            <w:r>
+              <w:rPr>
+                <w:rFonts w:cs="Times New Roman"/>
+              </w:rPr>
+              <w:t>No changes required</w:t>
+            </w:r>
+          </w:p>
+        </w:tc>
+      </w:tr>
+      <w:tr>
+        <w:tc>
+          <w:tcPr>
+            <w:tcW w:w="583" w:type="dxa"/>
+          </w:tcPr>
+          <w:p>
+            <w:pPr>
+              <w:spacing w:line="360" w:lineRule="auto"/>
+              <w:jc w:val="both"/>
+              <w:rPr>
+                <w:rFonts w:cs="Times New Roman"/>
+              </w:rPr>
+            </w:pPr>
+            <w:r>
+              <w:rPr>
+                <w:rFonts w:cs="Times New Roman"/>
+              </w:rPr>
+              <w:t>102</w:t>
+            </w:r>
+          </w:p>
+        </w:tc>
+        <w:tc>
+          <w:tcPr>
+            <w:tcW w:w="2742" w:type="dxa"/>
+          </w:tcPr>
+          <w:p>
+            <w:pPr>
+              <w:spacing w:line="360" w:lineRule="auto"/>
+              <w:jc w:val="both"/>
+              <w:rPr>
+                <w:rFonts w:cs="Times New Roman"/>
+              </w:rPr>
+            </w:pPr>
+            <w:r>
+              <w:rPr>
+                <w:rFonts w:cs="Times New Roman"/>
+              </w:rPr>
+              <w:t>Registration System</w:t>
+            </w:r>
+          </w:p>
+        </w:tc>
+        <w:tc>
+          <w:tcPr>
+            <w:tcW w:w="1350" w:type="dxa"/>
+          </w:tcPr>
+          <w:p>
+            <w:pPr>
+              <w:spacing w:line="360" w:lineRule="auto"/>
+              <w:jc w:val="both"/>
+              <w:rPr>
+                <w:rFonts w:cs="Times New Roman"/>
+              </w:rPr>
+            </w:pPr>
+            <w:proofErr w:type="spellStart"/>
+            <w:r>
+              <w:rPr>
+                <w:rFonts w:cs="Times New Roman"/>
+              </w:rPr>
+              <w:t>TC0</w:t>
+            </w:r>
+            <w:r>
+              <w:rPr>
+                <w:rFonts w:cs="Times New Roman"/>
+              </w:rPr>
+              <w:t>2</w:t>
+            </w:r>
+            <w:proofErr w:type="spellEnd"/>
+          </w:p>
+        </w:tc>
+        <w:tc>
+          <w:tcPr>
+            <w:tcW w:w="1963" w:type="dxa"/>
+          </w:tcPr>
+          <w:p>
+            <w:pPr>
+              <w:spacing w:line="360" w:lineRule="auto"/>
+              <w:jc w:val="both"/>
+              <w:rPr>
+                <w:rFonts w:cs="Times New Roman"/>
+              </w:rPr>
+            </w:pPr>
+            <w:proofErr w:type="spellStart"/>
+            <w:r>
+              <w:rPr>
+                <w:rFonts w:cs="Times New Roman"/>
+              </w:rPr>
+              <w:t>TC0</w:t>
+            </w:r>
+            <w:r>
+              <w:rPr>
+                <w:rFonts w:cs="Times New Roman"/>
+              </w:rPr>
+              <w:t>2</w:t>
+            </w:r>
+            <w:proofErr w:type="spellEnd"/>
+            <w:r>
+              <w:rPr>
+                <w:rFonts w:cs="Times New Roman"/>
+              </w:rPr>
+              <w:t xml:space="preserve">- </w:t>
+            </w:r>
+            <w:r>
+              <w:rPr>
+                <w:rFonts w:cs="Times New Roman"/>
+              </w:rPr>
+              <w:t>P</w:t>
+            </w:r>
+            <w:r>
+              <w:rPr>
+                <w:rFonts w:cs="Times New Roman"/>
+              </w:rPr>
+              <w:t>ass</w:t>
+            </w:r>
+          </w:p>
+        </w:tc>
+        <w:tc>
+          <w:tcPr>
+            <w:tcW w:w="1658" w:type="dxa"/>
+          </w:tcPr>
+          <w:p>
+            <w:pPr>
+              <w:spacing w:line="360" w:lineRule="auto"/>
+              <w:jc w:val="both"/>
+              <w:rPr>
+                <w:rFonts w:cs="Times New Roman"/>
+              </w:rPr>
+            </w:pPr>
+            <w:r>
+              <w:rPr>
+                <w:rFonts w:cs="Times New Roman"/>
+              </w:rPr>
+              <w:t>Working correctly</w:t>
+            </w:r>
+          </w:p>
+        </w:tc>
+      </w:tr>
+      <w:tr>
+        <w:tc>
+          <w:tcPr>
+            <w:tcW w:w="583" w:type="dxa"/>
+          </w:tcPr>
+          <w:p>
+            <w:pPr>
+              <w:spacing w:line="360" w:lineRule="auto"/>
+              <w:jc w:val="both"/>
+              <w:rPr>
+                <w:rFonts w:cs="Times New Roman"/>
+              </w:rPr>
+            </w:pPr>
+            <w:r>
+              <w:rPr>
+                <w:rFonts w:cs="Times New Roman"/>
+              </w:rPr>
+              <w:t>103</w:t>
+            </w:r>
+          </w:p>
+        </w:tc>
+        <w:tc>
+          <w:tcPr>
+            <w:tcW w:w="2742" w:type="dxa"/>
+          </w:tcPr>
+          <w:p>
+            <w:pPr>
+              <w:spacing w:line="360" w:lineRule="auto"/>
+              <w:jc w:val="both"/>
+              <w:rPr>
+                <w:rFonts w:cs="Times New Roman"/>
+              </w:rPr>
+            </w:pPr>
+            <w:r>
+              <w:rPr>
+                <w:rFonts w:cs="Times New Roman"/>
+              </w:rPr>
+              <w:t>Winner Determination</w:t>
+            </w:r>
+          </w:p>
+          <w:p>
+            <w:pPr>
+              <w:spacing w:line="360" w:lineRule="auto"/>
+              <w:jc w:val="both"/>
+              <w:rPr>
+                <w:rFonts w:cs="Times New Roman"/>
+              </w:rPr>
+            </w:pPr>
+          </w:p>
+        </w:tc>
+        <w:tc>
+          <w:tcPr>
+            <w:tcW w:w="1350" w:type="dxa"/>
+          </w:tcPr>
+          <w:p>
+            <w:pPr>
+              <w:spacing w:line="360" w:lineRule="auto"/>
+              <w:jc w:val="both"/>
+              <w:rPr>
+                <w:rFonts w:cs="Times New Roman"/>
+              </w:rPr>
+            </w:pPr>
+            <w:proofErr w:type="spellStart"/>
+            <w:r>
+              <w:rPr>
+                <w:rFonts w:cs="Times New Roman"/>
+              </w:rPr>
+              <w:t>TC03</w:t>
+            </w:r>
+            <w:proofErr w:type="spellEnd"/>
+          </w:p>
+        </w:tc>
+        <w:tc>
+          <w:tcPr>
+            <w:tcW w:w="1963" w:type="dxa"/>
+          </w:tcPr>
+          <w:p>
+            <w:pPr>
+              <w:spacing w:line="360" w:lineRule="auto"/>
+              <w:jc w:val="both"/>
+              <w:rPr>
+                <w:rFonts w:cs="Times New Roman"/>
+              </w:rPr>
+            </w:pPr>
+            <w:proofErr w:type="spellStart"/>
+            <w:r>
+              <w:rPr>
+                <w:rFonts w:cs="Times New Roman"/>
+              </w:rPr>
+              <w:t>TC03</w:t>
+            </w:r>
+            <w:proofErr w:type="spellEnd"/>
+            <w:r>
+              <w:rPr>
+                <w:rFonts w:cs="Times New Roman"/>
+              </w:rPr>
+              <w:t>-Pass</w:t>
+            </w:r>
+          </w:p>
+        </w:tc>
+        <w:tc>
+          <w:tcPr>
+            <w:tcW w:w="1658" w:type="dxa"/>
+          </w:tcPr>
+          <w:tbl>
+            <w:tblPr>
+              <w:tblW w:w="0" w:type="auto"/>
+              <w:tblCellSpacing w:w="15" w:type="dxa"/>
+              <w:tblCellMar>
+                <w:top w:w="15" w:type="dxa"/>
+                <w:left w:w="15" w:type="dxa"/>
+                <w:bottom w:w="15" w:type="dxa"/>
+                <w:right w:w="15" w:type="dxa"/>
+              </w:tblCellMar>
+              <w:tblLook w:val="04A0" w:firstRow="1" w:lastRow="0" w:firstColumn="1" w:lastColumn="0" w:noHBand="0" w:noVBand="1"/>
+            </w:tblPr>
+            <w:tblGrid>
+              <w:gridCol w:w="96"/>
+            </w:tblGrid>
+            <w:tr>
+              <w:trPr>
+                <w:tblCellSpacing w:w="15" w:type="dxa"/>
+              </w:trPr>
+              <w:tc>
+                <w:tcPr>
+                  <w:tcW w:w="0" w:type="auto"/>
+                  <w:vAlign w:val="center"/>
+                  <w:hideMark/>
+                </w:tcPr>
+                <w:p>
+                  <w:pPr>
+                    <w:spacing w:after="0" w:line="360" w:lineRule="auto"/>
+                    <w:jc w:val="both"/>
+                    <w:rPr>
+                      <w:rFonts w:cs="Times New Roman"/>
+                      <w:lang w:val="en-US"/>
+                    </w:rPr>
+                  </w:pPr>
+                </w:p>
+              </w:tc>
+            </w:tr>
+          </w:tbl>
+          <w:p>
+            <w:pPr>
+              <w:spacing w:line="360" w:lineRule="auto"/>
+              <w:jc w:val="both"/>
+              <w:rPr>
+                <w:rFonts w:cs="Times New Roman"/>
+                <w:vanish/>
+                <w:lang w:val="en-US"/>
+              </w:rPr>
+            </w:pPr>
+          </w:p>
+          <w:tbl>
+            <w:tblPr>
+              <w:tblW w:w="0" w:type="auto"/>
+              <w:tblCellSpacing w:w="15" w:type="dxa"/>
+              <w:tblCellMar>
+                <w:top w:w="15" w:type="dxa"/>
+                <w:left w:w="15" w:type="dxa"/>
+                <w:bottom w:w="15" w:type="dxa"/>
+                <w:right w:w="15" w:type="dxa"/>
+              </w:tblCellMar>
+              <w:tblLook w:val="04A0" w:firstRow="1" w:lastRow="0" w:firstColumn="1" w:lastColumn="0" w:noHBand="0" w:noVBand="1"/>
+            </w:tblPr>
+            <w:tblGrid>
+              <w:gridCol w:w="1442"/>
+            </w:tblGrid>
+            <w:tr>
+              <w:trPr>
+                <w:tblCellSpacing w:w="15" w:type="dxa"/>
+              </w:trPr>
+              <w:tc>
+                <w:tcPr>
+                  <w:tcW w:w="0" w:type="auto"/>
+                  <w:vAlign w:val="center"/>
+                  <w:hideMark/>
+                </w:tcPr>
+                <w:p>
+                  <w:pPr>
+                    <w:spacing w:after="0" w:line="360" w:lineRule="auto"/>
+                    <w:jc w:val="both"/>
+                    <w:rPr>
+                      <w:rFonts w:cs="Times New Roman"/>
+                      <w:lang w:val="en-US"/>
+                    </w:rPr>
+                  </w:pPr>
+                  <w:r>
+                    <w:rPr>
+                      <w:rFonts w:cs="Times New Roman"/>
+                      <w:lang w:val="en-US"/>
+                    </w:rPr>
+                    <w:t>Accurate results</w:t>
+                  </w:r>
+                </w:p>
+              </w:tc>
+            </w:tr>
+          </w:tbl>
+          <w:p>
+            <w:pPr>
+              <w:spacing w:line="360" w:lineRule="auto"/>
+              <w:jc w:val="both"/>
+              <w:rPr>
+                <w:rFonts w:cs="Times New Roman"/>
+              </w:rPr>
+            </w:pPr>
+          </w:p>
+        </w:tc>
+      </w:tr>
+      <w:tr>
+        <w:tc>
+          <w:tcPr>
+            <w:tcW w:w="583" w:type="dxa"/>
+          </w:tcPr>
+          <w:p>
+            <w:pPr>
+              <w:spacing w:line="360" w:lineRule="auto"/>
+              <w:jc w:val="both"/>
+              <w:rPr>
+                <w:rFonts w:cs="Times New Roman"/>
+              </w:rPr>
+            </w:pPr>
+            <w:r>
+              <w:rPr>
+                <w:rFonts w:cs="Times New Roman"/>
+              </w:rPr>
+              <w:lastRenderedPageBreak/>
+              <w:t>104</w:t>
+            </w:r>
+          </w:p>
+        </w:tc>
+        <w:tc>
+          <w:tcPr>
+            <w:tcW w:w="2742" w:type="dxa"/>
+          </w:tcPr>
+          <w:p>
+            <w:pPr>
+              <w:spacing w:line="360" w:lineRule="auto"/>
+              <w:jc w:val="both"/>
+              <w:rPr>
+                <w:rFonts w:cs="Times New Roman"/>
+              </w:rPr>
+            </w:pPr>
+            <w:r>
+              <w:rPr>
+                <w:rFonts w:cs="Times New Roman"/>
+              </w:rPr>
+              <w:t>Score Management</w:t>
+            </w:r>
+          </w:p>
+        </w:tc>
+        <w:tc>
+          <w:tcPr>
+            <w:tcW w:w="1350" w:type="dxa"/>
+          </w:tcPr>
+          <w:p>
+            <w:pPr>
+              <w:spacing w:line="360" w:lineRule="auto"/>
+              <w:jc w:val="both"/>
+              <w:rPr>
+                <w:rFonts w:cs="Times New Roman"/>
+              </w:rPr>
+            </w:pPr>
+            <w:proofErr w:type="spellStart"/>
+            <w:r>
+              <w:rPr>
+                <w:rFonts w:cs="Times New Roman"/>
+              </w:rPr>
+              <w:t>TCO4</w:t>
+            </w:r>
+            <w:proofErr w:type="spellEnd"/>
+          </w:p>
+        </w:tc>
+        <w:tc>
+          <w:tcPr>
+            <w:tcW w:w="1963" w:type="dxa"/>
+          </w:tcPr>
+          <w:p>
+            <w:pPr>
+              <w:spacing w:line="360" w:lineRule="auto"/>
+              <w:jc w:val="both"/>
+              <w:rPr>
+                <w:rFonts w:cs="Times New Roman"/>
+              </w:rPr>
+            </w:pPr>
+            <w:proofErr w:type="spellStart"/>
+            <w:r>
+              <w:rPr>
+                <w:rFonts w:cs="Times New Roman"/>
+              </w:rPr>
+              <w:t>TCO4</w:t>
+            </w:r>
+            <w:proofErr w:type="spellEnd"/>
+            <w:r>
+              <w:rPr>
+                <w:rFonts w:cs="Times New Roman"/>
+              </w:rPr>
+              <w:t>-Pass</w:t>
+            </w:r>
+          </w:p>
+        </w:tc>
+        <w:tc>
+          <w:tcPr>
+            <w:tcW w:w="1658" w:type="dxa"/>
+          </w:tcPr>
+          <w:p>
+            <w:pPr>
+              <w:spacing w:line="360" w:lineRule="auto"/>
+              <w:jc w:val="both"/>
+              <w:rPr>
+                <w:rFonts w:cs="Times New Roman"/>
+                <w:lang w:val="en-US"/>
+              </w:rPr>
+            </w:pPr>
+            <w:r>
+              <w:rPr>
+                <w:rFonts w:cs="Times New Roman"/>
+              </w:rPr>
+              <w:t>Data stored properly</w:t>
+            </w:r>
+          </w:p>
+        </w:tc>
+      </w:tr>
+    </w:tbl>
+    <w:p>
+      <w:pPr>
+        <w:rPr>
+          <w:lang w:val="en-US"/>
+        </w:rPr>
+      </w:pPr>
+    </w:p>
+    <w:p>
+      <w:pPr>
+        <w:rPr>
+          <w:b/>
+          <w:bCs/>
+        </w:rPr>
+      </w:pPr>
+      <w:r>
+        <w:rPr>
+          <w:b/>
+          <w:bCs/>
+        </w:rPr>
+        <w:t>8.4 User Acceptance Testing (UAT)</w:t>
+      </w:r>
+    </w:p>
+    <w:tbl>
+      <w:tblPr>
+        <w:tblStyle w:val="TableGrid"/>
+        <w:tblW w:w="0" w:type="auto"/>
+        <w:tblLook w:val="04A0" w:firstRow="1" w:lastRow="0" w:firstColumn="1" w:lastColumn="0" w:noHBand="0" w:noVBand="1"/>
+      </w:tblPr>
+      <w:tblGrid>
+        <w:gridCol w:w="570"/>
+        <w:gridCol w:w="2026"/>
+        <w:gridCol w:w="977"/>
+        <w:gridCol w:w="853"/>
+        <w:gridCol w:w="1009"/>
+        <w:gridCol w:w="978"/>
+        <w:gridCol w:w="1883"/>
+      </w:tblGrid>
+      <w:tr>
+        <w:tc>
+          <w:tcPr>
+            <w:tcW w:w="570" w:type="dxa"/>
+            <w:vMerge w:val="restart"/>
+            <w:shd w:val="clear" w:color="auto" w:fill="FFFFFF" w:themeFill="background1"/>
+          </w:tcPr>
+          <w:p>
+            <w:pPr>
+              <w:spacing w:line="360" w:lineRule="auto"/>
+              <w:rPr>
+                <w:szCs w:val="24"/>
+                <w:highlight w:val="lightGray"/>
+              </w:rPr>
+            </w:pPr>
+            <w:r>
+              <w:rPr>
+                <w:szCs w:val="24"/>
+                <w:shd w:val="clear" w:color="auto" w:fill="FFFFFF" w:themeFill="background1"/>
+              </w:rPr>
+              <w:t>No</w:t>
+            </w:r>
+            <w:r>
+              <w:rPr>
+                <w:szCs w:val="24"/>
+              </w:rPr>
+              <w:t>.</w:t>
+            </w:r>
+          </w:p>
+        </w:tc>
+        <w:tc>
+          <w:tcPr>
+            <w:tcW w:w="2026" w:type="dxa"/>
+            <w:vMerge w:val="restart"/>
+          </w:tcPr>
+          <w:p>
+            <w:pPr>
+              <w:spacing w:line="360" w:lineRule="auto"/>
+              <w:jc w:val="both"/>
+              <w:rPr>
+                <w:rFonts w:eastAsiaTheme="majorEastAsia" w:cs="Times New Roman"/>
+                <w:bCs/>
+                <w:szCs w:val="24"/>
+              </w:rPr>
+            </w:pPr>
+            <w:r>
+              <w:rPr>
+                <w:rFonts w:eastAsiaTheme="majorEastAsia" w:cs="Times New Roman"/>
+                <w:bCs/>
+                <w:szCs w:val="24"/>
+              </w:rPr>
+              <w:t xml:space="preserve">Acceptance </w:t>
+            </w:r>
+            <w:proofErr w:type="gramStart"/>
+            <w:r>
+              <w:rPr>
+                <w:rFonts w:eastAsiaTheme="majorEastAsia" w:cs="Times New Roman"/>
+                <w:bCs/>
+                <w:szCs w:val="24"/>
+              </w:rPr>
+              <w:t>requirement</w:t>
+            </w:r>
+            <w:r>
+              <w:rPr>
+                <w:rFonts w:eastAsiaTheme="majorEastAsia" w:cs="Times New Roman"/>
+                <w:bCs/>
+                <w:szCs w:val="24"/>
+              </w:rPr>
+              <w:t>(</w:t>
+            </w:r>
+            <w:proofErr w:type="gramEnd"/>
+            <w:r>
+              <w:rPr>
+                <w:rFonts w:eastAsiaTheme="majorEastAsia" w:cs="Times New Roman"/>
+                <w:bCs/>
+                <w:szCs w:val="24"/>
+              </w:rPr>
+              <w:t>USR)</w:t>
+            </w:r>
+          </w:p>
+        </w:tc>
+        <w:tc>
+          <w:tcPr>
+            <w:tcW w:w="1830" w:type="dxa"/>
+            <w:gridSpan w:val="2"/>
+          </w:tcPr>
+          <w:p>
+            <w:pPr>
+              <w:spacing w:line="360" w:lineRule="auto"/>
+              <w:jc w:val="both"/>
+              <w:rPr>
+                <w:rFonts w:eastAsiaTheme="majorEastAsia" w:cs="Times New Roman"/>
+                <w:bCs/>
+                <w:szCs w:val="24"/>
+              </w:rPr>
+            </w:pPr>
+            <w:r>
+              <w:rPr>
+                <w:rFonts w:eastAsiaTheme="majorEastAsia" w:cs="Times New Roman"/>
+                <w:bCs/>
+                <w:szCs w:val="24"/>
+              </w:rPr>
+              <w:t xml:space="preserve">Critical </w:t>
+            </w:r>
+            <w:r>
+              <w:rPr>
+                <w:rFonts w:eastAsiaTheme="majorEastAsia" w:cs="Times New Roman"/>
+                <w:bCs/>
+                <w:szCs w:val="24"/>
+              </w:rPr>
+              <w:t>(DEV)</w:t>
+            </w:r>
+          </w:p>
+        </w:tc>
+        <w:tc>
+          <w:tcPr>
+            <w:tcW w:w="1987" w:type="dxa"/>
+            <w:gridSpan w:val="2"/>
+          </w:tcPr>
+          <w:p>
+            <w:pPr>
+              <w:spacing w:line="360" w:lineRule="auto"/>
+              <w:jc w:val="both"/>
+              <w:rPr>
+                <w:rFonts w:eastAsiaTheme="majorEastAsia" w:cs="Times New Roman"/>
+                <w:b/>
+                <w:szCs w:val="24"/>
+                <w:highlight w:val="lightGray"/>
+              </w:rPr>
+            </w:pPr>
+            <w:r>
+              <w:rPr>
+                <w:rFonts w:eastAsiaTheme="majorEastAsia" w:cs="Times New Roman"/>
+                <w:bCs/>
+                <w:szCs w:val="24"/>
+              </w:rPr>
+              <w:t xml:space="preserve">Test </w:t>
+            </w:r>
+            <w:proofErr w:type="gramStart"/>
+            <w:r>
+              <w:rPr>
+                <w:rFonts w:eastAsiaTheme="majorEastAsia" w:cs="Times New Roman"/>
+                <w:bCs/>
+                <w:szCs w:val="24"/>
+              </w:rPr>
+              <w:t>Results</w:t>
+            </w:r>
+            <w:r>
+              <w:rPr>
+                <w:rFonts w:eastAsiaTheme="majorEastAsia" w:cs="Times New Roman"/>
+                <w:bCs/>
+                <w:szCs w:val="24"/>
+              </w:rPr>
+              <w:t>(</w:t>
+            </w:r>
+            <w:proofErr w:type="gramEnd"/>
+            <w:r>
+              <w:rPr>
+                <w:rFonts w:eastAsiaTheme="majorEastAsia" w:cs="Times New Roman"/>
+                <w:bCs/>
+                <w:szCs w:val="24"/>
+              </w:rPr>
+              <w:t>DEV)</w:t>
+            </w:r>
+          </w:p>
+        </w:tc>
+        <w:tc>
+          <w:tcPr>
+            <w:tcW w:w="1883" w:type="dxa"/>
+            <w:vMerge w:val="restart"/>
+          </w:tcPr>
+          <w:p>
+            <w:pPr>
+              <w:spacing w:line="360" w:lineRule="auto"/>
+              <w:jc w:val="both"/>
+              <w:rPr>
+                <w:rFonts w:eastAsiaTheme="majorEastAsia" w:cs="Times New Roman"/>
+                <w:b/>
+                <w:szCs w:val="24"/>
+                <w:highlight w:val="lightGray"/>
+              </w:rPr>
+            </w:pPr>
+            <w:proofErr w:type="gramStart"/>
+            <w:r>
+              <w:rPr>
+                <w:rFonts w:eastAsiaTheme="majorEastAsia" w:cs="Times New Roman"/>
+                <w:bCs/>
+                <w:szCs w:val="24"/>
+              </w:rPr>
+              <w:t>Comments</w:t>
+            </w:r>
+            <w:r>
+              <w:rPr>
+                <w:rFonts w:eastAsiaTheme="majorEastAsia" w:cs="Times New Roman"/>
+                <w:bCs/>
+                <w:szCs w:val="24"/>
+              </w:rPr>
+              <w:t>(</w:t>
+            </w:r>
+            <w:proofErr w:type="gramEnd"/>
+            <w:r>
+              <w:rPr>
+                <w:rFonts w:eastAsiaTheme="majorEastAsia" w:cs="Times New Roman"/>
+                <w:bCs/>
+                <w:szCs w:val="24"/>
+              </w:rPr>
+              <w:t>USR)</w:t>
+            </w:r>
+          </w:p>
+        </w:tc>
+      </w:tr>
+      <w:tr>
+        <w:tc>
+          <w:tcPr>
+            <w:tcW w:w="570" w:type="dxa"/>
+            <w:vMerge/>
+            <w:shd w:val="clear" w:color="auto" w:fill="FFFFFF" w:themeFill="background1"/>
+          </w:tcPr>
+          <w:p>
+            <w:pPr>
+              <w:spacing w:line="360" w:lineRule="auto"/>
+              <w:rPr>
+                <w:szCs w:val="24"/>
+                <w:shd w:val="clear" w:color="auto" w:fill="FFFFFF" w:themeFill="background1"/>
+              </w:rPr>
+            </w:pPr>
+          </w:p>
+        </w:tc>
+        <w:tc>
+          <w:tcPr>
+            <w:tcW w:w="2026" w:type="dxa"/>
+            <w:vMerge/>
+          </w:tcPr>
+          <w:p>
+            <w:pPr>
+              <w:spacing w:line="360" w:lineRule="auto"/>
+              <w:jc w:val="both"/>
+              <w:rPr>
+                <w:rFonts w:eastAsiaTheme="majorEastAsia" w:cs="Times New Roman"/>
+                <w:bCs/>
+                <w:szCs w:val="24"/>
+              </w:rPr>
+            </w:pPr>
+          </w:p>
+        </w:tc>
+        <w:tc>
+          <w:tcPr>
+            <w:tcW w:w="977" w:type="dxa"/>
+          </w:tcPr>
+          <w:p>
+            <w:pPr>
+              <w:spacing w:line="360" w:lineRule="auto"/>
+              <w:jc w:val="both"/>
+              <w:rPr>
+                <w:rFonts w:eastAsiaTheme="majorEastAsia" w:cs="Times New Roman"/>
+                <w:bCs/>
+                <w:szCs w:val="24"/>
+              </w:rPr>
+            </w:pPr>
+            <w:r>
+              <w:rPr>
+                <w:rFonts w:eastAsiaTheme="majorEastAsia" w:cs="Times New Roman"/>
+                <w:bCs/>
+                <w:szCs w:val="24"/>
+              </w:rPr>
+              <w:t>Yes</w:t>
+            </w:r>
+          </w:p>
+        </w:tc>
+        <w:tc>
+          <w:tcPr>
+            <w:tcW w:w="853" w:type="dxa"/>
+          </w:tcPr>
+          <w:p>
+            <w:pPr>
+              <w:spacing w:line="360" w:lineRule="auto"/>
+              <w:jc w:val="both"/>
+              <w:rPr>
+                <w:rFonts w:eastAsiaTheme="majorEastAsia" w:cs="Times New Roman"/>
+                <w:bCs/>
+                <w:szCs w:val="24"/>
+              </w:rPr>
+            </w:pPr>
+            <w:r>
+              <w:rPr>
+                <w:rFonts w:eastAsiaTheme="majorEastAsia" w:cs="Times New Roman"/>
+                <w:bCs/>
+                <w:szCs w:val="24"/>
+              </w:rPr>
+              <w:t>No</w:t>
+            </w:r>
+          </w:p>
+        </w:tc>
+        <w:tc>
+          <w:tcPr>
+            <w:tcW w:w="1009" w:type="dxa"/>
+          </w:tcPr>
+          <w:p>
+            <w:pPr>
+              <w:spacing w:line="360" w:lineRule="auto"/>
+              <w:jc w:val="both"/>
+              <w:rPr>
+                <w:rFonts w:eastAsiaTheme="majorEastAsia" w:cs="Times New Roman"/>
+                <w:bCs/>
+                <w:szCs w:val="24"/>
+              </w:rPr>
+            </w:pPr>
+            <w:r>
+              <w:rPr>
+                <w:rFonts w:eastAsiaTheme="majorEastAsia" w:cs="Times New Roman"/>
+                <w:bCs/>
+                <w:szCs w:val="24"/>
+              </w:rPr>
+              <w:t>Accept</w:t>
+            </w:r>
+          </w:p>
+        </w:tc>
+        <w:tc>
+          <w:tcPr>
+            <w:tcW w:w="978" w:type="dxa"/>
+          </w:tcPr>
+          <w:p>
+            <w:pPr>
+              <w:spacing w:line="360" w:lineRule="auto"/>
+              <w:jc w:val="both"/>
+              <w:rPr>
+                <w:rFonts w:eastAsiaTheme="majorEastAsia" w:cs="Times New Roman"/>
+                <w:bCs/>
+                <w:szCs w:val="24"/>
+              </w:rPr>
+            </w:pPr>
+            <w:r>
+              <w:rPr>
+                <w:rFonts w:eastAsiaTheme="majorEastAsia" w:cs="Times New Roman"/>
+                <w:bCs/>
+                <w:szCs w:val="24"/>
+              </w:rPr>
+              <w:t>Reject</w:t>
+            </w:r>
+          </w:p>
+        </w:tc>
+        <w:tc>
+          <w:tcPr>
+            <w:tcW w:w="1883" w:type="dxa"/>
+            <w:vMerge/>
+          </w:tcPr>
+          <w:p>
+            <w:pPr>
+              <w:spacing w:line="360" w:lineRule="auto"/>
+              <w:jc w:val="both"/>
+              <w:rPr>
+                <w:rFonts w:eastAsiaTheme="majorEastAsia" w:cs="Times New Roman"/>
+                <w:bCs/>
+                <w:szCs w:val="24"/>
+              </w:rPr>
+            </w:pPr>
+          </w:p>
+        </w:tc>
+      </w:tr>
+      <w:tr>
+        <w:tc>
+          <w:tcPr>
+            <w:tcW w:w="570" w:type="dxa"/>
+            <w:shd w:val="clear" w:color="auto" w:fill="FFFFFF" w:themeFill="background1"/>
+          </w:tcPr>
+          <w:p>
+            <w:pPr>
+              <w:spacing w:line="360" w:lineRule="auto"/>
+              <w:rPr>
+                <w:szCs w:val="24"/>
+                <w:shd w:val="clear" w:color="auto" w:fill="FFFFFF" w:themeFill="background1"/>
+              </w:rPr>
+            </w:pPr>
+            <w:r>
+              <w:rPr>
+                <w:szCs w:val="24"/>
+                <w:shd w:val="clear" w:color="auto" w:fill="FFFFFF" w:themeFill="background1"/>
+              </w:rPr>
+              <w:t>1.</w:t>
+            </w:r>
+          </w:p>
+        </w:tc>
+        <w:tc>
+          <w:tcPr>
+            <w:tcW w:w="2026" w:type="dxa"/>
+          </w:tcPr>
+          <w:tbl>
+            <w:tblPr>
+              <w:tblW w:w="0" w:type="auto"/>
+              <w:tblCellSpacing w:w="15" w:type="dxa"/>
+              <w:tblCellMar>
+                <w:top w:w="15" w:type="dxa"/>
+                <w:left w:w="15" w:type="dxa"/>
+                <w:bottom w:w="15" w:type="dxa"/>
+                <w:right w:w="15" w:type="dxa"/>
+              </w:tblCellMar>
+              <w:tblLook w:val="04A0" w:firstRow="1" w:lastRow="0" w:firstColumn="1" w:lastColumn="0" w:noHBand="0" w:noVBand="1"/>
+            </w:tblPr>
+            <w:tblGrid>
+              <w:gridCol w:w="96"/>
+            </w:tblGrid>
+            <w:tr>
+              <w:trPr>
+                <w:tblCellSpacing w:w="15" w:type="dxa"/>
+              </w:trPr>
+              <w:tc>
+                <w:tcPr>
+                  <w:tcW w:w="0" w:type="auto"/>
+                  <w:vAlign w:val="center"/>
+                  <w:hideMark/>
+                </w:tcPr>
+                <w:p>
+                  <w:pPr>
+                    <w:spacing w:after="0" w:line="360" w:lineRule="auto"/>
+                    <w:jc w:val="both"/>
+                    <w:rPr>
+                      <w:rFonts w:eastAsiaTheme="majorEastAsia" w:cs="Times New Roman"/>
+                      <w:bCs/>
+                      <w:szCs w:val="24"/>
+                      <w:lang w:val="en-US"/>
+                    </w:rPr>
+                  </w:pPr>
+                </w:p>
+              </w:tc>
+            </w:tr>
+          </w:tbl>
+          <w:p>
+            <w:pPr>
+              <w:spacing w:line="360" w:lineRule="auto"/>
+              <w:jc w:val="both"/>
+              <w:rPr>
+                <w:rFonts w:eastAsiaTheme="majorEastAsia" w:cs="Times New Roman"/>
+                <w:bCs/>
+                <w:vanish/>
+                <w:szCs w:val="24"/>
+                <w:lang w:val="en-US"/>
+              </w:rPr>
+            </w:pPr>
+          </w:p>
+          <w:tbl>
+            <w:tblPr>
+              <w:tblW w:w="0" w:type="auto"/>
+              <w:tblCellSpacing w:w="15" w:type="dxa"/>
+              <w:tblCellMar>
+                <w:top w:w="15" w:type="dxa"/>
+                <w:left w:w="15" w:type="dxa"/>
+                <w:bottom w:w="15" w:type="dxa"/>
+                <w:right w:w="15" w:type="dxa"/>
+              </w:tblCellMar>
+              <w:tblLook w:val="04A0" w:firstRow="1" w:lastRow="0" w:firstColumn="1" w:lastColumn="0" w:noHBand="0" w:noVBand="1"/>
+            </w:tblPr>
+            <w:tblGrid>
+              <w:gridCol w:w="1810"/>
+            </w:tblGrid>
+            <w:tr>
+              <w:trPr>
+                <w:tblCellSpacing w:w="15" w:type="dxa"/>
+              </w:trPr>
+              <w:tc>
+                <w:tcPr>
+                  <w:tcW w:w="0" w:type="auto"/>
+                  <w:vAlign w:val="center"/>
+                  <w:hideMark/>
+                </w:tcPr>
+                <w:p>
+                  <w:pPr>
+                    <w:spacing w:after="0" w:line="360" w:lineRule="auto"/>
+                    <w:jc w:val="both"/>
+                    <w:rPr>
+                      <w:rFonts w:eastAsiaTheme="majorEastAsia" w:cs="Times New Roman"/>
+                      <w:bCs/>
+                      <w:szCs w:val="24"/>
+                      <w:lang w:val="en-US"/>
+                    </w:rPr>
+                  </w:pPr>
+                  <w:r>
+                    <w:rPr>
+                      <w:rFonts w:eastAsiaTheme="majorEastAsia" w:cs="Times New Roman"/>
+                      <w:bCs/>
+                      <w:szCs w:val="24"/>
+                      <w:lang w:val="en-US"/>
+                    </w:rPr>
+                    <w:t>Login system should be secure</w:t>
+                  </w:r>
+                </w:p>
+              </w:tc>
+            </w:tr>
+          </w:tbl>
+          <w:p>
+            <w:pPr>
+              <w:spacing w:line="360" w:lineRule="auto"/>
+              <w:jc w:val="both"/>
+              <w:rPr>
+                <w:rFonts w:eastAsiaTheme="majorEastAsia" w:cs="Times New Roman"/>
+                <w:bCs/>
+                <w:szCs w:val="24"/>
+              </w:rPr>
+            </w:pPr>
+          </w:p>
+        </w:tc>
+        <w:tc>
+          <w:tcPr>
+            <w:tcW w:w="977" w:type="dxa"/>
+          </w:tcPr>
+          <w:p>
+            <w:pPr>
+              <w:spacing w:line="360" w:lineRule="auto"/>
+              <w:jc w:val="both"/>
+              <w:rPr>
+                <w:rFonts w:eastAsiaTheme="majorEastAsia" w:cs="Times New Roman"/>
+                <w:bCs/>
+                <w:szCs w:val="24"/>
+              </w:rPr>
+            </w:pPr>
+            <w:r>
+              <w:rPr>
+                <w:rFonts w:eastAsiaTheme="majorEastAsia" w:cs="Times New Roman"/>
+                <w:bCs/>
+                <w:szCs w:val="24"/>
+              </w:rPr>
+              <w:t>Affirm</w:t>
+            </w:r>
+            <w:r>
+              <w:rPr>
+                <w:rFonts w:eastAsiaTheme="majorEastAsia" w:cs="Times New Roman"/>
+                <w:bCs/>
+                <w:szCs w:val="24"/>
+              </w:rPr>
+              <w:t>.</w:t>
+            </w:r>
+          </w:p>
+        </w:tc>
+        <w:tc>
+          <w:tcPr>
+            <w:tcW w:w="853" w:type="dxa"/>
+          </w:tcPr>
+          <w:p>
+            <w:pPr>
+              <w:spacing w:line="360" w:lineRule="auto"/>
+              <w:jc w:val="both"/>
+              <w:rPr>
+                <w:rFonts w:eastAsiaTheme="majorEastAsia" w:cs="Times New Roman"/>
+                <w:bCs/>
+                <w:szCs w:val="24"/>
+              </w:rPr>
+            </w:pPr>
+          </w:p>
+        </w:tc>
+        <w:tc>
+          <w:tcPr>
+            <w:tcW w:w="1009" w:type="dxa"/>
+          </w:tcPr>
+          <w:p>
+            <w:pPr>
+              <w:spacing w:line="360" w:lineRule="auto"/>
+              <w:jc w:val="both"/>
+              <w:rPr>
+                <w:rFonts w:eastAsiaTheme="majorEastAsia" w:cs="Times New Roman"/>
+                <w:bCs/>
+                <w:szCs w:val="24"/>
+              </w:rPr>
+            </w:pPr>
+            <w:r>
+              <w:rPr>
+                <w:rFonts w:eastAsiaTheme="majorEastAsia" w:cs="Times New Roman"/>
+                <w:bCs/>
+                <w:szCs w:val="24"/>
+              </w:rPr>
+              <w:t>Affirm</w:t>
+            </w:r>
+          </w:p>
+        </w:tc>
+        <w:tc>
+          <w:tcPr>
+            <w:tcW w:w="978" w:type="dxa"/>
+          </w:tcPr>
+          <w:p>
+            <w:pPr>
+              <w:spacing w:line="360" w:lineRule="auto"/>
+              <w:jc w:val="both"/>
+              <w:rPr>
+                <w:rFonts w:eastAsiaTheme="majorEastAsia" w:cs="Times New Roman"/>
+                <w:bCs/>
+                <w:szCs w:val="24"/>
+              </w:rPr>
+            </w:pPr>
+          </w:p>
+        </w:tc>
+        <w:tc>
+          <w:tcPr>
+            <w:tcW w:w="1883" w:type="dxa"/>
+          </w:tcPr>
+          <w:p>
+            <w:pPr>
+              <w:spacing w:line="360" w:lineRule="auto"/>
+              <w:jc w:val="both"/>
+              <w:rPr>
+                <w:rFonts w:eastAsiaTheme="majorEastAsia" w:cs="Times New Roman"/>
+                <w:bCs/>
+                <w:szCs w:val="24"/>
+              </w:rPr>
+            </w:pPr>
+            <w:r>
+              <w:rPr>
+                <w:rFonts w:eastAsiaTheme="majorEastAsia" w:cs="Times New Roman"/>
+                <w:bCs/>
+                <w:szCs w:val="24"/>
+              </w:rPr>
+              <w:t>The system is felt secured.</w:t>
+            </w:r>
+          </w:p>
+        </w:tc>
+      </w:tr>
+      <w:tr>
+        <w:tc>
+          <w:tcPr>
+            <w:tcW w:w="570" w:type="dxa"/>
+            <w:shd w:val="clear" w:color="auto" w:fill="FFFFFF" w:themeFill="background1"/>
+          </w:tcPr>
+          <w:p>
+            <w:pPr>
+              <w:spacing w:line="360" w:lineRule="auto"/>
+              <w:rPr>
+                <w:szCs w:val="24"/>
+                <w:shd w:val="clear" w:color="auto" w:fill="FFFFFF" w:themeFill="background1"/>
+              </w:rPr>
+            </w:pPr>
+            <w:r>
+              <w:rPr>
+                <w:szCs w:val="24"/>
+                <w:shd w:val="clear" w:color="auto" w:fill="FFFFFF" w:themeFill="background1"/>
+              </w:rPr>
+              <w:t>2.</w:t>
+            </w:r>
+          </w:p>
+        </w:tc>
+        <w:tc>
+          <w:tcPr>
+            <w:tcW w:w="2026" w:type="dxa"/>
+          </w:tcPr>
+          <w:p>
+            <w:pPr>
+              <w:spacing w:line="360" w:lineRule="auto"/>
+              <w:jc w:val="both"/>
+              <w:rPr>
+                <w:rFonts w:eastAsiaTheme="majorEastAsia" w:cs="Times New Roman"/>
+                <w:bCs/>
+                <w:szCs w:val="24"/>
+              </w:rPr>
+            </w:pPr>
+            <w:r>
+              <w:rPr>
+                <w:rFonts w:eastAsiaTheme="majorEastAsia" w:cs="Times New Roman"/>
+                <w:bCs/>
+                <w:szCs w:val="24"/>
+              </w:rPr>
+              <w:t>Results should be accurate</w:t>
+            </w:r>
+          </w:p>
+        </w:tc>
+        <w:tc>
+          <w:tcPr>
+            <w:tcW w:w="977" w:type="dxa"/>
+          </w:tcPr>
+          <w:p>
+            <w:pPr>
+              <w:spacing w:line="360" w:lineRule="auto"/>
+              <w:jc w:val="both"/>
+              <w:rPr>
+                <w:rFonts w:eastAsiaTheme="majorEastAsia" w:cs="Times New Roman"/>
+                <w:bCs/>
+                <w:szCs w:val="24"/>
+              </w:rPr>
+            </w:pPr>
+            <w:r>
+              <w:rPr>
+                <w:rFonts w:eastAsiaTheme="majorEastAsia" w:cs="Times New Roman"/>
+                <w:bCs/>
+                <w:szCs w:val="24"/>
+              </w:rPr>
+              <w:t>Affirm.</w:t>
+            </w:r>
+          </w:p>
+        </w:tc>
+        <w:tc>
+          <w:tcPr>
+            <w:tcW w:w="853" w:type="dxa"/>
+          </w:tcPr>
+          <w:p>
+            <w:pPr>
+              <w:spacing w:line="360" w:lineRule="auto"/>
+              <w:jc w:val="both"/>
+              <w:rPr>
+                <w:rFonts w:eastAsiaTheme="majorEastAsia" w:cs="Times New Roman"/>
+                <w:bCs/>
+                <w:szCs w:val="24"/>
+              </w:rPr>
+            </w:pPr>
+          </w:p>
+        </w:tc>
+        <w:tc>
+          <w:tcPr>
+            <w:tcW w:w="1009" w:type="dxa"/>
+          </w:tcPr>
+          <w:p>
+            <w:pPr>
+              <w:spacing w:line="360" w:lineRule="auto"/>
+              <w:jc w:val="both"/>
+              <w:rPr>
+                <w:rFonts w:eastAsiaTheme="majorEastAsia" w:cs="Times New Roman"/>
+                <w:bCs/>
+                <w:szCs w:val="24"/>
+              </w:rPr>
+            </w:pPr>
+            <w:r>
+              <w:rPr>
+                <w:rFonts w:eastAsiaTheme="majorEastAsia" w:cs="Times New Roman"/>
+                <w:bCs/>
+                <w:szCs w:val="24"/>
+              </w:rPr>
+              <w:t>Affirm.</w:t>
+            </w:r>
+          </w:p>
+        </w:tc>
+        <w:tc>
+          <w:tcPr>
+            <w:tcW w:w="978" w:type="dxa"/>
+          </w:tcPr>
+          <w:p>
+            <w:pPr>
+              <w:spacing w:line="360" w:lineRule="auto"/>
+              <w:jc w:val="both"/>
+              <w:rPr>
+                <w:rFonts w:eastAsiaTheme="majorEastAsia" w:cs="Times New Roman"/>
+                <w:bCs/>
+                <w:szCs w:val="24"/>
+              </w:rPr>
+            </w:pPr>
+          </w:p>
+        </w:tc>
+        <w:tc>
+          <w:tcPr>
+            <w:tcW w:w="1883" w:type="dxa"/>
+          </w:tcPr>
+          <w:p>
+            <w:pPr>
+              <w:spacing w:line="360" w:lineRule="auto"/>
+              <w:jc w:val="both"/>
+              <w:rPr>
+                <w:rFonts w:eastAsiaTheme="majorEastAsia" w:cs="Times New Roman"/>
+                <w:bCs/>
+                <w:szCs w:val="24"/>
+              </w:rPr>
+            </w:pPr>
+            <w:r>
+              <w:rPr>
+                <w:rFonts w:eastAsiaTheme="majorEastAsia" w:cs="Times New Roman"/>
+                <w:bCs/>
+                <w:szCs w:val="24"/>
+              </w:rPr>
+              <w:t>The results were correct</w:t>
+            </w:r>
+          </w:p>
+        </w:tc>
+      </w:tr>
+      <w:tr>
+        <w:tc>
+          <w:tcPr>
+            <w:tcW w:w="570" w:type="dxa"/>
+            <w:shd w:val="clear" w:color="auto" w:fill="FFFFFF" w:themeFill="background1"/>
+          </w:tcPr>
+          <w:p>
+            <w:pPr>
+              <w:spacing w:line="360" w:lineRule="auto"/>
+              <w:rPr>
+                <w:szCs w:val="24"/>
+                <w:shd w:val="clear" w:color="auto" w:fill="FFFFFF" w:themeFill="background1"/>
+              </w:rPr>
+            </w:pPr>
+            <w:r>
+              <w:rPr>
+                <w:szCs w:val="24"/>
+                <w:shd w:val="clear" w:color="auto" w:fill="FFFFFF" w:themeFill="background1"/>
+              </w:rPr>
+              <w:t>3.</w:t>
+            </w:r>
+          </w:p>
+        </w:tc>
+        <w:tc>
+          <w:tcPr>
+            <w:tcW w:w="2026" w:type="dxa"/>
+          </w:tcPr>
+          <w:p>
+            <w:pPr>
+              <w:spacing w:line="360" w:lineRule="auto"/>
+              <w:jc w:val="both"/>
+              <w:rPr>
+                <w:rFonts w:eastAsiaTheme="majorEastAsia" w:cs="Times New Roman"/>
+                <w:bCs/>
+                <w:szCs w:val="24"/>
+              </w:rPr>
+            </w:pPr>
+            <w:r>
+              <w:rPr>
+                <w:rFonts w:eastAsiaTheme="majorEastAsia" w:cs="Times New Roman"/>
+                <w:bCs/>
+                <w:szCs w:val="24"/>
+              </w:rPr>
+              <w:t>Scores should be maintained</w:t>
+            </w:r>
+          </w:p>
+        </w:tc>
+        <w:tc>
+          <w:tcPr>
+            <w:tcW w:w="977" w:type="dxa"/>
+          </w:tcPr>
+          <w:p>
+            <w:pPr>
+              <w:spacing w:line="360" w:lineRule="auto"/>
+              <w:jc w:val="both"/>
+              <w:rPr>
+                <w:rFonts w:eastAsiaTheme="majorEastAsia" w:cs="Times New Roman"/>
+                <w:bCs/>
+                <w:szCs w:val="24"/>
+              </w:rPr>
+            </w:pPr>
+            <w:r>
+              <w:rPr>
+                <w:rFonts w:eastAsiaTheme="majorEastAsia" w:cs="Times New Roman"/>
+                <w:bCs/>
+                <w:szCs w:val="24"/>
+              </w:rPr>
+              <w:t>Affirm</w:t>
+            </w:r>
+          </w:p>
+        </w:tc>
+        <w:tc>
+          <w:tcPr>
+            <w:tcW w:w="853" w:type="dxa"/>
+          </w:tcPr>
+          <w:p>
+            <w:pPr>
+              <w:spacing w:line="360" w:lineRule="auto"/>
+              <w:jc w:val="both"/>
+              <w:rPr>
+                <w:rFonts w:eastAsiaTheme="majorEastAsia" w:cs="Times New Roman"/>
+                <w:bCs/>
+                <w:szCs w:val="24"/>
+              </w:rPr>
+            </w:pPr>
+          </w:p>
+        </w:tc>
+        <w:tc>
+          <w:tcPr>
+            <w:tcW w:w="1009" w:type="dxa"/>
+          </w:tcPr>
+          <w:p>
+            <w:pPr>
+              <w:spacing w:line="360" w:lineRule="auto"/>
+              <w:jc w:val="both"/>
+              <w:rPr>
+                <w:rFonts w:eastAsiaTheme="majorEastAsia" w:cs="Times New Roman"/>
+                <w:bCs/>
+                <w:szCs w:val="24"/>
+              </w:rPr>
+            </w:pPr>
+            <w:r>
+              <w:rPr>
+                <w:rFonts w:eastAsiaTheme="majorEastAsia" w:cs="Times New Roman"/>
+                <w:bCs/>
+                <w:szCs w:val="24"/>
+              </w:rPr>
+              <w:t>Affirm</w:t>
+            </w:r>
+          </w:p>
+        </w:tc>
+        <w:tc>
+          <w:tcPr>
+            <w:tcW w:w="978" w:type="dxa"/>
+          </w:tcPr>
+          <w:p>
+            <w:pPr>
+              <w:spacing w:line="360" w:lineRule="auto"/>
+              <w:jc w:val="both"/>
+              <w:rPr>
+                <w:rFonts w:eastAsiaTheme="majorEastAsia" w:cs="Times New Roman"/>
+                <w:bCs/>
+                <w:szCs w:val="24"/>
+              </w:rPr>
+            </w:pPr>
+          </w:p>
+        </w:tc>
+        <w:tc>
+          <w:tcPr>
+            <w:tcW w:w="1883" w:type="dxa"/>
+          </w:tcPr>
+          <w:p>
+            <w:pPr>
+              <w:spacing w:line="360" w:lineRule="auto"/>
+              <w:jc w:val="both"/>
+              <w:rPr>
+                <w:rFonts w:eastAsiaTheme="majorEastAsia" w:cs="Times New Roman"/>
+                <w:bCs/>
+                <w:szCs w:val="24"/>
+              </w:rPr>
+            </w:pPr>
+            <w:r>
+              <w:rPr>
+                <w:rFonts w:eastAsiaTheme="majorEastAsia" w:cs="Times New Roman"/>
+                <w:bCs/>
+                <w:szCs w:val="24"/>
+              </w:rPr>
+              <w:t>Score tracking works correctly</w:t>
+            </w:r>
+          </w:p>
+        </w:tc>
+      </w:tr>
+    </w:tbl>
+    <w:p>
+      <w:pPr>
+        <w:pStyle w:val="Heading1"/>
+        <w:spacing w:after="0" w:line="360" w:lineRule="auto"/>
+        <w:jc w:val="both"/>
+        <w:rPr>
+          <w:color w:val="FF0000"/>
+        </w:rPr>
+      </w:pPr>
+    </w:p>
+    <w:p>
+      <w:pPr>
+        <w:rPr>
+          <w:lang w:val="en-US"/>
+        </w:rPr>
+      </w:pPr>
+    </w:p>
+    <w:p>
+      <w:pPr>
+        <w:rPr>
+          <w:lang w:val="en-US"/>
+        </w:rPr>
+      </w:pPr>
+    </w:p>
+    <w:p>
+      <w:pPr>
+        <w:rPr>
+          <w:lang w:val="en-US"/>
         </w:rPr>
       </w:pPr>
     </w:p>
@@ -7947,6 +11173,7 @@
     <w:p/>
     <w:p/>
     <w:p/>
+    <w:p/>
     <w:p>
       <w:pPr>
         <w:rPr>
@@ -8040,6 +11267,7 @@
     </w:p>
     <w:p>
       <w:r>
+        <w:lastRenderedPageBreak/>
         <w:br w:type="page"/>
       </w:r>
     </w:p>
@@ -8094,7 +11322,7 @@
 </file>
 
 <file path=word/endnotes.xml><?xml version="1.0" encoding="utf-8"?>
-<w:endnotes xmlns:wpc="http://schemas.microsoft.com/office/word/2010/wordprocessingCanvas" xmlns:mc="http://schemas.openxmlformats.org/markup-compatibility/2006" xmlns:o="urn:schemas-microsoft-com:office:office" xmlns:r="http://schemas.openxmlformats.org/officeDocument/2006/relationships" xmlns:m="http://schemas.openxmlformats.org/officeDocument/2006/math" xmlns:v="urn:schemas-microsoft-com:vml" xmlns:wp14="http://schemas.microsoft.com/office/word/2010/wordprocessingDrawing" xmlns:wp="http://schemas.openxmlformats.org/drawingml/2006/wordprocessingDrawing" xmlns:w10="urn:schemas-microsoft-com:office:word" xmlns:w="http://schemas.openxmlformats.org/wordprocessingml/2006/main" xmlns:w14="http://schemas.microsoft.com/office/word/2010/wordml" xmlns:w15="http://schemas.microsoft.com/office/word/2012/wordml" xmlns:wpg="http://schemas.microsoft.com/office/word/2010/wordprocessingGroup" xmlns:wpi="http://schemas.microsoft.com/office/word/2010/wordprocessingInk" xmlns:wne="http://schemas.microsoft.com/office/word/2006/wordml" xmlns:wps="http://schemas.microsoft.com/office/word/2010/wordprocessingShape" mc:Ignorable="w14 w15 wp14">
+<w:endnotes xmlns:wpc="http://schemas.microsoft.com/office/word/2010/wordprocessingCanvas" xmlns:cx="http://schemas.microsoft.com/office/drawing/2014/chartex" xmlns:cx1="http://schemas.microsoft.com/office/drawing/2015/9/8/chartex" xmlns:cx2="http://schemas.microsoft.com/office/drawing/2015/10/21/chartex" xmlns:cx3="http://schemas.microsoft.com/office/drawing/2016/5/9/chartex" xmlns:cx4="http://schemas.microsoft.com/office/drawing/2016/5/10/chartex" xmlns:cx5="http://schemas.microsoft.com/office/drawing/2016/5/11/chartex" xmlns:cx6="http://schemas.microsoft.com/office/drawing/2016/5/12/chartex" xmlns:cx7="http://schemas.microsoft.com/office/drawing/2016/5/13/chartex" xmlns:cx8="http://schemas.microsoft.com/office/drawing/2016/5/14/chartex" xmlns:mc="http://schemas.openxmlformats.org/markup-compatibility/2006" xmlns:aink="http://schemas.microsoft.com/office/drawing/2016/ink" xmlns:am3d="http://schemas.microsoft.com/office/drawing/2017/model3d" xmlns:o="urn:schemas-microsoft-com:office:office" xmlns:oel="http://schemas.microsoft.com/office/2019/extlst" xmlns:r="http://schemas.openxmlformats.org/officeDocument/2006/relationships" xmlns:m="http://schemas.openxmlformats.org/officeDocument/2006/math" xmlns:v="urn:schemas-microsoft-com:vml" xmlns:wp14="http://schemas.microsoft.com/office/word/2010/wordprocessingDrawing" xmlns:wp="http://schemas.openxmlformats.org/drawingml/2006/wordprocessingDrawing" xmlns:w10="urn:schemas-microsoft-com:office:word" xmlns:w="http://schemas.openxmlformats.org/wordprocessingml/2006/main" xmlns:w14="http://schemas.microsoft.com/office/word/2010/wordml" xmlns:w15="http://schemas.microsoft.com/office/word/2012/wordml" xmlns:w16cex="http://schemas.microsoft.com/office/word/2018/wordml/cex" xmlns:w16cid="http://schemas.microsoft.com/office/word/2016/wordml/cid" xmlns:w16="http://schemas.microsoft.com/office/word/2018/wordml" xmlns:w16du="http://schemas.microsoft.com/office/word/2023/wordml/word16du" xmlns:w16sdtdh="http://schemas.microsoft.com/office/word/2020/wordml/sdtdatahash" xmlns:w16sdtfl="http://schemas.microsoft.com/office/word/2024/wordml/sdtformatlock" xmlns:w16se="http://schemas.microsoft.com/office/word/2015/wordml/symex" xmlns:wpg="http://schemas.microsoft.com/office/word/2010/wordprocessingGroup" xmlns:wpi="http://schemas.microsoft.com/office/word/2010/wordprocessingInk" xmlns:wne="http://schemas.microsoft.com/office/word/2006/wordml" xmlns:wps="http://schemas.microsoft.com/office/word/2010/wordprocessingShape" mc:Ignorable="w14 w15 w16se w16cid w16 w16cex w16sdtdh w16sdtfl w16du wp14">
   <w:endnote w:type="separator" w:id="-1">
     <w:p>
       <w:pPr>
@@ -8119,7 +11347,7 @@
 </file>
 
 <file path=word/footer1.xml><?xml version="1.0" encoding="utf-8"?>
-<w:ftr xmlns:wpc="http://schemas.microsoft.com/office/word/2010/wordprocessingCanvas" xmlns:mc="http://schemas.openxmlformats.org/markup-compatibility/2006" xmlns:o="urn:schemas-microsoft-com:office:office" xmlns:r="http://schemas.openxmlformats.org/officeDocument/2006/relationships" xmlns:m="http://schemas.openxmlformats.org/officeDocument/2006/math" xmlns:v="urn:schemas-microsoft-com:vml" xmlns:wp14="http://schemas.microsoft.com/office/word/2010/wordprocessingDrawing" xmlns:wp="http://schemas.openxmlformats.org/drawingml/2006/wordprocessingDrawing" xmlns:w10="urn:schemas-microsoft-com:office:word" xmlns:w="http://schemas.openxmlformats.org/wordprocessingml/2006/main" xmlns:w14="http://schemas.microsoft.com/office/word/2010/wordml" xmlns:w15="http://schemas.microsoft.com/office/word/2012/wordml" xmlns:wpg="http://schemas.microsoft.com/office/word/2010/wordprocessingGroup" xmlns:wpi="http://schemas.microsoft.com/office/word/2010/wordprocessingInk" xmlns:wne="http://schemas.microsoft.com/office/word/2006/wordml" xmlns:wps="http://schemas.microsoft.com/office/word/2010/wordprocessingShape" mc:Ignorable="w14 w15 wp14">
+<w:ftr xmlns:wpc="http://schemas.microsoft.com/office/word/2010/wordprocessingCanvas" xmlns:cx="http://schemas.microsoft.com/office/drawing/2014/chartex" xmlns:cx1="http://schemas.microsoft.com/office/drawing/2015/9/8/chartex" xmlns:cx2="http://schemas.microsoft.com/office/drawing/2015/10/21/chartex" xmlns:cx3="http://schemas.microsoft.com/office/drawing/2016/5/9/chartex" xmlns:cx4="http://schemas.microsoft.com/office/drawing/2016/5/10/chartex" xmlns:cx5="http://schemas.microsoft.com/office/drawing/2016/5/11/chartex" xmlns:cx6="http://schemas.microsoft.com/office/drawing/2016/5/12/chartex" xmlns:cx7="http://schemas.microsoft.com/office/drawing/2016/5/13/chartex" xmlns:cx8="http://schemas.microsoft.com/office/drawing/2016/5/14/chartex" xmlns:mc="http://schemas.openxmlformats.org/markup-compatibility/2006" xmlns:aink="http://schemas.microsoft.com/office/drawing/2016/ink" xmlns:am3d="http://schemas.microsoft.com/office/drawing/2017/model3d" xmlns:o="urn:schemas-microsoft-com:office:office" xmlns:oel="http://schemas.microsoft.com/office/2019/extlst" xmlns:r="http://schemas.openxmlformats.org/officeDocument/2006/relationships" xmlns:m="http://schemas.openxmlformats.org/officeDocument/2006/math" xmlns:v="urn:schemas-microsoft-com:vml" xmlns:wp14="http://schemas.microsoft.com/office/word/2010/wordprocessingDrawing" xmlns:wp="http://schemas.openxmlformats.org/drawingml/2006/wordprocessingDrawing" xmlns:w10="urn:schemas-microsoft-com:office:word" xmlns:w="http://schemas.openxmlformats.org/wordprocessingml/2006/main" xmlns:w14="http://schemas.microsoft.com/office/word/2010/wordml" xmlns:w15="http://schemas.microsoft.com/office/word/2012/wordml" xmlns:w16cex="http://schemas.microsoft.com/office/word/2018/wordml/cex" xmlns:w16cid="http://schemas.microsoft.com/office/word/2016/wordml/cid" xmlns:w16="http://schemas.microsoft.com/office/word/2018/wordml" xmlns:w16du="http://schemas.microsoft.com/office/word/2023/wordml/word16du" xmlns:w16sdtdh="http://schemas.microsoft.com/office/word/2020/wordml/sdtdatahash" xmlns:w16sdtfl="http://schemas.microsoft.com/office/word/2024/wordml/sdtformatlock" xmlns:w16se="http://schemas.microsoft.com/office/word/2015/wordml/symex" xmlns:wpg="http://schemas.microsoft.com/office/word/2010/wordprocessingGroup" xmlns:wpi="http://schemas.microsoft.com/office/word/2010/wordprocessingInk" xmlns:wne="http://schemas.microsoft.com/office/word/2006/wordml" xmlns:wps="http://schemas.microsoft.com/office/word/2010/wordprocessingShape" mc:Ignorable="w14 w15 w16se w16cid w16 w16cex w16sdtdh w16sdtfl w16du wp14">
   <w:sdt>
     <w:sdtPr>
       <w:id w:val="1769740165"/>
@@ -8172,7 +11400,7 @@
 </file>
 
 <file path=word/footnotes.xml><?xml version="1.0" encoding="utf-8"?>
-<w:footnotes xmlns:wpc="http://schemas.microsoft.com/office/word/2010/wordprocessingCanvas" xmlns:mc="http://schemas.openxmlformats.org/markup-compatibility/2006" xmlns:o="urn:schemas-microsoft-com:office:office" xmlns:r="http://schemas.openxmlformats.org/officeDocument/2006/relationships" xmlns:m="http://schemas.openxmlformats.org/officeDocument/2006/math" xmlns:v="urn:schemas-microsoft-com:vml" xmlns:wp14="http://schemas.microsoft.com/office/word/2010/wordprocessingDrawing" xmlns:wp="http://schemas.openxmlformats.org/drawingml/2006/wordprocessingDrawing" xmlns:w10="urn:schemas-microsoft-com:office:word" xmlns:w="http://schemas.openxmlformats.org/wordprocessingml/2006/main" xmlns:w14="http://schemas.microsoft.com/office/word/2010/wordml" xmlns:w15="http://schemas.microsoft.com/office/word/2012/wordml" xmlns:wpg="http://schemas.microsoft.com/office/word/2010/wordprocessingGroup" xmlns:wpi="http://schemas.microsoft.com/office/word/2010/wordprocessingInk" xmlns:wne="http://schemas.microsoft.com/office/word/2006/wordml" xmlns:wps="http://schemas.microsoft.com/office/word/2010/wordprocessingShape" mc:Ignorable="w14 w15 wp14">
+<w:footnotes xmlns:wpc="http://schemas.microsoft.com/office/word/2010/wordprocessingCanvas" xmlns:cx="http://schemas.microsoft.com/office/drawing/2014/chartex" xmlns:cx1="http://schemas.microsoft.com/office/drawing/2015/9/8/chartex" xmlns:cx2="http://schemas.microsoft.com/office/drawing/2015/10/21/chartex" xmlns:cx3="http://schemas.microsoft.com/office/drawing/2016/5/9/chartex" xmlns:cx4="http://schemas.microsoft.com/office/drawing/2016/5/10/chartex" xmlns:cx5="http://schemas.microsoft.com/office/drawing/2016/5/11/chartex" xmlns:cx6="http://schemas.microsoft.com/office/drawing/2016/5/12/chartex" xmlns:cx7="http://schemas.microsoft.com/office/drawing/2016/5/13/chartex" xmlns:cx8="http://schemas.microsoft.com/office/drawing/2016/5/14/chartex" xmlns:mc="http://schemas.openxmlformats.org/markup-compatibility/2006" xmlns:aink="http://schemas.microsoft.com/office/drawing/2016/ink" xmlns:am3d="http://schemas.microsoft.com/office/drawing/2017/model3d" xmlns:o="urn:schemas-microsoft-com:office:office" xmlns:oel="http://schemas.microsoft.com/office/2019/extlst" xmlns:r="http://schemas.openxmlformats.org/officeDocument/2006/relationships" xmlns:m="http://schemas.openxmlformats.org/officeDocument/2006/math" xmlns:v="urn:schemas-microsoft-com:vml" xmlns:wp14="http://schemas.microsoft.com/office/word/2010/wordprocessingDrawing" xmlns:wp="http://schemas.openxmlformats.org/drawingml/2006/wordprocessingDrawing" xmlns:w10="urn:schemas-microsoft-com:office:word" xmlns:w="http://schemas.openxmlformats.org/wordprocessingml/2006/main" xmlns:w14="http://schemas.microsoft.com/office/word/2010/wordml" xmlns:w15="http://schemas.microsoft.com/office/word/2012/wordml" xmlns:w16cex="http://schemas.microsoft.com/office/word/2018/wordml/cex" xmlns:w16cid="http://schemas.microsoft.com/office/word/2016/wordml/cid" xmlns:w16="http://schemas.microsoft.com/office/word/2018/wordml" xmlns:w16du="http://schemas.microsoft.com/office/word/2023/wordml/word16du" xmlns:w16sdtdh="http://schemas.microsoft.com/office/word/2020/wordml/sdtdatahash" xmlns:w16sdtfl="http://schemas.microsoft.com/office/word/2024/wordml/sdtformatlock" xmlns:w16se="http://schemas.microsoft.com/office/word/2015/wordml/symex" xmlns:wpg="http://schemas.microsoft.com/office/word/2010/wordprocessingGroup" xmlns:wpi="http://schemas.microsoft.com/office/word/2010/wordprocessingInk" xmlns:wne="http://schemas.microsoft.com/office/word/2006/wordml" xmlns:wps="http://schemas.microsoft.com/office/word/2010/wordprocessingShape" mc:Ignorable="w14 w15 w16se w16cid w16 w16cex w16sdtdh w16sdtfl w16du wp14">
   <w:footnote w:type="separator" w:id="-1">
     <w:p>
       <w:pPr>
@@ -8197,8 +11425,8 @@
 </file>
 
 <file path=word/numbering.xml><?xml version="1.0" encoding="utf-8"?>
-<w:numbering xmlns:wpc="http://schemas.microsoft.com/office/word/2010/wordprocessingCanvas" xmlns:mc="http://schemas.openxmlformats.org/markup-compatibility/2006" xmlns:o="urn:schemas-microsoft-com:office:office" xmlns:r="http://schemas.openxmlformats.org/officeDocument/2006/relationships" xmlns:m="http://schemas.openxmlformats.org/officeDocument/2006/math" xmlns:v="urn:schemas-microsoft-com:vml" xmlns:wp14="http://schemas.microsoft.com/office/word/2010/wordprocessingDrawing" xmlns:wp="http://schemas.openxmlformats.org/drawingml/2006/wordprocessingDrawing" xmlns:w10="urn:schemas-microsoft-com:office:word" xmlns:w="http://schemas.openxmlformats.org/wordprocessingml/2006/main" xmlns:w14="http://schemas.microsoft.com/office/word/2010/wordml" xmlns:w15="http://schemas.microsoft.com/office/word/2012/wordml" xmlns:wpg="http://schemas.microsoft.com/office/word/2010/wordprocessingGroup" xmlns:wpi="http://schemas.microsoft.com/office/word/2010/wordprocessingInk" xmlns:wne="http://schemas.microsoft.com/office/word/2006/wordml" xmlns:wps="http://schemas.microsoft.com/office/word/2010/wordprocessingShape" mc:Ignorable="w14 w15 wp14">
-  <w:abstractNum w:abstractNumId="0">
+<w:numbering xmlns:wpc="http://schemas.microsoft.com/office/word/2010/wordprocessingCanvas" xmlns:cx="http://schemas.microsoft.com/office/drawing/2014/chartex" xmlns:cx1="http://schemas.microsoft.com/office/drawing/2015/9/8/chartex" xmlns:cx2="http://schemas.microsoft.com/office/drawing/2015/10/21/chartex" xmlns:cx3="http://schemas.microsoft.com/office/drawing/2016/5/9/chartex" xmlns:cx4="http://schemas.microsoft.com/office/drawing/2016/5/10/chartex" xmlns:cx5="http://schemas.microsoft.com/office/drawing/2016/5/11/chartex" xmlns:cx6="http://schemas.microsoft.com/office/drawing/2016/5/12/chartex" xmlns:cx7="http://schemas.microsoft.com/office/drawing/2016/5/13/chartex" xmlns:cx8="http://schemas.microsoft.com/office/drawing/2016/5/14/chartex" xmlns:mc="http://schemas.openxmlformats.org/markup-compatibility/2006" xmlns:aink="http://schemas.microsoft.com/office/drawing/2016/ink" xmlns:am3d="http://schemas.microsoft.com/office/drawing/2017/model3d" xmlns:o="urn:schemas-microsoft-com:office:office" xmlns:oel="http://schemas.microsoft.com/office/2019/extlst" xmlns:r="http://schemas.openxmlformats.org/officeDocument/2006/relationships" xmlns:m="http://schemas.openxmlformats.org/officeDocument/2006/math" xmlns:v="urn:schemas-microsoft-com:vml" xmlns:wp14="http://schemas.microsoft.com/office/word/2010/wordprocessingDrawing" xmlns:wp="http://schemas.openxmlformats.org/drawingml/2006/wordprocessingDrawing" xmlns:w10="urn:schemas-microsoft-com:office:word" xmlns:w="http://schemas.openxmlformats.org/wordprocessingml/2006/main" xmlns:w14="http://schemas.microsoft.com/office/word/2010/wordml" xmlns:w15="http://schemas.microsoft.com/office/word/2012/wordml" xmlns:w16cex="http://schemas.microsoft.com/office/word/2018/wordml/cex" xmlns:w16cid="http://schemas.microsoft.com/office/word/2016/wordml/cid" xmlns:w16="http://schemas.microsoft.com/office/word/2018/wordml" xmlns:w16du="http://schemas.microsoft.com/office/word/2023/wordml/word16du" xmlns:w16sdtdh="http://schemas.microsoft.com/office/word/2020/wordml/sdtdatahash" xmlns:w16sdtfl="http://schemas.microsoft.com/office/word/2024/wordml/sdtformatlock" xmlns:w16se="http://schemas.microsoft.com/office/word/2015/wordml/symex" xmlns:wpg="http://schemas.microsoft.com/office/word/2010/wordprocessingGroup" xmlns:wpi="http://schemas.microsoft.com/office/word/2010/wordprocessingInk" xmlns:wne="http://schemas.microsoft.com/office/word/2006/wordml" xmlns:wps="http://schemas.microsoft.com/office/word/2010/wordprocessingShape" mc:Ignorable="w14 w15 w16se w16cid w16 w16cex w16sdtdh w16sdtfl w16du wp14">
+  <w:abstractNum w:abstractNumId="0" w15:restartNumberingAfterBreak="0">
     <w:nsid w:val="02AF2FA9"/>
     <w:multiLevelType w:val="hybridMultilevel"/>
     <w:tmpl w:val="26E0B6EA"/>
@@ -8311,7 +11539,7 @@
       </w:rPr>
     </w:lvl>
   </w:abstractNum>
-  <w:abstractNum w:abstractNumId="1">
+  <w:abstractNum w:abstractNumId="1" w15:restartNumberingAfterBreak="0">
     <w:nsid w:val="04710410"/>
     <w:multiLevelType w:val="hybridMultilevel"/>
     <w:tmpl w:val="1A20C2C2"/>
@@ -8424,7 +11652,7 @@
       </w:rPr>
     </w:lvl>
   </w:abstractNum>
-  <w:abstractNum w:abstractNumId="2">
+  <w:abstractNum w:abstractNumId="2" w15:restartNumberingAfterBreak="0">
     <w:nsid w:val="08F018C5"/>
     <w:multiLevelType w:val="hybridMultilevel"/>
     <w:tmpl w:val="F5F20FAA"/>
@@ -8537,7 +11765,7 @@
       </w:rPr>
     </w:lvl>
   </w:abstractNum>
-  <w:abstractNum w:abstractNumId="3">
+  <w:abstractNum w:abstractNumId="3" w15:restartNumberingAfterBreak="0">
     <w:nsid w:val="0E022743"/>
     <w:multiLevelType w:val="hybridMultilevel"/>
     <w:tmpl w:val="FCAAA680"/>
@@ -8626,7 +11854,7 @@
       </w:pPr>
     </w:lvl>
   </w:abstractNum>
-  <w:abstractNum w:abstractNumId="4">
+  <w:abstractNum w:abstractNumId="4" w15:restartNumberingAfterBreak="0">
     <w:nsid w:val="0FA97372"/>
     <w:multiLevelType w:val="multilevel"/>
     <w:tmpl w:val="7C181842"/>
@@ -8739,7 +11967,7 @@
       </w:rPr>
     </w:lvl>
   </w:abstractNum>
-  <w:abstractNum w:abstractNumId="5">
+  <w:abstractNum w:abstractNumId="5" w15:restartNumberingAfterBreak="0">
     <w:nsid w:val="11080D9D"/>
     <w:multiLevelType w:val="multilevel"/>
     <w:tmpl w:val="DB1C7804"/>
@@ -8888,7 +12116,7 @@
       </w:rPr>
     </w:lvl>
   </w:abstractNum>
-  <w:abstractNum w:abstractNumId="6">
+  <w:abstractNum w:abstractNumId="6" w15:restartNumberingAfterBreak="0">
     <w:nsid w:val="112A3736"/>
     <w:multiLevelType w:val="hybridMultilevel"/>
     <w:tmpl w:val="AC8C2C88"/>
@@ -9001,7 +12229,7 @@
       </w:rPr>
     </w:lvl>
   </w:abstractNum>
-  <w:abstractNum w:abstractNumId="7">
+  <w:abstractNum w:abstractNumId="7" w15:restartNumberingAfterBreak="0">
     <w:nsid w:val="16737223"/>
     <w:multiLevelType w:val="hybridMultilevel"/>
     <w:tmpl w:val="E1A62552"/>
@@ -9114,7 +12342,7 @@
       </w:rPr>
     </w:lvl>
   </w:abstractNum>
-  <w:abstractNum w:abstractNumId="8">
+  <w:abstractNum w:abstractNumId="8" w15:restartNumberingAfterBreak="0">
     <w:nsid w:val="1AB84912"/>
     <w:multiLevelType w:val="multilevel"/>
     <w:tmpl w:val="B6489DF0"/>
@@ -9232,7 +12460,7 @@
       </w:rPr>
     </w:lvl>
   </w:abstractNum>
-  <w:abstractNum w:abstractNumId="9">
+  <w:abstractNum w:abstractNumId="9" w15:restartNumberingAfterBreak="0">
     <w:nsid w:val="1D1574F5"/>
     <w:multiLevelType w:val="hybridMultilevel"/>
     <w:tmpl w:val="51DE0FC4"/>
@@ -9345,7 +12573,7 @@
       </w:rPr>
     </w:lvl>
   </w:abstractNum>
-  <w:abstractNum w:abstractNumId="10">
+  <w:abstractNum w:abstractNumId="10" w15:restartNumberingAfterBreak="0">
     <w:nsid w:val="1F5B20BF"/>
     <w:multiLevelType w:val="hybridMultilevel"/>
     <w:tmpl w:val="0B148300"/>
@@ -9431,7 +12659,7 @@
       </w:pPr>
     </w:lvl>
   </w:abstractNum>
-  <w:abstractNum w:abstractNumId="11">
+  <w:abstractNum w:abstractNumId="11" w15:restartNumberingAfterBreak="0">
     <w:nsid w:val="230E7A72"/>
     <w:multiLevelType w:val="hybridMultilevel"/>
     <w:tmpl w:val="D14E5DB6"/>
@@ -9520,7 +12748,7 @@
       </w:pPr>
     </w:lvl>
   </w:abstractNum>
-  <w:abstractNum w:abstractNumId="12">
+  <w:abstractNum w:abstractNumId="12" w15:restartNumberingAfterBreak="0">
     <w:nsid w:val="28D53AAE"/>
     <w:multiLevelType w:val="multilevel"/>
     <w:tmpl w:val="E0D85A56"/>
@@ -9641,7 +12869,7 @@
       </w:rPr>
     </w:lvl>
   </w:abstractNum>
-  <w:abstractNum w:abstractNumId="13">
+  <w:abstractNum w:abstractNumId="13" w15:restartNumberingAfterBreak="0">
     <w:nsid w:val="29DB7099"/>
     <w:multiLevelType w:val="multilevel"/>
     <w:tmpl w:val="D360899E"/>
@@ -9790,7 +13018,7 @@
       </w:rPr>
     </w:lvl>
   </w:abstractNum>
-  <w:abstractNum w:abstractNumId="14">
+  <w:abstractNum w:abstractNumId="14" w15:restartNumberingAfterBreak="0">
     <w:nsid w:val="2BC606F8"/>
     <w:multiLevelType w:val="hybridMultilevel"/>
     <w:tmpl w:val="02CE1BBA"/>
@@ -9879,7 +13107,7 @@
       </w:pPr>
     </w:lvl>
   </w:abstractNum>
-  <w:abstractNum w:abstractNumId="15">
+  <w:abstractNum w:abstractNumId="15" w15:restartNumberingAfterBreak="0">
     <w:nsid w:val="2E9B1B58"/>
     <w:multiLevelType w:val="hybridMultilevel"/>
     <w:tmpl w:val="7AAEFB44"/>
@@ -9992,7 +13220,7 @@
       </w:rPr>
     </w:lvl>
   </w:abstractNum>
-  <w:abstractNum w:abstractNumId="16">
+  <w:abstractNum w:abstractNumId="16" w15:restartNumberingAfterBreak="0">
     <w:nsid w:val="304450E7"/>
     <w:multiLevelType w:val="hybridMultilevel"/>
     <w:tmpl w:val="179C1F3A"/>
@@ -10081,7 +13309,7 @@
       </w:pPr>
     </w:lvl>
   </w:abstractNum>
-  <w:abstractNum w:abstractNumId="17">
+  <w:abstractNum w:abstractNumId="17" w15:restartNumberingAfterBreak="0">
     <w:nsid w:val="354143F8"/>
     <w:multiLevelType w:val="hybridMultilevel"/>
     <w:tmpl w:val="80A26312"/>
@@ -10194,7 +13422,7 @@
       </w:rPr>
     </w:lvl>
   </w:abstractNum>
-  <w:abstractNum w:abstractNumId="18">
+  <w:abstractNum w:abstractNumId="18" w15:restartNumberingAfterBreak="0">
     <w:nsid w:val="37B976D2"/>
     <w:multiLevelType w:val="hybridMultilevel"/>
     <w:tmpl w:val="C686B4C6"/>
@@ -10283,7 +13511,7 @@
       </w:pPr>
     </w:lvl>
   </w:abstractNum>
-  <w:abstractNum w:abstractNumId="19">
+  <w:abstractNum w:abstractNumId="19" w15:restartNumberingAfterBreak="0">
     <w:nsid w:val="3A103230"/>
     <w:multiLevelType w:val="hybridMultilevel"/>
     <w:tmpl w:val="420E5E74"/>
@@ -10372,7 +13600,7 @@
       </w:pPr>
     </w:lvl>
   </w:abstractNum>
-  <w:abstractNum w:abstractNumId="20">
+  <w:abstractNum w:abstractNumId="20" w15:restartNumberingAfterBreak="0">
     <w:nsid w:val="3CAA7D00"/>
     <w:multiLevelType w:val="hybridMultilevel"/>
     <w:tmpl w:val="7FAE95B6"/>
@@ -10485,7 +13713,7 @@
       </w:rPr>
     </w:lvl>
   </w:abstractNum>
-  <w:abstractNum w:abstractNumId="21">
+  <w:abstractNum w:abstractNumId="21" w15:restartNumberingAfterBreak="0">
     <w:nsid w:val="3D85501A"/>
     <w:multiLevelType w:val="hybridMultilevel"/>
     <w:tmpl w:val="7ED8929C"/>
@@ -10571,7 +13799,7 @@
       </w:pPr>
     </w:lvl>
   </w:abstractNum>
-  <w:abstractNum w:abstractNumId="22">
+  <w:abstractNum w:abstractNumId="22" w15:restartNumberingAfterBreak="0">
     <w:nsid w:val="3E057983"/>
     <w:multiLevelType w:val="hybridMultilevel"/>
     <w:tmpl w:val="B37E624E"/>
@@ -10684,7 +13912,7 @@
       </w:rPr>
     </w:lvl>
   </w:abstractNum>
-  <w:abstractNum w:abstractNumId="23">
+  <w:abstractNum w:abstractNumId="23" w15:restartNumberingAfterBreak="0">
     <w:nsid w:val="40EC6F4B"/>
     <w:multiLevelType w:val="hybridMultilevel"/>
     <w:tmpl w:val="CCFC8B78"/>
@@ -10797,7 +14025,7 @@
       </w:rPr>
     </w:lvl>
   </w:abstractNum>
-  <w:abstractNum w:abstractNumId="24">
+  <w:abstractNum w:abstractNumId="24" w15:restartNumberingAfterBreak="0">
     <w:nsid w:val="42FA2D85"/>
     <w:multiLevelType w:val="hybridMultilevel"/>
     <w:tmpl w:val="F1D89E2E"/>
@@ -10910,7 +14138,7 @@
       </w:rPr>
     </w:lvl>
   </w:abstractNum>
-  <w:abstractNum w:abstractNumId="25">
+  <w:abstractNum w:abstractNumId="25" w15:restartNumberingAfterBreak="0">
     <w:nsid w:val="45022324"/>
     <w:multiLevelType w:val="hybridMultilevel"/>
     <w:tmpl w:val="FD901576"/>
@@ -10999,7 +14227,7 @@
       </w:pPr>
     </w:lvl>
   </w:abstractNum>
-  <w:abstractNum w:abstractNumId="26">
+  <w:abstractNum w:abstractNumId="26" w15:restartNumberingAfterBreak="0">
     <w:nsid w:val="506753AC"/>
     <w:multiLevelType w:val="multilevel"/>
     <w:tmpl w:val="61100354"/>
@@ -11148,7 +14376,7 @@
       </w:rPr>
     </w:lvl>
   </w:abstractNum>
-  <w:abstractNum w:abstractNumId="27">
+  <w:abstractNum w:abstractNumId="27" w15:restartNumberingAfterBreak="0">
     <w:nsid w:val="510C12AC"/>
     <w:multiLevelType w:val="hybridMultilevel"/>
     <w:tmpl w:val="1EECA868"/>
@@ -11261,7 +14489,7 @@
       </w:rPr>
     </w:lvl>
   </w:abstractNum>
-  <w:abstractNum w:abstractNumId="28">
+  <w:abstractNum w:abstractNumId="28" w15:restartNumberingAfterBreak="0">
     <w:nsid w:val="582375CB"/>
     <w:multiLevelType w:val="hybridMultilevel"/>
     <w:tmpl w:val="8FA6697A"/>
@@ -11374,7 +14602,7 @@
       </w:rPr>
     </w:lvl>
   </w:abstractNum>
-  <w:abstractNum w:abstractNumId="29">
+  <w:abstractNum w:abstractNumId="29" w15:restartNumberingAfterBreak="0">
     <w:nsid w:val="59916BA6"/>
     <w:multiLevelType w:val="hybridMultilevel"/>
     <w:tmpl w:val="15280794"/>
@@ -11487,7 +14715,7 @@
       </w:rPr>
     </w:lvl>
   </w:abstractNum>
-  <w:abstractNum w:abstractNumId="30">
+  <w:abstractNum w:abstractNumId="30" w15:restartNumberingAfterBreak="0">
     <w:nsid w:val="5CFE4A2C"/>
     <w:multiLevelType w:val="hybridMultilevel"/>
     <w:tmpl w:val="07B62302"/>
@@ -11576,7 +14804,7 @@
       </w:pPr>
     </w:lvl>
   </w:abstractNum>
-  <w:abstractNum w:abstractNumId="31">
+  <w:abstractNum w:abstractNumId="31" w15:restartNumberingAfterBreak="0">
     <w:nsid w:val="5EE54FC1"/>
     <w:multiLevelType w:val="hybridMultilevel"/>
     <w:tmpl w:val="DA84BB5A"/>
@@ -11689,7 +14917,7 @@
       </w:rPr>
     </w:lvl>
   </w:abstractNum>
-  <w:abstractNum w:abstractNumId="32">
+  <w:abstractNum w:abstractNumId="32" w15:restartNumberingAfterBreak="0">
     <w:nsid w:val="60975DAC"/>
     <w:multiLevelType w:val="multilevel"/>
     <w:tmpl w:val="5F7805AA"/>
@@ -11811,7 +15039,7 @@
       </w:rPr>
     </w:lvl>
   </w:abstractNum>
-  <w:abstractNum w:abstractNumId="33">
+  <w:abstractNum w:abstractNumId="33" w15:restartNumberingAfterBreak="0">
     <w:nsid w:val="60B12A81"/>
     <w:multiLevelType w:val="multilevel"/>
     <w:tmpl w:val="BBE6D7CC"/>
@@ -11960,7 +15188,7 @@
       </w:rPr>
     </w:lvl>
   </w:abstractNum>
-  <w:abstractNum w:abstractNumId="34">
+  <w:abstractNum w:abstractNumId="34" w15:restartNumberingAfterBreak="0">
     <w:nsid w:val="690A662B"/>
     <w:multiLevelType w:val="hybridMultilevel"/>
     <w:tmpl w:val="B77E13B2"/>
@@ -12073,7 +15301,7 @@
       </w:rPr>
     </w:lvl>
   </w:abstractNum>
-  <w:abstractNum w:abstractNumId="35">
+  <w:abstractNum w:abstractNumId="35" w15:restartNumberingAfterBreak="0">
     <w:nsid w:val="692E515B"/>
     <w:multiLevelType w:val="multilevel"/>
     <w:tmpl w:val="D0A6F4BE"/>
@@ -12222,7 +15450,7 @@
       </w:rPr>
     </w:lvl>
   </w:abstractNum>
-  <w:abstractNum w:abstractNumId="36">
+  <w:abstractNum w:abstractNumId="36" w15:restartNumberingAfterBreak="0">
     <w:nsid w:val="69CA3B02"/>
     <w:multiLevelType w:val="hybridMultilevel"/>
     <w:tmpl w:val="F642E598"/>
@@ -12335,7 +15563,7 @@
       </w:rPr>
     </w:lvl>
   </w:abstractNum>
-  <w:abstractNum w:abstractNumId="37">
+  <w:abstractNum w:abstractNumId="37" w15:restartNumberingAfterBreak="0">
     <w:nsid w:val="6DE10F54"/>
     <w:multiLevelType w:val="hybridMultilevel"/>
     <w:tmpl w:val="57166F10"/>
@@ -12448,7 +15676,7 @@
       </w:rPr>
     </w:lvl>
   </w:abstractNum>
-  <w:abstractNum w:abstractNumId="38">
+  <w:abstractNum w:abstractNumId="38" w15:restartNumberingAfterBreak="0">
     <w:nsid w:val="6E17352B"/>
     <w:multiLevelType w:val="hybridMultilevel"/>
     <w:tmpl w:val="FB103E68"/>
@@ -12561,7 +15789,7 @@
       </w:rPr>
     </w:lvl>
   </w:abstractNum>
-  <w:abstractNum w:abstractNumId="39">
+  <w:abstractNum w:abstractNumId="39" w15:restartNumberingAfterBreak="0">
     <w:nsid w:val="72BA1947"/>
     <w:multiLevelType w:val="hybridMultilevel"/>
     <w:tmpl w:val="CCE4C876"/>
@@ -12674,7 +15902,7 @@
       </w:rPr>
     </w:lvl>
   </w:abstractNum>
-  <w:abstractNum w:abstractNumId="40">
+  <w:abstractNum w:abstractNumId="40" w15:restartNumberingAfterBreak="0">
     <w:nsid w:val="78FD57A9"/>
     <w:multiLevelType w:val="hybridMultilevel"/>
     <w:tmpl w:val="830A9456"/>
@@ -12787,7 +16015,7 @@
       </w:rPr>
     </w:lvl>
   </w:abstractNum>
-  <w:abstractNum w:abstractNumId="41">
+  <w:abstractNum w:abstractNumId="41" w15:restartNumberingAfterBreak="0">
     <w:nsid w:val="7A3B0902"/>
     <w:multiLevelType w:val="hybridMultilevel"/>
     <w:tmpl w:val="8F7AAA36"/>
@@ -12900,7 +16128,7 @@
       </w:rPr>
     </w:lvl>
   </w:abstractNum>
-  <w:abstractNum w:abstractNumId="42">
+  <w:abstractNum w:abstractNumId="42" w15:restartNumberingAfterBreak="0">
     <w:nsid w:val="7A600773"/>
     <w:multiLevelType w:val="hybridMultilevel"/>
     <w:tmpl w:val="0E0403B4"/>
@@ -13013,7 +16241,7 @@
       </w:rPr>
     </w:lvl>
   </w:abstractNum>
-  <w:abstractNum w:abstractNumId="43">
+  <w:abstractNum w:abstractNumId="43" w15:restartNumberingAfterBreak="0">
     <w:nsid w:val="7B7D3BBC"/>
     <w:multiLevelType w:val="multilevel"/>
     <w:tmpl w:val="99D04C86"/>
@@ -13162,143 +16390,143 @@
       </w:rPr>
     </w:lvl>
   </w:abstractNum>
-  <w:num w:numId="1">
+  <w:num w:numId="1" w16cid:durableId="227037953">
     <w:abstractNumId w:val="16"/>
   </w:num>
-  <w:num w:numId="2">
+  <w:num w:numId="2" w16cid:durableId="812529168">
     <w:abstractNumId w:val="32"/>
   </w:num>
-  <w:num w:numId="3">
+  <w:num w:numId="3" w16cid:durableId="1674726881">
     <w:abstractNumId w:val="17"/>
   </w:num>
-  <w:num w:numId="4">
+  <w:num w:numId="4" w16cid:durableId="371006971">
     <w:abstractNumId w:val="27"/>
   </w:num>
-  <w:num w:numId="5">
+  <w:num w:numId="5" w16cid:durableId="773786891">
     <w:abstractNumId w:val="33"/>
   </w:num>
-  <w:num w:numId="6">
+  <w:num w:numId="6" w16cid:durableId="1543245463">
     <w:abstractNumId w:val="36"/>
   </w:num>
-  <w:num w:numId="7">
+  <w:num w:numId="7" w16cid:durableId="633174636">
     <w:abstractNumId w:val="18"/>
   </w:num>
-  <w:num w:numId="8">
+  <w:num w:numId="8" w16cid:durableId="361631162">
     <w:abstractNumId w:val="10"/>
   </w:num>
-  <w:num w:numId="9">
+  <w:num w:numId="9" w16cid:durableId="640572460">
     <w:abstractNumId w:val="23"/>
   </w:num>
-  <w:num w:numId="10">
+  <w:num w:numId="10" w16cid:durableId="858081648">
     <w:abstractNumId w:val="4"/>
   </w:num>
-  <w:num w:numId="11">
+  <w:num w:numId="11" w16cid:durableId="1075130088">
     <w:abstractNumId w:val="19"/>
   </w:num>
-  <w:num w:numId="12">
+  <w:num w:numId="12" w16cid:durableId="1969896331">
     <w:abstractNumId w:val="30"/>
   </w:num>
-  <w:num w:numId="13">
+  <w:num w:numId="13" w16cid:durableId="1383552682">
     <w:abstractNumId w:val="21"/>
   </w:num>
-  <w:num w:numId="14">
+  <w:num w:numId="14" w16cid:durableId="821628560">
     <w:abstractNumId w:val="12"/>
   </w:num>
-  <w:num w:numId="15">
+  <w:num w:numId="15" w16cid:durableId="960263049">
     <w:abstractNumId w:val="41"/>
   </w:num>
-  <w:num w:numId="16">
+  <w:num w:numId="16" w16cid:durableId="302318446">
     <w:abstractNumId w:val="5"/>
   </w:num>
-  <w:num w:numId="17">
+  <w:num w:numId="17" w16cid:durableId="2142921340">
     <w:abstractNumId w:val="39"/>
   </w:num>
-  <w:num w:numId="18">
+  <w:num w:numId="18" w16cid:durableId="600532474">
     <w:abstractNumId w:val="20"/>
   </w:num>
-  <w:num w:numId="19">
+  <w:num w:numId="19" w16cid:durableId="936911742">
     <w:abstractNumId w:val="3"/>
   </w:num>
-  <w:num w:numId="20">
+  <w:num w:numId="20" w16cid:durableId="1292517352">
     <w:abstractNumId w:val="14"/>
   </w:num>
-  <w:num w:numId="21">
+  <w:num w:numId="21" w16cid:durableId="450125714">
     <w:abstractNumId w:val="25"/>
   </w:num>
-  <w:num w:numId="22">
+  <w:num w:numId="22" w16cid:durableId="259680257">
     <w:abstractNumId w:val="11"/>
   </w:num>
-  <w:num w:numId="23">
+  <w:num w:numId="23" w16cid:durableId="549266444">
     <w:abstractNumId w:val="28"/>
   </w:num>
-  <w:num w:numId="24">
+  <w:num w:numId="24" w16cid:durableId="1023018884">
     <w:abstractNumId w:val="7"/>
   </w:num>
-  <w:num w:numId="25">
+  <w:num w:numId="25" w16cid:durableId="1022247827">
     <w:abstractNumId w:val="42"/>
   </w:num>
-  <w:num w:numId="26">
+  <w:num w:numId="26" w16cid:durableId="1706176461">
     <w:abstractNumId w:val="9"/>
   </w:num>
-  <w:num w:numId="27">
+  <w:num w:numId="27" w16cid:durableId="521822815">
     <w:abstractNumId w:val="24"/>
   </w:num>
-  <w:num w:numId="28">
+  <w:num w:numId="28" w16cid:durableId="1820265098">
     <w:abstractNumId w:val="38"/>
   </w:num>
-  <w:num w:numId="29">
+  <w:num w:numId="29" w16cid:durableId="1231304274">
     <w:abstractNumId w:val="15"/>
   </w:num>
-  <w:num w:numId="30">
+  <w:num w:numId="30" w16cid:durableId="1040127997">
     <w:abstractNumId w:val="29"/>
   </w:num>
-  <w:num w:numId="31">
+  <w:num w:numId="31" w16cid:durableId="1652831341">
     <w:abstractNumId w:val="2"/>
   </w:num>
-  <w:num w:numId="32">
+  <w:num w:numId="32" w16cid:durableId="132451563">
     <w:abstractNumId w:val="26"/>
   </w:num>
-  <w:num w:numId="33">
+  <w:num w:numId="33" w16cid:durableId="139422290">
     <w:abstractNumId w:val="1"/>
   </w:num>
-  <w:num w:numId="34">
+  <w:num w:numId="34" w16cid:durableId="1313679671">
     <w:abstractNumId w:val="0"/>
   </w:num>
-  <w:num w:numId="35">
+  <w:num w:numId="35" w16cid:durableId="2064714247">
     <w:abstractNumId w:val="13"/>
   </w:num>
-  <w:num w:numId="36">
+  <w:num w:numId="36" w16cid:durableId="697317120">
     <w:abstractNumId w:val="40"/>
   </w:num>
-  <w:num w:numId="37">
+  <w:num w:numId="37" w16cid:durableId="1227254910">
     <w:abstractNumId w:val="43"/>
   </w:num>
-  <w:num w:numId="38">
+  <w:num w:numId="38" w16cid:durableId="1549025181">
     <w:abstractNumId w:val="6"/>
   </w:num>
-  <w:num w:numId="39">
+  <w:num w:numId="39" w16cid:durableId="1733579039">
     <w:abstractNumId w:val="34"/>
   </w:num>
-  <w:num w:numId="40">
+  <w:num w:numId="40" w16cid:durableId="497500573">
     <w:abstractNumId w:val="31"/>
   </w:num>
-  <w:num w:numId="41">
+  <w:num w:numId="41" w16cid:durableId="1927035437">
     <w:abstractNumId w:val="22"/>
   </w:num>
-  <w:num w:numId="42">
+  <w:num w:numId="42" w16cid:durableId="2092578161">
     <w:abstractNumId w:val="37"/>
   </w:num>
-  <w:num w:numId="43">
+  <w:num w:numId="43" w16cid:durableId="980158846">
     <w:abstractNumId w:val="35"/>
   </w:num>
-  <w:num w:numId="44">
+  <w:num w:numId="44" w16cid:durableId="1539271639">
     <w:abstractNumId w:val="8"/>
   </w:num>
 </w:numbering>
 </file>
 
 <file path=word/styles.xml><?xml version="1.0" encoding="utf-8"?>
-<w:styles xmlns:mc="http://schemas.openxmlformats.org/markup-compatibility/2006" xmlns:r="http://schemas.openxmlformats.org/officeDocument/2006/relationships" xmlns:w="http://schemas.openxmlformats.org/wordprocessingml/2006/main" xmlns:w14="http://schemas.microsoft.com/office/word/2010/wordml" xmlns:w15="http://schemas.microsoft.com/office/word/2012/wordml" mc:Ignorable="w14 w15">
+<w:styles xmlns:mc="http://schemas.openxmlformats.org/markup-compatibility/2006" xmlns:r="http://schemas.openxmlformats.org/officeDocument/2006/relationships" xmlns:w="http://schemas.openxmlformats.org/wordprocessingml/2006/main" xmlns:w14="http://schemas.microsoft.com/office/word/2010/wordml" xmlns:w15="http://schemas.microsoft.com/office/word/2012/wordml" xmlns:w16cex="http://schemas.microsoft.com/office/word/2018/wordml/cex" xmlns:w16cid="http://schemas.microsoft.com/office/word/2016/wordml/cid" xmlns:w16="http://schemas.microsoft.com/office/word/2018/wordml" xmlns:w16du="http://schemas.microsoft.com/office/word/2023/wordml/word16du" xmlns:w16sdtdh="http://schemas.microsoft.com/office/word/2020/wordml/sdtdatahash" xmlns:w16sdtfl="http://schemas.microsoft.com/office/word/2024/wordml/sdtformatlock" xmlns:w16se="http://schemas.microsoft.com/office/word/2015/wordml/symex" mc:Ignorable="w14 w15 w16se w16cid w16 w16cex w16sdtdh w16sdtfl w16du">
   <w:docDefaults>
     <w:rPrDefault>
       <w:rPr>
@@ -13314,7 +16542,7 @@
       </w:pPr>
     </w:pPrDefault>
   </w:docDefaults>
-  <w:latentStyles w:defLockedState="0" w:defUIPriority="99" w:defSemiHidden="0" w:defUnhideWhenUsed="0" w:defQFormat="0" w:count="371">
+  <w:latentStyles w:defLockedState="0" w:defUIPriority="99" w:defSemiHidden="0" w:defUnhideWhenUsed="0" w:defQFormat="0" w:count="376">
     <w:lsdException w:name="Normal" w:uiPriority="0" w:qFormat="1"/>
     <w:lsdException w:name="heading 1" w:uiPriority="9" w:qFormat="1"/>
     <w:lsdException w:name="heading 2" w:semiHidden="1" w:uiPriority="9" w:unhideWhenUsed="1" w:qFormat="1"/>
@@ -13686,6 +16914,11 @@
     <w:lsdException w:name="List Table 5 Dark Accent 6" w:uiPriority="50"/>
     <w:lsdException w:name="List Table 6 Colorful Accent 6" w:uiPriority="51"/>
     <w:lsdException w:name="List Table 7 Colorful Accent 6" w:uiPriority="52"/>
+    <w:lsdException w:name="Mention" w:semiHidden="1" w:unhideWhenUsed="1"/>
+    <w:lsdException w:name="Smart Hyperlink" w:semiHidden="1" w:unhideWhenUsed="1"/>
+    <w:lsdException w:name="Hashtag" w:semiHidden="1" w:unhideWhenUsed="1"/>
+    <w:lsdException w:name="Unresolved Mention" w:semiHidden="1" w:unhideWhenUsed="1"/>
+    <w:lsdException w:name="Smart Link" w:semiHidden="1" w:unhideWhenUsed="1"/>
   </w:latentStyles>
   <w:style w:type="paragraph" w:default="1" w:styleId="Normal">
     <w:name w:val="Normal"/>
@@ -13765,7 +16998,6 @@
   <w:style w:type="character" w:default="1" w:styleId="DefaultParagraphFont">
     <w:name w:val="Default Paragraph Font"/>
     <w:uiPriority w:val="1"/>
-    <w:semiHidden/>
     <w:unhideWhenUsed/>
   </w:style>
   <w:style w:type="table" w:default="1" w:styleId="TableNormal">
@@ -13798,7 +17030,6 @@
       <w:spacing w:after="0" w:line="240" w:lineRule="auto"/>
     </w:pPr>
     <w:tblPr>
-      <w:tblInd w:w="0" w:type="dxa"/>
       <w:tblBorders>
         <w:top w:val="single" w:sz="4" w:space="0" w:color="auto"/>
         <w:left w:val="single" w:sz="4" w:space="0" w:color="auto"/>
@@ -13807,12 +17038,6 @@
         <w:insideH w:val="single" w:sz="4" w:space="0" w:color="auto"/>
         <w:insideV w:val="single" w:sz="4" w:space="0" w:color="auto"/>
       </w:tblBorders>
-      <w:tblCellMar>
-        <w:top w:w="0" w:type="dxa"/>
-        <w:left w:w="108" w:type="dxa"/>
-        <w:bottom w:w="0" w:type="dxa"/>
-        <w:right w:w="108" w:type="dxa"/>
-      </w:tblCellMar>
     </w:tblPr>
   </w:style>
   <w:style w:type="character" w:styleId="PlaceholderText">
@@ -14001,19 +17226,12 @@
     <w:tblPr>
       <w:tblStyleRowBandSize w:val="1"/>
       <w:tblStyleColBandSize w:val="1"/>
-      <w:tblInd w:w="0" w:type="dxa"/>
       <w:tblBorders>
         <w:top w:val="single" w:sz="4" w:space="0" w:color="000000" w:themeColor="text1"/>
         <w:left w:val="single" w:sz="4" w:space="0" w:color="000000" w:themeColor="text1"/>
         <w:bottom w:val="single" w:sz="4" w:space="0" w:color="000000" w:themeColor="text1"/>
         <w:right w:val="single" w:sz="4" w:space="0" w:color="000000" w:themeColor="text1"/>
       </w:tblBorders>
-      <w:tblCellMar>
-        <w:top w:w="0" w:type="dxa"/>
-        <w:left w:w="108" w:type="dxa"/>
-        <w:bottom w:w="0" w:type="dxa"/>
-        <w:right w:w="108" w:type="dxa"/>
-      </w:tblCellMar>
     </w:tblPr>
     <w:tblStylePr w:type="firstRow">
       <w:rPr>
@@ -14132,7 +17350,6 @@
     <w:tblPr>
       <w:tblStyleRowBandSize w:val="1"/>
       <w:tblStyleColBandSize w:val="1"/>
-      <w:tblInd w:w="0" w:type="dxa"/>
       <w:tblBorders>
         <w:top w:val="single" w:sz="4" w:space="0" w:color="999999" w:themeColor="text1" w:themeTint="66"/>
         <w:left w:val="single" w:sz="4" w:space="0" w:color="999999" w:themeColor="text1" w:themeTint="66"/>
@@ -14141,12 +17358,6 @@
         <w:insideH w:val="single" w:sz="4" w:space="0" w:color="999999" w:themeColor="text1" w:themeTint="66"/>
         <w:insideV w:val="single" w:sz="4" w:space="0" w:color="999999" w:themeColor="text1" w:themeTint="66"/>
       </w:tblBorders>
-      <w:tblCellMar>
-        <w:top w:w="0" w:type="dxa"/>
-        <w:left w:w="108" w:type="dxa"/>
-        <w:bottom w:w="0" w:type="dxa"/>
-        <w:right w:w="108" w:type="dxa"/>
-      </w:tblCellMar>
     </w:tblPr>
     <w:tblStylePr w:type="firstRow">
       <w:rPr>
@@ -14303,7 +17514,7 @@
 </file>
 
 <file path=word/glossary/document.xml><?xml version="1.0" encoding="utf-8"?>
-<w:glossaryDocument xmlns:wpc="http://schemas.microsoft.com/office/word/2010/wordprocessingCanvas" xmlns:mc="http://schemas.openxmlformats.org/markup-compatibility/2006" xmlns:o="urn:schemas-microsoft-com:office:office" xmlns:r="http://schemas.openxmlformats.org/officeDocument/2006/relationships" xmlns:m="http://schemas.openxmlformats.org/officeDocument/2006/math" xmlns:v="urn:schemas-microsoft-com:vml" xmlns:wp14="http://schemas.microsoft.com/office/word/2010/wordprocessingDrawing" xmlns:wp="http://schemas.openxmlformats.org/drawingml/2006/wordprocessingDrawing" xmlns:w10="urn:schemas-microsoft-com:office:word" xmlns:w="http://schemas.openxmlformats.org/wordprocessingml/2006/main" xmlns:w14="http://schemas.microsoft.com/office/word/2010/wordml" xmlns:w15="http://schemas.microsoft.com/office/word/2012/wordml" xmlns:wpg="http://schemas.microsoft.com/office/word/2010/wordprocessingGroup" xmlns:wpi="http://schemas.microsoft.com/office/word/2010/wordprocessingInk" xmlns:wne="http://schemas.microsoft.com/office/word/2006/wordml" xmlns:wps="http://schemas.microsoft.com/office/word/2010/wordprocessingShape" mc:Ignorable="w14 w15 wp14">
+<w:glossaryDocument xmlns:wpc="http://schemas.microsoft.com/office/word/2010/wordprocessingCanvas" xmlns:cx="http://schemas.microsoft.com/office/drawing/2014/chartex" xmlns:cx1="http://schemas.microsoft.com/office/drawing/2015/9/8/chartex" xmlns:cx2="http://schemas.microsoft.com/office/drawing/2015/10/21/chartex" xmlns:cx3="http://schemas.microsoft.com/office/drawing/2016/5/9/chartex" xmlns:cx4="http://schemas.microsoft.com/office/drawing/2016/5/10/chartex" xmlns:cx5="http://schemas.microsoft.com/office/drawing/2016/5/11/chartex" xmlns:cx6="http://schemas.microsoft.com/office/drawing/2016/5/12/chartex" xmlns:cx7="http://schemas.microsoft.com/office/drawing/2016/5/13/chartex" xmlns:cx8="http://schemas.microsoft.com/office/drawing/2016/5/14/chartex" xmlns:mc="http://schemas.openxmlformats.org/markup-compatibility/2006" xmlns:aink="http://schemas.microsoft.com/office/drawing/2016/ink" xmlns:am3d="http://schemas.microsoft.com/office/drawing/2017/model3d" xmlns:o="urn:schemas-microsoft-com:office:office" xmlns:oel="http://schemas.microsoft.com/office/2019/extlst" xmlns:r="http://schemas.openxmlformats.org/officeDocument/2006/relationships" xmlns:m="http://schemas.openxmlformats.org/officeDocument/2006/math" xmlns:v="urn:schemas-microsoft-com:vml" xmlns:wp14="http://schemas.microsoft.com/office/word/2010/wordprocessingDrawing" xmlns:wp="http://schemas.openxmlformats.org/drawingml/2006/wordprocessingDrawing" xmlns:w10="urn:schemas-microsoft-com:office:word" xmlns:w="http://schemas.openxmlformats.org/wordprocessingml/2006/main" xmlns:w14="http://schemas.microsoft.com/office/word/2010/wordml" xmlns:w15="http://schemas.microsoft.com/office/word/2012/wordml" xmlns:w16cex="http://schemas.microsoft.com/office/word/2018/wordml/cex" xmlns:w16cid="http://schemas.microsoft.com/office/word/2016/wordml/cid" xmlns:w16="http://schemas.microsoft.com/office/word/2018/wordml" xmlns:w16du="http://schemas.microsoft.com/office/word/2023/wordml/word16du" xmlns:w16sdtdh="http://schemas.microsoft.com/office/word/2020/wordml/sdtdatahash" xmlns:w16sdtfl="http://schemas.microsoft.com/office/word/2024/wordml/sdtformatlock" xmlns:w16se="http://schemas.microsoft.com/office/word/2015/wordml/symex" xmlns:wpg="http://schemas.microsoft.com/office/word/2010/wordprocessingGroup" xmlns:wpi="http://schemas.microsoft.com/office/word/2010/wordprocessingInk" xmlns:wne="http://schemas.microsoft.com/office/word/2006/wordml" xmlns:wps="http://schemas.microsoft.com/office/word/2010/wordprocessingShape" mc:Ignorable="w14 w15 w16se w16cid w16 w16cex w16sdtdh w16sdtfl w16du wp14">
   <w:docParts>
     <w:docPart>
       <w:docPartPr>
@@ -14339,7 +17550,7 @@
 </file>
 
 <file path=word/glossary/fontTable.xml><?xml version="1.0" encoding="utf-8"?>
-<w:fonts xmlns:mc="http://schemas.openxmlformats.org/markup-compatibility/2006" xmlns:r="http://schemas.openxmlformats.org/officeDocument/2006/relationships" xmlns:w="http://schemas.openxmlformats.org/wordprocessingml/2006/main" xmlns:w14="http://schemas.microsoft.com/office/word/2010/wordml" xmlns:w15="http://schemas.microsoft.com/office/word/2012/wordml" mc:Ignorable="w14 w15">
+<w:fonts xmlns:mc="http://schemas.openxmlformats.org/markup-compatibility/2006" xmlns:r="http://schemas.openxmlformats.org/officeDocument/2006/relationships" xmlns:w="http://schemas.openxmlformats.org/wordprocessingml/2006/main" xmlns:w14="http://schemas.microsoft.com/office/word/2010/wordml" xmlns:w15="http://schemas.microsoft.com/office/word/2012/wordml" xmlns:w16cex="http://schemas.microsoft.com/office/word/2018/wordml/cex" xmlns:w16cid="http://schemas.microsoft.com/office/word/2016/wordml/cid" xmlns:w16="http://schemas.microsoft.com/office/word/2018/wordml" xmlns:w16du="http://schemas.microsoft.com/office/word/2023/wordml/word16du" xmlns:w16sdtdh="http://schemas.microsoft.com/office/word/2020/wordml/sdtdatahash" xmlns:w16sdtfl="http://schemas.microsoft.com/office/word/2024/wordml/sdtformatlock" xmlns:w16se="http://schemas.microsoft.com/office/word/2015/wordml/symex" mc:Ignorable="w14 w15 w16se w16cid w16 w16cex w16sdtdh w16sdtfl w16du">
   <w:font w:name="Symbol">
     <w:panose1 w:val="05050102010706020507"/>
     <w:charset w:val="02"/>
@@ -14400,7 +17611,7 @@
 </file>
 
 <file path=word/glossary/settings.xml><?xml version="1.0" encoding="utf-8"?>
-<w:settings xmlns:mc="http://schemas.openxmlformats.org/markup-compatibility/2006" xmlns:o="urn:schemas-microsoft-com:office:office" xmlns:r="http://schemas.openxmlformats.org/officeDocument/2006/relationships" xmlns:m="http://schemas.openxmlformats.org/officeDocument/2006/math" xmlns:v="urn:schemas-microsoft-com:vml" xmlns:w10="urn:schemas-microsoft-com:office:word" xmlns:w="http://schemas.openxmlformats.org/wordprocessingml/2006/main" xmlns:w14="http://schemas.microsoft.com/office/word/2010/wordml" xmlns:w15="http://schemas.microsoft.com/office/word/2012/wordml" xmlns:sl="http://schemas.openxmlformats.org/schemaLibrary/2006/main" mc:Ignorable="w14 w15">
+<w:settings xmlns:mc="http://schemas.openxmlformats.org/markup-compatibility/2006" xmlns:o="urn:schemas-microsoft-com:office:office" xmlns:r="http://schemas.openxmlformats.org/officeDocument/2006/relationships" xmlns:m="http://schemas.openxmlformats.org/officeDocument/2006/math" xmlns:v="urn:schemas-microsoft-com:vml" xmlns:w10="urn:schemas-microsoft-com:office:word" xmlns:w="http://schemas.openxmlformats.org/wordprocessingml/2006/main" xmlns:w14="http://schemas.microsoft.com/office/word/2010/wordml" xmlns:w15="http://schemas.microsoft.com/office/word/2012/wordml" xmlns:w16cex="http://schemas.microsoft.com/office/word/2018/wordml/cex" xmlns:w16cid="http://schemas.microsoft.com/office/word/2016/wordml/cid" xmlns:w16="http://schemas.microsoft.com/office/word/2018/wordml" xmlns:w16du="http://schemas.microsoft.com/office/word/2023/wordml/word16du" xmlns:w16sdtdh="http://schemas.microsoft.com/office/word/2020/wordml/sdtdatahash" xmlns:w16sdtfl="http://schemas.microsoft.com/office/word/2024/wordml/sdtformatlock" xmlns:w16se="http://schemas.microsoft.com/office/word/2015/wordml/symex" xmlns:sl="http://schemas.openxmlformats.org/schemaLibrary/2006/main" mc:Ignorable="w14 w15 w16se w16cid w16 w16cex w16sdtdh w16sdtfl w16du">
   <w:view w:val="normal"/>
   <w:defaultTabStop w:val="720"/>
   <w:characterSpacingControl w:val="doNotCompress"/>
@@ -14410,11 +17621,13 @@
     <w:compatSetting w:name="overrideTableStyleFontSizeAndJustification" w:uri="http://schemas.microsoft.com/office/word" w:val="1"/>
     <w:compatSetting w:name="enableOpenTypeFeatures" w:uri="http://schemas.microsoft.com/office/word" w:val="1"/>
     <w:compatSetting w:name="doNotFlipMirrorIndents" w:uri="http://schemas.microsoft.com/office/word" w:val="1"/>
+    <w:compatSetting w:name="useWord2013TrackBottomHyphenation" w:uri="http://schemas.microsoft.com/office/word" w:val="1"/>
   </w:compat>
   <w:rsids>
     <w:rsidRoot w:val="001B1BB0"/>
     <w:rsid w:val="000F3C26"/>
     <w:rsid w:val="001300FF"/>
+    <w:rsid w:val="001614A5"/>
     <w:rsid w:val="001B1BB0"/>
     <w:rsid w:val="002F0AE4"/>
     <w:rsid w:val="003212F4"/>
@@ -14430,6 +17643,7 @@
     <w:rsid w:val="00743365"/>
     <w:rsid w:val="007C12A3"/>
     <w:rsid w:val="00806FB8"/>
+    <w:rsid w:val="0084393D"/>
     <w:rsid w:val="008A5352"/>
     <w:rsid w:val="009308D6"/>
     <w:rsid w:val="00931747"/>
@@ -14477,7 +17691,7 @@
 </file>
 
 <file path=word/glossary/styles.xml><?xml version="1.0" encoding="utf-8"?>
-<w:styles xmlns:mc="http://schemas.openxmlformats.org/markup-compatibility/2006" xmlns:r="http://schemas.openxmlformats.org/officeDocument/2006/relationships" xmlns:w="http://schemas.openxmlformats.org/wordprocessingml/2006/main" xmlns:w14="http://schemas.microsoft.com/office/word/2010/wordml" xmlns:w15="http://schemas.microsoft.com/office/word/2012/wordml" mc:Ignorable="w14 w15">
+<w:styles xmlns:mc="http://schemas.openxmlformats.org/markup-compatibility/2006" xmlns:r="http://schemas.openxmlformats.org/officeDocument/2006/relationships" xmlns:w="http://schemas.openxmlformats.org/wordprocessingml/2006/main" xmlns:w14="http://schemas.microsoft.com/office/word/2010/wordml" xmlns:w15="http://schemas.microsoft.com/office/word/2012/wordml" xmlns:w16cex="http://schemas.microsoft.com/office/word/2018/wordml/cex" xmlns:w16cid="http://schemas.microsoft.com/office/word/2016/wordml/cid" xmlns:w16="http://schemas.microsoft.com/office/word/2018/wordml" xmlns:w16du="http://schemas.microsoft.com/office/word/2023/wordml/word16du" xmlns:w16sdtdh="http://schemas.microsoft.com/office/word/2020/wordml/sdtdatahash" xmlns:w16sdtfl="http://schemas.microsoft.com/office/word/2024/wordml/sdtformatlock" xmlns:w16se="http://schemas.microsoft.com/office/word/2015/wordml/symex" mc:Ignorable="w14 w15 w16se w16cid w16 w16cex w16sdtdh w16sdtfl w16du">
   <w:docDefaults>
     <w:rPrDefault>
       <w:rPr>
@@ -14493,7 +17707,7 @@
       </w:pPr>
     </w:pPrDefault>
   </w:docDefaults>
-  <w:latentStyles w:defLockedState="0" w:defUIPriority="99" w:defSemiHidden="0" w:defUnhideWhenUsed="0" w:defQFormat="0" w:count="371">
+  <w:latentStyles w:defLockedState="0" w:defUIPriority="99" w:defSemiHidden="0" w:defUnhideWhenUsed="0" w:defQFormat="0" w:count="376">
     <w:lsdException w:name="Normal" w:uiPriority="0" w:qFormat="1"/>
     <w:lsdException w:name="heading 1" w:uiPriority="9" w:qFormat="1"/>
     <w:lsdException w:name="heading 2" w:semiHidden="1" w:uiPriority="9" w:unhideWhenUsed="1" w:qFormat="1"/>
@@ -14865,6 +18079,11 @@
     <w:lsdException w:name="List Table 5 Dark Accent 6" w:uiPriority="50"/>
     <w:lsdException w:name="List Table 6 Colorful Accent 6" w:uiPriority="51"/>
     <w:lsdException w:name="List Table 7 Colorful Accent 6" w:uiPriority="52"/>
+    <w:lsdException w:name="Mention" w:semiHidden="1" w:unhideWhenUsed="1"/>
+    <w:lsdException w:name="Smart Hyperlink" w:semiHidden="1" w:unhideWhenUsed="1"/>
+    <w:lsdException w:name="Hashtag" w:semiHidden="1" w:unhideWhenUsed="1"/>
+    <w:lsdException w:name="Unresolved Mention" w:semiHidden="1" w:unhideWhenUsed="1"/>
+    <w:lsdException w:name="Smart Link" w:semiHidden="1" w:unhideWhenUsed="1"/>
   </w:latentStyles>
   <w:style w:type="paragraph" w:default="1" w:styleId="Normal">
     <w:name w:val="Normal"/>
@@ -14915,7 +18134,7 @@
 </file>
 
 <file path=word/glossary/webSettings.xml><?xml version="1.0" encoding="utf-8"?>
-<w:webSettings xmlns:mc="http://schemas.openxmlformats.org/markup-compatibility/2006" xmlns:r="http://schemas.openxmlformats.org/officeDocument/2006/relationships" xmlns:w="http://schemas.openxmlformats.org/wordprocessingml/2006/main" xmlns:w14="http://schemas.microsoft.com/office/word/2010/wordml" xmlns:w15="http://schemas.microsoft.com/office/word/2012/wordml" mc:Ignorable="w14 w15">
+<w:webSettings xmlns:mc="http://schemas.openxmlformats.org/markup-compatibility/2006" xmlns:r="http://schemas.openxmlformats.org/officeDocument/2006/relationships" xmlns:w="http://schemas.openxmlformats.org/wordprocessingml/2006/main" xmlns:w14="http://schemas.microsoft.com/office/word/2010/wordml" xmlns:w15="http://schemas.microsoft.com/office/word/2012/wordml" xmlns:w16cex="http://schemas.microsoft.com/office/word/2018/wordml/cex" xmlns:w16cid="http://schemas.microsoft.com/office/word/2016/wordml/cid" xmlns:w16="http://schemas.microsoft.com/office/word/2018/wordml" xmlns:w16du="http://schemas.microsoft.com/office/word/2023/wordml/word16du" xmlns:w16sdtdh="http://schemas.microsoft.com/office/word/2020/wordml/sdtdatahash" xmlns:w16sdtfl="http://schemas.microsoft.com/office/word/2024/wordml/sdtformatlock" xmlns:w16se="http://schemas.microsoft.com/office/word/2015/wordml/symex" mc:Ignorable="w14 w15 w16se w16cid w16 w16cex w16sdtdh w16sdtfl w16du">
   <w:optimizeForBrowser/>
   <w:allowPNG/>
 </w:webSettings>
@@ -15217,12 +18436,6 @@
 </file>
 
 <file path=customXml/item1.xml><?xml version="1.0" encoding="utf-8"?>
-<p:properties xmlns:p="http://schemas.microsoft.com/office/2006/metadata/properties" xmlns:xsi="http://www.w3.org/2001/XMLSchema-instance" xmlns:pc="http://schemas.microsoft.com/office/infopath/2007/PartnerControls">
-  <documentManagement/>
-</p:properties>
-</file>
-
-<file path=customXml/item2.xml><?xml version="1.0" encoding="utf-8"?>
 <ct:contentTypeSchema xmlns:ct="http://schemas.microsoft.com/office/2006/metadata/contentType" xmlns:ma="http://schemas.microsoft.com/office/2006/metadata/properties/metaAttributes" ct:_="" ma:_="" ma:contentTypeName="Document" ma:contentTypeID="0x01010021A59588BC0053418FC88F40861DA871" ma:contentTypeVersion="10" ma:contentTypeDescription="Create a new document." ma:contentTypeScope="" ma:versionID="3673c1cf7550c71788a22a838bb0d9c0">
   <xsd:schema xmlns:xsd="http://www.w3.org/2001/XMLSchema" xmlns:xs="http://www.w3.org/2001/XMLSchema" xmlns:p="http://schemas.microsoft.com/office/2006/metadata/properties" xmlns:ns2="22f4eba5-1bf1-421f-a001-fd7acca9760c" targetNamespace="http://schemas.microsoft.com/office/2006/metadata/properties" ma:root="true" ma:fieldsID="ac330b6bfa0f539d41f40e8181b11b47" ns2:_="">
     <xsd:import namespace="22f4eba5-1bf1-421f-a001-fd7acca9760c"/>
@@ -15406,7 +18619,17 @@
 </ct:contentTypeSchema>
 </file>
 
+<file path=customXml/item2.xml><?xml version="1.0" encoding="utf-8"?>
+<p:properties xmlns:p="http://schemas.microsoft.com/office/2006/metadata/properties" xmlns:xsi="http://www.w3.org/2001/XMLSchema-instance" xmlns:pc="http://schemas.microsoft.com/office/infopath/2007/PartnerControls">
+  <documentManagement/>
+</p:properties>
+</file>
+
 <file path=customXml/item3.xml><?xml version="1.0" encoding="utf-8"?>
+<b:Sources xmlns:b="http://schemas.openxmlformats.org/officeDocument/2006/bibliography" xmlns="http://schemas.openxmlformats.org/officeDocument/2006/bibliography" SelectedStyle="\APASixthEditionOfficeOnline.xsl" StyleName="APA" Version="6"/>
+</file>
+
+<file path=customXml/item4.xml><?xml version="1.0" encoding="utf-8"?>
 <?mso-contentType ?>
 <FormTemplates xmlns="http://schemas.microsoft.com/sharepoint/v3/contenttype/forms">
   <Display>DocumentLibraryForm</Display>
@@ -15415,20 +18638,7 @@
 </FormTemplates>
 </file>
 
-<file path=customXml/item4.xml><?xml version="1.0" encoding="utf-8"?>
-<b:Sources xmlns:b="http://schemas.openxmlformats.org/officeDocument/2006/bibliography" xmlns="http://schemas.openxmlformats.org/officeDocument/2006/bibliography" SelectedStyle="\APASixthEditionOfficeOnline.xsl" StyleName="APA" Version="6"/>
-</file>
-
 <file path=customXml/itemProps1.xml><?xml version="1.0" encoding="utf-8"?>
-<ds:datastoreItem xmlns:ds="http://schemas.openxmlformats.org/officeDocument/2006/customXml" ds:itemID="{279A32A1-94B8-4C38-AF26-42DBFF0B0D86}">
-  <ds:schemaRefs>
-    <ds:schemaRef ds:uri="http://schemas.microsoft.com/office/2006/metadata/properties"/>
-    <ds:schemaRef ds:uri="http://schemas.microsoft.com/office/infopath/2007/PartnerControls"/>
-  </ds:schemaRefs>
-</ds:datastoreItem>
-</file>
-
-<file path=customXml/itemProps2.xml><?xml version="1.0" encoding="utf-8"?>
 <ds:datastoreItem xmlns:ds="http://schemas.openxmlformats.org/officeDocument/2006/customXml" ds:itemID="{65E5B5D4-677A-455F-8552-96943537CE77}">
   <ds:schemaRefs>
     <ds:schemaRef ds:uri="http://schemas.microsoft.com/office/2006/metadata/contentType"/>
@@ -15446,18 +18656,27 @@
 </ds:datastoreItem>
 </file>
 
+<file path=customXml/itemProps2.xml><?xml version="1.0" encoding="utf-8"?>
+<ds:datastoreItem xmlns:ds="http://schemas.openxmlformats.org/officeDocument/2006/customXml" ds:itemID="{279A32A1-94B8-4C38-AF26-42DBFF0B0D86}">
+  <ds:schemaRefs>
+    <ds:schemaRef ds:uri="http://schemas.microsoft.com/office/2006/metadata/properties"/>
+    <ds:schemaRef ds:uri="http://schemas.microsoft.com/office/infopath/2007/PartnerControls"/>
+  </ds:schemaRefs>
+</ds:datastoreItem>
+</file>
+
 <file path=customXml/itemProps3.xml><?xml version="1.0" encoding="utf-8"?>
+<ds:datastoreItem xmlns:ds="http://schemas.openxmlformats.org/officeDocument/2006/customXml" ds:itemID="{DF9323CB-EC46-4806-85E7-93656A633B33}">
+  <ds:schemaRefs>
+    <ds:schemaRef ds:uri="http://schemas.openxmlformats.org/officeDocument/2006/bibliography"/>
+  </ds:schemaRefs>
+</ds:datastoreItem>
+</file>
+
+<file path=customXml/itemProps4.xml><?xml version="1.0" encoding="utf-8"?>
 <ds:datastoreItem xmlns:ds="http://schemas.openxmlformats.org/officeDocument/2006/customXml" ds:itemID="{56C44748-5791-4773-80AF-F953C3055353}">
   <ds:schemaRefs>
     <ds:schemaRef ds:uri="http://schemas.microsoft.com/sharepoint/v3/contenttype/forms"/>
   </ds:schemaRefs>
 </ds:datastoreItem>
-</file>
-
-<file path=customXml/itemProps4.xml><?xml version="1.0" encoding="utf-8"?>
-<ds:datastoreItem xmlns:ds="http://schemas.openxmlformats.org/officeDocument/2006/customXml" ds:itemID="{DF9323CB-EC46-4806-85E7-93656A633B33}">
-  <ds:schemaRefs>
-    <ds:schemaRef ds:uri="http://schemas.openxmlformats.org/officeDocument/2006/bibliography"/>
-  </ds:schemaRefs>
-</ds:datastoreItem>
 </file>
</xml_diff>

<commit_message>
change in testing and document updated
</commit_message>
<xml_diff>
--- a/final project report.docx
+++ b/final project report.docx
@@ -1,6 +1,6 @@
 
 <file path=word/document.xml><?xml version="1.0" encoding="utf-8"?>
-<w:document xmlns:wpc="http://schemas.microsoft.com/office/word/2010/wordprocessingCanvas" xmlns:mc="http://schemas.openxmlformats.org/markup-compatibility/2006" xmlns:o="urn:schemas-microsoft-com:office:office" xmlns:r="http://schemas.openxmlformats.org/officeDocument/2006/relationships" xmlns:m="http://schemas.openxmlformats.org/officeDocument/2006/math" xmlns:v="urn:schemas-microsoft-com:vml" xmlns:wp14="http://schemas.microsoft.com/office/word/2010/wordprocessingDrawing" xmlns:wp="http://schemas.openxmlformats.org/drawingml/2006/wordprocessingDrawing" xmlns:w10="urn:schemas-microsoft-com:office:word" xmlns:w="http://schemas.openxmlformats.org/wordprocessingml/2006/main" xmlns:w14="http://schemas.microsoft.com/office/word/2010/wordml" xmlns:w15="http://schemas.microsoft.com/office/word/2012/wordml" xmlns:wpg="http://schemas.microsoft.com/office/word/2010/wordprocessingGroup" xmlns:wpi="http://schemas.microsoft.com/office/word/2010/wordprocessingInk" xmlns:wne="http://schemas.microsoft.com/office/word/2006/wordml" xmlns:wps="http://schemas.microsoft.com/office/word/2010/wordprocessingShape" mc:Ignorable="w14 w15 wp14">
+<w:document xmlns:wpc="http://schemas.microsoft.com/office/word/2010/wordprocessingCanvas" xmlns:cx="http://schemas.microsoft.com/office/drawing/2014/chartex" xmlns:cx1="http://schemas.microsoft.com/office/drawing/2015/9/8/chartex" xmlns:cx2="http://schemas.microsoft.com/office/drawing/2015/10/21/chartex" xmlns:cx3="http://schemas.microsoft.com/office/drawing/2016/5/9/chartex" xmlns:cx4="http://schemas.microsoft.com/office/drawing/2016/5/10/chartex" xmlns:cx5="http://schemas.microsoft.com/office/drawing/2016/5/11/chartex" xmlns:cx6="http://schemas.microsoft.com/office/drawing/2016/5/12/chartex" xmlns:cx7="http://schemas.microsoft.com/office/drawing/2016/5/13/chartex" xmlns:cx8="http://schemas.microsoft.com/office/drawing/2016/5/14/chartex" xmlns:mc="http://schemas.openxmlformats.org/markup-compatibility/2006" xmlns:aink="http://schemas.microsoft.com/office/drawing/2016/ink" xmlns:am3d="http://schemas.microsoft.com/office/drawing/2017/model3d" xmlns:o="urn:schemas-microsoft-com:office:office" xmlns:oel="http://schemas.microsoft.com/office/2019/extlst" xmlns:r="http://schemas.openxmlformats.org/officeDocument/2006/relationships" xmlns:m="http://schemas.openxmlformats.org/officeDocument/2006/math" xmlns:v="urn:schemas-microsoft-com:vml" xmlns:wp14="http://schemas.microsoft.com/office/word/2010/wordprocessingDrawing" xmlns:wp="http://schemas.openxmlformats.org/drawingml/2006/wordprocessingDrawing" xmlns:w10="urn:schemas-microsoft-com:office:word" xmlns:w="http://schemas.openxmlformats.org/wordprocessingml/2006/main" xmlns:w14="http://schemas.microsoft.com/office/word/2010/wordml" xmlns:w15="http://schemas.microsoft.com/office/word/2012/wordml" xmlns:w16cex="http://schemas.microsoft.com/office/word/2018/wordml/cex" xmlns:w16cid="http://schemas.microsoft.com/office/word/2016/wordml/cid" xmlns:w16="http://schemas.microsoft.com/office/word/2018/wordml" xmlns:w16du="http://schemas.microsoft.com/office/word/2023/wordml/word16du" xmlns:w16sdtdh="http://schemas.microsoft.com/office/word/2020/wordml/sdtdatahash" xmlns:w16sdtfl="http://schemas.microsoft.com/office/word/2024/wordml/sdtformatlock" xmlns:w16se="http://schemas.microsoft.com/office/word/2015/wordml/symex" xmlns:wpg="http://schemas.microsoft.com/office/word/2010/wordprocessingGroup" xmlns:wpi="http://schemas.microsoft.com/office/word/2010/wordprocessingInk" xmlns:wne="http://schemas.microsoft.com/office/word/2006/wordml" xmlns:wps="http://schemas.microsoft.com/office/word/2010/wordprocessingShape" mc:Ignorable="w14 w15 w16se w16cid w16 w16cex w16sdtdh w16sdtfl w16du wp14">
   <w:body>
     <w:p>
       <w:pPr>
@@ -110,6 +110,8 @@
         </w:rPr>
         <w:tab/>
       </w:r>
+      <w:proofErr w:type="spellStart"/>
+      <w:proofErr w:type="gramStart"/>
       <w:r>
         <w:rPr>
           <w:rFonts w:cs="Times New Roman"/>
@@ -120,6 +122,7 @@
         </w:rPr>
         <w:t>Simalchaur</w:t>
       </w:r>
+      <w:proofErr w:type="spellEnd"/>
       <w:r>
         <w:rPr>
           <w:rFonts w:cs="Times New Roman"/>
@@ -138,7 +141,18 @@
           <w:sz w:val="28"/>
           <w:szCs w:val="28"/>
         </w:rPr>
-        <w:t>, Pokhara</w:t>
+        <w:t>,</w:t>
+      </w:r>
+      <w:proofErr w:type="gramEnd"/>
+      <w:r>
+        <w:rPr>
+          <w:rFonts w:cs="Times New Roman"/>
+          <w:b/>
+          <w:bCs/>
+          <w:sz w:val="28"/>
+          <w:szCs w:val="28"/>
+        </w:rPr>
+        <w:t xml:space="preserve"> Pokhara</w:t>
       </w:r>
       <w:r>
         <w:rPr>
@@ -260,7 +274,6 @@
           <w:dataBinding w:prefixMappings="xmlns:ns0='http://purl.org/dc/elements/1.1/' xmlns:ns1='http://schemas.openxmlformats.org/package/2006/metadata/core-properties' " w:xpath="/ns1:coreProperties[1]/ns0:title[1]" w:storeItemID="{6C3C8BC8-F283-45AE-878A-BAB7291924A1}"/>
           <w:text/>
         </w:sdtPr>
-        <w:sdtEndPr/>
         <w:sdtContent>
           <w:r>
             <w:rPr>
@@ -424,7 +437,7 @@
               </wp:inline>
             </w:drawing>
           </mc:Choice>
-          <mc:Fallback xmlns:cx="http://schemas.microsoft.com/office/drawing/2014/chartex" xmlns:cx1="http://schemas.microsoft.com/office/drawing/2015/9/8/chartex" xmlns:cx2="http://schemas.microsoft.com/office/drawing/2015/10/21/chartex" xmlns:cx3="http://schemas.microsoft.com/office/drawing/2016/5/9/chartex" xmlns:cx4="http://schemas.microsoft.com/office/drawing/2016/5/10/chartex" xmlns:cx5="http://schemas.microsoft.com/office/drawing/2016/5/11/chartex" xmlns:cx6="http://schemas.microsoft.com/office/drawing/2016/5/12/chartex" xmlns:cx7="http://schemas.microsoft.com/office/drawing/2016/5/13/chartex" xmlns:cx8="http://schemas.microsoft.com/office/drawing/2016/5/14/chartex" xmlns:aink="http://schemas.microsoft.com/office/drawing/2016/ink" xmlns:am3d="http://schemas.microsoft.com/office/drawing/2017/model3d" xmlns:oel="http://schemas.microsoft.com/office/2019/extlst" xmlns:w16cex="http://schemas.microsoft.com/office/word/2018/wordml/cex" xmlns:w16cid="http://schemas.microsoft.com/office/word/2016/wordml/cid" xmlns:w16="http://schemas.microsoft.com/office/word/2018/wordml" xmlns:w16du="http://schemas.microsoft.com/office/word/2023/wordml/word16du" xmlns:w16sdtdh="http://schemas.microsoft.com/office/word/2020/wordml/sdtdatahash" xmlns:w16sdtfl="http://schemas.microsoft.com/office/word/2024/wordml/sdtformatlock" xmlns:w16se="http://schemas.microsoft.com/office/word/2015/wordml/symex">
+          <mc:Fallback>
             <w:pict>
               <v:group w14:anchorId="5F28FB87" id="Group 5" o:spid="_x0000_s1026" style="width:43.55pt;height:123.05pt;mso-position-horizontal-relative:char;mso-position-vertical-relative:line" coordsize="6762,16097" o:gfxdata="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">
                 <v:line id="Straight Connector 2" o:spid="_x0000_s1027" style="position:absolute;visibility:visible;mso-wrap-style:square" from="3333,0" to="3333,16097" o:connectortype="straight" o:gfxdata="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" strokecolor="black [3200]" strokeweight="2.5pt">
@@ -684,6 +697,7 @@
                 <w:szCs w:val="24"/>
               </w:rPr>
             </w:pPr>
+            <w:proofErr w:type="spellStart"/>
             <w:r>
               <w:rPr>
                 <w:rFonts w:cs="Times New Roman"/>
@@ -691,7 +705,17 @@
                 <w:bCs/>
                 <w:szCs w:val="24"/>
               </w:rPr>
-              <w:t>P.U. Registration Number</w:t>
+              <w:t>P.U</w:t>
+            </w:r>
+            <w:proofErr w:type="spellEnd"/>
+            <w:r>
+              <w:rPr>
+                <w:rFonts w:cs="Times New Roman"/>
+                <w:b/>
+                <w:bCs/>
+                <w:szCs w:val="24"/>
+              </w:rPr>
+              <w:t>. Registration Number</w:t>
             </w:r>
           </w:p>
         </w:tc>
@@ -906,6 +930,7 @@
           <w:szCs w:val="24"/>
         </w:rPr>
       </w:pPr>
+      <w:proofErr w:type="spellStart"/>
       <w:r>
         <w:rPr>
           <w:rFonts w:cs="Times New Roman"/>
@@ -950,7 +975,18 @@
           <w:noProof/>
           <w:szCs w:val="24"/>
         </w:rPr>
-        <w:t>08/07/2026</w:t>
+        <w:t>08</w:t>
+      </w:r>
+      <w:proofErr w:type="spellEnd"/>
+      <w:r>
+        <w:rPr>
+          <w:rFonts w:cs="Times New Roman"/>
+          <w:b/>
+          <w:bCs/>
+          <w:noProof/>
+          <w:szCs w:val="24"/>
+        </w:rPr>
+        <w:t>/07/2026</w:t>
       </w:r>
       <w:r>
         <w:rPr>
@@ -1135,6 +1171,7 @@
           <w:sz w:val="32"/>
           <w:szCs w:val="32"/>
         </w:rPr>
+        <w:lastRenderedPageBreak/>
         <w:t>Declaration for</w:t>
       </w:r>
     </w:p>
@@ -1158,6 +1195,8 @@
         </w:rPr>
         <w:t>“</w:t>
       </w:r>
+      <w:proofErr w:type="spellStart"/>
+      <w:proofErr w:type="gramStart"/>
       <w:r>
         <w:rPr>
           <w:rFonts w:cs="Times New Roman"/>
@@ -1165,8 +1204,9 @@
           <w:sz w:val="32"/>
           <w:szCs w:val="32"/>
         </w:rPr>
-        <w:t>Rock,Paper,Scissor</w:t>
-      </w:r>
+        <w:t>Rock,Paper</w:t>
+      </w:r>
+      <w:proofErr w:type="gramEnd"/>
       <w:r>
         <w:rPr>
           <w:rFonts w:cs="Times New Roman"/>
@@ -1174,6 +1214,16 @@
           <w:sz w:val="32"/>
           <w:szCs w:val="32"/>
         </w:rPr>
+        <w:t>,Scissor</w:t>
+      </w:r>
+      <w:proofErr w:type="spellEnd"/>
+      <w:r>
+        <w:rPr>
+          <w:rFonts w:cs="Times New Roman"/>
+          <w:b/>
+          <w:sz w:val="32"/>
+          <w:szCs w:val="32"/>
+        </w:rPr>
         <w:t>”</w:t>
       </w:r>
     </w:p>
@@ -1336,12 +1386,21 @@
           <w:szCs w:val="24"/>
         </w:rPr>
       </w:pPr>
+      <w:proofErr w:type="gramStart"/>
       <w:r>
         <w:rPr>
           <w:rFonts w:cs="Times New Roman"/>
           <w:szCs w:val="24"/>
         </w:rPr>
-        <w:t>Date:____ / ____ / ________</w:t>
+        <w:t>Date:_</w:t>
+      </w:r>
+      <w:proofErr w:type="gramEnd"/>
+      <w:r>
+        <w:rPr>
+          <w:rFonts w:cs="Times New Roman"/>
+          <w:szCs w:val="24"/>
+        </w:rPr>
+        <w:t>___ / ____ / ________</w:t>
       </w:r>
     </w:p>
     <w:p>
@@ -1371,6 +1430,7 @@
           <w:sz w:val="28"/>
           <w:szCs w:val="24"/>
         </w:rPr>
+        <w:lastRenderedPageBreak/>
         <w:t>Supervisor</w:t>
       </w:r>
       <w:r>
@@ -1408,28 +1468,32 @@
         </w:rPr>
         <w:t>I hereby recommend that this project entitled “</w:t>
       </w:r>
+      <w:proofErr w:type="spellStart"/>
+      <w:proofErr w:type="gramStart"/>
       <w:r>
         <w:rPr>
           <w:rFonts w:cs="Times New Roman"/>
           <w:b/>
           <w:szCs w:val="24"/>
         </w:rPr>
-        <w:t>Rock,Paper,Scissor</w:t>
-      </w:r>
-      <w:r>
-        <w:rPr>
-          <w:rFonts w:cs="Times New Roman"/>
-          <w:szCs w:val="24"/>
-        </w:rPr>
-        <w:t xml:space="preserve">” is done under my supervision by </w:t>
-      </w:r>
+        <w:t>Rock,Paper</w:t>
+      </w:r>
+      <w:proofErr w:type="gramEnd"/>
       <w:r>
         <w:rPr>
           <w:rFonts w:cs="Times New Roman"/>
           <w:b/>
           <w:szCs w:val="24"/>
         </w:rPr>
-        <w:t xml:space="preserve">Divya Sharma </w:t>
+        <w:t>,Scissor</w:t>
+      </w:r>
+      <w:proofErr w:type="spellEnd"/>
+      <w:r>
+        <w:rPr>
+          <w:rFonts w:cs="Times New Roman"/>
+          <w:szCs w:val="24"/>
+        </w:rPr>
+        <w:t xml:space="preserve">” is done under my supervision by </w:t>
       </w:r>
       <w:r>
         <w:rPr>
@@ -1437,7 +1501,7 @@
           <w:b/>
           <w:szCs w:val="24"/>
         </w:rPr>
-        <w:t>and</w:t>
+        <w:t xml:space="preserve">Divya Sharma </w:t>
       </w:r>
       <w:r>
         <w:rPr>
@@ -1445,7 +1509,7 @@
           <w:b/>
           <w:szCs w:val="24"/>
         </w:rPr>
-        <w:t xml:space="preserve"> S</w:t>
+        <w:t>and</w:t>
       </w:r>
       <w:r>
         <w:rPr>
@@ -1453,21 +1517,7 @@
           <w:b/>
           <w:szCs w:val="24"/>
         </w:rPr>
-        <w:t xml:space="preserve">abina Puwanli </w:t>
-      </w:r>
-      <w:r>
-        <w:rPr>
-          <w:rFonts w:cs="Times New Roman"/>
-          <w:szCs w:val="24"/>
-        </w:rPr>
-        <w:t xml:space="preserve">during their </w:t>
-      </w:r>
-      <w:r>
-        <w:rPr>
-          <w:rFonts w:cs="Times New Roman"/>
-          <w:szCs w:val="24"/>
-        </w:rPr>
-        <w:t>2nd</w:t>
+        <w:t xml:space="preserve"> S</w:t>
       </w:r>
       <w:r>
         <w:rPr>
@@ -1475,56 +1525,21 @@
           <w:b/>
           <w:szCs w:val="24"/>
         </w:rPr>
-        <w:t xml:space="preserve"> </w:t>
+        <w:t xml:space="preserve">abina Puwanli </w:t>
       </w:r>
       <w:r>
         <w:rPr>
           <w:rFonts w:cs="Times New Roman"/>
           <w:szCs w:val="24"/>
         </w:rPr>
-        <w:t xml:space="preserve">Semester in partial </w:t>
+        <w:t xml:space="preserve">during their </w:t>
       </w:r>
       <w:r>
         <w:rPr>
           <w:rFonts w:cs="Times New Roman"/>
           <w:szCs w:val="24"/>
         </w:rPr>
-        <w:t>fulfilment</w:t>
-      </w:r>
-      <w:r>
-        <w:rPr>
-          <w:rFonts w:cs="Times New Roman"/>
-          <w:szCs w:val="24"/>
-        </w:rPr>
-        <w:t xml:space="preserve"> of the requirements for the degree of</w:t>
-      </w:r>
-      <w:r>
-        <w:rPr>
-          <w:rFonts w:cs="Times New Roman"/>
-          <w:szCs w:val="24"/>
-        </w:rPr>
-        <w:t xml:space="preserve"> Bachelor of Computer Application</w:t>
-      </w:r>
-      <w:r>
-        <w:rPr>
-          <w:rFonts w:cs="Times New Roman"/>
-          <w:szCs w:val="24"/>
-        </w:rPr>
-        <w:t xml:space="preserve"> (BCA)</w:t>
-      </w:r>
-      <w:r>
-        <w:rPr>
-          <w:rFonts w:cs="Times New Roman"/>
-          <w:szCs w:val="24"/>
-        </w:rPr>
-        <w:t xml:space="preserve"> </w:t>
-      </w:r>
-      <w:r>
-        <w:rPr>
-          <w:rFonts w:cs="Times New Roman"/>
-          <w:szCs w:val="24"/>
-        </w:rPr>
-        <w:t xml:space="preserve"> under </w:t>
+        <w:t>2nd</w:t>
       </w:r>
       <w:r>
         <w:rPr>
@@ -1532,6 +1547,79 @@
           <w:b/>
           <w:szCs w:val="24"/>
         </w:rPr>
+        <w:t xml:space="preserve"> </w:t>
+      </w:r>
+      <w:r>
+        <w:rPr>
+          <w:rFonts w:cs="Times New Roman"/>
+          <w:szCs w:val="24"/>
+        </w:rPr>
+        <w:t xml:space="preserve">Semester in partial </w:t>
+      </w:r>
+      <w:r>
+        <w:rPr>
+          <w:rFonts w:cs="Times New Roman"/>
+          <w:szCs w:val="24"/>
+        </w:rPr>
+        <w:t>fulfilment</w:t>
+      </w:r>
+      <w:r>
+        <w:rPr>
+          <w:rFonts w:cs="Times New Roman"/>
+          <w:szCs w:val="24"/>
+        </w:rPr>
+        <w:t xml:space="preserve"> of the requirements for the degree of</w:t>
+      </w:r>
+      <w:r>
+        <w:rPr>
+          <w:rFonts w:cs="Times New Roman"/>
+          <w:szCs w:val="24"/>
+        </w:rPr>
+        <w:t xml:space="preserve"> Bachelor of Computer Application</w:t>
+      </w:r>
+      <w:r>
+        <w:rPr>
+          <w:rFonts w:cs="Times New Roman"/>
+          <w:szCs w:val="24"/>
+        </w:rPr>
+        <w:t xml:space="preserve"> (</w:t>
+      </w:r>
+      <w:proofErr w:type="gramStart"/>
+      <w:r>
+        <w:rPr>
+          <w:rFonts w:cs="Times New Roman"/>
+          <w:szCs w:val="24"/>
+        </w:rPr>
+        <w:t>BCA)</w:t>
+      </w:r>
+      <w:r>
+        <w:rPr>
+          <w:rFonts w:cs="Times New Roman"/>
+          <w:szCs w:val="24"/>
+        </w:rPr>
+        <w:t xml:space="preserve"> </w:t>
+      </w:r>
+      <w:r>
+        <w:rPr>
+          <w:rFonts w:cs="Times New Roman"/>
+          <w:szCs w:val="24"/>
+        </w:rPr>
+        <w:t xml:space="preserve"> under</w:t>
+      </w:r>
+      <w:proofErr w:type="gramEnd"/>
+      <w:r>
+        <w:rPr>
+          <w:rFonts w:cs="Times New Roman"/>
+          <w:szCs w:val="24"/>
+        </w:rPr>
+        <w:t xml:space="preserve"> </w:t>
+      </w:r>
+      <w:r>
+        <w:rPr>
+          <w:rFonts w:cs="Times New Roman"/>
+          <w:b/>
+          <w:szCs w:val="24"/>
+        </w:rPr>
         <w:t>Pokhara University</w:t>
       </w:r>
       <w:r>
@@ -1579,13 +1667,25 @@
           <w:szCs w:val="24"/>
         </w:rPr>
       </w:pPr>
+      <w:proofErr w:type="spellStart"/>
+      <w:proofErr w:type="gramStart"/>
       <w:r>
         <w:rPr>
           <w:rFonts w:cs="Times New Roman"/>
           <w:b/>
           <w:szCs w:val="24"/>
         </w:rPr>
-        <w:t>Mr.Arpan Pokhrel</w:t>
+        <w:t>Mr.Arpan</w:t>
+      </w:r>
+      <w:proofErr w:type="spellEnd"/>
+      <w:proofErr w:type="gramEnd"/>
+      <w:r>
+        <w:rPr>
+          <w:rFonts w:cs="Times New Roman"/>
+          <w:b/>
+          <w:szCs w:val="24"/>
+        </w:rPr>
+        <w:t xml:space="preserve"> Pokhrel</w:t>
       </w:r>
     </w:p>
     <w:p>
@@ -1638,12 +1738,21 @@
           <w:szCs w:val="24"/>
         </w:rPr>
       </w:pPr>
+      <w:proofErr w:type="gramStart"/>
       <w:r>
         <w:rPr>
           <w:rFonts w:cs="Times New Roman"/>
           <w:szCs w:val="24"/>
         </w:rPr>
-        <w:t>Date:____ / ____ / ________</w:t>
+        <w:t>Date:_</w:t>
+      </w:r>
+      <w:proofErr w:type="gramEnd"/>
+      <w:r>
+        <w:rPr>
+          <w:rFonts w:cs="Times New Roman"/>
+          <w:szCs w:val="24"/>
+        </w:rPr>
+        <w:t>___ / ____ / ________</w:t>
       </w:r>
     </w:p>
     <w:p>
@@ -1681,6 +1790,7 @@
           <w:sz w:val="32"/>
           <w:szCs w:val="24"/>
         </w:rPr>
+        <w:lastRenderedPageBreak/>
         <w:t>Letter of Approval</w:t>
       </w:r>
     </w:p>
@@ -1751,13 +1861,23 @@
         </w:rPr>
         <w:t xml:space="preserve"> of the requirements for the degree of </w:t>
       </w:r>
+      <w:proofErr w:type="spellStart"/>
       <w:r>
         <w:rPr>
           <w:rFonts w:cs="Times New Roman"/>
           <w:b/>
           <w:szCs w:val="24"/>
         </w:rPr>
-        <w:t xml:space="preserve">Bachleor of Computer Application </w:t>
+        <w:t>Bachleor</w:t>
+      </w:r>
+      <w:proofErr w:type="spellEnd"/>
+      <w:r>
+        <w:rPr>
+          <w:rFonts w:cs="Times New Roman"/>
+          <w:b/>
+          <w:szCs w:val="24"/>
+        </w:rPr>
+        <w:t xml:space="preserve"> of Computer Application </w:t>
       </w:r>
       <w:r>
         <w:rPr>
@@ -1991,12 +2111,21 @@
                 <w:szCs w:val="24"/>
               </w:rPr>
             </w:pPr>
+            <w:proofErr w:type="gramStart"/>
             <w:r>
               <w:rPr>
                 <w:rFonts w:cs="Times New Roman"/>
                 <w:szCs w:val="24"/>
               </w:rPr>
-              <w:t>Date:____ / ____ / ________</w:t>
+              <w:t>Date:_</w:t>
+            </w:r>
+            <w:proofErr w:type="gramEnd"/>
+            <w:r>
+              <w:rPr>
+                <w:rFonts w:cs="Times New Roman"/>
+                <w:szCs w:val="24"/>
+              </w:rPr>
+              <w:t>___ / ____ / ________</w:t>
             </w:r>
           </w:p>
           <w:p>
@@ -3259,8 +3388,20 @@
           <w:sz w:val="32"/>
           <w:szCs w:val="32"/>
         </w:rPr>
-        <w:t>LIST OF FIGURE</w:t>
-      </w:r>
+        <w:lastRenderedPageBreak/>
+        <w:t xml:space="preserve">LIST OF </w:t>
+      </w:r>
+      <w:proofErr w:type="gramStart"/>
+      <w:r>
+        <w:rPr>
+          <w:rFonts w:cs="Times New Roman"/>
+          <w:b/>
+          <w:sz w:val="32"/>
+          <w:szCs w:val="32"/>
+        </w:rPr>
+        <w:t>FIGURE</w:t>
+      </w:r>
+      <w:proofErr w:type="gramEnd"/>
     </w:p>
     <w:p>
       <w:pPr>
@@ -3844,6 +3985,7 @@
         <w:rPr>
           <w:sz w:val="32"/>
         </w:rPr>
+        <w:lastRenderedPageBreak/>
         <w:t>Introduction</w:t>
       </w:r>
       <w:bookmarkEnd w:id="3"/>
@@ -4049,7 +4191,11 @@
         <w:jc w:val="both"/>
       </w:pPr>
       <w:r>
-        <w:t>This project also includes additional innovative feature such as tournament mode and streak bonus system. Tournament mode allows users to compete in multiple rounds continuously, while the streak bonus system reward users for consecutive wins. These features increase excitement and provide better gaming experience.</w:t>
+        <w:t xml:space="preserve">This project also includes additional innovative feature such as tournament mode and streak bonus system. Tournament mode allows users to compete in multiple rounds </w:t>
+      </w:r>
+      <w:r>
+        <w:lastRenderedPageBreak/>
+        <w:t>continuously, while the streak bonus system reward users for consecutive wins. These features increase excitement and provide better gaming experience.</w:t>
       </w:r>
     </w:p>
     <w:p>
@@ -4128,6 +4274,7 @@
         <w:rPr>
           <w:sz w:val="32"/>
         </w:rPr>
+        <w:lastRenderedPageBreak/>
         <w:t>Problem Statement</w:t>
       </w:r>
       <w:bookmarkEnd w:id="4"/>
@@ -4184,6 +4331,7 @@
         <w:rPr>
           <w:sz w:val="32"/>
         </w:rPr>
+        <w:lastRenderedPageBreak/>
         <w:t>Objective</w:t>
       </w:r>
       <w:bookmarkEnd w:id="5"/>
@@ -4319,6 +4467,7 @@
       </w:pPr>
       <w:bookmarkStart w:id="6" w:name="_Toc232570757"/>
       <w:r>
+        <w:lastRenderedPageBreak/>
         <w:t>Background Study</w:t>
       </w:r>
       <w:bookmarkEnd w:id="6"/>
@@ -4363,10 +4512,28 @@
         </w:rPr>
       </w:pPr>
       <w:r>
-        <w:t xml:space="preserve"> Many existing systems do not support multiplayer functionality, which limits social interaction. Additionally, traditional game systems often do not include comprehensive dashboards or real-time leaderboards, which are critical for motivating players.This project aims to address these gaps by implementing a multi-mode Rock-Paper-Scissors game with robust data management, multiplayer capabilities, and an intuitive user interface. The motivation stems from the need to create an engaging online game platform that is accessible to users with varying levels of technical expertise, and to explore how traditional games can be adapted to modern digital environments.</w:t>
-      </w:r>
-      <w:r>
-        <w:t xml:space="preserve"> The development process involves analyzing existing systems, identifying missing features, and designing an integrated system that combines game logic with user management, data persistence, and interactive interfaces.</w:t>
+        <w:t xml:space="preserve"> Many existing systems do not support multiplayer functionality, which limits social interaction. Additionally, traditional game systems often do not include comprehensive dashboards or real-time leaderboards, which are critical for motivating </w:t>
+      </w:r>
+      <w:proofErr w:type="spellStart"/>
+      <w:proofErr w:type="gramStart"/>
+      <w:r>
+        <w:t>players.This</w:t>
+      </w:r>
+      <w:proofErr w:type="spellEnd"/>
+      <w:proofErr w:type="gramEnd"/>
+      <w:r>
+        <w:t xml:space="preserve"> project aims to address these gaps by implementing a multi-mode Rock-Paper-Scissors game with robust data management, multiplayer capabilities, and an intuitive user interface. The motivation stems from the need to create an engaging online game platform that is accessible to users with varying levels of technical expertise, and to explore how traditional games can be adapted to modern digital environments.</w:t>
+      </w:r>
+      <w:r>
+        <w:t xml:space="preserve"> The development process involves </w:t>
+      </w:r>
+      <w:proofErr w:type="spellStart"/>
+      <w:r>
+        <w:t>analyzing</w:t>
+      </w:r>
+      <w:proofErr w:type="spellEnd"/>
+      <w:r>
+        <w:t xml:space="preserve"> existing systems, identifying missing features, and designing an integrated system that combines game logic with user management, data persistence, and interactive interfaces.</w:t>
       </w:r>
       <w:r>
         <w:rPr>
@@ -4397,6 +4564,7 @@
       </w:pPr>
       <w:bookmarkStart w:id="7" w:name="_Toc232570758"/>
       <w:r>
+        <w:lastRenderedPageBreak/>
         <w:t>Requirement Document</w:t>
       </w:r>
       <w:bookmarkEnd w:id="7"/>
@@ -4716,14 +4884,22 @@
               <w:rPr>
                 <w:lang w:val="en-GB"/>
               </w:rPr>
-              <w:t xml:space="preserve">d and  </w:t>
-            </w:r>
+              <w:t xml:space="preserve">d </w:t>
+            </w:r>
+            <w:proofErr w:type="gramStart"/>
             <w:r>
               <w:rPr>
                 <w:lang w:val="en-GB"/>
               </w:rPr>
+              <w:t xml:space="preserve">and  </w:t>
+            </w:r>
+            <w:r>
+              <w:rPr>
+                <w:lang w:val="en-GB"/>
+              </w:rPr>
               <w:t>Authenticates</w:t>
             </w:r>
+            <w:proofErr w:type="gramEnd"/>
             <w:r>
               <w:rPr>
                 <w:lang w:val="en-GB"/>
@@ -4787,8 +4963,16 @@
               <w:rPr>
                 <w:lang w:val="en-GB"/>
               </w:rPr>
-              <w:t xml:space="preserve"> and security feature .</w:t>
-            </w:r>
+              <w:t xml:space="preserve"> and security </w:t>
+            </w:r>
+            <w:proofErr w:type="gramStart"/>
+            <w:r>
+              <w:rPr>
+                <w:lang w:val="en-GB"/>
+              </w:rPr>
+              <w:t>feature .</w:t>
+            </w:r>
+            <w:proofErr w:type="gramEnd"/>
           </w:p>
         </w:tc>
       </w:tr>
@@ -5009,6 +5193,7 @@
               <w:jc w:val="both"/>
             </w:pPr>
             <w:r>
+              <w:lastRenderedPageBreak/>
               <w:t>4.</w:t>
             </w:r>
           </w:p>
@@ -5343,13 +5528,27 @@
               <w:rPr>
                 <w:lang w:val="en-GB"/>
               </w:rPr>
-              <w:t xml:space="preserve"> and  </w:t>
-            </w:r>
+              <w:t xml:space="preserve"> </w:t>
+            </w:r>
+            <w:proofErr w:type="gramStart"/>
             <w:r>
               <w:rPr>
                 <w:lang w:val="en-GB"/>
               </w:rPr>
-              <w:t>Score Management System</w:t>
+              <w:t xml:space="preserve">and  </w:t>
+            </w:r>
+            <w:r>
+              <w:rPr>
+                <w:lang w:val="en-GB"/>
+              </w:rPr>
+              <w:t>Score</w:t>
+            </w:r>
+            <w:proofErr w:type="gramEnd"/>
+            <w:r>
+              <w:rPr>
+                <w:lang w:val="en-GB"/>
+              </w:rPr>
+              <w:t xml:space="preserve"> Management System</w:t>
             </w:r>
           </w:p>
         </w:tc>
@@ -5750,11 +5949,19 @@
               </w:rPr>
               <w:t xml:space="preserve"> and </w:t>
             </w:r>
+            <w:proofErr w:type="gramStart"/>
             <w:r>
               <w:rPr>
                 <w:lang w:val="en-GB"/>
               </w:rPr>
-              <w:t>Closes the application safely.</w:t>
+              <w:t>Closes</w:t>
+            </w:r>
+            <w:proofErr w:type="gramEnd"/>
+            <w:r>
+              <w:rPr>
+                <w:lang w:val="en-GB"/>
+              </w:rPr>
+              <w:t xml:space="preserve"> the application safely.</w:t>
             </w:r>
           </w:p>
         </w:tc>
@@ -5817,6 +6024,7 @@
       </w:pPr>
       <w:bookmarkStart w:id="9" w:name="_Toc232570760"/>
       <w:r>
+        <w:lastRenderedPageBreak/>
         <w:t xml:space="preserve">5.2 </w:t>
       </w:r>
       <w:r>
@@ -5857,11 +6065,19 @@
           <w:lang w:val="en-US"/>
         </w:rPr>
       </w:pPr>
+      <w:proofErr w:type="gramStart"/>
       <w:r>
         <w:rPr>
           <w:lang w:val="en-US"/>
         </w:rPr>
-        <w:t xml:space="preserve">.Reduce manual score keeping </w:t>
+        <w:t>.Reduce</w:t>
+      </w:r>
+      <w:proofErr w:type="gramEnd"/>
+      <w:r>
+        <w:rPr>
+          <w:lang w:val="en-US"/>
+        </w:rPr>
+        <w:t xml:space="preserve"> manual score keeping </w:t>
       </w:r>
     </w:p>
     <w:p>
@@ -6223,11 +6439,19 @@
           <w:lang w:val="en-US"/>
         </w:rPr>
       </w:pPr>
+      <w:proofErr w:type="spellStart"/>
       <w:r>
         <w:rPr>
           <w:lang w:val="en-US"/>
         </w:rPr>
-        <w:t xml:space="preserve">PerformanceReliability  </w:t>
+        <w:t>PerformanceReliability</w:t>
+      </w:r>
+      <w:proofErr w:type="spellEnd"/>
+      <w:r>
+        <w:rPr>
+          <w:lang w:val="en-US"/>
+        </w:rPr>
+        <w:t xml:space="preserve">  </w:t>
       </w:r>
     </w:p>
     <w:p>
@@ -6347,6 +6571,7 @@
       </w:pPr>
       <w:bookmarkStart w:id="13" w:name="_Toc232570764"/>
       <w:r>
+        <w:lastRenderedPageBreak/>
         <w:t>System</w:t>
       </w:r>
       <w:r>
@@ -6363,14 +6588,13 @@
       <w:pPr>
         <w:keepNext/>
       </w:pPr>
-      <w:bookmarkStart w:id="14" w:name="_GoBack"/>
       <w:r>
         <w:rPr>
           <w:noProof/>
           <w:lang w:val="en-US"/>
         </w:rPr>
         <w:drawing>
-          <wp:inline distT="0" distB="0" distL="0" distR="0" wp14:anchorId="497F33C4" wp14:editId="712ACC7A">
+          <wp:inline distT="0" distB="0" distL="0" distR="0" wp14:anchorId="497F33C4" wp14:editId="0E979894">
             <wp:extent cx="5274310" cy="2467610"/>
             <wp:effectExtent l="0" t="0" r="2540" b="8890"/>
             <wp:docPr id="6" name="Picture 6"/>
@@ -6411,7 +6635,6 @@
           </wp:inline>
         </w:drawing>
       </w:r>
-      <w:bookmarkEnd w:id="14"/>
     </w:p>
     <w:p>
       <w:pPr>
@@ -6486,7 +6709,27 @@
           <w:sz w:val="24"/>
           <w:szCs w:val="24"/>
         </w:rPr>
-        <w:t xml:space="preserve"> Level 0 DFD of Rock Paper Scissor</w:t>
+        <w:t xml:space="preserve"> Level 0 </w:t>
+      </w:r>
+      <w:proofErr w:type="spellStart"/>
+      <w:r>
+        <w:rPr>
+          <w:i w:val="0"/>
+          <w:color w:val="auto"/>
+          <w:sz w:val="24"/>
+          <w:szCs w:val="24"/>
+        </w:rPr>
+        <w:t>DFD</w:t>
+      </w:r>
+      <w:proofErr w:type="spellEnd"/>
+      <w:r>
+        <w:rPr>
+          <w:i w:val="0"/>
+          <w:color w:val="auto"/>
+          <w:sz w:val="24"/>
+          <w:szCs w:val="24"/>
+        </w:rPr>
+        <w:t xml:space="preserve"> of Rock Paper Scissor</w:t>
       </w:r>
     </w:p>
     <w:p>
@@ -6512,14 +6755,13 @@
       <w:r>
         <w:rPr>
           <w:noProof/>
-          <w:szCs w:val="24"/>
-          <w:lang w:val="en-US"/>
-        </w:rPr>
+        </w:rPr>
+        <w:lastRenderedPageBreak/>
         <w:drawing>
-          <wp:inline distT="0" distB="0" distL="0" distR="0" wp14:anchorId="396530F8" wp14:editId="41FD6FC5">
-            <wp:extent cx="4685289" cy="5854638"/>
-            <wp:effectExtent l="0" t="0" r="1270" b="0"/>
-            <wp:docPr id="7" name="Picture 7"/>
+          <wp:inline distT="0" distB="0" distL="0" distR="0" wp14:anchorId="17D41435" wp14:editId="66E86AC8">
+            <wp:extent cx="5274310" cy="5115560"/>
+            <wp:effectExtent l="0" t="0" r="2540" b="8890"/>
+            <wp:docPr id="1357934831" name="Picture 4"/>
             <wp:cNvGraphicFramePr>
               <a:graphicFrameLocks xmlns:a="http://schemas.openxmlformats.org/drawingml/2006/main" noChangeAspect="1"/>
             </wp:cNvGraphicFramePr>
@@ -6527,29 +6769,36 @@
               <a:graphicData uri="http://schemas.openxmlformats.org/drawingml/2006/picture">
                 <pic:pic xmlns:pic="http://schemas.openxmlformats.org/drawingml/2006/picture">
                   <pic:nvPicPr>
-                    <pic:cNvPr id="7" name="ChatGPT Image Jul 6, 2026, 04_21_23 PM.png"/>
-                    <pic:cNvPicPr/>
+                    <pic:cNvPr id="0" name="Picture 1"/>
+                    <pic:cNvPicPr>
+                      <a:picLocks noChangeAspect="1" noChangeArrowheads="1"/>
+                    </pic:cNvPicPr>
                   </pic:nvPicPr>
                   <pic:blipFill>
-                    <a:blip r:embed="rId13">
+                    <a:blip r:embed="rId13" cstate="print">
                       <a:extLst>
                         <a:ext uri="{28A0092B-C50C-407E-A947-70E740481C1C}">
                           <a14:useLocalDpi xmlns:a14="http://schemas.microsoft.com/office/drawing/2010/main" val="0"/>
                         </a:ext>
                       </a:extLst>
                     </a:blip>
+                    <a:srcRect/>
                     <a:stretch>
                       <a:fillRect/>
                     </a:stretch>
                   </pic:blipFill>
-                  <pic:spPr>
+                  <pic:spPr bwMode="auto">
                     <a:xfrm>
                       <a:off x="0" y="0"/>
-                      <a:ext cx="4694605" cy="5866279"/>
+                      <a:ext cx="5274310" cy="5115560"/>
                     </a:xfrm>
                     <a:prstGeom prst="rect">
                       <a:avLst/>
                     </a:prstGeom>
+                    <a:noFill/>
+                    <a:ln>
+                      <a:noFill/>
+                    </a:ln>
                   </pic:spPr>
                 </pic:pic>
               </a:graphicData>
@@ -6653,6 +6902,7 @@
           <w:szCs w:val="24"/>
           <w:lang w:val="en-US"/>
         </w:rPr>
+        <w:lastRenderedPageBreak/>
         <w:drawing>
           <wp:inline distT="0" distB="0" distL="0" distR="0" wp14:anchorId="6F218E08" wp14:editId="7552BCAB">
             <wp:extent cx="4458712" cy="4961163"/>
@@ -6824,6 +7074,7 @@
           <w:szCs w:val="24"/>
           <w:lang w:val="en-US"/>
         </w:rPr>
+        <w:lastRenderedPageBreak/>
         <w:drawing>
           <wp:inline distT="0" distB="0" distL="0" distR="0" wp14:anchorId="78C41E9D" wp14:editId="5FFE4C43">
             <wp:extent cx="5274310" cy="6285230"/>
@@ -6879,7 +7130,7 @@
           <w:szCs w:val="24"/>
         </w:rPr>
       </w:pPr>
-      <w:bookmarkStart w:id="15" w:name="_Toc232590307"/>
+      <w:bookmarkStart w:id="14" w:name="_Toc232590307"/>
       <w:r>
         <w:rPr>
           <w:i w:val="0"/>
@@ -6951,7 +7202,7 @@
         </w:rPr>
         <w:t xml:space="preserve"> Single Gameplay Flowchart</w:t>
       </w:r>
-      <w:bookmarkEnd w:id="15"/>
+      <w:bookmarkEnd w:id="14"/>
     </w:p>
     <w:p>
       <w:pPr>
@@ -6987,6 +7238,7 @@
           <w:szCs w:val="24"/>
           <w:lang w:val="en-US"/>
         </w:rPr>
+        <w:lastRenderedPageBreak/>
         <w:drawing>
           <wp:inline distT="0" distB="0" distL="0" distR="0" wp14:anchorId="0C47A2B4" wp14:editId="33916B23">
             <wp:extent cx="5274310" cy="5942965"/>
@@ -7042,7 +7294,7 @@
           <w:szCs w:val="24"/>
         </w:rPr>
       </w:pPr>
-      <w:bookmarkStart w:id="16" w:name="_Toc232590308"/>
+      <w:bookmarkStart w:id="15" w:name="_Toc232590308"/>
       <w:r>
         <w:rPr>
           <w:i w:val="0"/>
@@ -7114,7 +7366,7 @@
         </w:rPr>
         <w:t>Multiplayer Gameplay Flowchart</w:t>
       </w:r>
-      <w:bookmarkEnd w:id="16"/>
+      <w:bookmarkEnd w:id="15"/>
     </w:p>
     <w:p>
       <w:pPr>
@@ -7136,6 +7388,7 @@
           <w:noProof/>
           <w:lang w:val="en-US"/>
         </w:rPr>
+        <w:lastRenderedPageBreak/>
         <w:drawing>
           <wp:inline distT="0" distB="0" distL="0" distR="0" wp14:anchorId="35581872" wp14:editId="2FD39BE4">
             <wp:extent cx="3830955" cy="4398579"/>
@@ -7195,7 +7448,7 @@
           <w:szCs w:val="24"/>
         </w:rPr>
       </w:pPr>
-      <w:bookmarkStart w:id="17" w:name="_Toc232590309"/>
+      <w:bookmarkStart w:id="16" w:name="_Toc232590309"/>
       <w:r>
         <w:rPr>
           <w:i w:val="0"/>
@@ -7267,7 +7520,7 @@
         </w:rPr>
         <w:t xml:space="preserve"> Use case diagram</w:t>
       </w:r>
-      <w:bookmarkEnd w:id="17"/>
+      <w:bookmarkEnd w:id="16"/>
     </w:p>
     <w:p>
       <w:r>
@@ -7285,11 +7538,12 @@
         <w:ind w:left="360"/>
         <w:jc w:val="both"/>
       </w:pPr>
-      <w:bookmarkStart w:id="18" w:name="_Toc232570765"/>
-      <w:r>
+      <w:bookmarkStart w:id="17" w:name="_Toc232570765"/>
+      <w:r>
+        <w:lastRenderedPageBreak/>
         <w:t>Development</w:t>
       </w:r>
-      <w:bookmarkEnd w:id="18"/>
+      <w:bookmarkEnd w:id="17"/>
     </w:p>
     <w:p>
       <w:pPr>
@@ -7314,7 +7568,21 @@
         <w:rPr>
           <w:szCs w:val="24"/>
         </w:rPr>
-        <w:t xml:space="preserve"> chosen for the development of the Rock Paper Scissor game because it is suitable for small and well defined projects. The project re</w:t>
+        <w:t xml:space="preserve"> chosen for the development of the Rock Paper Scissor game because it is suitable for small and </w:t>
+      </w:r>
+      <w:proofErr w:type="gramStart"/>
+      <w:r>
+        <w:rPr>
+          <w:szCs w:val="24"/>
+        </w:rPr>
+        <w:t>well defined</w:t>
+      </w:r>
+      <w:proofErr w:type="gramEnd"/>
+      <w:r>
+        <w:rPr>
+          <w:szCs w:val="24"/>
+        </w:rPr>
+        <w:t xml:space="preserve"> projects. The project re</w:t>
       </w:r>
       <w:r>
         <w:rPr>
@@ -7720,11 +7988,468 @@
     </w:p>
     <w:p>
       <w:pPr>
-        <w:rPr>
-          <w:szCs w:val="24"/>
-        </w:rPr>
-      </w:pPr>
-    </w:p>
+        <w:pStyle w:val="NormalWeb"/>
+        <w:shd w:val="clear" w:color="auto" w:fill="FFFFFF"/>
+        <w:spacing w:before="0" w:beforeAutospacing="0" w:after="0" w:afterAutospacing="0" w:line="360" w:lineRule="auto"/>
+        <w:jc w:val="both"/>
+      </w:pPr>
+      <w:r>
+        <w:t>Finally, most importantly, the chart of work assignment</w:t>
+      </w:r>
+    </w:p>
+    <w:tbl>
+      <w:tblPr>
+        <w:tblStyle w:val="TableGrid"/>
+        <w:tblW w:w="0" w:type="auto"/>
+        <w:tblLook w:val="04A0" w:firstRow="1" w:lastRow="0" w:firstColumn="1" w:lastColumn="0" w:noHBand="0" w:noVBand="1"/>
+      </w:tblPr>
+      <w:tblGrid>
+        <w:gridCol w:w="643"/>
+        <w:gridCol w:w="2502"/>
+        <w:gridCol w:w="3100"/>
+        <w:gridCol w:w="2051"/>
+      </w:tblGrid>
+      <w:tr>
+        <w:tc>
+          <w:tcPr>
+            <w:tcW w:w="643" w:type="dxa"/>
+          </w:tcPr>
+          <w:p>
+            <w:pPr>
+              <w:pStyle w:val="NormalWeb"/>
+              <w:spacing w:before="0" w:beforeAutospacing="0" w:after="0" w:afterAutospacing="0" w:line="360" w:lineRule="auto"/>
+              <w:jc w:val="both"/>
+            </w:pPr>
+            <w:proofErr w:type="spellStart"/>
+            <w:r>
+              <w:lastRenderedPageBreak/>
+              <w:t>S.N</w:t>
+            </w:r>
+            <w:proofErr w:type="spellEnd"/>
+            <w:r>
+              <w:t>.</w:t>
+            </w:r>
+          </w:p>
+        </w:tc>
+        <w:tc>
+          <w:tcPr>
+            <w:tcW w:w="2502" w:type="dxa"/>
+          </w:tcPr>
+          <w:p>
+            <w:pPr>
+              <w:pStyle w:val="NormalWeb"/>
+              <w:spacing w:before="0" w:beforeAutospacing="0" w:after="0" w:afterAutospacing="0" w:line="360" w:lineRule="auto"/>
+              <w:jc w:val="both"/>
+            </w:pPr>
+            <w:r>
+              <w:t>Name of the member</w:t>
+            </w:r>
+          </w:p>
+        </w:tc>
+        <w:tc>
+          <w:tcPr>
+            <w:tcW w:w="3100" w:type="dxa"/>
+          </w:tcPr>
+          <w:p>
+            <w:pPr>
+              <w:pStyle w:val="NormalWeb"/>
+              <w:spacing w:before="0" w:beforeAutospacing="0" w:after="0" w:afterAutospacing="0" w:line="360" w:lineRule="auto"/>
+              <w:jc w:val="both"/>
+            </w:pPr>
+            <w:r>
+              <w:t xml:space="preserve">Work assigned </w:t>
+            </w:r>
+          </w:p>
+        </w:tc>
+        <w:tc>
+          <w:tcPr>
+            <w:tcW w:w="2051" w:type="dxa"/>
+          </w:tcPr>
+          <w:p>
+            <w:pPr>
+              <w:pStyle w:val="NormalWeb"/>
+              <w:spacing w:before="0" w:beforeAutospacing="0" w:after="0" w:afterAutospacing="0" w:line="360" w:lineRule="auto"/>
+              <w:jc w:val="both"/>
+            </w:pPr>
+            <w:r>
+              <w:t>Remarks</w:t>
+            </w:r>
+          </w:p>
+        </w:tc>
+      </w:tr>
+      <w:tr>
+        <w:tc>
+          <w:tcPr>
+            <w:tcW w:w="643" w:type="dxa"/>
+          </w:tcPr>
+          <w:p>
+            <w:pPr>
+              <w:pStyle w:val="NormalWeb"/>
+              <w:spacing w:before="0" w:beforeAutospacing="0" w:after="0" w:afterAutospacing="0" w:line="360" w:lineRule="auto"/>
+              <w:jc w:val="both"/>
+            </w:pPr>
+            <w:r>
+              <w:t>1.</w:t>
+            </w:r>
+          </w:p>
+        </w:tc>
+        <w:tc>
+          <w:tcPr>
+            <w:tcW w:w="2502" w:type="dxa"/>
+          </w:tcPr>
+          <w:p>
+            <w:pPr>
+              <w:pStyle w:val="NormalWeb"/>
+              <w:spacing w:before="0" w:beforeAutospacing="0" w:after="0" w:afterAutospacing="0" w:line="360" w:lineRule="auto"/>
+              <w:jc w:val="both"/>
+            </w:pPr>
+            <w:r>
+              <w:t xml:space="preserve">Divya Sharma </w:t>
+            </w:r>
+          </w:p>
+        </w:tc>
+        <w:tc>
+          <w:tcPr>
+            <w:tcW w:w="3100" w:type="dxa"/>
+          </w:tcPr>
+          <w:p>
+            <w:pPr>
+              <w:pStyle w:val="NormalWeb"/>
+              <w:spacing w:before="0" w:beforeAutospacing="0" w:after="0" w:afterAutospacing="0" w:line="360" w:lineRule="auto"/>
+              <w:jc w:val="both"/>
+            </w:pPr>
+            <w:r>
+              <w:t>Documentation and coding.</w:t>
+            </w:r>
+          </w:p>
+          <w:p>
+            <w:pPr>
+              <w:pStyle w:val="NormalWeb"/>
+              <w:numPr>
+                <w:ilvl w:val="0"/>
+                <w:numId w:val="6"/>
+              </w:numPr>
+              <w:spacing w:before="0" w:beforeAutospacing="0" w:after="0" w:afterAutospacing="0" w:line="360" w:lineRule="auto"/>
+              <w:ind w:left="346"/>
+              <w:jc w:val="both"/>
+            </w:pPr>
+            <w:r>
+              <w:t>Flowchart</w:t>
+            </w:r>
+          </w:p>
+          <w:p>
+            <w:pPr>
+              <w:pStyle w:val="NormalWeb"/>
+              <w:numPr>
+                <w:ilvl w:val="0"/>
+                <w:numId w:val="6"/>
+              </w:numPr>
+              <w:spacing w:before="0" w:beforeAutospacing="0" w:after="0" w:afterAutospacing="0" w:line="360" w:lineRule="auto"/>
+              <w:ind w:left="346"/>
+              <w:jc w:val="both"/>
+            </w:pPr>
+            <w:r>
+              <w:t>Problem Identification</w:t>
+            </w:r>
+          </w:p>
+          <w:p>
+            <w:pPr>
+              <w:pStyle w:val="NormalWeb"/>
+              <w:numPr>
+                <w:ilvl w:val="0"/>
+                <w:numId w:val="6"/>
+              </w:numPr>
+              <w:spacing w:before="0" w:beforeAutospacing="0" w:after="0" w:afterAutospacing="0" w:line="360" w:lineRule="auto"/>
+              <w:ind w:left="346"/>
+              <w:jc w:val="both"/>
+            </w:pPr>
+            <w:r>
+              <w:t>Coding</w:t>
+            </w:r>
+          </w:p>
+          <w:p>
+            <w:pPr>
+              <w:pStyle w:val="NormalWeb"/>
+              <w:numPr>
+                <w:ilvl w:val="0"/>
+                <w:numId w:val="6"/>
+              </w:numPr>
+              <w:spacing w:before="0" w:beforeAutospacing="0" w:after="0" w:afterAutospacing="0" w:line="360" w:lineRule="auto"/>
+              <w:ind w:left="346"/>
+              <w:jc w:val="both"/>
+            </w:pPr>
+            <w:r>
+              <w:t>Support in system design.</w:t>
+            </w:r>
+          </w:p>
+        </w:tc>
+        <w:tc>
+          <w:tcPr>
+            <w:tcW w:w="2051" w:type="dxa"/>
+          </w:tcPr>
+          <w:p>
+            <w:pPr>
+              <w:pStyle w:val="NormalWeb"/>
+              <w:spacing w:before="0" w:beforeAutospacing="0" w:after="0" w:afterAutospacing="0" w:line="360" w:lineRule="auto"/>
+              <w:jc w:val="both"/>
+            </w:pPr>
+          </w:p>
+        </w:tc>
+      </w:tr>
+      <w:tr>
+        <w:tc>
+          <w:tcPr>
+            <w:tcW w:w="643" w:type="dxa"/>
+          </w:tcPr>
+          <w:p>
+            <w:pPr>
+              <w:pStyle w:val="NormalWeb"/>
+              <w:spacing w:before="0" w:beforeAutospacing="0" w:after="0" w:afterAutospacing="0" w:line="360" w:lineRule="auto"/>
+              <w:jc w:val="both"/>
+            </w:pPr>
+            <w:r>
+              <w:t>2.</w:t>
+            </w:r>
+          </w:p>
+        </w:tc>
+        <w:tc>
+          <w:tcPr>
+            <w:tcW w:w="2502" w:type="dxa"/>
+          </w:tcPr>
+          <w:p>
+            <w:pPr>
+              <w:pStyle w:val="NormalWeb"/>
+              <w:spacing w:before="0" w:beforeAutospacing="0" w:after="0" w:afterAutospacing="0" w:line="360" w:lineRule="auto"/>
+              <w:jc w:val="both"/>
+            </w:pPr>
+            <w:r>
+              <w:t>Sabina Puwanli</w:t>
+            </w:r>
+          </w:p>
+        </w:tc>
+        <w:tc>
+          <w:tcPr>
+            <w:tcW w:w="3100" w:type="dxa"/>
+          </w:tcPr>
+          <w:p>
+            <w:pPr>
+              <w:pStyle w:val="NormalWeb"/>
+              <w:spacing w:before="0" w:beforeAutospacing="0" w:after="0" w:afterAutospacing="0" w:line="360" w:lineRule="auto"/>
+              <w:jc w:val="both"/>
+            </w:pPr>
+            <w:r>
+              <w:t>Documentation and coding.</w:t>
+            </w:r>
+          </w:p>
+          <w:p>
+            <w:pPr>
+              <w:pStyle w:val="NormalWeb"/>
+              <w:numPr>
+                <w:ilvl w:val="0"/>
+                <w:numId w:val="6"/>
+              </w:numPr>
+              <w:spacing w:before="0" w:beforeAutospacing="0" w:after="0" w:afterAutospacing="0" w:line="360" w:lineRule="auto"/>
+              <w:ind w:left="346"/>
+              <w:jc w:val="both"/>
+            </w:pPr>
+            <w:r>
+              <w:t xml:space="preserve">Gantt Chart </w:t>
+            </w:r>
+          </w:p>
+          <w:p>
+            <w:pPr>
+              <w:pStyle w:val="NormalWeb"/>
+              <w:numPr>
+                <w:ilvl w:val="0"/>
+                <w:numId w:val="6"/>
+              </w:numPr>
+              <w:spacing w:before="0" w:beforeAutospacing="0" w:after="0" w:afterAutospacing="0" w:line="360" w:lineRule="auto"/>
+              <w:ind w:left="346"/>
+              <w:jc w:val="both"/>
+            </w:pPr>
+            <w:r>
+              <w:t xml:space="preserve">Coding </w:t>
+            </w:r>
+          </w:p>
+          <w:p>
+            <w:pPr>
+              <w:pStyle w:val="NormalWeb"/>
+              <w:numPr>
+                <w:ilvl w:val="0"/>
+                <w:numId w:val="6"/>
+              </w:numPr>
+              <w:spacing w:before="0" w:beforeAutospacing="0" w:after="0" w:afterAutospacing="0" w:line="360" w:lineRule="auto"/>
+              <w:ind w:left="346"/>
+              <w:jc w:val="both"/>
+            </w:pPr>
+            <w:r>
+              <w:t>Support in system design.</w:t>
+            </w:r>
+          </w:p>
+          <w:p>
+            <w:pPr>
+              <w:pStyle w:val="NormalWeb"/>
+              <w:numPr>
+                <w:ilvl w:val="0"/>
+                <w:numId w:val="6"/>
+              </w:numPr>
+              <w:spacing w:before="0" w:beforeAutospacing="0" w:after="0" w:afterAutospacing="0" w:line="360" w:lineRule="auto"/>
+              <w:ind w:left="346"/>
+              <w:jc w:val="both"/>
+            </w:pPr>
+            <w:proofErr w:type="spellStart"/>
+            <w:r>
+              <w:t>Dfd</w:t>
+            </w:r>
+            <w:proofErr w:type="spellEnd"/>
+          </w:p>
+        </w:tc>
+        <w:tc>
+          <w:tcPr>
+            <w:tcW w:w="2051" w:type="dxa"/>
+          </w:tcPr>
+          <w:p>
+            <w:pPr>
+              <w:pStyle w:val="NormalWeb"/>
+              <w:spacing w:before="0" w:beforeAutospacing="0" w:after="0" w:afterAutospacing="0" w:line="360" w:lineRule="auto"/>
+              <w:jc w:val="both"/>
+            </w:pPr>
+          </w:p>
+        </w:tc>
+      </w:tr>
+    </w:tbl>
+    <w:p>
+      <w:pPr>
+        <w:rPr>
+          <w:szCs w:val="24"/>
+        </w:rPr>
+      </w:pPr>
+    </w:p>
+    <w:p>
+      <w:pPr>
+        <w:rPr>
+          <w:szCs w:val="24"/>
+        </w:rPr>
+      </w:pPr>
+    </w:p>
+    <w:p>
+      <w:pPr>
+        <w:rPr>
+          <w:szCs w:val="24"/>
+        </w:rPr>
+      </w:pPr>
+    </w:p>
+    <w:p>
+      <w:pPr>
+        <w:rPr>
+          <w:szCs w:val="24"/>
+        </w:rPr>
+      </w:pPr>
+    </w:p>
+    <w:p>
+      <w:pPr>
+        <w:rPr>
+          <w:szCs w:val="24"/>
+        </w:rPr>
+      </w:pPr>
+    </w:p>
+    <w:p>
+      <w:pPr>
+        <w:rPr>
+          <w:szCs w:val="24"/>
+        </w:rPr>
+      </w:pPr>
+    </w:p>
+    <w:p>
+      <w:pPr>
+        <w:rPr>
+          <w:szCs w:val="24"/>
+        </w:rPr>
+      </w:pPr>
+    </w:p>
+    <w:p>
+      <w:pPr>
+        <w:rPr>
+          <w:szCs w:val="24"/>
+        </w:rPr>
+      </w:pPr>
+    </w:p>
+    <w:p>
+      <w:pPr>
+        <w:rPr>
+          <w:szCs w:val="24"/>
+        </w:rPr>
+      </w:pPr>
+    </w:p>
+    <w:p>
+      <w:pPr>
+        <w:rPr>
+          <w:szCs w:val="24"/>
+        </w:rPr>
+      </w:pPr>
+    </w:p>
+    <w:p>
+      <w:pPr>
+        <w:rPr>
+          <w:szCs w:val="24"/>
+        </w:rPr>
+      </w:pPr>
+    </w:p>
+    <w:p>
+      <w:pPr>
+        <w:rPr>
+          <w:szCs w:val="24"/>
+        </w:rPr>
+      </w:pPr>
+    </w:p>
+    <w:p>
+      <w:pPr>
+        <w:rPr>
+          <w:szCs w:val="24"/>
+        </w:rPr>
+      </w:pPr>
+    </w:p>
+    <w:p>
+      <w:pPr>
+        <w:rPr>
+          <w:szCs w:val="24"/>
+        </w:rPr>
+      </w:pPr>
+    </w:p>
+    <w:p>
+      <w:pPr>
+        <w:rPr>
+          <w:szCs w:val="24"/>
+        </w:rPr>
+      </w:pPr>
+    </w:p>
+    <w:p>
+      <w:pPr>
+        <w:rPr>
+          <w:szCs w:val="24"/>
+        </w:rPr>
+      </w:pPr>
+    </w:p>
+    <w:p>
+      <w:pPr>
+        <w:rPr>
+          <w:szCs w:val="24"/>
+        </w:rPr>
+      </w:pPr>
+    </w:p>
+    <w:p>
+      <w:pPr>
+        <w:rPr>
+          <w:szCs w:val="24"/>
+        </w:rPr>
+      </w:pPr>
+    </w:p>
+    <w:p>
+      <w:pPr>
+        <w:pStyle w:val="Heading1"/>
+      </w:pPr>
+    </w:p>
+    <w:p/>
     <w:p>
       <w:pPr>
         <w:spacing w:after="0" w:line="360" w:lineRule="auto"/>
@@ -7739,6 +8464,7 @@
           <w:b/>
           <w:szCs w:val="24"/>
         </w:rPr>
+        <w:lastRenderedPageBreak/>
         <w:t>Gantt Chart</w:t>
       </w:r>
     </w:p>
@@ -7822,7 +8548,7 @@
           <w:szCs w:val="24"/>
         </w:rPr>
       </w:pPr>
-      <w:bookmarkStart w:id="19" w:name="_Toc232590311"/>
+      <w:bookmarkStart w:id="18" w:name="_Toc232590311"/>
       <w:r>
         <w:rPr>
           <w:i w:val="0"/>
@@ -7894,7 +8620,7 @@
         </w:rPr>
         <w:t xml:space="preserve"> Gantt Chart</w:t>
       </w:r>
-      <w:bookmarkEnd w:id="19"/>
+      <w:bookmarkEnd w:id="18"/>
     </w:p>
     <w:p>
       <w:r>
@@ -7903,12 +8629,1532 @@
     </w:p>
     <w:p>
       <w:pPr>
-        <w:pStyle w:val="ListParagraph"/>
-        <w:ind w:left="360"/>
+        <w:pStyle w:val="Heading1"/>
+        <w:numPr>
+          <w:ilvl w:val="0"/>
+          <w:numId w:val="44"/>
+        </w:numPr>
+        <w:tabs>
+          <w:tab w:val="left" w:pos="360"/>
+        </w:tabs>
+        <w:ind w:left="180" w:hanging="180"/>
+      </w:pPr>
+      <w:r>
+        <w:lastRenderedPageBreak/>
+        <w:t>Testing</w:t>
+      </w:r>
+    </w:p>
+    <w:p>
+      <w:r>
+        <w:t>Testing is a vital phase of software development that ensures the system functions according to the specified requirements. The Rock Paper Scissors Game was tested using different testing techniques to verify the correctness, reliability, and usability of each module. All identified errors were corrected before the final implementation</w:t>
+      </w:r>
+      <w:r>
+        <w:t>.</w:t>
+      </w:r>
+    </w:p>
+    <w:p>
+      <w:pPr>
         <w:rPr>
           <w:b/>
-          <w:sz w:val="32"/>
-          <w:szCs w:val="32"/>
+          <w:bCs/>
+          <w:lang w:val="en-US"/>
+        </w:rPr>
+      </w:pPr>
+      <w:r>
+        <w:rPr>
+          <w:b/>
+          <w:bCs/>
+          <w:lang w:val="en-US"/>
+        </w:rPr>
+        <w:t>8.1 Software Testing Life Cycle (</w:t>
+      </w:r>
+      <w:proofErr w:type="spellStart"/>
+      <w:r>
+        <w:rPr>
+          <w:b/>
+          <w:bCs/>
+          <w:lang w:val="en-US"/>
+        </w:rPr>
+        <w:t>STLC</w:t>
+      </w:r>
+      <w:proofErr w:type="spellEnd"/>
+      <w:r>
+        <w:rPr>
+          <w:b/>
+          <w:bCs/>
+          <w:lang w:val="en-US"/>
+        </w:rPr>
+        <w:t>)</w:t>
+      </w:r>
+    </w:p>
+    <w:p>
+      <w:pPr>
+        <w:rPr>
+          <w:lang w:val="en-US"/>
+        </w:rPr>
+      </w:pPr>
+      <w:r>
+        <w:rPr>
+          <w:lang w:val="en-US"/>
+        </w:rPr>
+        <w:t>The Software Testing Life Cycle followed in this project consists of the following phases:</w:t>
+      </w:r>
+    </w:p>
+    <w:p>
+      <w:pPr>
+        <w:rPr>
+          <w:b/>
+          <w:bCs/>
+          <w:lang w:val="en-US"/>
+        </w:rPr>
+      </w:pPr>
+      <w:r>
+        <w:rPr>
+          <w:b/>
+          <w:bCs/>
+          <w:lang w:val="en-US"/>
+        </w:rPr>
+        <w:t>1. Requirement Analysis</w:t>
+      </w:r>
+    </w:p>
+    <w:p>
+      <w:pPr>
+        <w:rPr>
+          <w:lang w:val="en-US"/>
+        </w:rPr>
+      </w:pPr>
+      <w:r>
+        <w:rPr>
+          <w:lang w:val="en-US"/>
+        </w:rPr>
+        <w:t>The project requirements were analyzed to identify the functionalities that needed testing. These include registration, login, gameplay, score management, history, leaderboard, profile update, and account deletion.</w:t>
+      </w:r>
+    </w:p>
+    <w:p>
+      <w:pPr>
+        <w:rPr>
+          <w:b/>
+          <w:bCs/>
+          <w:lang w:val="en-US"/>
+        </w:rPr>
+      </w:pPr>
+      <w:r>
+        <w:rPr>
+          <w:b/>
+          <w:bCs/>
+          <w:lang w:val="en-US"/>
+        </w:rPr>
+        <w:t>2. Test Planning</w:t>
+      </w:r>
+    </w:p>
+    <w:p>
+      <w:pPr>
+        <w:rPr>
+          <w:lang w:val="en-US"/>
+        </w:rPr>
+      </w:pPr>
+      <w:r>
+        <w:rPr>
+          <w:lang w:val="en-US"/>
+        </w:rPr>
+        <w:t>A test plan was prepared to define the objectives, testing methods, and expected outcomes for every module.</w:t>
+      </w:r>
+    </w:p>
+    <w:p>
+      <w:pPr>
+        <w:rPr>
+          <w:b/>
+          <w:bCs/>
+          <w:lang w:val="en-US"/>
+        </w:rPr>
+      </w:pPr>
+      <w:r>
+        <w:rPr>
+          <w:b/>
+          <w:bCs/>
+          <w:lang w:val="en-US"/>
+        </w:rPr>
+        <w:t>3. Test Case Design</w:t>
+      </w:r>
+    </w:p>
+    <w:p>
+      <w:pPr>
+        <w:rPr>
+          <w:lang w:val="en-US"/>
+        </w:rPr>
+      </w:pPr>
+      <w:r>
+        <w:rPr>
+          <w:lang w:val="en-US"/>
+        </w:rPr>
+        <w:t>Test cases were designed for both valid and invalid inputs to verify the correctness of each feature.</w:t>
+      </w:r>
+    </w:p>
+    <w:p>
+      <w:pPr>
+        <w:rPr>
+          <w:b/>
+          <w:bCs/>
+          <w:lang w:val="en-US"/>
+        </w:rPr>
+      </w:pPr>
+      <w:r>
+        <w:rPr>
+          <w:b/>
+          <w:bCs/>
+          <w:lang w:val="en-US"/>
+        </w:rPr>
+        <w:t>4. Test Environment Setup</w:t>
+      </w:r>
+    </w:p>
+    <w:p>
+      <w:pPr>
+        <w:rPr>
+          <w:lang w:val="en-US"/>
+        </w:rPr>
+      </w:pPr>
+      <w:r>
+        <w:rPr>
+          <w:lang w:val="en-US"/>
+        </w:rPr>
+        <w:t>The application was compiled and executed using the Dev-C++ compiler on Windows. The binary data file (</w:t>
+      </w:r>
+      <w:r>
+        <w:rPr>
+          <w:b/>
+          <w:bCs/>
+          <w:lang w:val="en-US"/>
+        </w:rPr>
+        <w:t>game_rock.dat</w:t>
+      </w:r>
+      <w:r>
+        <w:rPr>
+          <w:lang w:val="en-US"/>
+        </w:rPr>
+        <w:t>) was created to store user information.</w:t>
+      </w:r>
+    </w:p>
+    <w:p>
+      <w:pPr>
+        <w:rPr>
+          <w:b/>
+          <w:bCs/>
+          <w:lang w:val="en-US"/>
+        </w:rPr>
+      </w:pPr>
+      <w:r>
+        <w:rPr>
+          <w:b/>
+          <w:bCs/>
+          <w:lang w:val="en-US"/>
+        </w:rPr>
+        <w:t>5. Test Execution</w:t>
+      </w:r>
+    </w:p>
+    <w:p>
+      <w:pPr>
+        <w:rPr>
+          <w:lang w:val="en-US"/>
+        </w:rPr>
+      </w:pPr>
+      <w:r>
+        <w:rPr>
+          <w:lang w:val="en-US"/>
+        </w:rPr>
+        <w:t>Each module was executed independently and then integrated to verify complete system functionality.</w:t>
+      </w:r>
+    </w:p>
+    <w:p>
+      <w:pPr>
+        <w:rPr>
+          <w:b/>
+          <w:bCs/>
+          <w:lang w:val="en-US"/>
+        </w:rPr>
+      </w:pPr>
+      <w:r>
+        <w:rPr>
+          <w:b/>
+          <w:bCs/>
+          <w:lang w:val="en-US"/>
+        </w:rPr>
+        <w:t>6. Test Closure</w:t>
+      </w:r>
+    </w:p>
+    <w:p>
+      <w:pPr>
+        <w:rPr>
+          <w:lang w:val="en-US"/>
+        </w:rPr>
+      </w:pPr>
+      <w:r>
+        <w:rPr>
+          <w:lang w:val="en-US"/>
+        </w:rPr>
+        <w:t>After successful execution of all test cases, the application was approved for deployment.</w:t>
+      </w:r>
+    </w:p>
+    <w:p>
+      <w:pPr>
+        <w:rPr>
+          <w:b/>
+          <w:bCs/>
+        </w:rPr>
+      </w:pPr>
+      <w:r>
+        <w:rPr>
+          <w:b/>
+          <w:bCs/>
+        </w:rPr>
+        <w:t>8.2 Test Cases</w:t>
+      </w:r>
+    </w:p>
+    <w:p>
+      <w:pPr>
+        <w:rPr>
+          <w:b/>
+          <w:bCs/>
+          <w:lang w:val="en-US"/>
+        </w:rPr>
+      </w:pPr>
+      <w:r>
+        <w:rPr>
+          <w:b/>
+          <w:bCs/>
+          <w:lang w:val="en-US"/>
+        </w:rPr>
+        <w:t>Title</w:t>
+      </w:r>
+    </w:p>
+    <w:p>
+      <w:pPr>
+        <w:rPr>
+          <w:lang w:val="en-US"/>
+        </w:rPr>
+      </w:pPr>
+      <w:r>
+        <w:rPr>
+          <w:lang w:val="en-US"/>
+        </w:rPr>
+        <w:t>Module Testing of Login Authentication</w:t>
+      </w:r>
+    </w:p>
+    <w:p>
+      <w:pPr>
+        <w:rPr>
+          <w:b/>
+          <w:bCs/>
+          <w:lang w:val="en-US"/>
+        </w:rPr>
+      </w:pPr>
+      <w:r>
+        <w:rPr>
+          <w:b/>
+          <w:bCs/>
+          <w:lang w:val="en-US"/>
+        </w:rPr>
+        <w:t>Test ID</w:t>
+      </w:r>
+    </w:p>
+    <w:p>
+      <w:pPr>
+        <w:rPr>
+          <w:lang w:val="en-US"/>
+        </w:rPr>
+      </w:pPr>
+      <w:r>
+        <w:rPr>
+          <w:lang w:val="en-US"/>
+        </w:rPr>
+        <w:t>TC-001, TC-002, TC-003</w:t>
+      </w:r>
+    </w:p>
+    <w:p>
+      <w:pPr>
+        <w:rPr>
+          <w:b/>
+          <w:bCs/>
+          <w:lang w:val="en-US"/>
+        </w:rPr>
+      </w:pPr>
+      <w:r>
+        <w:rPr>
+          <w:b/>
+          <w:bCs/>
+          <w:lang w:val="en-US"/>
+        </w:rPr>
+        <w:t>Description</w:t>
+      </w:r>
+    </w:p>
+    <w:p>
+      <w:pPr>
+        <w:rPr>
+          <w:lang w:val="en-US"/>
+        </w:rPr>
+      </w:pPr>
+      <w:r>
+        <w:rPr>
+          <w:lang w:val="en-US"/>
+        </w:rPr>
+        <w:lastRenderedPageBreak/>
+        <w:t>The system should authenticate users using the registered username and password before granting access to the game dashboard.</w:t>
+      </w:r>
+    </w:p>
+    <w:p>
+      <w:pPr>
+        <w:rPr>
+          <w:b/>
+          <w:bCs/>
+          <w:lang w:val="en-US"/>
+        </w:rPr>
+      </w:pPr>
+      <w:r>
+        <w:rPr>
+          <w:b/>
+          <w:bCs/>
+          <w:lang w:val="en-US"/>
+        </w:rPr>
+        <w:t>Precondition</w:t>
+      </w:r>
+    </w:p>
+    <w:p>
+      <w:pPr>
+        <w:rPr>
+          <w:lang w:val="en-US"/>
+        </w:rPr>
+      </w:pPr>
+      <w:r>
+        <w:rPr>
+          <w:lang w:val="en-US"/>
+        </w:rPr>
+        <w:t>The user must have successfully registered an account in the system.</w:t>
+      </w:r>
+    </w:p>
+    <w:p>
+      <w:pPr>
+        <w:rPr>
+          <w:b/>
+          <w:bCs/>
+          <w:lang w:val="en-US"/>
+        </w:rPr>
+      </w:pPr>
+      <w:r>
+        <w:rPr>
+          <w:b/>
+          <w:bCs/>
+          <w:lang w:val="en-US"/>
+        </w:rPr>
+        <w:t>Test Steps</w:t>
+      </w:r>
+    </w:p>
+    <w:p>
+      <w:pPr>
+        <w:numPr>
+          <w:ilvl w:val="0"/>
+          <w:numId w:val="45"/>
+        </w:numPr>
+        <w:rPr>
+          <w:lang w:val="en-US"/>
+        </w:rPr>
+      </w:pPr>
+      <w:r>
+        <w:rPr>
+          <w:lang w:val="en-US"/>
+        </w:rPr>
+        <w:t xml:space="preserve">Execute the application. </w:t>
+      </w:r>
+    </w:p>
+    <w:p>
+      <w:pPr>
+        <w:numPr>
+          <w:ilvl w:val="0"/>
+          <w:numId w:val="45"/>
+        </w:numPr>
+        <w:rPr>
+          <w:lang w:val="en-US"/>
+        </w:rPr>
+      </w:pPr>
+      <w:r>
+        <w:rPr>
+          <w:lang w:val="en-US"/>
+        </w:rPr>
+        <w:t xml:space="preserve">Select </w:t>
+      </w:r>
+      <w:r>
+        <w:rPr>
+          <w:b/>
+          <w:bCs/>
+          <w:lang w:val="en-US"/>
+        </w:rPr>
+        <w:t>Login</w:t>
+      </w:r>
+      <w:r>
+        <w:rPr>
+          <w:lang w:val="en-US"/>
+        </w:rPr>
+        <w:t xml:space="preserve"> from the Main Menu. </w:t>
+      </w:r>
+    </w:p>
+    <w:p>
+      <w:pPr>
+        <w:numPr>
+          <w:ilvl w:val="0"/>
+          <w:numId w:val="45"/>
+        </w:numPr>
+        <w:rPr>
+          <w:lang w:val="en-US"/>
+        </w:rPr>
+      </w:pPr>
+      <w:r>
+        <w:rPr>
+          <w:lang w:val="en-US"/>
+        </w:rPr>
+        <w:t>Enter a valid username and password.</w:t>
+      </w:r>
+    </w:p>
+    <w:p>
+      <w:pPr>
+        <w:pStyle w:val="Heading1"/>
+        <w:rPr>
+          <w:sz w:val="48"/>
+          <w:lang w:val="en-US"/>
+        </w:rPr>
+      </w:pPr>
+      <w:r>
+        <w:rPr>
+          <w:rStyle w:val="Strong"/>
+          <w:b/>
+          <w:bCs w:val="0"/>
+        </w:rPr>
+        <w:t>8.2 Requirement Traceability Matrix (RTM)</w:t>
+      </w:r>
+    </w:p>
+    <w:tbl>
+      <w:tblPr>
+        <w:tblStyle w:val="TableGrid"/>
+        <w:tblW w:w="0" w:type="auto"/>
+        <w:tblLook w:val="04A0" w:firstRow="1" w:lastRow="0" w:firstColumn="1" w:lastColumn="0" w:noHBand="0" w:noVBand="1"/>
+      </w:tblPr>
+      <w:tblGrid>
+        <w:gridCol w:w="643"/>
+        <w:gridCol w:w="2369"/>
+        <w:gridCol w:w="1407"/>
+        <w:gridCol w:w="857"/>
+        <w:gridCol w:w="3020"/>
+      </w:tblGrid>
+      <w:tr>
+        <w:tc>
+          <w:tcPr>
+            <w:tcW w:w="0" w:type="auto"/>
+            <w:hideMark/>
+          </w:tcPr>
+          <w:p>
+            <w:pPr>
+              <w:jc w:val="center"/>
+              <w:rPr>
+                <w:b/>
+                <w:bCs/>
+              </w:rPr>
+            </w:pPr>
+            <w:proofErr w:type="spellStart"/>
+            <w:r>
+              <w:rPr>
+                <w:b/>
+                <w:bCs/>
+              </w:rPr>
+              <w:t>S.N</w:t>
+            </w:r>
+            <w:proofErr w:type="spellEnd"/>
+            <w:r>
+              <w:rPr>
+                <w:b/>
+                <w:bCs/>
+              </w:rPr>
+              <w:t>.</w:t>
+            </w:r>
+          </w:p>
+        </w:tc>
+        <w:tc>
+          <w:tcPr>
+            <w:tcW w:w="0" w:type="auto"/>
+            <w:hideMark/>
+          </w:tcPr>
+          <w:p>
+            <w:pPr>
+              <w:jc w:val="center"/>
+              <w:rPr>
+                <w:b/>
+                <w:bCs/>
+              </w:rPr>
+            </w:pPr>
+            <w:r>
+              <w:rPr>
+                <w:b/>
+                <w:bCs/>
+              </w:rPr>
+              <w:t>Requirement Description</w:t>
+            </w:r>
+          </w:p>
+        </w:tc>
+        <w:tc>
+          <w:tcPr>
+            <w:tcW w:w="0" w:type="auto"/>
+            <w:hideMark/>
+          </w:tcPr>
+          <w:p>
+            <w:pPr>
+              <w:jc w:val="center"/>
+              <w:rPr>
+                <w:b/>
+                <w:bCs/>
+              </w:rPr>
+            </w:pPr>
+            <w:r>
+              <w:rPr>
+                <w:b/>
+                <w:bCs/>
+              </w:rPr>
+              <w:t>Test Case ID</w:t>
+            </w:r>
+          </w:p>
+        </w:tc>
+        <w:tc>
+          <w:tcPr>
+            <w:tcW w:w="0" w:type="auto"/>
+            <w:hideMark/>
+          </w:tcPr>
+          <w:p>
+            <w:pPr>
+              <w:jc w:val="center"/>
+              <w:rPr>
+                <w:b/>
+                <w:bCs/>
+              </w:rPr>
+            </w:pPr>
+            <w:r>
+              <w:rPr>
+                <w:b/>
+                <w:bCs/>
+              </w:rPr>
+              <w:t>Status</w:t>
+            </w:r>
+          </w:p>
+        </w:tc>
+        <w:tc>
+          <w:tcPr>
+            <w:tcW w:w="0" w:type="auto"/>
+            <w:hideMark/>
+          </w:tcPr>
+          <w:p>
+            <w:pPr>
+              <w:jc w:val="center"/>
+              <w:rPr>
+                <w:b/>
+                <w:bCs/>
+              </w:rPr>
+            </w:pPr>
+            <w:r>
+              <w:rPr>
+                <w:b/>
+                <w:bCs/>
+              </w:rPr>
+              <w:t>Remarks</w:t>
+            </w:r>
+          </w:p>
+        </w:tc>
+      </w:tr>
+      <w:tr>
+        <w:tc>
+          <w:tcPr>
+            <w:tcW w:w="0" w:type="auto"/>
+            <w:hideMark/>
+          </w:tcPr>
+          <w:p>
+            <w:r>
+              <w:t>101</w:t>
+            </w:r>
+          </w:p>
+        </w:tc>
+        <w:tc>
+          <w:tcPr>
+            <w:tcW w:w="0" w:type="auto"/>
+            <w:hideMark/>
+          </w:tcPr>
+          <w:p>
+            <w:r>
+              <w:t>User Registration</w:t>
+            </w:r>
+          </w:p>
+        </w:tc>
+        <w:tc>
+          <w:tcPr>
+            <w:tcW w:w="0" w:type="auto"/>
+            <w:hideMark/>
+          </w:tcPr>
+          <w:p>
+            <w:r>
+              <w:t>TC-001</w:t>
+            </w:r>
+          </w:p>
+        </w:tc>
+        <w:tc>
+          <w:tcPr>
+            <w:tcW w:w="0" w:type="auto"/>
+            <w:hideMark/>
+          </w:tcPr>
+          <w:p>
+            <w:r>
+              <w:t>Pass</w:t>
+            </w:r>
+          </w:p>
+        </w:tc>
+        <w:tc>
+          <w:tcPr>
+            <w:tcW w:w="0" w:type="auto"/>
+            <w:hideMark/>
+          </w:tcPr>
+          <w:p>
+            <w:r>
+              <w:t>User account created successfully</w:t>
+            </w:r>
+          </w:p>
+        </w:tc>
+      </w:tr>
+      <w:tr>
+        <w:tc>
+          <w:tcPr>
+            <w:tcW w:w="0" w:type="auto"/>
+            <w:hideMark/>
+          </w:tcPr>
+          <w:p>
+            <w:r>
+              <w:t>102</w:t>
+            </w:r>
+          </w:p>
+        </w:tc>
+        <w:tc>
+          <w:tcPr>
+            <w:tcW w:w="0" w:type="auto"/>
+            <w:hideMark/>
+          </w:tcPr>
+          <w:p>
+            <w:r>
+              <w:t>Login Authentication</w:t>
+            </w:r>
+          </w:p>
+        </w:tc>
+        <w:tc>
+          <w:tcPr>
+            <w:tcW w:w="0" w:type="auto"/>
+            <w:hideMark/>
+          </w:tcPr>
+          <w:p>
+            <w:r>
+              <w:t>TC-002, TC-003</w:t>
+            </w:r>
+          </w:p>
+        </w:tc>
+        <w:tc>
+          <w:tcPr>
+            <w:tcW w:w="0" w:type="auto"/>
+            <w:hideMark/>
+          </w:tcPr>
+          <w:p>
+            <w:r>
+              <w:t>Pass</w:t>
+            </w:r>
+          </w:p>
+        </w:tc>
+        <w:tc>
+          <w:tcPr>
+            <w:tcW w:w="0" w:type="auto"/>
+            <w:hideMark/>
+          </w:tcPr>
+          <w:p>
+            <w:r>
+              <w:t>Invalid credentials handled correctly</w:t>
+            </w:r>
+          </w:p>
+        </w:tc>
+      </w:tr>
+      <w:tr>
+        <w:tc>
+          <w:tcPr>
+            <w:tcW w:w="0" w:type="auto"/>
+            <w:hideMark/>
+          </w:tcPr>
+          <w:p>
+            <w:r>
+              <w:t>103</w:t>
+            </w:r>
+          </w:p>
+        </w:tc>
+        <w:tc>
+          <w:tcPr>
+            <w:tcW w:w="0" w:type="auto"/>
+            <w:hideMark/>
+          </w:tcPr>
+          <w:p>
+            <w:r>
+              <w:t>Single Player Mode</w:t>
+            </w:r>
+          </w:p>
+        </w:tc>
+        <w:tc>
+          <w:tcPr>
+            <w:tcW w:w="0" w:type="auto"/>
+            <w:hideMark/>
+          </w:tcPr>
+          <w:p>
+            <w:r>
+              <w:t>TC-004</w:t>
+            </w:r>
+          </w:p>
+        </w:tc>
+        <w:tc>
+          <w:tcPr>
+            <w:tcW w:w="0" w:type="auto"/>
+            <w:hideMark/>
+          </w:tcPr>
+          <w:p>
+            <w:r>
+              <w:t>Pass</w:t>
+            </w:r>
+          </w:p>
+        </w:tc>
+        <w:tc>
+          <w:tcPr>
+            <w:tcW w:w="0" w:type="auto"/>
+            <w:hideMark/>
+          </w:tcPr>
+          <w:p>
+            <w:r>
+              <w:t>Winner calculated correctly</w:t>
+            </w:r>
+          </w:p>
+        </w:tc>
+      </w:tr>
+      <w:tr>
+        <w:tc>
+          <w:tcPr>
+            <w:tcW w:w="0" w:type="auto"/>
+            <w:hideMark/>
+          </w:tcPr>
+          <w:p>
+            <w:r>
+              <w:t>104</w:t>
+            </w:r>
+          </w:p>
+        </w:tc>
+        <w:tc>
+          <w:tcPr>
+            <w:tcW w:w="0" w:type="auto"/>
+            <w:hideMark/>
+          </w:tcPr>
+          <w:p>
+            <w:r>
+              <w:t>Multiplayer Mode</w:t>
+            </w:r>
+          </w:p>
+        </w:tc>
+        <w:tc>
+          <w:tcPr>
+            <w:tcW w:w="0" w:type="auto"/>
+            <w:hideMark/>
+          </w:tcPr>
+          <w:p>
+            <w:r>
+              <w:t>TC-005</w:t>
+            </w:r>
+          </w:p>
+        </w:tc>
+        <w:tc>
+          <w:tcPr>
+            <w:tcW w:w="0" w:type="auto"/>
+            <w:hideMark/>
+          </w:tcPr>
+          <w:p>
+            <w:r>
+              <w:t>Pass</w:t>
+            </w:r>
+          </w:p>
+        </w:tc>
+        <w:tc>
+          <w:tcPr>
+            <w:tcW w:w="0" w:type="auto"/>
+            <w:hideMark/>
+          </w:tcPr>
+          <w:p>
+            <w:r>
+              <w:t>Both player scores updated correctly</w:t>
+            </w:r>
+          </w:p>
+        </w:tc>
+      </w:tr>
+      <w:tr>
+        <w:tc>
+          <w:tcPr>
+            <w:tcW w:w="0" w:type="auto"/>
+            <w:hideMark/>
+          </w:tcPr>
+          <w:p>
+            <w:r>
+              <w:t>105</w:t>
+            </w:r>
+          </w:p>
+        </w:tc>
+        <w:tc>
+          <w:tcPr>
+            <w:tcW w:w="0" w:type="auto"/>
+            <w:hideMark/>
+          </w:tcPr>
+          <w:p>
+            <w:r>
+              <w:t>Score Management</w:t>
+            </w:r>
+          </w:p>
+        </w:tc>
+        <w:tc>
+          <w:tcPr>
+            <w:tcW w:w="0" w:type="auto"/>
+            <w:hideMark/>
+          </w:tcPr>
+          <w:p>
+            <w:r>
+              <w:t>TC-006</w:t>
+            </w:r>
+          </w:p>
+        </w:tc>
+        <w:tc>
+          <w:tcPr>
+            <w:tcW w:w="0" w:type="auto"/>
+            <w:hideMark/>
+          </w:tcPr>
+          <w:p>
+            <w:r>
+              <w:t>Pass</w:t>
+            </w:r>
+          </w:p>
+        </w:tc>
+        <w:tc>
+          <w:tcPr>
+            <w:tcW w:w="0" w:type="auto"/>
+            <w:hideMark/>
+          </w:tcPr>
+          <w:p>
+            <w:r>
+              <w:t>Wins, losses and draws</w:t>
+            </w:r>
+          </w:p>
+        </w:tc>
+      </w:tr>
+      <w:tr>
+        <w:tc>
+          <w:tcPr>
+            <w:tcW w:w="0" w:type="auto"/>
+            <w:hideMark/>
+          </w:tcPr>
+          <w:p>
+            <w:pPr>
+              <w:rPr>
+                <w:rFonts w:eastAsia="Times New Roman" w:cs="Times New Roman"/>
+                <w:szCs w:val="24"/>
+                <w:lang w:val="en-US"/>
+              </w:rPr>
+            </w:pPr>
+            <w:r>
+              <w:rPr>
+                <w:rFonts w:eastAsia="Times New Roman" w:cs="Times New Roman"/>
+                <w:szCs w:val="24"/>
+                <w:lang w:val="en-US"/>
+              </w:rPr>
+              <w:t>106</w:t>
+            </w:r>
+          </w:p>
+        </w:tc>
+        <w:tc>
+          <w:tcPr>
+            <w:tcW w:w="0" w:type="auto"/>
+            <w:hideMark/>
+          </w:tcPr>
+          <w:p>
+            <w:pPr>
+              <w:rPr>
+                <w:rFonts w:eastAsia="Times New Roman" w:cs="Times New Roman"/>
+                <w:szCs w:val="24"/>
+                <w:lang w:val="en-US"/>
+              </w:rPr>
+            </w:pPr>
+            <w:r>
+              <w:rPr>
+                <w:rFonts w:eastAsia="Times New Roman" w:cs="Times New Roman"/>
+                <w:szCs w:val="24"/>
+                <w:lang w:val="en-US"/>
+              </w:rPr>
+              <w:t>Match History</w:t>
+            </w:r>
+          </w:p>
+        </w:tc>
+        <w:tc>
+          <w:tcPr>
+            <w:tcW w:w="0" w:type="auto"/>
+            <w:hideMark/>
+          </w:tcPr>
+          <w:p>
+            <w:pPr>
+              <w:rPr>
+                <w:rFonts w:eastAsia="Times New Roman" w:cs="Times New Roman"/>
+                <w:szCs w:val="24"/>
+                <w:lang w:val="en-US"/>
+              </w:rPr>
+            </w:pPr>
+            <w:r>
+              <w:rPr>
+                <w:rFonts w:eastAsia="Times New Roman" w:cs="Times New Roman"/>
+                <w:szCs w:val="24"/>
+                <w:lang w:val="en-US"/>
+              </w:rPr>
+              <w:t>TC-007</w:t>
+            </w:r>
+          </w:p>
+        </w:tc>
+        <w:tc>
+          <w:tcPr>
+            <w:tcW w:w="0" w:type="auto"/>
+            <w:hideMark/>
+          </w:tcPr>
+          <w:p>
+            <w:pPr>
+              <w:rPr>
+                <w:rFonts w:eastAsia="Times New Roman" w:cs="Times New Roman"/>
+                <w:szCs w:val="24"/>
+                <w:lang w:val="en-US"/>
+              </w:rPr>
+            </w:pPr>
+            <w:r>
+              <w:rPr>
+                <w:rFonts w:eastAsia="Times New Roman" w:cs="Times New Roman"/>
+                <w:szCs w:val="24"/>
+                <w:lang w:val="en-US"/>
+              </w:rPr>
+              <w:t>Pass</w:t>
+            </w:r>
+          </w:p>
+        </w:tc>
+        <w:tc>
+          <w:tcPr>
+            <w:tcW w:w="0" w:type="auto"/>
+            <w:hideMark/>
+          </w:tcPr>
+          <w:p>
+            <w:pPr>
+              <w:rPr>
+                <w:rFonts w:eastAsia="Times New Roman" w:cs="Times New Roman"/>
+                <w:szCs w:val="24"/>
+                <w:lang w:val="en-US"/>
+              </w:rPr>
+            </w:pPr>
+            <w:r>
+              <w:rPr>
+                <w:rFonts w:eastAsia="Times New Roman" w:cs="Times New Roman"/>
+                <w:szCs w:val="24"/>
+                <w:lang w:val="en-US"/>
+              </w:rPr>
+              <w:t>History stored successfully</w:t>
+            </w:r>
+          </w:p>
+        </w:tc>
+      </w:tr>
+      <w:tr>
+        <w:tc>
+          <w:tcPr>
+            <w:tcW w:w="0" w:type="auto"/>
+            <w:hideMark/>
+          </w:tcPr>
+          <w:p>
+            <w:pPr>
+              <w:rPr>
+                <w:rFonts w:eastAsia="Times New Roman" w:cs="Times New Roman"/>
+                <w:szCs w:val="24"/>
+                <w:lang w:val="en-US"/>
+              </w:rPr>
+            </w:pPr>
+            <w:r>
+              <w:rPr>
+                <w:rFonts w:eastAsia="Times New Roman" w:cs="Times New Roman"/>
+                <w:szCs w:val="24"/>
+                <w:lang w:val="en-US"/>
+              </w:rPr>
+              <w:t>107</w:t>
+            </w:r>
+          </w:p>
+        </w:tc>
+        <w:tc>
+          <w:tcPr>
+            <w:tcW w:w="0" w:type="auto"/>
+            <w:hideMark/>
+          </w:tcPr>
+          <w:p>
+            <w:pPr>
+              <w:rPr>
+                <w:rFonts w:eastAsia="Times New Roman" w:cs="Times New Roman"/>
+                <w:szCs w:val="24"/>
+                <w:lang w:val="en-US"/>
+              </w:rPr>
+            </w:pPr>
+            <w:r>
+              <w:rPr>
+                <w:rFonts w:eastAsia="Times New Roman" w:cs="Times New Roman"/>
+                <w:szCs w:val="24"/>
+                <w:lang w:val="en-US"/>
+              </w:rPr>
+              <w:t>Leaderboard</w:t>
+            </w:r>
+          </w:p>
+        </w:tc>
+        <w:tc>
+          <w:tcPr>
+            <w:tcW w:w="0" w:type="auto"/>
+            <w:hideMark/>
+          </w:tcPr>
+          <w:p>
+            <w:pPr>
+              <w:rPr>
+                <w:rFonts w:eastAsia="Times New Roman" w:cs="Times New Roman"/>
+                <w:szCs w:val="24"/>
+                <w:lang w:val="en-US"/>
+              </w:rPr>
+            </w:pPr>
+            <w:r>
+              <w:rPr>
+                <w:rFonts w:eastAsia="Times New Roman" w:cs="Times New Roman"/>
+                <w:szCs w:val="24"/>
+                <w:lang w:val="en-US"/>
+              </w:rPr>
+              <w:t>TC-008</w:t>
+            </w:r>
+          </w:p>
+        </w:tc>
+        <w:tc>
+          <w:tcPr>
+            <w:tcW w:w="0" w:type="auto"/>
+            <w:hideMark/>
+          </w:tcPr>
+          <w:p>
+            <w:pPr>
+              <w:rPr>
+                <w:rFonts w:eastAsia="Times New Roman" w:cs="Times New Roman"/>
+                <w:szCs w:val="24"/>
+                <w:lang w:val="en-US"/>
+              </w:rPr>
+            </w:pPr>
+            <w:r>
+              <w:rPr>
+                <w:rFonts w:eastAsia="Times New Roman" w:cs="Times New Roman"/>
+                <w:szCs w:val="24"/>
+                <w:lang w:val="en-US"/>
+              </w:rPr>
+              <w:t>Pass</w:t>
+            </w:r>
+          </w:p>
+        </w:tc>
+        <w:tc>
+          <w:tcPr>
+            <w:tcW w:w="0" w:type="auto"/>
+            <w:hideMark/>
+          </w:tcPr>
+          <w:p>
+            <w:pPr>
+              <w:rPr>
+                <w:rFonts w:eastAsia="Times New Roman" w:cs="Times New Roman"/>
+                <w:szCs w:val="24"/>
+                <w:lang w:val="en-US"/>
+              </w:rPr>
+            </w:pPr>
+            <w:r>
+              <w:rPr>
+                <w:rFonts w:eastAsia="Times New Roman" w:cs="Times New Roman"/>
+                <w:szCs w:val="24"/>
+                <w:lang w:val="en-US"/>
+              </w:rPr>
+              <w:t>Users sorted according to wins</w:t>
+            </w:r>
+          </w:p>
+        </w:tc>
+      </w:tr>
+      <w:tr>
+        <w:tc>
+          <w:tcPr>
+            <w:tcW w:w="0" w:type="auto"/>
+            <w:hideMark/>
+          </w:tcPr>
+          <w:p>
+            <w:pPr>
+              <w:rPr>
+                <w:rFonts w:eastAsia="Times New Roman" w:cs="Times New Roman"/>
+                <w:szCs w:val="24"/>
+                <w:lang w:val="en-US"/>
+              </w:rPr>
+            </w:pPr>
+            <w:r>
+              <w:rPr>
+                <w:rFonts w:eastAsia="Times New Roman" w:cs="Times New Roman"/>
+                <w:szCs w:val="24"/>
+                <w:lang w:val="en-US"/>
+              </w:rPr>
+              <w:t>108</w:t>
+            </w:r>
+          </w:p>
+        </w:tc>
+        <w:tc>
+          <w:tcPr>
+            <w:tcW w:w="0" w:type="auto"/>
+            <w:hideMark/>
+          </w:tcPr>
+          <w:p>
+            <w:pPr>
+              <w:rPr>
+                <w:rFonts w:eastAsia="Times New Roman" w:cs="Times New Roman"/>
+                <w:szCs w:val="24"/>
+                <w:lang w:val="en-US"/>
+              </w:rPr>
+            </w:pPr>
+            <w:r>
+              <w:rPr>
+                <w:rFonts w:eastAsia="Times New Roman" w:cs="Times New Roman"/>
+                <w:szCs w:val="24"/>
+                <w:lang w:val="en-US"/>
+              </w:rPr>
+              <w:t>Profile Update</w:t>
+            </w:r>
+          </w:p>
+        </w:tc>
+        <w:tc>
+          <w:tcPr>
+            <w:tcW w:w="0" w:type="auto"/>
+            <w:hideMark/>
+          </w:tcPr>
+          <w:p>
+            <w:pPr>
+              <w:rPr>
+                <w:rFonts w:eastAsia="Times New Roman" w:cs="Times New Roman"/>
+                <w:szCs w:val="24"/>
+                <w:lang w:val="en-US"/>
+              </w:rPr>
+            </w:pPr>
+            <w:r>
+              <w:rPr>
+                <w:rFonts w:eastAsia="Times New Roman" w:cs="Times New Roman"/>
+                <w:szCs w:val="24"/>
+                <w:lang w:val="en-US"/>
+              </w:rPr>
+              <w:t>TC-009</w:t>
+            </w:r>
+          </w:p>
+        </w:tc>
+        <w:tc>
+          <w:tcPr>
+            <w:tcW w:w="0" w:type="auto"/>
+            <w:hideMark/>
+          </w:tcPr>
+          <w:p>
+            <w:pPr>
+              <w:rPr>
+                <w:rFonts w:eastAsia="Times New Roman" w:cs="Times New Roman"/>
+                <w:szCs w:val="24"/>
+                <w:lang w:val="en-US"/>
+              </w:rPr>
+            </w:pPr>
+            <w:r>
+              <w:rPr>
+                <w:rFonts w:eastAsia="Times New Roman" w:cs="Times New Roman"/>
+                <w:szCs w:val="24"/>
+                <w:lang w:val="en-US"/>
+              </w:rPr>
+              <w:t>Pass</w:t>
+            </w:r>
+          </w:p>
+        </w:tc>
+        <w:tc>
+          <w:tcPr>
+            <w:tcW w:w="0" w:type="auto"/>
+            <w:hideMark/>
+          </w:tcPr>
+          <w:p>
+            <w:pPr>
+              <w:rPr>
+                <w:rFonts w:eastAsia="Times New Roman" w:cs="Times New Roman"/>
+                <w:szCs w:val="24"/>
+                <w:lang w:val="en-US"/>
+              </w:rPr>
+            </w:pPr>
+            <w:r>
+              <w:rPr>
+                <w:rFonts w:eastAsia="Times New Roman" w:cs="Times New Roman"/>
+                <w:szCs w:val="24"/>
+                <w:lang w:val="en-US"/>
+              </w:rPr>
+              <w:t>Password updated successfully</w:t>
+            </w:r>
+          </w:p>
+        </w:tc>
+      </w:tr>
+      <w:tr>
+        <w:tc>
+          <w:tcPr>
+            <w:tcW w:w="0" w:type="auto"/>
+            <w:hideMark/>
+          </w:tcPr>
+          <w:p>
+            <w:pPr>
+              <w:rPr>
+                <w:rFonts w:eastAsia="Times New Roman" w:cs="Times New Roman"/>
+                <w:szCs w:val="24"/>
+                <w:lang w:val="en-US"/>
+              </w:rPr>
+            </w:pPr>
+            <w:r>
+              <w:rPr>
+                <w:rFonts w:eastAsia="Times New Roman" w:cs="Times New Roman"/>
+                <w:szCs w:val="24"/>
+                <w:lang w:val="en-US"/>
+              </w:rPr>
+              <w:t>109</w:t>
+            </w:r>
+          </w:p>
+        </w:tc>
+        <w:tc>
+          <w:tcPr>
+            <w:tcW w:w="0" w:type="auto"/>
+            <w:hideMark/>
+          </w:tcPr>
+          <w:p>
+            <w:pPr>
+              <w:rPr>
+                <w:rFonts w:eastAsia="Times New Roman" w:cs="Times New Roman"/>
+                <w:szCs w:val="24"/>
+                <w:lang w:val="en-US"/>
+              </w:rPr>
+            </w:pPr>
+            <w:r>
+              <w:rPr>
+                <w:rFonts w:eastAsia="Times New Roman" w:cs="Times New Roman"/>
+                <w:szCs w:val="24"/>
+                <w:lang w:val="en-US"/>
+              </w:rPr>
+              <w:t>Delete Account</w:t>
+            </w:r>
+          </w:p>
+        </w:tc>
+        <w:tc>
+          <w:tcPr>
+            <w:tcW w:w="0" w:type="auto"/>
+            <w:hideMark/>
+          </w:tcPr>
+          <w:p>
+            <w:pPr>
+              <w:rPr>
+                <w:rFonts w:eastAsia="Times New Roman" w:cs="Times New Roman"/>
+                <w:szCs w:val="24"/>
+                <w:lang w:val="en-US"/>
+              </w:rPr>
+            </w:pPr>
+            <w:r>
+              <w:rPr>
+                <w:rFonts w:eastAsia="Times New Roman" w:cs="Times New Roman"/>
+                <w:szCs w:val="24"/>
+                <w:lang w:val="en-US"/>
+              </w:rPr>
+              <w:t>TC-010</w:t>
+            </w:r>
+          </w:p>
+        </w:tc>
+        <w:tc>
+          <w:tcPr>
+            <w:tcW w:w="0" w:type="auto"/>
+            <w:hideMark/>
+          </w:tcPr>
+          <w:p>
+            <w:pPr>
+              <w:rPr>
+                <w:rFonts w:eastAsia="Times New Roman" w:cs="Times New Roman"/>
+                <w:szCs w:val="24"/>
+                <w:lang w:val="en-US"/>
+              </w:rPr>
+            </w:pPr>
+            <w:r>
+              <w:rPr>
+                <w:rFonts w:eastAsia="Times New Roman" w:cs="Times New Roman"/>
+                <w:szCs w:val="24"/>
+                <w:lang w:val="en-US"/>
+              </w:rPr>
+              <w:t>Pass</w:t>
+            </w:r>
+          </w:p>
+        </w:tc>
+        <w:tc>
+          <w:tcPr>
+            <w:tcW w:w="0" w:type="auto"/>
+            <w:hideMark/>
+          </w:tcPr>
+          <w:p>
+            <w:pPr>
+              <w:rPr>
+                <w:rFonts w:eastAsia="Times New Roman" w:cs="Times New Roman"/>
+                <w:szCs w:val="24"/>
+                <w:lang w:val="en-US"/>
+              </w:rPr>
+            </w:pPr>
+            <w:r>
+              <w:rPr>
+                <w:rFonts w:eastAsia="Times New Roman" w:cs="Times New Roman"/>
+                <w:szCs w:val="24"/>
+                <w:lang w:val="en-US"/>
+              </w:rPr>
+              <w:t>Account removed successfully</w:t>
+            </w:r>
+          </w:p>
+        </w:tc>
+      </w:tr>
+      <w:tr>
+        <w:tc>
+          <w:tcPr>
+            <w:tcW w:w="0" w:type="auto"/>
+            <w:hideMark/>
+          </w:tcPr>
+          <w:p>
+            <w:pPr>
+              <w:rPr>
+                <w:rFonts w:eastAsia="Times New Roman" w:cs="Times New Roman"/>
+                <w:szCs w:val="24"/>
+                <w:lang w:val="en-US"/>
+              </w:rPr>
+            </w:pPr>
+            <w:r>
+              <w:rPr>
+                <w:rFonts w:eastAsia="Times New Roman" w:cs="Times New Roman"/>
+                <w:szCs w:val="24"/>
+                <w:lang w:val="en-US"/>
+              </w:rPr>
+              <w:t>110</w:t>
+            </w:r>
+          </w:p>
+        </w:tc>
+        <w:tc>
+          <w:tcPr>
+            <w:tcW w:w="0" w:type="auto"/>
+            <w:hideMark/>
+          </w:tcPr>
+          <w:p>
+            <w:pPr>
+              <w:rPr>
+                <w:rFonts w:eastAsia="Times New Roman" w:cs="Times New Roman"/>
+                <w:szCs w:val="24"/>
+                <w:lang w:val="en-US"/>
+              </w:rPr>
+            </w:pPr>
+            <w:r>
+              <w:rPr>
+                <w:rFonts w:eastAsia="Times New Roman" w:cs="Times New Roman"/>
+                <w:szCs w:val="24"/>
+                <w:lang w:val="en-US"/>
+              </w:rPr>
+              <w:t>File Handling</w:t>
+            </w:r>
+          </w:p>
+        </w:tc>
+        <w:tc>
+          <w:tcPr>
+            <w:tcW w:w="0" w:type="auto"/>
+            <w:hideMark/>
+          </w:tcPr>
+          <w:p>
+            <w:pPr>
+              <w:rPr>
+                <w:rFonts w:eastAsia="Times New Roman" w:cs="Times New Roman"/>
+                <w:szCs w:val="24"/>
+                <w:lang w:val="en-US"/>
+              </w:rPr>
+            </w:pPr>
+            <w:r>
+              <w:rPr>
+                <w:rFonts w:eastAsia="Times New Roman" w:cs="Times New Roman"/>
+                <w:szCs w:val="24"/>
+                <w:lang w:val="en-US"/>
+              </w:rPr>
+              <w:t>TC-011</w:t>
+            </w:r>
+          </w:p>
+        </w:tc>
+        <w:tc>
+          <w:tcPr>
+            <w:tcW w:w="0" w:type="auto"/>
+            <w:hideMark/>
+          </w:tcPr>
+          <w:p>
+            <w:pPr>
+              <w:rPr>
+                <w:rFonts w:eastAsia="Times New Roman" w:cs="Times New Roman"/>
+                <w:szCs w:val="24"/>
+                <w:lang w:val="en-US"/>
+              </w:rPr>
+            </w:pPr>
+            <w:r>
+              <w:rPr>
+                <w:rFonts w:eastAsia="Times New Roman" w:cs="Times New Roman"/>
+                <w:szCs w:val="24"/>
+                <w:lang w:val="en-US"/>
+              </w:rPr>
+              <w:t>Pass</w:t>
+            </w:r>
+          </w:p>
+        </w:tc>
+        <w:tc>
+          <w:tcPr>
+            <w:tcW w:w="0" w:type="auto"/>
+            <w:hideMark/>
+          </w:tcPr>
+          <w:p>
+            <w:pPr>
+              <w:rPr>
+                <w:rFonts w:eastAsia="Times New Roman" w:cs="Times New Roman"/>
+                <w:szCs w:val="24"/>
+                <w:lang w:val="en-US"/>
+              </w:rPr>
+            </w:pPr>
+            <w:r>
+              <w:rPr>
+                <w:rFonts w:eastAsia="Times New Roman" w:cs="Times New Roman"/>
+                <w:szCs w:val="24"/>
+                <w:lang w:val="en-US"/>
+              </w:rPr>
+              <w:t>User data stored and retrieved correctly</w:t>
+            </w:r>
+          </w:p>
+        </w:tc>
+      </w:tr>
+    </w:tbl>
+    <w:p/>
+    <w:p>
+      <w:pPr>
+        <w:rPr>
+          <w:b/>
+          <w:bCs/>
+        </w:rPr>
+      </w:pPr>
+      <w:r>
+        <w:rPr>
+          <w:b/>
+          <w:bCs/>
+        </w:rPr>
+        <w:t>8.4 User Acceptance Testing (UAT)</w:t>
+      </w:r>
+    </w:p>
+    <w:p>
+      <w:pPr>
+        <w:rPr>
+          <w:b/>
+          <w:bCs/>
         </w:rPr>
       </w:pPr>
     </w:p>
@@ -7943,7 +10189,6 @@
     <w:p/>
     <w:p/>
     <w:p/>
-    <w:p/>
     <w:p>
       <w:pPr>
         <w:rPr>
@@ -8037,6 +10282,7 @@
     </w:p>
     <w:p>
       <w:r>
+        <w:lastRenderedPageBreak/>
         <w:br w:type="page"/>
       </w:r>
     </w:p>
@@ -8091,7 +10337,7 @@
 </file>
 
 <file path=word/endnotes.xml><?xml version="1.0" encoding="utf-8"?>
-<w:endnotes xmlns:wpc="http://schemas.microsoft.com/office/word/2010/wordprocessingCanvas" xmlns:mc="http://schemas.openxmlformats.org/markup-compatibility/2006" xmlns:o="urn:schemas-microsoft-com:office:office" xmlns:r="http://schemas.openxmlformats.org/officeDocument/2006/relationships" xmlns:m="http://schemas.openxmlformats.org/officeDocument/2006/math" xmlns:v="urn:schemas-microsoft-com:vml" xmlns:wp14="http://schemas.microsoft.com/office/word/2010/wordprocessingDrawing" xmlns:wp="http://schemas.openxmlformats.org/drawingml/2006/wordprocessingDrawing" xmlns:w10="urn:schemas-microsoft-com:office:word" xmlns:w="http://schemas.openxmlformats.org/wordprocessingml/2006/main" xmlns:w14="http://schemas.microsoft.com/office/word/2010/wordml" xmlns:w15="http://schemas.microsoft.com/office/word/2012/wordml" xmlns:wpg="http://schemas.microsoft.com/office/word/2010/wordprocessingGroup" xmlns:wpi="http://schemas.microsoft.com/office/word/2010/wordprocessingInk" xmlns:wne="http://schemas.microsoft.com/office/word/2006/wordml" xmlns:wps="http://schemas.microsoft.com/office/word/2010/wordprocessingShape" mc:Ignorable="w14 w15 wp14">
+<w:endnotes xmlns:wpc="http://schemas.microsoft.com/office/word/2010/wordprocessingCanvas" xmlns:cx="http://schemas.microsoft.com/office/drawing/2014/chartex" xmlns:cx1="http://schemas.microsoft.com/office/drawing/2015/9/8/chartex" xmlns:cx2="http://schemas.microsoft.com/office/drawing/2015/10/21/chartex" xmlns:cx3="http://schemas.microsoft.com/office/drawing/2016/5/9/chartex" xmlns:cx4="http://schemas.microsoft.com/office/drawing/2016/5/10/chartex" xmlns:cx5="http://schemas.microsoft.com/office/drawing/2016/5/11/chartex" xmlns:cx6="http://schemas.microsoft.com/office/drawing/2016/5/12/chartex" xmlns:cx7="http://schemas.microsoft.com/office/drawing/2016/5/13/chartex" xmlns:cx8="http://schemas.microsoft.com/office/drawing/2016/5/14/chartex" xmlns:mc="http://schemas.openxmlformats.org/markup-compatibility/2006" xmlns:aink="http://schemas.microsoft.com/office/drawing/2016/ink" xmlns:am3d="http://schemas.microsoft.com/office/drawing/2017/model3d" xmlns:o="urn:schemas-microsoft-com:office:office" xmlns:oel="http://schemas.microsoft.com/office/2019/extlst" xmlns:r="http://schemas.openxmlformats.org/officeDocument/2006/relationships" xmlns:m="http://schemas.openxmlformats.org/officeDocument/2006/math" xmlns:v="urn:schemas-microsoft-com:vml" xmlns:wp14="http://schemas.microsoft.com/office/word/2010/wordprocessingDrawing" xmlns:wp="http://schemas.openxmlformats.org/drawingml/2006/wordprocessingDrawing" xmlns:w10="urn:schemas-microsoft-com:office:word" xmlns:w="http://schemas.openxmlformats.org/wordprocessingml/2006/main" xmlns:w14="http://schemas.microsoft.com/office/word/2010/wordml" xmlns:w15="http://schemas.microsoft.com/office/word/2012/wordml" xmlns:w16cex="http://schemas.microsoft.com/office/word/2018/wordml/cex" xmlns:w16cid="http://schemas.microsoft.com/office/word/2016/wordml/cid" xmlns:w16="http://schemas.microsoft.com/office/word/2018/wordml" xmlns:w16du="http://schemas.microsoft.com/office/word/2023/wordml/word16du" xmlns:w16sdtdh="http://schemas.microsoft.com/office/word/2020/wordml/sdtdatahash" xmlns:w16sdtfl="http://schemas.microsoft.com/office/word/2024/wordml/sdtformatlock" xmlns:w16se="http://schemas.microsoft.com/office/word/2015/wordml/symex" xmlns:wpg="http://schemas.microsoft.com/office/word/2010/wordprocessingGroup" xmlns:wpi="http://schemas.microsoft.com/office/word/2010/wordprocessingInk" xmlns:wne="http://schemas.microsoft.com/office/word/2006/wordml" xmlns:wps="http://schemas.microsoft.com/office/word/2010/wordprocessingShape" mc:Ignorable="w14 w15 w16se w16cid w16 w16cex w16sdtdh w16sdtfl w16du wp14">
   <w:endnote w:type="separator" w:id="-1">
     <w:p>
       <w:pPr>
@@ -8116,7 +10362,7 @@
 </file>
 
 <file path=word/footer1.xml><?xml version="1.0" encoding="utf-8"?>
-<w:ftr xmlns:wpc="http://schemas.microsoft.com/office/word/2010/wordprocessingCanvas" xmlns:mc="http://schemas.openxmlformats.org/markup-compatibility/2006" xmlns:o="urn:schemas-microsoft-com:office:office" xmlns:r="http://schemas.openxmlformats.org/officeDocument/2006/relationships" xmlns:m="http://schemas.openxmlformats.org/officeDocument/2006/math" xmlns:v="urn:schemas-microsoft-com:vml" xmlns:wp14="http://schemas.microsoft.com/office/word/2010/wordprocessingDrawing" xmlns:wp="http://schemas.openxmlformats.org/drawingml/2006/wordprocessingDrawing" xmlns:w10="urn:schemas-microsoft-com:office:word" xmlns:w="http://schemas.openxmlformats.org/wordprocessingml/2006/main" xmlns:w14="http://schemas.microsoft.com/office/word/2010/wordml" xmlns:w15="http://schemas.microsoft.com/office/word/2012/wordml" xmlns:wpg="http://schemas.microsoft.com/office/word/2010/wordprocessingGroup" xmlns:wpi="http://schemas.microsoft.com/office/word/2010/wordprocessingInk" xmlns:wne="http://schemas.microsoft.com/office/word/2006/wordml" xmlns:wps="http://schemas.microsoft.com/office/word/2010/wordprocessingShape" mc:Ignorable="w14 w15 wp14">
+<w:ftr xmlns:wpc="http://schemas.microsoft.com/office/word/2010/wordprocessingCanvas" xmlns:cx="http://schemas.microsoft.com/office/drawing/2014/chartex" xmlns:cx1="http://schemas.microsoft.com/office/drawing/2015/9/8/chartex" xmlns:cx2="http://schemas.microsoft.com/office/drawing/2015/10/21/chartex" xmlns:cx3="http://schemas.microsoft.com/office/drawing/2016/5/9/chartex" xmlns:cx4="http://schemas.microsoft.com/office/drawing/2016/5/10/chartex" xmlns:cx5="http://schemas.microsoft.com/office/drawing/2016/5/11/chartex" xmlns:cx6="http://schemas.microsoft.com/office/drawing/2016/5/12/chartex" xmlns:cx7="http://schemas.microsoft.com/office/drawing/2016/5/13/chartex" xmlns:cx8="http://schemas.microsoft.com/office/drawing/2016/5/14/chartex" xmlns:mc="http://schemas.openxmlformats.org/markup-compatibility/2006" xmlns:aink="http://schemas.microsoft.com/office/drawing/2016/ink" xmlns:am3d="http://schemas.microsoft.com/office/drawing/2017/model3d" xmlns:o="urn:schemas-microsoft-com:office:office" xmlns:oel="http://schemas.microsoft.com/office/2019/extlst" xmlns:r="http://schemas.openxmlformats.org/officeDocument/2006/relationships" xmlns:m="http://schemas.openxmlformats.org/officeDocument/2006/math" xmlns:v="urn:schemas-microsoft-com:vml" xmlns:wp14="http://schemas.microsoft.com/office/word/2010/wordprocessingDrawing" xmlns:wp="http://schemas.openxmlformats.org/drawingml/2006/wordprocessingDrawing" xmlns:w10="urn:schemas-microsoft-com:office:word" xmlns:w="http://schemas.openxmlformats.org/wordprocessingml/2006/main" xmlns:w14="http://schemas.microsoft.com/office/word/2010/wordml" xmlns:w15="http://schemas.microsoft.com/office/word/2012/wordml" xmlns:w16cex="http://schemas.microsoft.com/office/word/2018/wordml/cex" xmlns:w16cid="http://schemas.microsoft.com/office/word/2016/wordml/cid" xmlns:w16="http://schemas.microsoft.com/office/word/2018/wordml" xmlns:w16du="http://schemas.microsoft.com/office/word/2023/wordml/word16du" xmlns:w16sdtdh="http://schemas.microsoft.com/office/word/2020/wordml/sdtdatahash" xmlns:w16sdtfl="http://schemas.microsoft.com/office/word/2024/wordml/sdtformatlock" xmlns:w16se="http://schemas.microsoft.com/office/word/2015/wordml/symex" xmlns:wpg="http://schemas.microsoft.com/office/word/2010/wordprocessingGroup" xmlns:wpi="http://schemas.microsoft.com/office/word/2010/wordprocessingInk" xmlns:wne="http://schemas.microsoft.com/office/word/2006/wordml" xmlns:wps="http://schemas.microsoft.com/office/word/2010/wordprocessingShape" mc:Ignorable="w14 w15 w16se w16cid w16 w16cex w16sdtdh w16sdtfl w16du wp14">
   <w:sdt>
     <w:sdtPr>
       <w:id w:val="1769740165"/>
@@ -8169,7 +10415,7 @@
 </file>
 
 <file path=word/footnotes.xml><?xml version="1.0" encoding="utf-8"?>
-<w:footnotes xmlns:wpc="http://schemas.microsoft.com/office/word/2010/wordprocessingCanvas" xmlns:mc="http://schemas.openxmlformats.org/markup-compatibility/2006" xmlns:o="urn:schemas-microsoft-com:office:office" xmlns:r="http://schemas.openxmlformats.org/officeDocument/2006/relationships" xmlns:m="http://schemas.openxmlformats.org/officeDocument/2006/math" xmlns:v="urn:schemas-microsoft-com:vml" xmlns:wp14="http://schemas.microsoft.com/office/word/2010/wordprocessingDrawing" xmlns:wp="http://schemas.openxmlformats.org/drawingml/2006/wordprocessingDrawing" xmlns:w10="urn:schemas-microsoft-com:office:word" xmlns:w="http://schemas.openxmlformats.org/wordprocessingml/2006/main" xmlns:w14="http://schemas.microsoft.com/office/word/2010/wordml" xmlns:w15="http://schemas.microsoft.com/office/word/2012/wordml" xmlns:wpg="http://schemas.microsoft.com/office/word/2010/wordprocessingGroup" xmlns:wpi="http://schemas.microsoft.com/office/word/2010/wordprocessingInk" xmlns:wne="http://schemas.microsoft.com/office/word/2006/wordml" xmlns:wps="http://schemas.microsoft.com/office/word/2010/wordprocessingShape" mc:Ignorable="w14 w15 wp14">
+<w:footnotes xmlns:wpc="http://schemas.microsoft.com/office/word/2010/wordprocessingCanvas" xmlns:cx="http://schemas.microsoft.com/office/drawing/2014/chartex" xmlns:cx1="http://schemas.microsoft.com/office/drawing/2015/9/8/chartex" xmlns:cx2="http://schemas.microsoft.com/office/drawing/2015/10/21/chartex" xmlns:cx3="http://schemas.microsoft.com/office/drawing/2016/5/9/chartex" xmlns:cx4="http://schemas.microsoft.com/office/drawing/2016/5/10/chartex" xmlns:cx5="http://schemas.microsoft.com/office/drawing/2016/5/11/chartex" xmlns:cx6="http://schemas.microsoft.com/office/drawing/2016/5/12/chartex" xmlns:cx7="http://schemas.microsoft.com/office/drawing/2016/5/13/chartex" xmlns:cx8="http://schemas.microsoft.com/office/drawing/2016/5/14/chartex" xmlns:mc="http://schemas.openxmlformats.org/markup-compatibility/2006" xmlns:aink="http://schemas.microsoft.com/office/drawing/2016/ink" xmlns:am3d="http://schemas.microsoft.com/office/drawing/2017/model3d" xmlns:o="urn:schemas-microsoft-com:office:office" xmlns:oel="http://schemas.microsoft.com/office/2019/extlst" xmlns:r="http://schemas.openxmlformats.org/officeDocument/2006/relationships" xmlns:m="http://schemas.openxmlformats.org/officeDocument/2006/math" xmlns:v="urn:schemas-microsoft-com:vml" xmlns:wp14="http://schemas.microsoft.com/office/word/2010/wordprocessingDrawing" xmlns:wp="http://schemas.openxmlformats.org/drawingml/2006/wordprocessingDrawing" xmlns:w10="urn:schemas-microsoft-com:office:word" xmlns:w="http://schemas.openxmlformats.org/wordprocessingml/2006/main" xmlns:w14="http://schemas.microsoft.com/office/word/2010/wordml" xmlns:w15="http://schemas.microsoft.com/office/word/2012/wordml" xmlns:w16cex="http://schemas.microsoft.com/office/word/2018/wordml/cex" xmlns:w16cid="http://schemas.microsoft.com/office/word/2016/wordml/cid" xmlns:w16="http://schemas.microsoft.com/office/word/2018/wordml" xmlns:w16du="http://schemas.microsoft.com/office/word/2023/wordml/word16du" xmlns:w16sdtdh="http://schemas.microsoft.com/office/word/2020/wordml/sdtdatahash" xmlns:w16sdtfl="http://schemas.microsoft.com/office/word/2024/wordml/sdtformatlock" xmlns:w16se="http://schemas.microsoft.com/office/word/2015/wordml/symex" xmlns:wpg="http://schemas.microsoft.com/office/word/2010/wordprocessingGroup" xmlns:wpi="http://schemas.microsoft.com/office/word/2010/wordprocessingInk" xmlns:wne="http://schemas.microsoft.com/office/word/2006/wordml" xmlns:wps="http://schemas.microsoft.com/office/word/2010/wordprocessingShape" mc:Ignorable="w14 w15 w16se w16cid w16 w16cex w16sdtdh w16sdtfl w16du wp14">
   <w:footnote w:type="separator" w:id="-1">
     <w:p>
       <w:pPr>
@@ -8194,8 +10440,8 @@
 </file>
 
 <file path=word/numbering.xml><?xml version="1.0" encoding="utf-8"?>
-<w:numbering xmlns:wpc="http://schemas.microsoft.com/office/word/2010/wordprocessingCanvas" xmlns:mc="http://schemas.openxmlformats.org/markup-compatibility/2006" xmlns:o="urn:schemas-microsoft-com:office:office" xmlns:r="http://schemas.openxmlformats.org/officeDocument/2006/relationships" xmlns:m="http://schemas.openxmlformats.org/officeDocument/2006/math" xmlns:v="urn:schemas-microsoft-com:vml" xmlns:wp14="http://schemas.microsoft.com/office/word/2010/wordprocessingDrawing" xmlns:wp="http://schemas.openxmlformats.org/drawingml/2006/wordprocessingDrawing" xmlns:w10="urn:schemas-microsoft-com:office:word" xmlns:w="http://schemas.openxmlformats.org/wordprocessingml/2006/main" xmlns:w14="http://schemas.microsoft.com/office/word/2010/wordml" xmlns:w15="http://schemas.microsoft.com/office/word/2012/wordml" xmlns:wpg="http://schemas.microsoft.com/office/word/2010/wordprocessingGroup" xmlns:wpi="http://schemas.microsoft.com/office/word/2010/wordprocessingInk" xmlns:wne="http://schemas.microsoft.com/office/word/2006/wordml" xmlns:wps="http://schemas.microsoft.com/office/word/2010/wordprocessingShape" mc:Ignorable="w14 w15 wp14">
-  <w:abstractNum w:abstractNumId="0">
+<w:numbering xmlns:wpc="http://schemas.microsoft.com/office/word/2010/wordprocessingCanvas" xmlns:cx="http://schemas.microsoft.com/office/drawing/2014/chartex" xmlns:cx1="http://schemas.microsoft.com/office/drawing/2015/9/8/chartex" xmlns:cx2="http://schemas.microsoft.com/office/drawing/2015/10/21/chartex" xmlns:cx3="http://schemas.microsoft.com/office/drawing/2016/5/9/chartex" xmlns:cx4="http://schemas.microsoft.com/office/drawing/2016/5/10/chartex" xmlns:cx5="http://schemas.microsoft.com/office/drawing/2016/5/11/chartex" xmlns:cx6="http://schemas.microsoft.com/office/drawing/2016/5/12/chartex" xmlns:cx7="http://schemas.microsoft.com/office/drawing/2016/5/13/chartex" xmlns:cx8="http://schemas.microsoft.com/office/drawing/2016/5/14/chartex" xmlns:mc="http://schemas.openxmlformats.org/markup-compatibility/2006" xmlns:aink="http://schemas.microsoft.com/office/drawing/2016/ink" xmlns:am3d="http://schemas.microsoft.com/office/drawing/2017/model3d" xmlns:o="urn:schemas-microsoft-com:office:office" xmlns:oel="http://schemas.microsoft.com/office/2019/extlst" xmlns:r="http://schemas.openxmlformats.org/officeDocument/2006/relationships" xmlns:m="http://schemas.openxmlformats.org/officeDocument/2006/math" xmlns:v="urn:schemas-microsoft-com:vml" xmlns:wp14="http://schemas.microsoft.com/office/word/2010/wordprocessingDrawing" xmlns:wp="http://schemas.openxmlformats.org/drawingml/2006/wordprocessingDrawing" xmlns:w10="urn:schemas-microsoft-com:office:word" xmlns:w="http://schemas.openxmlformats.org/wordprocessingml/2006/main" xmlns:w14="http://schemas.microsoft.com/office/word/2010/wordml" xmlns:w15="http://schemas.microsoft.com/office/word/2012/wordml" xmlns:w16cex="http://schemas.microsoft.com/office/word/2018/wordml/cex" xmlns:w16cid="http://schemas.microsoft.com/office/word/2016/wordml/cid" xmlns:w16="http://schemas.microsoft.com/office/word/2018/wordml" xmlns:w16du="http://schemas.microsoft.com/office/word/2023/wordml/word16du" xmlns:w16sdtdh="http://schemas.microsoft.com/office/word/2020/wordml/sdtdatahash" xmlns:w16sdtfl="http://schemas.microsoft.com/office/word/2024/wordml/sdtformatlock" xmlns:w16se="http://schemas.microsoft.com/office/word/2015/wordml/symex" xmlns:wpg="http://schemas.microsoft.com/office/word/2010/wordprocessingGroup" xmlns:wpi="http://schemas.microsoft.com/office/word/2010/wordprocessingInk" xmlns:wne="http://schemas.microsoft.com/office/word/2006/wordml" xmlns:wps="http://schemas.microsoft.com/office/word/2010/wordprocessingShape" mc:Ignorable="w14 w15 w16se w16cid w16 w16cex w16sdtdh w16sdtfl w16du wp14">
+  <w:abstractNum w:abstractNumId="0" w15:restartNumberingAfterBreak="0">
     <w:nsid w:val="02AF2FA9"/>
     <w:multiLevelType w:val="hybridMultilevel"/>
     <w:tmpl w:val="26E0B6EA"/>
@@ -8308,7 +10554,7 @@
       </w:rPr>
     </w:lvl>
   </w:abstractNum>
-  <w:abstractNum w:abstractNumId="1">
+  <w:abstractNum w:abstractNumId="1" w15:restartNumberingAfterBreak="0">
     <w:nsid w:val="04710410"/>
     <w:multiLevelType w:val="hybridMultilevel"/>
     <w:tmpl w:val="1A20C2C2"/>
@@ -8421,7 +10667,7 @@
       </w:rPr>
     </w:lvl>
   </w:abstractNum>
-  <w:abstractNum w:abstractNumId="2">
+  <w:abstractNum w:abstractNumId="2" w15:restartNumberingAfterBreak="0">
     <w:nsid w:val="08F018C5"/>
     <w:multiLevelType w:val="hybridMultilevel"/>
     <w:tmpl w:val="F5F20FAA"/>
@@ -8534,7 +10780,7 @@
       </w:rPr>
     </w:lvl>
   </w:abstractNum>
-  <w:abstractNum w:abstractNumId="3">
+  <w:abstractNum w:abstractNumId="3" w15:restartNumberingAfterBreak="0">
     <w:nsid w:val="0E022743"/>
     <w:multiLevelType w:val="hybridMultilevel"/>
     <w:tmpl w:val="FCAAA680"/>
@@ -8623,7 +10869,7 @@
       </w:pPr>
     </w:lvl>
   </w:abstractNum>
-  <w:abstractNum w:abstractNumId="4">
+  <w:abstractNum w:abstractNumId="4" w15:restartNumberingAfterBreak="0">
     <w:nsid w:val="0FA97372"/>
     <w:multiLevelType w:val="multilevel"/>
     <w:tmpl w:val="7C181842"/>
@@ -8736,7 +10982,7 @@
       </w:rPr>
     </w:lvl>
   </w:abstractNum>
-  <w:abstractNum w:abstractNumId="5">
+  <w:abstractNum w:abstractNumId="5" w15:restartNumberingAfterBreak="0">
     <w:nsid w:val="11080D9D"/>
     <w:multiLevelType w:val="multilevel"/>
     <w:tmpl w:val="DB1C7804"/>
@@ -8885,7 +11131,7 @@
       </w:rPr>
     </w:lvl>
   </w:abstractNum>
-  <w:abstractNum w:abstractNumId="6">
+  <w:abstractNum w:abstractNumId="6" w15:restartNumberingAfterBreak="0">
     <w:nsid w:val="112A3736"/>
     <w:multiLevelType w:val="hybridMultilevel"/>
     <w:tmpl w:val="AC8C2C88"/>
@@ -8998,7 +11244,7 @@
       </w:rPr>
     </w:lvl>
   </w:abstractNum>
-  <w:abstractNum w:abstractNumId="7">
+  <w:abstractNum w:abstractNumId="7" w15:restartNumberingAfterBreak="0">
     <w:nsid w:val="16737223"/>
     <w:multiLevelType w:val="hybridMultilevel"/>
     <w:tmpl w:val="E1A62552"/>
@@ -9111,7 +11357,7 @@
       </w:rPr>
     </w:lvl>
   </w:abstractNum>
-  <w:abstractNum w:abstractNumId="8">
+  <w:abstractNum w:abstractNumId="8" w15:restartNumberingAfterBreak="0">
     <w:nsid w:val="1AB84912"/>
     <w:multiLevelType w:val="multilevel"/>
     <w:tmpl w:val="B6489DF0"/>
@@ -9229,7 +11475,7 @@
       </w:rPr>
     </w:lvl>
   </w:abstractNum>
-  <w:abstractNum w:abstractNumId="9">
+  <w:abstractNum w:abstractNumId="9" w15:restartNumberingAfterBreak="0">
     <w:nsid w:val="1D1574F5"/>
     <w:multiLevelType w:val="hybridMultilevel"/>
     <w:tmpl w:val="51DE0FC4"/>
@@ -9342,7 +11588,7 @@
       </w:rPr>
     </w:lvl>
   </w:abstractNum>
-  <w:abstractNum w:abstractNumId="10">
+  <w:abstractNum w:abstractNumId="10" w15:restartNumberingAfterBreak="0">
     <w:nsid w:val="1F5B20BF"/>
     <w:multiLevelType w:val="hybridMultilevel"/>
     <w:tmpl w:val="0B148300"/>
@@ -9428,7 +11674,7 @@
       </w:pPr>
     </w:lvl>
   </w:abstractNum>
-  <w:abstractNum w:abstractNumId="11">
+  <w:abstractNum w:abstractNumId="11" w15:restartNumberingAfterBreak="0">
     <w:nsid w:val="230E7A72"/>
     <w:multiLevelType w:val="hybridMultilevel"/>
     <w:tmpl w:val="D14E5DB6"/>
@@ -9517,7 +11763,7 @@
       </w:pPr>
     </w:lvl>
   </w:abstractNum>
-  <w:abstractNum w:abstractNumId="12">
+  <w:abstractNum w:abstractNumId="12" w15:restartNumberingAfterBreak="0">
     <w:nsid w:val="28D53AAE"/>
     <w:multiLevelType w:val="multilevel"/>
     <w:tmpl w:val="E0D85A56"/>
@@ -9638,7 +11884,7 @@
       </w:rPr>
     </w:lvl>
   </w:abstractNum>
-  <w:abstractNum w:abstractNumId="13">
+  <w:abstractNum w:abstractNumId="13" w15:restartNumberingAfterBreak="0">
     <w:nsid w:val="29DB7099"/>
     <w:multiLevelType w:val="multilevel"/>
     <w:tmpl w:val="D360899E"/>
@@ -9787,7 +12033,7 @@
       </w:rPr>
     </w:lvl>
   </w:abstractNum>
-  <w:abstractNum w:abstractNumId="14">
+  <w:abstractNum w:abstractNumId="14" w15:restartNumberingAfterBreak="0">
     <w:nsid w:val="2BC606F8"/>
     <w:multiLevelType w:val="hybridMultilevel"/>
     <w:tmpl w:val="02CE1BBA"/>
@@ -9876,7 +12122,7 @@
       </w:pPr>
     </w:lvl>
   </w:abstractNum>
-  <w:abstractNum w:abstractNumId="15">
+  <w:abstractNum w:abstractNumId="15" w15:restartNumberingAfterBreak="0">
     <w:nsid w:val="2E9B1B58"/>
     <w:multiLevelType w:val="hybridMultilevel"/>
     <w:tmpl w:val="7AAEFB44"/>
@@ -9989,7 +12235,7 @@
       </w:rPr>
     </w:lvl>
   </w:abstractNum>
-  <w:abstractNum w:abstractNumId="16">
+  <w:abstractNum w:abstractNumId="16" w15:restartNumberingAfterBreak="0">
     <w:nsid w:val="304450E7"/>
     <w:multiLevelType w:val="hybridMultilevel"/>
     <w:tmpl w:val="179C1F3A"/>
@@ -10078,7 +12324,7 @@
       </w:pPr>
     </w:lvl>
   </w:abstractNum>
-  <w:abstractNum w:abstractNumId="17">
+  <w:abstractNum w:abstractNumId="17" w15:restartNumberingAfterBreak="0">
     <w:nsid w:val="354143F8"/>
     <w:multiLevelType w:val="hybridMultilevel"/>
     <w:tmpl w:val="80A26312"/>
@@ -10191,7 +12437,7 @@
       </w:rPr>
     </w:lvl>
   </w:abstractNum>
-  <w:abstractNum w:abstractNumId="18">
+  <w:abstractNum w:abstractNumId="18" w15:restartNumberingAfterBreak="0">
     <w:nsid w:val="37B976D2"/>
     <w:multiLevelType w:val="hybridMultilevel"/>
     <w:tmpl w:val="C686B4C6"/>
@@ -10280,7 +12526,7 @@
       </w:pPr>
     </w:lvl>
   </w:abstractNum>
-  <w:abstractNum w:abstractNumId="19">
+  <w:abstractNum w:abstractNumId="19" w15:restartNumberingAfterBreak="0">
     <w:nsid w:val="3A103230"/>
     <w:multiLevelType w:val="hybridMultilevel"/>
     <w:tmpl w:val="420E5E74"/>
@@ -10369,7 +12615,7 @@
       </w:pPr>
     </w:lvl>
   </w:abstractNum>
-  <w:abstractNum w:abstractNumId="20">
+  <w:abstractNum w:abstractNumId="20" w15:restartNumberingAfterBreak="0">
     <w:nsid w:val="3CAA7D00"/>
     <w:multiLevelType w:val="hybridMultilevel"/>
     <w:tmpl w:val="7FAE95B6"/>
@@ -10482,7 +12728,7 @@
       </w:rPr>
     </w:lvl>
   </w:abstractNum>
-  <w:abstractNum w:abstractNumId="21">
+  <w:abstractNum w:abstractNumId="21" w15:restartNumberingAfterBreak="0">
     <w:nsid w:val="3D85501A"/>
     <w:multiLevelType w:val="hybridMultilevel"/>
     <w:tmpl w:val="7ED8929C"/>
@@ -10568,7 +12814,7 @@
       </w:pPr>
     </w:lvl>
   </w:abstractNum>
-  <w:abstractNum w:abstractNumId="22">
+  <w:abstractNum w:abstractNumId="22" w15:restartNumberingAfterBreak="0">
     <w:nsid w:val="3E057983"/>
     <w:multiLevelType w:val="hybridMultilevel"/>
     <w:tmpl w:val="B37E624E"/>
@@ -10681,7 +12927,7 @@
       </w:rPr>
     </w:lvl>
   </w:abstractNum>
-  <w:abstractNum w:abstractNumId="23">
+  <w:abstractNum w:abstractNumId="23" w15:restartNumberingAfterBreak="0">
     <w:nsid w:val="40EC6F4B"/>
     <w:multiLevelType w:val="hybridMultilevel"/>
     <w:tmpl w:val="CCFC8B78"/>
@@ -10794,7 +13040,7 @@
       </w:rPr>
     </w:lvl>
   </w:abstractNum>
-  <w:abstractNum w:abstractNumId="24">
+  <w:abstractNum w:abstractNumId="24" w15:restartNumberingAfterBreak="0">
     <w:nsid w:val="42FA2D85"/>
     <w:multiLevelType w:val="hybridMultilevel"/>
     <w:tmpl w:val="F1D89E2E"/>
@@ -10907,7 +13153,7 @@
       </w:rPr>
     </w:lvl>
   </w:abstractNum>
-  <w:abstractNum w:abstractNumId="25">
+  <w:abstractNum w:abstractNumId="25" w15:restartNumberingAfterBreak="0">
     <w:nsid w:val="45022324"/>
     <w:multiLevelType w:val="hybridMultilevel"/>
     <w:tmpl w:val="FD901576"/>
@@ -10996,7 +13242,7 @@
       </w:pPr>
     </w:lvl>
   </w:abstractNum>
-  <w:abstractNum w:abstractNumId="26">
+  <w:abstractNum w:abstractNumId="26" w15:restartNumberingAfterBreak="0">
     <w:nsid w:val="506753AC"/>
     <w:multiLevelType w:val="multilevel"/>
     <w:tmpl w:val="61100354"/>
@@ -11145,7 +13391,7 @@
       </w:rPr>
     </w:lvl>
   </w:abstractNum>
-  <w:abstractNum w:abstractNumId="27">
+  <w:abstractNum w:abstractNumId="27" w15:restartNumberingAfterBreak="0">
     <w:nsid w:val="510C12AC"/>
     <w:multiLevelType w:val="hybridMultilevel"/>
     <w:tmpl w:val="1EECA868"/>
@@ -11258,7 +13504,7 @@
       </w:rPr>
     </w:lvl>
   </w:abstractNum>
-  <w:abstractNum w:abstractNumId="28">
+  <w:abstractNum w:abstractNumId="28" w15:restartNumberingAfterBreak="0">
     <w:nsid w:val="582375CB"/>
     <w:multiLevelType w:val="hybridMultilevel"/>
     <w:tmpl w:val="8FA6697A"/>
@@ -11371,7 +13617,7 @@
       </w:rPr>
     </w:lvl>
   </w:abstractNum>
-  <w:abstractNum w:abstractNumId="29">
+  <w:abstractNum w:abstractNumId="29" w15:restartNumberingAfterBreak="0">
     <w:nsid w:val="59916BA6"/>
     <w:multiLevelType w:val="hybridMultilevel"/>
     <w:tmpl w:val="15280794"/>
@@ -11484,7 +13730,7 @@
       </w:rPr>
     </w:lvl>
   </w:abstractNum>
-  <w:abstractNum w:abstractNumId="30">
+  <w:abstractNum w:abstractNumId="30" w15:restartNumberingAfterBreak="0">
     <w:nsid w:val="5CFE4A2C"/>
     <w:multiLevelType w:val="hybridMultilevel"/>
     <w:tmpl w:val="07B62302"/>
@@ -11573,7 +13819,7 @@
       </w:pPr>
     </w:lvl>
   </w:abstractNum>
-  <w:abstractNum w:abstractNumId="31">
+  <w:abstractNum w:abstractNumId="31" w15:restartNumberingAfterBreak="0">
     <w:nsid w:val="5EE54FC1"/>
     <w:multiLevelType w:val="hybridMultilevel"/>
     <w:tmpl w:val="DA84BB5A"/>
@@ -11686,7 +13932,7 @@
       </w:rPr>
     </w:lvl>
   </w:abstractNum>
-  <w:abstractNum w:abstractNumId="32">
+  <w:abstractNum w:abstractNumId="32" w15:restartNumberingAfterBreak="0">
     <w:nsid w:val="60975DAC"/>
     <w:multiLevelType w:val="multilevel"/>
     <w:tmpl w:val="5F7805AA"/>
@@ -11808,7 +14054,7 @@
       </w:rPr>
     </w:lvl>
   </w:abstractNum>
-  <w:abstractNum w:abstractNumId="33">
+  <w:abstractNum w:abstractNumId="33" w15:restartNumberingAfterBreak="0">
     <w:nsid w:val="60B12A81"/>
     <w:multiLevelType w:val="multilevel"/>
     <w:tmpl w:val="BBE6D7CC"/>
@@ -11957,7 +14203,7 @@
       </w:rPr>
     </w:lvl>
   </w:abstractNum>
-  <w:abstractNum w:abstractNumId="34">
+  <w:abstractNum w:abstractNumId="34" w15:restartNumberingAfterBreak="0">
     <w:nsid w:val="690A662B"/>
     <w:multiLevelType w:val="hybridMultilevel"/>
     <w:tmpl w:val="B77E13B2"/>
@@ -12070,7 +14316,7 @@
       </w:rPr>
     </w:lvl>
   </w:abstractNum>
-  <w:abstractNum w:abstractNumId="35">
+  <w:abstractNum w:abstractNumId="35" w15:restartNumberingAfterBreak="0">
     <w:nsid w:val="692E515B"/>
     <w:multiLevelType w:val="multilevel"/>
     <w:tmpl w:val="D0A6F4BE"/>
@@ -12219,7 +14465,7 @@
       </w:rPr>
     </w:lvl>
   </w:abstractNum>
-  <w:abstractNum w:abstractNumId="36">
+  <w:abstractNum w:abstractNumId="36" w15:restartNumberingAfterBreak="0">
     <w:nsid w:val="69CA3B02"/>
     <w:multiLevelType w:val="hybridMultilevel"/>
     <w:tmpl w:val="F642E598"/>
@@ -12332,7 +14578,7 @@
       </w:rPr>
     </w:lvl>
   </w:abstractNum>
-  <w:abstractNum w:abstractNumId="37">
+  <w:abstractNum w:abstractNumId="37" w15:restartNumberingAfterBreak="0">
     <w:nsid w:val="6DE10F54"/>
     <w:multiLevelType w:val="hybridMultilevel"/>
     <w:tmpl w:val="57166F10"/>
@@ -12445,7 +14691,7 @@
       </w:rPr>
     </w:lvl>
   </w:abstractNum>
-  <w:abstractNum w:abstractNumId="38">
+  <w:abstractNum w:abstractNumId="38" w15:restartNumberingAfterBreak="0">
     <w:nsid w:val="6E17352B"/>
     <w:multiLevelType w:val="hybridMultilevel"/>
     <w:tmpl w:val="FB103E68"/>
@@ -12558,7 +14804,7 @@
       </w:rPr>
     </w:lvl>
   </w:abstractNum>
-  <w:abstractNum w:abstractNumId="39">
+  <w:abstractNum w:abstractNumId="39" w15:restartNumberingAfterBreak="0">
     <w:nsid w:val="72BA1947"/>
     <w:multiLevelType w:val="hybridMultilevel"/>
     <w:tmpl w:val="CCE4C876"/>
@@ -12671,7 +14917,7 @@
       </w:rPr>
     </w:lvl>
   </w:abstractNum>
-  <w:abstractNum w:abstractNumId="40">
+  <w:abstractNum w:abstractNumId="40" w15:restartNumberingAfterBreak="0">
     <w:nsid w:val="78FD57A9"/>
     <w:multiLevelType w:val="hybridMultilevel"/>
     <w:tmpl w:val="830A9456"/>
@@ -12784,7 +15030,7 @@
       </w:rPr>
     </w:lvl>
   </w:abstractNum>
-  <w:abstractNum w:abstractNumId="41">
+  <w:abstractNum w:abstractNumId="41" w15:restartNumberingAfterBreak="0">
     <w:nsid w:val="7A3B0902"/>
     <w:multiLevelType w:val="hybridMultilevel"/>
     <w:tmpl w:val="8F7AAA36"/>
@@ -12897,7 +15143,7 @@
       </w:rPr>
     </w:lvl>
   </w:abstractNum>
-  <w:abstractNum w:abstractNumId="42">
+  <w:abstractNum w:abstractNumId="42" w15:restartNumberingAfterBreak="0">
     <w:nsid w:val="7A600773"/>
     <w:multiLevelType w:val="hybridMultilevel"/>
     <w:tmpl w:val="0E0403B4"/>
@@ -13010,7 +15256,7 @@
       </w:rPr>
     </w:lvl>
   </w:abstractNum>
-  <w:abstractNum w:abstractNumId="43">
+  <w:abstractNum w:abstractNumId="43" w15:restartNumberingAfterBreak="0">
     <w:nsid w:val="7B7D3BBC"/>
     <w:multiLevelType w:val="multilevel"/>
     <w:tmpl w:val="99D04C86"/>
@@ -13159,143 +15405,259 @@
       </w:rPr>
     </w:lvl>
   </w:abstractNum>
-  <w:num w:numId="1">
+  <w:abstractNum w:abstractNumId="44" w15:restartNumberingAfterBreak="0">
+    <w:nsid w:val="7D5A3D66"/>
+    <w:multiLevelType w:val="multilevel"/>
+    <w:tmpl w:val="5F141AEA"/>
+    <w:lvl w:ilvl="0">
+      <w:start w:val="1"/>
+      <w:numFmt w:val="decimal"/>
+      <w:lvlText w:val="%1."/>
+      <w:lvlJc w:val="left"/>
+      <w:pPr>
+        <w:tabs>
+          <w:tab w:val="num" w:pos="720"/>
+        </w:tabs>
+        <w:ind w:left="720" w:hanging="360"/>
+      </w:pPr>
+    </w:lvl>
+    <w:lvl w:ilvl="1" w:tentative="1">
+      <w:start w:val="1"/>
+      <w:numFmt w:val="decimal"/>
+      <w:lvlText w:val="%2."/>
+      <w:lvlJc w:val="left"/>
+      <w:pPr>
+        <w:tabs>
+          <w:tab w:val="num" w:pos="1440"/>
+        </w:tabs>
+        <w:ind w:left="1440" w:hanging="360"/>
+      </w:pPr>
+    </w:lvl>
+    <w:lvl w:ilvl="2" w:tentative="1">
+      <w:start w:val="1"/>
+      <w:numFmt w:val="decimal"/>
+      <w:lvlText w:val="%3."/>
+      <w:lvlJc w:val="left"/>
+      <w:pPr>
+        <w:tabs>
+          <w:tab w:val="num" w:pos="2160"/>
+        </w:tabs>
+        <w:ind w:left="2160" w:hanging="360"/>
+      </w:pPr>
+    </w:lvl>
+    <w:lvl w:ilvl="3" w:tentative="1">
+      <w:start w:val="1"/>
+      <w:numFmt w:val="decimal"/>
+      <w:lvlText w:val="%4."/>
+      <w:lvlJc w:val="left"/>
+      <w:pPr>
+        <w:tabs>
+          <w:tab w:val="num" w:pos="2880"/>
+        </w:tabs>
+        <w:ind w:left="2880" w:hanging="360"/>
+      </w:pPr>
+    </w:lvl>
+    <w:lvl w:ilvl="4" w:tentative="1">
+      <w:start w:val="1"/>
+      <w:numFmt w:val="decimal"/>
+      <w:lvlText w:val="%5."/>
+      <w:lvlJc w:val="left"/>
+      <w:pPr>
+        <w:tabs>
+          <w:tab w:val="num" w:pos="3600"/>
+        </w:tabs>
+        <w:ind w:left="3600" w:hanging="360"/>
+      </w:pPr>
+    </w:lvl>
+    <w:lvl w:ilvl="5" w:tentative="1">
+      <w:start w:val="1"/>
+      <w:numFmt w:val="decimal"/>
+      <w:lvlText w:val="%6."/>
+      <w:lvlJc w:val="left"/>
+      <w:pPr>
+        <w:tabs>
+          <w:tab w:val="num" w:pos="4320"/>
+        </w:tabs>
+        <w:ind w:left="4320" w:hanging="360"/>
+      </w:pPr>
+    </w:lvl>
+    <w:lvl w:ilvl="6" w:tentative="1">
+      <w:start w:val="1"/>
+      <w:numFmt w:val="decimal"/>
+      <w:lvlText w:val="%7."/>
+      <w:lvlJc w:val="left"/>
+      <w:pPr>
+        <w:tabs>
+          <w:tab w:val="num" w:pos="5040"/>
+        </w:tabs>
+        <w:ind w:left="5040" w:hanging="360"/>
+      </w:pPr>
+    </w:lvl>
+    <w:lvl w:ilvl="7" w:tentative="1">
+      <w:start w:val="1"/>
+      <w:numFmt w:val="decimal"/>
+      <w:lvlText w:val="%8."/>
+      <w:lvlJc w:val="left"/>
+      <w:pPr>
+        <w:tabs>
+          <w:tab w:val="num" w:pos="5760"/>
+        </w:tabs>
+        <w:ind w:left="5760" w:hanging="360"/>
+      </w:pPr>
+    </w:lvl>
+    <w:lvl w:ilvl="8" w:tentative="1">
+      <w:start w:val="1"/>
+      <w:numFmt w:val="decimal"/>
+      <w:lvlText w:val="%9."/>
+      <w:lvlJc w:val="left"/>
+      <w:pPr>
+        <w:tabs>
+          <w:tab w:val="num" w:pos="6480"/>
+        </w:tabs>
+        <w:ind w:left="6480" w:hanging="360"/>
+      </w:pPr>
+    </w:lvl>
+  </w:abstractNum>
+  <w:num w:numId="1" w16cid:durableId="1362894492">
     <w:abstractNumId w:val="16"/>
   </w:num>
-  <w:num w:numId="2">
+  <w:num w:numId="2" w16cid:durableId="1874073624">
     <w:abstractNumId w:val="32"/>
   </w:num>
-  <w:num w:numId="3">
+  <w:num w:numId="3" w16cid:durableId="1655137899">
     <w:abstractNumId w:val="17"/>
   </w:num>
-  <w:num w:numId="4">
+  <w:num w:numId="4" w16cid:durableId="558707628">
     <w:abstractNumId w:val="27"/>
   </w:num>
-  <w:num w:numId="5">
+  <w:num w:numId="5" w16cid:durableId="975987443">
     <w:abstractNumId w:val="33"/>
   </w:num>
-  <w:num w:numId="6">
+  <w:num w:numId="6" w16cid:durableId="804004018">
     <w:abstractNumId w:val="36"/>
   </w:num>
-  <w:num w:numId="7">
+  <w:num w:numId="7" w16cid:durableId="558709608">
     <w:abstractNumId w:val="18"/>
   </w:num>
-  <w:num w:numId="8">
+  <w:num w:numId="8" w16cid:durableId="541137364">
     <w:abstractNumId w:val="10"/>
   </w:num>
-  <w:num w:numId="9">
+  <w:num w:numId="9" w16cid:durableId="391469950">
     <w:abstractNumId w:val="23"/>
   </w:num>
-  <w:num w:numId="10">
+  <w:num w:numId="10" w16cid:durableId="689258822">
     <w:abstractNumId w:val="4"/>
   </w:num>
-  <w:num w:numId="11">
+  <w:num w:numId="11" w16cid:durableId="1407193610">
     <w:abstractNumId w:val="19"/>
   </w:num>
-  <w:num w:numId="12">
+  <w:num w:numId="12" w16cid:durableId="2055764761">
     <w:abstractNumId w:val="30"/>
   </w:num>
-  <w:num w:numId="13">
+  <w:num w:numId="13" w16cid:durableId="885483820">
     <w:abstractNumId w:val="21"/>
   </w:num>
-  <w:num w:numId="14">
+  <w:num w:numId="14" w16cid:durableId="1686175874">
     <w:abstractNumId w:val="12"/>
   </w:num>
-  <w:num w:numId="15">
+  <w:num w:numId="15" w16cid:durableId="820267519">
     <w:abstractNumId w:val="41"/>
   </w:num>
-  <w:num w:numId="16">
+  <w:num w:numId="16" w16cid:durableId="681514373">
     <w:abstractNumId w:val="5"/>
   </w:num>
-  <w:num w:numId="17">
+  <w:num w:numId="17" w16cid:durableId="2117559287">
     <w:abstractNumId w:val="39"/>
   </w:num>
-  <w:num w:numId="18">
+  <w:num w:numId="18" w16cid:durableId="228153116">
     <w:abstractNumId w:val="20"/>
   </w:num>
-  <w:num w:numId="19">
+  <w:num w:numId="19" w16cid:durableId="854927916">
     <w:abstractNumId w:val="3"/>
   </w:num>
-  <w:num w:numId="20">
+  <w:num w:numId="20" w16cid:durableId="596256572">
     <w:abstractNumId w:val="14"/>
   </w:num>
-  <w:num w:numId="21">
+  <w:num w:numId="21" w16cid:durableId="1793935055">
     <w:abstractNumId w:val="25"/>
   </w:num>
-  <w:num w:numId="22">
+  <w:num w:numId="22" w16cid:durableId="599947979">
     <w:abstractNumId w:val="11"/>
   </w:num>
-  <w:num w:numId="23">
+  <w:num w:numId="23" w16cid:durableId="347220280">
     <w:abstractNumId w:val="28"/>
   </w:num>
-  <w:num w:numId="24">
+  <w:num w:numId="24" w16cid:durableId="1371344287">
     <w:abstractNumId w:val="7"/>
   </w:num>
-  <w:num w:numId="25">
+  <w:num w:numId="25" w16cid:durableId="289166435">
     <w:abstractNumId w:val="42"/>
   </w:num>
-  <w:num w:numId="26">
+  <w:num w:numId="26" w16cid:durableId="1914391485">
     <w:abstractNumId w:val="9"/>
   </w:num>
-  <w:num w:numId="27">
+  <w:num w:numId="27" w16cid:durableId="467354857">
     <w:abstractNumId w:val="24"/>
   </w:num>
-  <w:num w:numId="28">
+  <w:num w:numId="28" w16cid:durableId="146753049">
     <w:abstractNumId w:val="38"/>
   </w:num>
-  <w:num w:numId="29">
+  <w:num w:numId="29" w16cid:durableId="1997225360">
     <w:abstractNumId w:val="15"/>
   </w:num>
-  <w:num w:numId="30">
+  <w:num w:numId="30" w16cid:durableId="1866939747">
     <w:abstractNumId w:val="29"/>
   </w:num>
-  <w:num w:numId="31">
+  <w:num w:numId="31" w16cid:durableId="415714998">
     <w:abstractNumId w:val="2"/>
   </w:num>
-  <w:num w:numId="32">
+  <w:num w:numId="32" w16cid:durableId="1723477810">
     <w:abstractNumId w:val="26"/>
   </w:num>
-  <w:num w:numId="33">
+  <w:num w:numId="33" w16cid:durableId="1825705628">
     <w:abstractNumId w:val="1"/>
   </w:num>
-  <w:num w:numId="34">
+  <w:num w:numId="34" w16cid:durableId="56323094">
     <w:abstractNumId w:val="0"/>
   </w:num>
-  <w:num w:numId="35">
+  <w:num w:numId="35" w16cid:durableId="363099988">
     <w:abstractNumId w:val="13"/>
   </w:num>
-  <w:num w:numId="36">
+  <w:num w:numId="36" w16cid:durableId="1513302833">
     <w:abstractNumId w:val="40"/>
   </w:num>
-  <w:num w:numId="37">
+  <w:num w:numId="37" w16cid:durableId="662857838">
     <w:abstractNumId w:val="43"/>
   </w:num>
-  <w:num w:numId="38">
+  <w:num w:numId="38" w16cid:durableId="1422337958">
     <w:abstractNumId w:val="6"/>
   </w:num>
-  <w:num w:numId="39">
+  <w:num w:numId="39" w16cid:durableId="498930649">
     <w:abstractNumId w:val="34"/>
   </w:num>
-  <w:num w:numId="40">
+  <w:num w:numId="40" w16cid:durableId="272248103">
     <w:abstractNumId w:val="31"/>
   </w:num>
-  <w:num w:numId="41">
+  <w:num w:numId="41" w16cid:durableId="2074892409">
     <w:abstractNumId w:val="22"/>
   </w:num>
-  <w:num w:numId="42">
+  <w:num w:numId="42" w16cid:durableId="222641357">
     <w:abstractNumId w:val="37"/>
   </w:num>
-  <w:num w:numId="43">
+  <w:num w:numId="43" w16cid:durableId="440879220">
     <w:abstractNumId w:val="35"/>
   </w:num>
-  <w:num w:numId="44">
+  <w:num w:numId="44" w16cid:durableId="17704610">
     <w:abstractNumId w:val="8"/>
+  </w:num>
+  <w:num w:numId="45" w16cid:durableId="47144095">
+    <w:abstractNumId w:val="44"/>
   </w:num>
 </w:numbering>
 </file>
 
 <file path=word/styles.xml><?xml version="1.0" encoding="utf-8"?>
-<w:styles xmlns:mc="http://schemas.openxmlformats.org/markup-compatibility/2006" xmlns:r="http://schemas.openxmlformats.org/officeDocument/2006/relationships" xmlns:w="http://schemas.openxmlformats.org/wordprocessingml/2006/main" xmlns:w14="http://schemas.microsoft.com/office/word/2010/wordml" xmlns:w15="http://schemas.microsoft.com/office/word/2012/wordml" mc:Ignorable="w14 w15">
+<w:styles xmlns:mc="http://schemas.openxmlformats.org/markup-compatibility/2006" xmlns:r="http://schemas.openxmlformats.org/officeDocument/2006/relationships" xmlns:w="http://schemas.openxmlformats.org/wordprocessingml/2006/main" xmlns:w14="http://schemas.microsoft.com/office/word/2010/wordml" xmlns:w15="http://schemas.microsoft.com/office/word/2012/wordml" xmlns:w16cex="http://schemas.microsoft.com/office/word/2018/wordml/cex" xmlns:w16cid="http://schemas.microsoft.com/office/word/2016/wordml/cid" xmlns:w16="http://schemas.microsoft.com/office/word/2018/wordml" xmlns:w16du="http://schemas.microsoft.com/office/word/2023/wordml/word16du" xmlns:w16sdtdh="http://schemas.microsoft.com/office/word/2020/wordml/sdtdatahash" xmlns:w16sdtfl="http://schemas.microsoft.com/office/word/2024/wordml/sdtformatlock" xmlns:w16se="http://schemas.microsoft.com/office/word/2015/wordml/symex" mc:Ignorable="w14 w15 w16se w16cid w16 w16cex w16sdtdh w16sdtfl w16du">
   <w:docDefaults>
     <w:rPrDefault>
       <w:rPr>
@@ -13311,7 +15673,7 @@
       </w:pPr>
     </w:pPrDefault>
   </w:docDefaults>
-  <w:latentStyles w:defLockedState="0" w:defUIPriority="99" w:defSemiHidden="0" w:defUnhideWhenUsed="0" w:defQFormat="0" w:count="371">
+  <w:latentStyles w:defLockedState="0" w:defUIPriority="99" w:defSemiHidden="0" w:defUnhideWhenUsed="0" w:defQFormat="0" w:count="376">
     <w:lsdException w:name="Normal" w:uiPriority="0" w:qFormat="1"/>
     <w:lsdException w:name="heading 1" w:uiPriority="9" w:qFormat="1"/>
     <w:lsdException w:name="heading 2" w:semiHidden="1" w:uiPriority="9" w:unhideWhenUsed="1" w:qFormat="1"/>
@@ -13683,6 +16045,11 @@
     <w:lsdException w:name="List Table 5 Dark Accent 6" w:uiPriority="50"/>
     <w:lsdException w:name="List Table 6 Colorful Accent 6" w:uiPriority="51"/>
     <w:lsdException w:name="List Table 7 Colorful Accent 6" w:uiPriority="52"/>
+    <w:lsdException w:name="Mention" w:semiHidden="1" w:unhideWhenUsed="1"/>
+    <w:lsdException w:name="Smart Hyperlink" w:semiHidden="1" w:unhideWhenUsed="1"/>
+    <w:lsdException w:name="Hashtag" w:semiHidden="1" w:unhideWhenUsed="1"/>
+    <w:lsdException w:name="Unresolved Mention" w:semiHidden="1" w:unhideWhenUsed="1"/>
+    <w:lsdException w:name="Smart Link" w:semiHidden="1" w:unhideWhenUsed="1"/>
   </w:latentStyles>
   <w:style w:type="paragraph" w:default="1" w:styleId="Normal">
     <w:name w:val="Normal"/>
@@ -13762,7 +16129,6 @@
   <w:style w:type="character" w:default="1" w:styleId="DefaultParagraphFont">
     <w:name w:val="Default Paragraph Font"/>
     <w:uiPriority w:val="1"/>
-    <w:semiHidden/>
     <w:unhideWhenUsed/>
   </w:style>
   <w:style w:type="table" w:default="1" w:styleId="TableNormal">
@@ -13795,7 +16161,6 @@
       <w:spacing w:after="0" w:line="240" w:lineRule="auto"/>
     </w:pPr>
     <w:tblPr>
-      <w:tblInd w:w="0" w:type="dxa"/>
       <w:tblBorders>
         <w:top w:val="single" w:sz="4" w:space="0" w:color="auto"/>
         <w:left w:val="single" w:sz="4" w:space="0" w:color="auto"/>
@@ -13804,12 +16169,6 @@
         <w:insideH w:val="single" w:sz="4" w:space="0" w:color="auto"/>
         <w:insideV w:val="single" w:sz="4" w:space="0" w:color="auto"/>
       </w:tblBorders>
-      <w:tblCellMar>
-        <w:top w:w="0" w:type="dxa"/>
-        <w:left w:w="108" w:type="dxa"/>
-        <w:bottom w:w="0" w:type="dxa"/>
-        <w:right w:w="108" w:type="dxa"/>
-      </w:tblCellMar>
     </w:tblPr>
   </w:style>
   <w:style w:type="character" w:styleId="PlaceholderText">
@@ -13998,19 +16357,12 @@
     <w:tblPr>
       <w:tblStyleRowBandSize w:val="1"/>
       <w:tblStyleColBandSize w:val="1"/>
-      <w:tblInd w:w="0" w:type="dxa"/>
       <w:tblBorders>
         <w:top w:val="single" w:sz="4" w:space="0" w:color="000000" w:themeColor="text1"/>
         <w:left w:val="single" w:sz="4" w:space="0" w:color="000000" w:themeColor="text1"/>
         <w:bottom w:val="single" w:sz="4" w:space="0" w:color="000000" w:themeColor="text1"/>
         <w:right w:val="single" w:sz="4" w:space="0" w:color="000000" w:themeColor="text1"/>
       </w:tblBorders>
-      <w:tblCellMar>
-        <w:top w:w="0" w:type="dxa"/>
-        <w:left w:w="108" w:type="dxa"/>
-        <w:bottom w:w="0" w:type="dxa"/>
-        <w:right w:w="108" w:type="dxa"/>
-      </w:tblCellMar>
     </w:tblPr>
     <w:tblStylePr w:type="firstRow">
       <w:rPr>
@@ -14129,7 +16481,6 @@
     <w:tblPr>
       <w:tblStyleRowBandSize w:val="1"/>
       <w:tblStyleColBandSize w:val="1"/>
-      <w:tblInd w:w="0" w:type="dxa"/>
       <w:tblBorders>
         <w:top w:val="single" w:sz="4" w:space="0" w:color="999999" w:themeColor="text1" w:themeTint="66"/>
         <w:left w:val="single" w:sz="4" w:space="0" w:color="999999" w:themeColor="text1" w:themeTint="66"/>
@@ -14138,12 +16489,6 @@
         <w:insideH w:val="single" w:sz="4" w:space="0" w:color="999999" w:themeColor="text1" w:themeTint="66"/>
         <w:insideV w:val="single" w:sz="4" w:space="0" w:color="999999" w:themeColor="text1" w:themeTint="66"/>
       </w:tblBorders>
-      <w:tblCellMar>
-        <w:top w:w="0" w:type="dxa"/>
-        <w:left w:w="108" w:type="dxa"/>
-        <w:bottom w:w="0" w:type="dxa"/>
-        <w:right w:w="108" w:type="dxa"/>
-      </w:tblCellMar>
     </w:tblPr>
     <w:tblStylePr w:type="firstRow">
       <w:rPr>
@@ -14300,7 +16645,7 @@
 </file>
 
 <file path=word/glossary/document.xml><?xml version="1.0" encoding="utf-8"?>
-<w:glossaryDocument xmlns:wpc="http://schemas.microsoft.com/office/word/2010/wordprocessingCanvas" xmlns:mc="http://schemas.openxmlformats.org/markup-compatibility/2006" xmlns:o="urn:schemas-microsoft-com:office:office" xmlns:r="http://schemas.openxmlformats.org/officeDocument/2006/relationships" xmlns:m="http://schemas.openxmlformats.org/officeDocument/2006/math" xmlns:v="urn:schemas-microsoft-com:vml" xmlns:wp14="http://schemas.microsoft.com/office/word/2010/wordprocessingDrawing" xmlns:wp="http://schemas.openxmlformats.org/drawingml/2006/wordprocessingDrawing" xmlns:w10="urn:schemas-microsoft-com:office:word" xmlns:w="http://schemas.openxmlformats.org/wordprocessingml/2006/main" xmlns:w14="http://schemas.microsoft.com/office/word/2010/wordml" xmlns:w15="http://schemas.microsoft.com/office/word/2012/wordml" xmlns:wpg="http://schemas.microsoft.com/office/word/2010/wordprocessingGroup" xmlns:wpi="http://schemas.microsoft.com/office/word/2010/wordprocessingInk" xmlns:wne="http://schemas.microsoft.com/office/word/2006/wordml" xmlns:wps="http://schemas.microsoft.com/office/word/2010/wordprocessingShape" mc:Ignorable="w14 w15 wp14">
+<w:glossaryDocument xmlns:wpc="http://schemas.microsoft.com/office/word/2010/wordprocessingCanvas" xmlns:cx="http://schemas.microsoft.com/office/drawing/2014/chartex" xmlns:cx1="http://schemas.microsoft.com/office/drawing/2015/9/8/chartex" xmlns:cx2="http://schemas.microsoft.com/office/drawing/2015/10/21/chartex" xmlns:cx3="http://schemas.microsoft.com/office/drawing/2016/5/9/chartex" xmlns:cx4="http://schemas.microsoft.com/office/drawing/2016/5/10/chartex" xmlns:cx5="http://schemas.microsoft.com/office/drawing/2016/5/11/chartex" xmlns:cx6="http://schemas.microsoft.com/office/drawing/2016/5/12/chartex" xmlns:cx7="http://schemas.microsoft.com/office/drawing/2016/5/13/chartex" xmlns:cx8="http://schemas.microsoft.com/office/drawing/2016/5/14/chartex" xmlns:mc="http://schemas.openxmlformats.org/markup-compatibility/2006" xmlns:aink="http://schemas.microsoft.com/office/drawing/2016/ink" xmlns:am3d="http://schemas.microsoft.com/office/drawing/2017/model3d" xmlns:o="urn:schemas-microsoft-com:office:office" xmlns:oel="http://schemas.microsoft.com/office/2019/extlst" xmlns:r="http://schemas.openxmlformats.org/officeDocument/2006/relationships" xmlns:m="http://schemas.openxmlformats.org/officeDocument/2006/math" xmlns:v="urn:schemas-microsoft-com:vml" xmlns:wp14="http://schemas.microsoft.com/office/word/2010/wordprocessingDrawing" xmlns:wp="http://schemas.openxmlformats.org/drawingml/2006/wordprocessingDrawing" xmlns:w10="urn:schemas-microsoft-com:office:word" xmlns:w="http://schemas.openxmlformats.org/wordprocessingml/2006/main" xmlns:w14="http://schemas.microsoft.com/office/word/2010/wordml" xmlns:w15="http://schemas.microsoft.com/office/word/2012/wordml" xmlns:w16cex="http://schemas.microsoft.com/office/word/2018/wordml/cex" xmlns:w16cid="http://schemas.microsoft.com/office/word/2016/wordml/cid" xmlns:w16="http://schemas.microsoft.com/office/word/2018/wordml" xmlns:w16du="http://schemas.microsoft.com/office/word/2023/wordml/word16du" xmlns:w16sdtdh="http://schemas.microsoft.com/office/word/2020/wordml/sdtdatahash" xmlns:w16sdtfl="http://schemas.microsoft.com/office/word/2024/wordml/sdtformatlock" xmlns:w16se="http://schemas.microsoft.com/office/word/2015/wordml/symex" xmlns:wpg="http://schemas.microsoft.com/office/word/2010/wordprocessingGroup" xmlns:wpi="http://schemas.microsoft.com/office/word/2010/wordprocessingInk" xmlns:wne="http://schemas.microsoft.com/office/word/2006/wordml" xmlns:wps="http://schemas.microsoft.com/office/word/2010/wordprocessingShape" mc:Ignorable="w14 w15 w16se w16cid w16 w16cex w16sdtdh w16sdtfl w16du wp14">
   <w:docParts>
     <w:docPart>
       <w:docPartPr>
@@ -14336,7 +16681,7 @@
 </file>
 
 <file path=word/glossary/fontTable.xml><?xml version="1.0" encoding="utf-8"?>
-<w:fonts xmlns:mc="http://schemas.openxmlformats.org/markup-compatibility/2006" xmlns:r="http://schemas.openxmlformats.org/officeDocument/2006/relationships" xmlns:w="http://schemas.openxmlformats.org/wordprocessingml/2006/main" xmlns:w14="http://schemas.microsoft.com/office/word/2010/wordml" xmlns:w15="http://schemas.microsoft.com/office/word/2012/wordml" mc:Ignorable="w14 w15">
+<w:fonts xmlns:mc="http://schemas.openxmlformats.org/markup-compatibility/2006" xmlns:r="http://schemas.openxmlformats.org/officeDocument/2006/relationships" xmlns:w="http://schemas.openxmlformats.org/wordprocessingml/2006/main" xmlns:w14="http://schemas.microsoft.com/office/word/2010/wordml" xmlns:w15="http://schemas.microsoft.com/office/word/2012/wordml" xmlns:w16cex="http://schemas.microsoft.com/office/word/2018/wordml/cex" xmlns:w16cid="http://schemas.microsoft.com/office/word/2016/wordml/cid" xmlns:w16="http://schemas.microsoft.com/office/word/2018/wordml" xmlns:w16du="http://schemas.microsoft.com/office/word/2023/wordml/word16du" xmlns:w16sdtdh="http://schemas.microsoft.com/office/word/2020/wordml/sdtdatahash" xmlns:w16sdtfl="http://schemas.microsoft.com/office/word/2024/wordml/sdtformatlock" xmlns:w16se="http://schemas.microsoft.com/office/word/2015/wordml/symex" mc:Ignorable="w14 w15 w16se w16cid w16 w16cex w16sdtdh w16sdtfl w16du">
   <w:font w:name="Symbol">
     <w:panose1 w:val="05050102010706020507"/>
     <w:charset w:val="02"/>
@@ -14397,7 +16742,7 @@
 </file>
 
 <file path=word/glossary/settings.xml><?xml version="1.0" encoding="utf-8"?>
-<w:settings xmlns:mc="http://schemas.openxmlformats.org/markup-compatibility/2006" xmlns:o="urn:schemas-microsoft-com:office:office" xmlns:r="http://schemas.openxmlformats.org/officeDocument/2006/relationships" xmlns:m="http://schemas.openxmlformats.org/officeDocument/2006/math" xmlns:v="urn:schemas-microsoft-com:vml" xmlns:w10="urn:schemas-microsoft-com:office:word" xmlns:w="http://schemas.openxmlformats.org/wordprocessingml/2006/main" xmlns:w14="http://schemas.microsoft.com/office/word/2010/wordml" xmlns:w15="http://schemas.microsoft.com/office/word/2012/wordml" xmlns:sl="http://schemas.openxmlformats.org/schemaLibrary/2006/main" mc:Ignorable="w14 w15">
+<w:settings xmlns:mc="http://schemas.openxmlformats.org/markup-compatibility/2006" xmlns:o="urn:schemas-microsoft-com:office:office" xmlns:r="http://schemas.openxmlformats.org/officeDocument/2006/relationships" xmlns:m="http://schemas.openxmlformats.org/officeDocument/2006/math" xmlns:v="urn:schemas-microsoft-com:vml" xmlns:w10="urn:schemas-microsoft-com:office:word" xmlns:w="http://schemas.openxmlformats.org/wordprocessingml/2006/main" xmlns:w14="http://schemas.microsoft.com/office/word/2010/wordml" xmlns:w15="http://schemas.microsoft.com/office/word/2012/wordml" xmlns:w16cex="http://schemas.microsoft.com/office/word/2018/wordml/cex" xmlns:w16cid="http://schemas.microsoft.com/office/word/2016/wordml/cid" xmlns:w16="http://schemas.microsoft.com/office/word/2018/wordml" xmlns:w16du="http://schemas.microsoft.com/office/word/2023/wordml/word16du" xmlns:w16sdtdh="http://schemas.microsoft.com/office/word/2020/wordml/sdtdatahash" xmlns:w16sdtfl="http://schemas.microsoft.com/office/word/2024/wordml/sdtformatlock" xmlns:w16se="http://schemas.microsoft.com/office/word/2015/wordml/symex" xmlns:sl="http://schemas.openxmlformats.org/schemaLibrary/2006/main" mc:Ignorable="w14 w15 w16se w16cid w16 w16cex w16sdtdh w16sdtfl w16du">
   <w:view w:val="normal"/>
   <w:defaultTabStop w:val="720"/>
   <w:characterSpacingControl w:val="doNotCompress"/>
@@ -14407,9 +16752,11 @@
     <w:compatSetting w:name="overrideTableStyleFontSizeAndJustification" w:uri="http://schemas.microsoft.com/office/word" w:val="1"/>
     <w:compatSetting w:name="enableOpenTypeFeatures" w:uri="http://schemas.microsoft.com/office/word" w:val="1"/>
     <w:compatSetting w:name="doNotFlipMirrorIndents" w:uri="http://schemas.microsoft.com/office/word" w:val="1"/>
+    <w:compatSetting w:name="useWord2013TrackBottomHyphenation" w:uri="http://schemas.microsoft.com/office/word" w:val="1"/>
   </w:compat>
   <w:rsids>
     <w:rsidRoot w:val="001B1BB0"/>
+    <w:rsid w:val="00091E1A"/>
     <w:rsid w:val="000F3C26"/>
     <w:rsid w:val="001300FF"/>
     <w:rsid w:val="001B1BB0"/>
@@ -14428,11 +16775,13 @@
     <w:rsid w:val="006D4DF3"/>
     <w:rsid w:val="00743365"/>
     <w:rsid w:val="007C12A3"/>
+    <w:rsid w:val="007D06B7"/>
     <w:rsid w:val="007E4B06"/>
     <w:rsid w:val="00806FB8"/>
     <w:rsid w:val="008A5352"/>
     <w:rsid w:val="009308D6"/>
     <w:rsid w:val="00931747"/>
+    <w:rsid w:val="00975386"/>
     <w:rsid w:val="00A141E9"/>
     <w:rsid w:val="00A41DD8"/>
     <w:rsid w:val="00A65D08"/>
@@ -14448,6 +16797,7 @@
     <w:rsid w:val="00DA309B"/>
     <w:rsid w:val="00DD3B45"/>
     <w:rsid w:val="00DF390D"/>
+    <w:rsid w:val="00E3246C"/>
     <w:rsid w:val="00E64B65"/>
     <w:rsid w:val="00E7419B"/>
     <w:rsid w:val="00ED5739"/>
@@ -14477,7 +16827,7 @@
 </file>
 
 <file path=word/glossary/styles.xml><?xml version="1.0" encoding="utf-8"?>
-<w:styles xmlns:mc="http://schemas.openxmlformats.org/markup-compatibility/2006" xmlns:r="http://schemas.openxmlformats.org/officeDocument/2006/relationships" xmlns:w="http://schemas.openxmlformats.org/wordprocessingml/2006/main" xmlns:w14="http://schemas.microsoft.com/office/word/2010/wordml" xmlns:w15="http://schemas.microsoft.com/office/word/2012/wordml" mc:Ignorable="w14 w15">
+<w:styles xmlns:mc="http://schemas.openxmlformats.org/markup-compatibility/2006" xmlns:r="http://schemas.openxmlformats.org/officeDocument/2006/relationships" xmlns:w="http://schemas.openxmlformats.org/wordprocessingml/2006/main" xmlns:w14="http://schemas.microsoft.com/office/word/2010/wordml" xmlns:w15="http://schemas.microsoft.com/office/word/2012/wordml" xmlns:w16cex="http://schemas.microsoft.com/office/word/2018/wordml/cex" xmlns:w16cid="http://schemas.microsoft.com/office/word/2016/wordml/cid" xmlns:w16="http://schemas.microsoft.com/office/word/2018/wordml" xmlns:w16du="http://schemas.microsoft.com/office/word/2023/wordml/word16du" xmlns:w16sdtdh="http://schemas.microsoft.com/office/word/2020/wordml/sdtdatahash" xmlns:w16sdtfl="http://schemas.microsoft.com/office/word/2024/wordml/sdtformatlock" xmlns:w16se="http://schemas.microsoft.com/office/word/2015/wordml/symex" mc:Ignorable="w14 w15 w16se w16cid w16 w16cex w16sdtdh w16sdtfl w16du">
   <w:docDefaults>
     <w:rPrDefault>
       <w:rPr>
@@ -14493,7 +16843,7 @@
       </w:pPr>
     </w:pPrDefault>
   </w:docDefaults>
-  <w:latentStyles w:defLockedState="0" w:defUIPriority="99" w:defSemiHidden="0" w:defUnhideWhenUsed="0" w:defQFormat="0" w:count="371">
+  <w:latentStyles w:defLockedState="0" w:defUIPriority="99" w:defSemiHidden="0" w:defUnhideWhenUsed="0" w:defQFormat="0" w:count="376">
     <w:lsdException w:name="Normal" w:uiPriority="0" w:qFormat="1"/>
     <w:lsdException w:name="heading 1" w:uiPriority="9" w:qFormat="1"/>
     <w:lsdException w:name="heading 2" w:semiHidden="1" w:uiPriority="9" w:unhideWhenUsed="1" w:qFormat="1"/>
@@ -14865,6 +17215,11 @@
     <w:lsdException w:name="List Table 5 Dark Accent 6" w:uiPriority="50"/>
     <w:lsdException w:name="List Table 6 Colorful Accent 6" w:uiPriority="51"/>
     <w:lsdException w:name="List Table 7 Colorful Accent 6" w:uiPriority="52"/>
+    <w:lsdException w:name="Mention" w:semiHidden="1" w:unhideWhenUsed="1"/>
+    <w:lsdException w:name="Smart Hyperlink" w:semiHidden="1" w:unhideWhenUsed="1"/>
+    <w:lsdException w:name="Hashtag" w:semiHidden="1" w:unhideWhenUsed="1"/>
+    <w:lsdException w:name="Unresolved Mention" w:semiHidden="1" w:unhideWhenUsed="1"/>
+    <w:lsdException w:name="Smart Link" w:semiHidden="1" w:unhideWhenUsed="1"/>
   </w:latentStyles>
   <w:style w:type="paragraph" w:default="1" w:styleId="Normal">
     <w:name w:val="Normal"/>
@@ -14915,7 +17270,7 @@
 </file>
 
 <file path=word/glossary/webSettings.xml><?xml version="1.0" encoding="utf-8"?>
-<w:webSettings xmlns:mc="http://schemas.openxmlformats.org/markup-compatibility/2006" xmlns:r="http://schemas.openxmlformats.org/officeDocument/2006/relationships" xmlns:w="http://schemas.openxmlformats.org/wordprocessingml/2006/main" xmlns:w14="http://schemas.microsoft.com/office/word/2010/wordml" xmlns:w15="http://schemas.microsoft.com/office/word/2012/wordml" mc:Ignorable="w14 w15">
+<w:webSettings xmlns:mc="http://schemas.openxmlformats.org/markup-compatibility/2006" xmlns:r="http://schemas.openxmlformats.org/officeDocument/2006/relationships" xmlns:w="http://schemas.openxmlformats.org/wordprocessingml/2006/main" xmlns:w14="http://schemas.microsoft.com/office/word/2010/wordml" xmlns:w15="http://schemas.microsoft.com/office/word/2012/wordml" xmlns:w16cex="http://schemas.microsoft.com/office/word/2018/wordml/cex" xmlns:w16cid="http://schemas.microsoft.com/office/word/2016/wordml/cid" xmlns:w16="http://schemas.microsoft.com/office/word/2018/wordml" xmlns:w16du="http://schemas.microsoft.com/office/word/2023/wordml/word16du" xmlns:w16sdtdh="http://schemas.microsoft.com/office/word/2020/wordml/sdtdatahash" xmlns:w16sdtfl="http://schemas.microsoft.com/office/word/2024/wordml/sdtformatlock" xmlns:w16se="http://schemas.microsoft.com/office/word/2015/wordml/symex" mc:Ignorable="w14 w15 w16se w16cid w16 w16cex w16sdtdh w16sdtfl w16du">
   <w:optimizeForBrowser/>
   <w:allowPNG/>
 </w:webSettings>

</xml_diff>

<commit_message>
change in dfd and updated documents
</commit_message>
<xml_diff>
--- a/final project report.docx
+++ b/final project report.docx
@@ -4888,20 +4888,6 @@
         <w:tabs>
           <w:tab w:val="right" w:leader="dot" w:pos="8296"/>
         </w:tabs>
-        <w:rPr>
-          <w:b/>
-          <w:bCs/>
-          <w:sz w:val="28"/>
-          <w:szCs w:val="28"/>
-        </w:rPr>
-      </w:pPr>
-    </w:p>
-    <w:p>
-      <w:pPr>
-        <w:pStyle w:val="TableofFigures"/>
-        <w:tabs>
-          <w:tab w:val="right" w:leader="dot" w:pos="8296"/>
-        </w:tabs>
         <w:spacing w:line="360" w:lineRule="auto"/>
         <w:jc w:val="center"/>
         <w:rPr>
@@ -4918,6 +4904,7 @@
           <w:sz w:val="32"/>
           <w:szCs w:val="32"/>
         </w:rPr>
+        <w:lastRenderedPageBreak/>
         <w:t>List of Figures</w:t>
       </w:r>
     </w:p>
@@ -6299,12 +6286,1041 @@
         <w:spacing w:line="360" w:lineRule="auto"/>
       </w:pPr>
     </w:p>
+    <w:p/>
+    <w:p>
+      <w:pPr>
+        <w:pStyle w:val="TableofFigures"/>
+        <w:tabs>
+          <w:tab w:val="right" w:leader="dot" w:pos="8296"/>
+        </w:tabs>
+        <w:rPr>
+          <w:b/>
+          <w:bCs/>
+          <w:sz w:val="28"/>
+          <w:szCs w:val="28"/>
+        </w:rPr>
+      </w:pPr>
+    </w:p>
+    <w:p>
+      <w:pPr>
+        <w:rPr>
+          <w:b/>
+          <w:bCs/>
+          <w:sz w:val="28"/>
+          <w:szCs w:val="28"/>
+        </w:rPr>
+      </w:pPr>
+      <w:r>
+        <w:rPr>
+          <w:b/>
+          <w:bCs/>
+          <w:sz w:val="28"/>
+          <w:szCs w:val="28"/>
+        </w:rPr>
+        <w:br w:type="page"/>
+      </w:r>
+    </w:p>
+    <w:p>
+      <w:pPr>
+        <w:pStyle w:val="TableofFigures"/>
+        <w:tabs>
+          <w:tab w:val="right" w:leader="dot" w:pos="8296"/>
+        </w:tabs>
+        <w:spacing w:line="360" w:lineRule="auto"/>
+        <w:jc w:val="center"/>
+        <w:rPr>
+          <w:b/>
+          <w:bCs/>
+          <w:sz w:val="32"/>
+          <w:szCs w:val="32"/>
+        </w:rPr>
+      </w:pPr>
+      <w:r>
+        <w:rPr>
+          <w:b/>
+          <w:bCs/>
+          <w:sz w:val="32"/>
+          <w:szCs w:val="32"/>
+        </w:rPr>
+        <w:lastRenderedPageBreak/>
+        <w:t>Abbreviations</w:t>
+      </w:r>
+    </w:p>
+    <w:tbl>
+      <w:tblPr>
+        <w:tblStyle w:val="TableGrid"/>
+        <w:tblW w:w="8286" w:type="dxa"/>
+        <w:tblLook w:val="04A0" w:firstRow="1" w:lastRow="0" w:firstColumn="1" w:lastColumn="0" w:noHBand="0" w:noVBand="1"/>
+      </w:tblPr>
+      <w:tblGrid>
+        <w:gridCol w:w="2385"/>
+        <w:gridCol w:w="5901"/>
+      </w:tblGrid>
+      <w:tr>
+        <w:trPr>
+          <w:trHeight w:val="594"/>
+        </w:trPr>
+        <w:tc>
+          <w:tcPr>
+            <w:tcW w:w="0" w:type="auto"/>
+            <w:hideMark/>
+          </w:tcPr>
+          <w:p>
+            <w:pPr>
+              <w:spacing w:after="160" w:line="360" w:lineRule="auto"/>
+              <w:rPr>
+                <w:b/>
+                <w:bCs/>
+                <w:lang w:val="en-US"/>
+              </w:rPr>
+            </w:pPr>
+            <w:r>
+              <w:rPr>
+                <w:b/>
+                <w:bCs/>
+                <w:lang w:val="en-US"/>
+              </w:rPr>
+              <w:t>Abbreviation</w:t>
+            </w:r>
+          </w:p>
+        </w:tc>
+        <w:tc>
+          <w:tcPr>
+            <w:tcW w:w="0" w:type="auto"/>
+            <w:hideMark/>
+          </w:tcPr>
+          <w:p>
+            <w:pPr>
+              <w:spacing w:after="160" w:line="360" w:lineRule="auto"/>
+              <w:rPr>
+                <w:b/>
+                <w:bCs/>
+                <w:lang w:val="en-US"/>
+              </w:rPr>
+            </w:pPr>
+            <w:r>
+              <w:rPr>
+                <w:b/>
+                <w:bCs/>
+                <w:lang w:val="en-US"/>
+              </w:rPr>
+              <w:t>Full Form</w:t>
+            </w:r>
+          </w:p>
+        </w:tc>
+      </w:tr>
+      <w:tr>
+        <w:trPr>
+          <w:trHeight w:val="581"/>
+        </w:trPr>
+        <w:tc>
+          <w:tcPr>
+            <w:tcW w:w="0" w:type="auto"/>
+            <w:hideMark/>
+          </w:tcPr>
+          <w:p>
+            <w:pPr>
+              <w:spacing w:after="160" w:line="360" w:lineRule="auto"/>
+              <w:rPr>
+                <w:lang w:val="en-US"/>
+              </w:rPr>
+            </w:pPr>
+            <w:r>
+              <w:rPr>
+                <w:lang w:val="en-US"/>
+              </w:rPr>
+              <w:t>AI</w:t>
+            </w:r>
+          </w:p>
+        </w:tc>
+        <w:tc>
+          <w:tcPr>
+            <w:tcW w:w="0" w:type="auto"/>
+            <w:hideMark/>
+          </w:tcPr>
+          <w:p>
+            <w:pPr>
+              <w:spacing w:after="160" w:line="360" w:lineRule="auto"/>
+              <w:rPr>
+                <w:lang w:val="en-US"/>
+              </w:rPr>
+            </w:pPr>
+            <w:r>
+              <w:rPr>
+                <w:lang w:val="en-US"/>
+              </w:rPr>
+              <w:t>Artificial Intelligence</w:t>
+            </w:r>
+          </w:p>
+        </w:tc>
+      </w:tr>
+      <w:tr>
+        <w:trPr>
+          <w:trHeight w:val="594"/>
+        </w:trPr>
+        <w:tc>
+          <w:tcPr>
+            <w:tcW w:w="0" w:type="auto"/>
+            <w:hideMark/>
+          </w:tcPr>
+          <w:p>
+            <w:pPr>
+              <w:spacing w:after="160" w:line="360" w:lineRule="auto"/>
+              <w:rPr>
+                <w:lang w:val="en-US"/>
+              </w:rPr>
+            </w:pPr>
+            <w:r>
+              <w:rPr>
+                <w:lang w:val="en-US"/>
+              </w:rPr>
+              <w:t>ANSI</w:t>
+            </w:r>
+          </w:p>
+        </w:tc>
+        <w:tc>
+          <w:tcPr>
+            <w:tcW w:w="0" w:type="auto"/>
+            <w:hideMark/>
+          </w:tcPr>
+          <w:p>
+            <w:pPr>
+              <w:spacing w:after="160" w:line="360" w:lineRule="auto"/>
+              <w:rPr>
+                <w:lang w:val="en-US"/>
+              </w:rPr>
+            </w:pPr>
+            <w:r>
+              <w:rPr>
+                <w:lang w:val="en-US"/>
+              </w:rPr>
+              <w:t>American National Standards Institute</w:t>
+            </w:r>
+          </w:p>
+        </w:tc>
+      </w:tr>
+      <w:tr>
+        <w:trPr>
+          <w:trHeight w:val="594"/>
+        </w:trPr>
+        <w:tc>
+          <w:tcPr>
+            <w:tcW w:w="0" w:type="auto"/>
+            <w:hideMark/>
+          </w:tcPr>
+          <w:p>
+            <w:pPr>
+              <w:spacing w:after="160" w:line="360" w:lineRule="auto"/>
+              <w:rPr>
+                <w:lang w:val="en-US"/>
+              </w:rPr>
+            </w:pPr>
+            <w:r>
+              <w:rPr>
+                <w:lang w:val="en-US"/>
+              </w:rPr>
+              <w:t>API</w:t>
+            </w:r>
+          </w:p>
+        </w:tc>
+        <w:tc>
+          <w:tcPr>
+            <w:tcW w:w="0" w:type="auto"/>
+            <w:hideMark/>
+          </w:tcPr>
+          <w:p>
+            <w:pPr>
+              <w:spacing w:after="160" w:line="360" w:lineRule="auto"/>
+              <w:rPr>
+                <w:lang w:val="en-US"/>
+              </w:rPr>
+            </w:pPr>
+            <w:r>
+              <w:rPr>
+                <w:lang w:val="en-US"/>
+              </w:rPr>
+              <w:t>Application Programming Interface</w:t>
+            </w:r>
+          </w:p>
+        </w:tc>
+      </w:tr>
+      <w:tr>
+        <w:trPr>
+          <w:trHeight w:val="581"/>
+        </w:trPr>
+        <w:tc>
+          <w:tcPr>
+            <w:tcW w:w="0" w:type="auto"/>
+            <w:hideMark/>
+          </w:tcPr>
+          <w:p>
+            <w:pPr>
+              <w:spacing w:after="160" w:line="360" w:lineRule="auto"/>
+              <w:rPr>
+                <w:lang w:val="en-US"/>
+              </w:rPr>
+            </w:pPr>
+            <w:r>
+              <w:rPr>
+                <w:lang w:val="en-US"/>
+              </w:rPr>
+              <w:t>C</w:t>
+            </w:r>
+          </w:p>
+        </w:tc>
+        <w:tc>
+          <w:tcPr>
+            <w:tcW w:w="0" w:type="auto"/>
+            <w:hideMark/>
+          </w:tcPr>
+          <w:p>
+            <w:pPr>
+              <w:spacing w:after="160" w:line="360" w:lineRule="auto"/>
+              <w:rPr>
+                <w:lang w:val="en-US"/>
+              </w:rPr>
+            </w:pPr>
+            <w:r>
+              <w:rPr>
+                <w:lang w:val="en-US"/>
+              </w:rPr>
+              <w:t>C Programming Language</w:t>
+            </w:r>
+          </w:p>
+        </w:tc>
+      </w:tr>
+      <w:tr>
+        <w:trPr>
+          <w:trHeight w:val="594"/>
+        </w:trPr>
+        <w:tc>
+          <w:tcPr>
+            <w:tcW w:w="0" w:type="auto"/>
+            <w:hideMark/>
+          </w:tcPr>
+          <w:p>
+            <w:pPr>
+              <w:spacing w:after="160" w:line="360" w:lineRule="auto"/>
+              <w:rPr>
+                <w:lang w:val="en-US"/>
+              </w:rPr>
+            </w:pPr>
+            <w:r>
+              <w:rPr>
+                <w:lang w:val="en-US"/>
+              </w:rPr>
+              <w:t>CPU</w:t>
+            </w:r>
+          </w:p>
+        </w:tc>
+        <w:tc>
+          <w:tcPr>
+            <w:tcW w:w="0" w:type="auto"/>
+            <w:hideMark/>
+          </w:tcPr>
+          <w:p>
+            <w:pPr>
+              <w:spacing w:after="160" w:line="360" w:lineRule="auto"/>
+              <w:rPr>
+                <w:lang w:val="en-US"/>
+              </w:rPr>
+            </w:pPr>
+            <w:r>
+              <w:rPr>
+                <w:lang w:val="en-US"/>
+              </w:rPr>
+              <w:t>Central Processing Unit</w:t>
+            </w:r>
+          </w:p>
+        </w:tc>
+      </w:tr>
+      <w:tr>
+        <w:trPr>
+          <w:trHeight w:val="581"/>
+        </w:trPr>
+        <w:tc>
+          <w:tcPr>
+            <w:tcW w:w="0" w:type="auto"/>
+            <w:hideMark/>
+          </w:tcPr>
+          <w:p>
+            <w:pPr>
+              <w:spacing w:after="160" w:line="360" w:lineRule="auto"/>
+              <w:rPr>
+                <w:lang w:val="en-US"/>
+              </w:rPr>
+            </w:pPr>
+            <w:r>
+              <w:rPr>
+                <w:lang w:val="en-US"/>
+              </w:rPr>
+              <w:t>CRUD</w:t>
+            </w:r>
+          </w:p>
+        </w:tc>
+        <w:tc>
+          <w:tcPr>
+            <w:tcW w:w="0" w:type="auto"/>
+            <w:hideMark/>
+          </w:tcPr>
+          <w:p>
+            <w:pPr>
+              <w:spacing w:after="160" w:line="360" w:lineRule="auto"/>
+              <w:rPr>
+                <w:lang w:val="en-US"/>
+              </w:rPr>
+            </w:pPr>
+            <w:r>
+              <w:rPr>
+                <w:lang w:val="en-US"/>
+              </w:rPr>
+              <w:t>Create, Read, Update, Delete</w:t>
+            </w:r>
+          </w:p>
+        </w:tc>
+      </w:tr>
+      <w:tr>
+        <w:trPr>
+          <w:trHeight w:val="594"/>
+        </w:trPr>
+        <w:tc>
+          <w:tcPr>
+            <w:tcW w:w="0" w:type="auto"/>
+            <w:hideMark/>
+          </w:tcPr>
+          <w:p>
+            <w:pPr>
+              <w:spacing w:after="160" w:line="360" w:lineRule="auto"/>
+              <w:rPr>
+                <w:lang w:val="en-US"/>
+              </w:rPr>
+            </w:pPr>
+            <w:r>
+              <w:rPr>
+                <w:lang w:val="en-US"/>
+              </w:rPr>
+              <w:t>DFD</w:t>
+            </w:r>
+          </w:p>
+        </w:tc>
+        <w:tc>
+          <w:tcPr>
+            <w:tcW w:w="0" w:type="auto"/>
+            <w:hideMark/>
+          </w:tcPr>
+          <w:p>
+            <w:pPr>
+              <w:spacing w:after="160" w:line="360" w:lineRule="auto"/>
+              <w:rPr>
+                <w:lang w:val="en-US"/>
+              </w:rPr>
+            </w:pPr>
+            <w:r>
+              <w:rPr>
+                <w:lang w:val="en-US"/>
+              </w:rPr>
+              <w:t>Data Flow Diagram</w:t>
+            </w:r>
+          </w:p>
+        </w:tc>
+      </w:tr>
+      <w:tr>
+        <w:trPr>
+          <w:trHeight w:val="594"/>
+        </w:trPr>
+        <w:tc>
+          <w:tcPr>
+            <w:tcW w:w="0" w:type="auto"/>
+            <w:hideMark/>
+          </w:tcPr>
+          <w:p>
+            <w:pPr>
+              <w:spacing w:after="160" w:line="360" w:lineRule="auto"/>
+              <w:rPr>
+                <w:lang w:val="en-US"/>
+              </w:rPr>
+            </w:pPr>
+            <w:r>
+              <w:rPr>
+                <w:lang w:val="en-US"/>
+              </w:rPr>
+              <w:t>GUI</w:t>
+            </w:r>
+          </w:p>
+        </w:tc>
+        <w:tc>
+          <w:tcPr>
+            <w:tcW w:w="0" w:type="auto"/>
+            <w:hideMark/>
+          </w:tcPr>
+          <w:p>
+            <w:pPr>
+              <w:spacing w:after="160" w:line="360" w:lineRule="auto"/>
+              <w:rPr>
+                <w:lang w:val="en-US"/>
+              </w:rPr>
+            </w:pPr>
+            <w:r>
+              <w:rPr>
+                <w:lang w:val="en-US"/>
+              </w:rPr>
+              <w:t>Graphical User Interface</w:t>
+            </w:r>
+          </w:p>
+        </w:tc>
+      </w:tr>
+      <w:tr>
+        <w:trPr>
+          <w:trHeight w:val="581"/>
+        </w:trPr>
+        <w:tc>
+          <w:tcPr>
+            <w:tcW w:w="0" w:type="auto"/>
+            <w:hideMark/>
+          </w:tcPr>
+          <w:p>
+            <w:pPr>
+              <w:spacing w:after="160" w:line="360" w:lineRule="auto"/>
+              <w:rPr>
+                <w:lang w:val="en-US"/>
+              </w:rPr>
+            </w:pPr>
+            <w:r>
+              <w:rPr>
+                <w:lang w:val="en-US"/>
+              </w:rPr>
+              <w:t>IDE</w:t>
+            </w:r>
+          </w:p>
+        </w:tc>
+        <w:tc>
+          <w:tcPr>
+            <w:tcW w:w="0" w:type="auto"/>
+            <w:hideMark/>
+          </w:tcPr>
+          <w:p>
+            <w:pPr>
+              <w:spacing w:after="160" w:line="360" w:lineRule="auto"/>
+              <w:rPr>
+                <w:lang w:val="en-US"/>
+              </w:rPr>
+            </w:pPr>
+            <w:r>
+              <w:rPr>
+                <w:lang w:val="en-US"/>
+              </w:rPr>
+              <w:t>Integrated Development Environment</w:t>
+            </w:r>
+          </w:p>
+        </w:tc>
+      </w:tr>
+      <w:tr>
+        <w:trPr>
+          <w:trHeight w:val="594"/>
+        </w:trPr>
+        <w:tc>
+          <w:tcPr>
+            <w:tcW w:w="0" w:type="auto"/>
+            <w:hideMark/>
+          </w:tcPr>
+          <w:p>
+            <w:pPr>
+              <w:spacing w:after="160" w:line="360" w:lineRule="auto"/>
+              <w:rPr>
+                <w:lang w:val="en-US"/>
+              </w:rPr>
+            </w:pPr>
+            <w:r>
+              <w:rPr>
+                <w:lang w:val="en-US"/>
+              </w:rPr>
+              <w:t>PU</w:t>
+            </w:r>
+          </w:p>
+        </w:tc>
+        <w:tc>
+          <w:tcPr>
+            <w:tcW w:w="0" w:type="auto"/>
+            <w:hideMark/>
+          </w:tcPr>
+          <w:p>
+            <w:pPr>
+              <w:spacing w:after="160" w:line="360" w:lineRule="auto"/>
+              <w:rPr>
+                <w:lang w:val="en-US"/>
+              </w:rPr>
+            </w:pPr>
+            <w:r>
+              <w:rPr>
+                <w:lang w:val="en-US"/>
+              </w:rPr>
+              <w:t>Pokhara University</w:t>
+            </w:r>
+          </w:p>
+        </w:tc>
+      </w:tr>
+      <w:tr>
+        <w:trPr>
+          <w:trHeight w:val="594"/>
+        </w:trPr>
+        <w:tc>
+          <w:tcPr>
+            <w:tcW w:w="0" w:type="auto"/>
+            <w:hideMark/>
+          </w:tcPr>
+          <w:p>
+            <w:pPr>
+              <w:spacing w:after="160" w:line="360" w:lineRule="auto"/>
+              <w:rPr>
+                <w:lang w:val="en-US"/>
+              </w:rPr>
+            </w:pPr>
+            <w:r>
+              <w:rPr>
+                <w:lang w:val="en-US"/>
+              </w:rPr>
+              <w:t>RAM</w:t>
+            </w:r>
+          </w:p>
+        </w:tc>
+        <w:tc>
+          <w:tcPr>
+            <w:tcW w:w="0" w:type="auto"/>
+            <w:hideMark/>
+          </w:tcPr>
+          <w:p>
+            <w:pPr>
+              <w:spacing w:after="160" w:line="360" w:lineRule="auto"/>
+              <w:rPr>
+                <w:lang w:val="en-US"/>
+              </w:rPr>
+            </w:pPr>
+            <w:r>
+              <w:rPr>
+                <w:lang w:val="en-US"/>
+              </w:rPr>
+              <w:t>Random Access Memory</w:t>
+            </w:r>
+          </w:p>
+        </w:tc>
+      </w:tr>
+      <w:tr>
+        <w:trPr>
+          <w:trHeight w:val="581"/>
+        </w:trPr>
+        <w:tc>
+          <w:tcPr>
+            <w:tcW w:w="0" w:type="auto"/>
+            <w:hideMark/>
+          </w:tcPr>
+          <w:p>
+            <w:pPr>
+              <w:spacing w:after="160" w:line="360" w:lineRule="auto"/>
+              <w:rPr>
+                <w:lang w:val="en-US"/>
+              </w:rPr>
+            </w:pPr>
+            <w:r>
+              <w:rPr>
+                <w:lang w:val="en-US"/>
+              </w:rPr>
+              <w:t>RTM</w:t>
+            </w:r>
+          </w:p>
+        </w:tc>
+        <w:tc>
+          <w:tcPr>
+            <w:tcW w:w="0" w:type="auto"/>
+            <w:hideMark/>
+          </w:tcPr>
+          <w:p>
+            <w:pPr>
+              <w:spacing w:after="160" w:line="360" w:lineRule="auto"/>
+              <w:rPr>
+                <w:lang w:val="en-US"/>
+              </w:rPr>
+            </w:pPr>
+            <w:r>
+              <w:rPr>
+                <w:lang w:val="en-US"/>
+              </w:rPr>
+              <w:t>Requirement Traceability Matrix</w:t>
+            </w:r>
+          </w:p>
+        </w:tc>
+      </w:tr>
+      <w:tr>
+        <w:trPr>
+          <w:trHeight w:val="594"/>
+        </w:trPr>
+        <w:tc>
+          <w:tcPr>
+            <w:tcW w:w="0" w:type="auto"/>
+            <w:hideMark/>
+          </w:tcPr>
+          <w:p>
+            <w:pPr>
+              <w:spacing w:after="160" w:line="360" w:lineRule="auto"/>
+              <w:rPr>
+                <w:lang w:val="en-US"/>
+              </w:rPr>
+            </w:pPr>
+            <w:r>
+              <w:rPr>
+                <w:lang w:val="en-US"/>
+              </w:rPr>
+              <w:t>SDLC</w:t>
+            </w:r>
+          </w:p>
+        </w:tc>
+        <w:tc>
+          <w:tcPr>
+            <w:tcW w:w="0" w:type="auto"/>
+            <w:hideMark/>
+          </w:tcPr>
+          <w:p>
+            <w:pPr>
+              <w:spacing w:after="160" w:line="360" w:lineRule="auto"/>
+              <w:rPr>
+                <w:lang w:val="en-US"/>
+              </w:rPr>
+            </w:pPr>
+            <w:r>
+              <w:rPr>
+                <w:lang w:val="en-US"/>
+              </w:rPr>
+              <w:t>Software Development Life Cycle</w:t>
+            </w:r>
+          </w:p>
+        </w:tc>
+      </w:tr>
+      <w:tr>
+        <w:trPr>
+          <w:trHeight w:val="594"/>
+        </w:trPr>
+        <w:tc>
+          <w:tcPr>
+            <w:tcW w:w="0" w:type="auto"/>
+            <w:hideMark/>
+          </w:tcPr>
+          <w:p>
+            <w:pPr>
+              <w:spacing w:after="160" w:line="360" w:lineRule="auto"/>
+              <w:rPr>
+                <w:lang w:val="en-US"/>
+              </w:rPr>
+            </w:pPr>
+            <w:r>
+              <w:rPr>
+                <w:lang w:val="en-US"/>
+              </w:rPr>
+              <w:t>SN</w:t>
+            </w:r>
+          </w:p>
+        </w:tc>
+        <w:tc>
+          <w:tcPr>
+            <w:tcW w:w="0" w:type="auto"/>
+            <w:hideMark/>
+          </w:tcPr>
+          <w:p>
+            <w:pPr>
+              <w:spacing w:after="160" w:line="360" w:lineRule="auto"/>
+              <w:rPr>
+                <w:lang w:val="en-US"/>
+              </w:rPr>
+            </w:pPr>
+            <w:r>
+              <w:rPr>
+                <w:lang w:val="en-US"/>
+              </w:rPr>
+              <w:t>Serial Number</w:t>
+            </w:r>
+          </w:p>
+        </w:tc>
+      </w:tr>
+      <w:tr>
+        <w:trPr>
+          <w:trHeight w:val="581"/>
+        </w:trPr>
+        <w:tc>
+          <w:tcPr>
+            <w:tcW w:w="0" w:type="auto"/>
+            <w:hideMark/>
+          </w:tcPr>
+          <w:p>
+            <w:pPr>
+              <w:spacing w:after="160" w:line="360" w:lineRule="auto"/>
+              <w:rPr>
+                <w:lang w:val="en-US"/>
+              </w:rPr>
+            </w:pPr>
+            <w:r>
+              <w:rPr>
+                <w:lang w:val="en-US"/>
+              </w:rPr>
+              <w:t>STLC</w:t>
+            </w:r>
+          </w:p>
+        </w:tc>
+        <w:tc>
+          <w:tcPr>
+            <w:tcW w:w="0" w:type="auto"/>
+            <w:hideMark/>
+          </w:tcPr>
+          <w:p>
+            <w:pPr>
+              <w:spacing w:after="160" w:line="360" w:lineRule="auto"/>
+              <w:rPr>
+                <w:lang w:val="en-US"/>
+              </w:rPr>
+            </w:pPr>
+            <w:r>
+              <w:rPr>
+                <w:lang w:val="en-US"/>
+              </w:rPr>
+              <w:t>Software Testing Life Cycle</w:t>
+            </w:r>
+          </w:p>
+        </w:tc>
+      </w:tr>
+      <w:tr>
+        <w:trPr>
+          <w:trHeight w:val="594"/>
+        </w:trPr>
+        <w:tc>
+          <w:tcPr>
+            <w:tcW w:w="0" w:type="auto"/>
+            <w:hideMark/>
+          </w:tcPr>
+          <w:p>
+            <w:pPr>
+              <w:spacing w:after="160" w:line="360" w:lineRule="auto"/>
+              <w:rPr>
+                <w:lang w:val="en-US"/>
+              </w:rPr>
+            </w:pPr>
+            <w:r>
+              <w:rPr>
+                <w:lang w:val="en-US"/>
+              </w:rPr>
+              <w:t>TC</w:t>
+            </w:r>
+          </w:p>
+        </w:tc>
+        <w:tc>
+          <w:tcPr>
+            <w:tcW w:w="0" w:type="auto"/>
+            <w:hideMark/>
+          </w:tcPr>
+          <w:p>
+            <w:pPr>
+              <w:spacing w:after="160" w:line="360" w:lineRule="auto"/>
+              <w:rPr>
+                <w:lang w:val="en-US"/>
+              </w:rPr>
+            </w:pPr>
+            <w:r>
+              <w:rPr>
+                <w:lang w:val="en-US"/>
+              </w:rPr>
+              <w:t>Test Case</w:t>
+            </w:r>
+          </w:p>
+        </w:tc>
+      </w:tr>
+      <w:tr>
+        <w:trPr>
+          <w:trHeight w:val="581"/>
+        </w:trPr>
+        <w:tc>
+          <w:tcPr>
+            <w:tcW w:w="0" w:type="auto"/>
+            <w:hideMark/>
+          </w:tcPr>
+          <w:p>
+            <w:pPr>
+              <w:spacing w:after="160" w:line="360" w:lineRule="auto"/>
+              <w:rPr>
+                <w:lang w:val="en-US"/>
+              </w:rPr>
+            </w:pPr>
+            <w:r>
+              <w:rPr>
+                <w:lang w:val="en-US"/>
+              </w:rPr>
+              <w:t>UAT</w:t>
+            </w:r>
+          </w:p>
+        </w:tc>
+        <w:tc>
+          <w:tcPr>
+            <w:tcW w:w="0" w:type="auto"/>
+            <w:hideMark/>
+          </w:tcPr>
+          <w:p>
+            <w:pPr>
+              <w:spacing w:after="160" w:line="360" w:lineRule="auto"/>
+              <w:rPr>
+                <w:lang w:val="en-US"/>
+              </w:rPr>
+            </w:pPr>
+            <w:r>
+              <w:rPr>
+                <w:lang w:val="en-US"/>
+              </w:rPr>
+              <w:t>User Acceptance Testing</w:t>
+            </w:r>
+          </w:p>
+        </w:tc>
+      </w:tr>
+      <w:tr>
+        <w:trPr>
+          <w:trHeight w:val="594"/>
+        </w:trPr>
+        <w:tc>
+          <w:tcPr>
+            <w:tcW w:w="0" w:type="auto"/>
+            <w:hideMark/>
+          </w:tcPr>
+          <w:p>
+            <w:pPr>
+              <w:spacing w:after="160" w:line="360" w:lineRule="auto"/>
+              <w:rPr>
+                <w:lang w:val="en-US"/>
+              </w:rPr>
+            </w:pPr>
+            <w:r>
+              <w:rPr>
+                <w:lang w:val="en-US"/>
+              </w:rPr>
+              <w:t>UI</w:t>
+            </w:r>
+          </w:p>
+        </w:tc>
+        <w:tc>
+          <w:tcPr>
+            <w:tcW w:w="0" w:type="auto"/>
+            <w:hideMark/>
+          </w:tcPr>
+          <w:p>
+            <w:pPr>
+              <w:spacing w:after="160" w:line="360" w:lineRule="auto"/>
+              <w:rPr>
+                <w:lang w:val="en-US"/>
+              </w:rPr>
+            </w:pPr>
+            <w:r>
+              <w:rPr>
+                <w:lang w:val="en-US"/>
+              </w:rPr>
+              <w:t>User Interface</w:t>
+            </w:r>
+          </w:p>
+        </w:tc>
+      </w:tr>
+      <w:tr>
+        <w:trPr>
+          <w:trHeight w:val="594"/>
+        </w:trPr>
+        <w:tc>
+          <w:tcPr>
+            <w:tcW w:w="0" w:type="auto"/>
+            <w:hideMark/>
+          </w:tcPr>
+          <w:p>
+            <w:pPr>
+              <w:spacing w:after="160" w:line="360" w:lineRule="auto"/>
+              <w:rPr>
+                <w:lang w:val="en-US"/>
+              </w:rPr>
+            </w:pPr>
+            <w:r>
+              <w:rPr>
+                <w:lang w:val="en-US"/>
+              </w:rPr>
+              <w:t>URL</w:t>
+            </w:r>
+          </w:p>
+        </w:tc>
+        <w:tc>
+          <w:tcPr>
+            <w:tcW w:w="0" w:type="auto"/>
+            <w:hideMark/>
+          </w:tcPr>
+          <w:p>
+            <w:pPr>
+              <w:spacing w:after="160" w:line="360" w:lineRule="auto"/>
+              <w:rPr>
+                <w:lang w:val="en-US"/>
+              </w:rPr>
+            </w:pPr>
+            <w:r>
+              <w:rPr>
+                <w:lang w:val="en-US"/>
+              </w:rPr>
+              <w:t>Uniform Resource Locator</w:t>
+            </w:r>
+          </w:p>
+        </w:tc>
+      </w:tr>
+      <w:tr>
+        <w:trPr>
+          <w:trHeight w:val="581"/>
+        </w:trPr>
+        <w:tc>
+          <w:tcPr>
+            <w:tcW w:w="0" w:type="auto"/>
+            <w:hideMark/>
+          </w:tcPr>
+          <w:p>
+            <w:pPr>
+              <w:spacing w:after="160" w:line="360" w:lineRule="auto"/>
+              <w:rPr>
+                <w:lang w:val="en-US"/>
+              </w:rPr>
+            </w:pPr>
+            <w:r>
+              <w:rPr>
+                <w:lang w:val="en-US"/>
+              </w:rPr>
+              <w:t>USR</w:t>
+            </w:r>
+          </w:p>
+        </w:tc>
+        <w:tc>
+          <w:tcPr>
+            <w:tcW w:w="0" w:type="auto"/>
+            <w:hideMark/>
+          </w:tcPr>
+          <w:p>
+            <w:pPr>
+              <w:spacing w:after="160" w:line="360" w:lineRule="auto"/>
+              <w:rPr>
+                <w:lang w:val="en-US"/>
+              </w:rPr>
+            </w:pPr>
+            <w:r>
+              <w:rPr>
+                <w:lang w:val="en-US"/>
+              </w:rPr>
+              <w:t>User Requirement</w:t>
+            </w:r>
+          </w:p>
+        </w:tc>
+      </w:tr>
+    </w:tbl>
+    <w:p>
+      <w:pPr>
+        <w:spacing w:line="360" w:lineRule="auto"/>
+      </w:pPr>
+    </w:p>
     <w:p>
       <w:pPr>
         <w:pStyle w:val="Heading1"/>
         <w:numPr>
           <w:ilvl w:val="0"/>
-          <w:numId w:val="19"/>
+          <w:numId w:val="0"/>
         </w:numPr>
         <w:spacing w:line="360" w:lineRule="auto"/>
         <w:rPr>
@@ -6324,15 +7340,13 @@
         <w:pStyle w:val="Heading1"/>
         <w:ind w:left="180" w:hanging="180"/>
       </w:pPr>
-      <w:bookmarkStart w:id="3" w:name="_Toc234493076"/>
       <w:r>
         <w:lastRenderedPageBreak/>
         <w:t>.</w:t>
       </w:r>
       <w:r>
-        <w:t>Introduction</w:t>
-      </w:r>
-      <w:bookmarkEnd w:id="3"/>
+        <w:t xml:space="preserve"> Introduction</w:t>
+      </w:r>
     </w:p>
     <w:p>
       <w:pPr>
@@ -6643,7 +7657,7 @@
           <w:tab w:val="left" w:pos="180"/>
         </w:tabs>
       </w:pPr>
-      <w:bookmarkStart w:id="4" w:name="_Toc234493077"/>
+      <w:bookmarkStart w:id="3" w:name="_Toc234493077"/>
       <w:r>
         <w:lastRenderedPageBreak/>
         <w:t>.</w:t>
@@ -6651,7 +7665,7 @@
       <w:r>
         <w:t>Problem Statement</w:t>
       </w:r>
-      <w:bookmarkEnd w:id="4"/>
+      <w:bookmarkEnd w:id="3"/>
     </w:p>
     <w:p>
       <w:pPr>
@@ -6755,7 +7769,7 @@
         <w:pStyle w:val="Heading1"/>
         <w:ind w:left="180" w:hanging="180"/>
       </w:pPr>
-      <w:bookmarkStart w:id="5" w:name="_Toc234493078"/>
+      <w:bookmarkStart w:id="4" w:name="_Toc234493078"/>
       <w:r>
         <w:lastRenderedPageBreak/>
         <w:t>.</w:t>
@@ -6763,7 +7777,7 @@
       <w:r>
         <w:t>Objective</w:t>
       </w:r>
-      <w:bookmarkEnd w:id="5"/>
+      <w:bookmarkEnd w:id="4"/>
       <w:r>
         <w:t xml:space="preserve"> </w:t>
       </w:r>
@@ -6932,7 +7946,7 @@
         <w:spacing w:line="360" w:lineRule="auto"/>
         <w:ind w:left="180" w:hanging="180"/>
       </w:pPr>
-      <w:bookmarkStart w:id="6" w:name="_Toc234493079"/>
+      <w:bookmarkStart w:id="5" w:name="_Toc234493079"/>
       <w:r>
         <w:lastRenderedPageBreak/>
         <w:t>.</w:t>
@@ -6940,7 +7954,7 @@
       <w:r>
         <w:t>Background Study</w:t>
       </w:r>
-      <w:bookmarkEnd w:id="6"/>
+      <w:bookmarkEnd w:id="5"/>
     </w:p>
     <w:p>
       <w:pPr>
@@ -7114,7 +8128,7 @@
         <w:pStyle w:val="Heading1"/>
         <w:ind w:left="180" w:hanging="180"/>
       </w:pPr>
-      <w:bookmarkStart w:id="7" w:name="_Toc234493080"/>
+      <w:bookmarkStart w:id="6" w:name="_Toc234493080"/>
       <w:r>
         <w:lastRenderedPageBreak/>
         <w:t>.</w:t>
@@ -7122,7 +8136,7 @@
       <w:r>
         <w:t>Requirement Document</w:t>
       </w:r>
-      <w:bookmarkEnd w:id="7"/>
+      <w:bookmarkEnd w:id="6"/>
     </w:p>
     <w:p>
       <w:pPr>
@@ -7151,11 +8165,14 @@
       <w:pPr>
         <w:pStyle w:val="Heading2"/>
       </w:pPr>
-      <w:bookmarkStart w:id="8" w:name="_Toc234493081"/>
+      <w:bookmarkStart w:id="7" w:name="_Toc234493081"/>
       <w:r>
         <w:t>Requirement Matrix</w:t>
       </w:r>
-      <w:bookmarkEnd w:id="8"/>
+      <w:bookmarkEnd w:id="7"/>
+      <w:r>
+        <w:t xml:space="preserve"> </w:t>
+      </w:r>
     </w:p>
     <w:tbl>
       <w:tblPr>
@@ -8587,14 +9604,14 @@
           <w:lang w:val="en-US"/>
         </w:rPr>
       </w:pPr>
-      <w:bookmarkStart w:id="9" w:name="_Toc234493083"/>
+      <w:bookmarkStart w:id="8" w:name="_Toc234493083"/>
       <w:r>
         <w:rPr>
           <w:lang w:val="en-US"/>
         </w:rPr>
         <w:t>User Requirements</w:t>
       </w:r>
-      <w:bookmarkEnd w:id="9"/>
+      <w:bookmarkEnd w:id="8"/>
     </w:p>
     <w:p>
       <w:pPr>
@@ -8725,14 +9742,14 @@
           <w:lang w:val="en-US"/>
         </w:rPr>
       </w:pPr>
-      <w:bookmarkStart w:id="10" w:name="_Toc234493084"/>
+      <w:bookmarkStart w:id="9" w:name="_Toc234493084"/>
       <w:r>
         <w:rPr>
           <w:lang w:val="en-US"/>
         </w:rPr>
         <w:t>Functional Requirements</w:t>
       </w:r>
-      <w:bookmarkEnd w:id="10"/>
+      <w:bookmarkEnd w:id="9"/>
     </w:p>
     <w:p>
       <w:pPr>
@@ -8863,14 +9880,14 @@
           <w:lang w:val="en-US"/>
         </w:rPr>
       </w:pPr>
-      <w:bookmarkStart w:id="11" w:name="_Toc234493085"/>
+      <w:bookmarkStart w:id="10" w:name="_Toc234493085"/>
       <w:r>
         <w:rPr>
           <w:lang w:val="en-US"/>
         </w:rPr>
         <w:t>Non-Functional Requirements</w:t>
       </w:r>
-      <w:bookmarkEnd w:id="11"/>
+      <w:bookmarkEnd w:id="10"/>
     </w:p>
     <w:p>
       <w:pPr>
@@ -8989,7 +10006,7 @@
         <w:pStyle w:val="Heading1"/>
         <w:ind w:left="180" w:hanging="180"/>
       </w:pPr>
-      <w:bookmarkStart w:id="12" w:name="_Toc234493086"/>
+      <w:bookmarkStart w:id="11" w:name="_Toc234493086"/>
       <w:r>
         <w:lastRenderedPageBreak/>
         <w:t>.</w:t>
@@ -9000,7 +10017,7 @@
       <w:r>
         <w:t xml:space="preserve"> Design</w:t>
       </w:r>
-      <w:bookmarkEnd w:id="12"/>
+      <w:bookmarkEnd w:id="11"/>
     </w:p>
     <w:p>
       <w:pPr>
@@ -9016,11 +10033,11 @@
         <w:pStyle w:val="Heading2"/>
         <w:ind w:left="360" w:hanging="360"/>
       </w:pPr>
-      <w:bookmarkStart w:id="13" w:name="_Toc234493087"/>
+      <w:bookmarkStart w:id="12" w:name="_Toc234493087"/>
       <w:r>
         <w:t>Data Flow Diagram (DFD)</w:t>
       </w:r>
-      <w:bookmarkEnd w:id="13"/>
+      <w:bookmarkEnd w:id="12"/>
     </w:p>
     <w:p>
       <w:pPr>
@@ -9034,9 +10051,9 @@
           <w:lang w:val="en-US"/>
         </w:rPr>
         <w:drawing>
-          <wp:inline distT="0" distB="0" distL="0" distR="0" wp14:anchorId="497F33C4" wp14:editId="3E2E4C94">
-            <wp:extent cx="5274310" cy="2467610"/>
-            <wp:effectExtent l="0" t="0" r="2540" b="8890"/>
+          <wp:inline distT="0" distB="0" distL="0" distR="0" wp14:anchorId="497F33C4" wp14:editId="76476D4A">
+            <wp:extent cx="5613400" cy="2372098"/>
+            <wp:effectExtent l="0" t="0" r="6350" b="9525"/>
             <wp:docPr id="6" name="Picture 6"/>
             <wp:cNvGraphicFramePr>
               <a:graphicFrameLocks xmlns:a="http://schemas.openxmlformats.org/drawingml/2006/main" noChangeAspect="1"/>
@@ -9063,7 +10080,7 @@
                   <pic:spPr>
                     <a:xfrm>
                       <a:off x="0" y="0"/>
-                      <a:ext cx="5274310" cy="2467610"/>
+                      <a:ext cx="5621707" cy="2375609"/>
                     </a:xfrm>
                     <a:prstGeom prst="rect">
                       <a:avLst/>
@@ -9084,7 +10101,7 @@
           <w:szCs w:val="24"/>
         </w:rPr>
       </w:pPr>
-      <w:bookmarkStart w:id="14" w:name="_Toc234515401"/>
+      <w:bookmarkStart w:id="13" w:name="_Toc234515401"/>
       <w:r>
         <w:rPr>
           <w:sz w:val="24"/>
@@ -9183,7 +10200,7 @@
         </w:rPr>
         <w:t xml:space="preserve"> of Rock, Paper, Scissor</w:t>
       </w:r>
-      <w:bookmarkEnd w:id="14"/>
+      <w:bookmarkEnd w:id="13"/>
     </w:p>
     <w:p>
       <w:pPr>
@@ -9209,9 +10226,9 @@
           <w:lang w:val="en-US"/>
         </w:rPr>
         <w:drawing>
-          <wp:inline distT="0" distB="0" distL="0" distR="0" wp14:anchorId="7442E6B5" wp14:editId="4CC4426B">
-            <wp:extent cx="5274310" cy="3850005"/>
-            <wp:effectExtent l="0" t="0" r="2540" b="0"/>
+          <wp:inline distT="0" distB="0" distL="0" distR="0" wp14:anchorId="7442E6B5" wp14:editId="5EB21A7A">
+            <wp:extent cx="5899238" cy="3743960"/>
+            <wp:effectExtent l="0" t="0" r="6350" b="8890"/>
             <wp:docPr id="1" name="Picture 1"/>
             <wp:cNvGraphicFramePr>
               <a:graphicFrameLocks xmlns:a="http://schemas.openxmlformats.org/drawingml/2006/main" noChangeAspect="1"/>
@@ -9220,11 +10237,11 @@
               <a:graphicData uri="http://schemas.openxmlformats.org/drawingml/2006/picture">
                 <pic:pic xmlns:pic="http://schemas.openxmlformats.org/drawingml/2006/picture">
                   <pic:nvPicPr>
-                    <pic:cNvPr id="1" name="WhatsApp Image 2026-07-08 at 10.07.58 PM.jpeg"/>
+                    <pic:cNvPr id="1" name="Picture 1"/>
                     <pic:cNvPicPr/>
                   </pic:nvPicPr>
                   <pic:blipFill>
-                    <a:blip r:embed="rId14">
+                    <a:blip r:embed="rId14" cstate="print">
                       <a:extLst>
                         <a:ext uri="{28A0092B-C50C-407E-A947-70E740481C1C}">
                           <a14:useLocalDpi xmlns:a14="http://schemas.microsoft.com/office/drawing/2010/main" val="0"/>
@@ -9238,7 +10255,7 @@
                   <pic:spPr>
                     <a:xfrm>
                       <a:off x="0" y="0"/>
-                      <a:ext cx="5274310" cy="3850005"/>
+                      <a:ext cx="5924836" cy="3760206"/>
                     </a:xfrm>
                     <a:prstGeom prst="rect">
                       <a:avLst/>
@@ -9259,7 +10276,7 @@
           <w:szCs w:val="24"/>
         </w:rPr>
       </w:pPr>
-      <w:bookmarkStart w:id="15" w:name="_Toc234515402"/>
+      <w:bookmarkStart w:id="14" w:name="_Toc234515402"/>
       <w:r>
         <w:rPr>
           <w:sz w:val="24"/>
@@ -9358,19 +10375,19 @@
         </w:rPr>
         <w:t xml:space="preserve"> of Rock, Paper, Scissor</w:t>
       </w:r>
-      <w:bookmarkEnd w:id="15"/>
+      <w:bookmarkEnd w:id="14"/>
     </w:p>
     <w:p>
       <w:pPr>
         <w:pStyle w:val="Heading2"/>
         <w:ind w:left="360" w:hanging="360"/>
       </w:pPr>
-      <w:bookmarkStart w:id="16" w:name="_Toc234493088"/>
+      <w:bookmarkStart w:id="15" w:name="_Toc234493088"/>
       <w:r>
         <w:lastRenderedPageBreak/>
         <w:t>Flowchart</w:t>
       </w:r>
-      <w:bookmarkEnd w:id="16"/>
+      <w:bookmarkEnd w:id="15"/>
     </w:p>
     <w:p>
       <w:pPr>
@@ -9434,7 +10451,7 @@
           <w:szCs w:val="24"/>
         </w:rPr>
       </w:pPr>
-      <w:bookmarkStart w:id="17" w:name="_Toc234515403"/>
+      <w:bookmarkStart w:id="16" w:name="_Toc234515403"/>
       <w:r>
         <w:rPr>
           <w:sz w:val="24"/>
@@ -9549,7 +10566,7 @@
         </w:rPr>
         <w:t xml:space="preserve"> for main menu, login and registration</w:t>
       </w:r>
-      <w:bookmarkEnd w:id="17"/>
+      <w:bookmarkEnd w:id="16"/>
     </w:p>
     <w:p>
       <w:pPr>
@@ -9623,7 +10640,7 @@
       <w:pPr>
         <w:pStyle w:val="Caption"/>
       </w:pPr>
-      <w:bookmarkStart w:id="18" w:name="_Toc234515404"/>
+      <w:bookmarkStart w:id="17" w:name="_Toc234515404"/>
       <w:r>
         <w:t xml:space="preserve">Figure </w:t>
       </w:r>
@@ -9672,7 +10689,7 @@
       <w:r>
         <w:t xml:space="preserve"> Flowchart for Dashboard</w:t>
       </w:r>
-      <w:bookmarkEnd w:id="18"/>
+      <w:bookmarkEnd w:id="17"/>
     </w:p>
     <w:p>
       <w:pPr>
@@ -9751,7 +10768,7 @@
           <w:szCs w:val="24"/>
         </w:rPr>
       </w:pPr>
-      <w:bookmarkStart w:id="19" w:name="_Toc234515405"/>
+      <w:bookmarkStart w:id="18" w:name="_Toc234515405"/>
       <w:r>
         <w:rPr>
           <w:sz w:val="24"/>
@@ -9845,7 +10862,7 @@
         </w:rPr>
         <w:t xml:space="preserve"> : Single Player Gameplay</w:t>
       </w:r>
-      <w:bookmarkEnd w:id="19"/>
+      <w:bookmarkEnd w:id="18"/>
     </w:p>
     <w:p>
       <w:pPr>
@@ -9962,7 +10979,7 @@
           <w:szCs w:val="24"/>
         </w:rPr>
       </w:pPr>
-      <w:bookmarkStart w:id="20" w:name="_Toc234515406"/>
+      <w:bookmarkStart w:id="19" w:name="_Toc234515406"/>
       <w:r>
         <w:rPr>
           <w:sz w:val="24"/>
@@ -10056,7 +11073,7 @@
         </w:rPr>
         <w:t xml:space="preserve"> : Multiplayer Gameplay Flowchart</w:t>
       </w:r>
-      <w:bookmarkEnd w:id="20"/>
+      <w:bookmarkEnd w:id="19"/>
     </w:p>
     <w:p>
       <w:pPr>
@@ -10157,7 +11174,7 @@
           <w:szCs w:val="24"/>
         </w:rPr>
       </w:pPr>
-      <w:bookmarkStart w:id="21" w:name="_Toc234515407"/>
+      <w:bookmarkStart w:id="20" w:name="_Toc234515407"/>
       <w:r>
         <w:rPr>
           <w:sz w:val="24"/>
@@ -10251,7 +11268,7 @@
         </w:rPr>
         <w:t xml:space="preserve"> : Flowchart for History, Leader board and Delete</w:t>
       </w:r>
-      <w:bookmarkEnd w:id="21"/>
+      <w:bookmarkEnd w:id="20"/>
     </w:p>
     <w:p>
       <w:pPr>
@@ -10287,11 +11304,11 @@
         <w:lastRenderedPageBreak/>
         <w:t xml:space="preserve"> </w:t>
       </w:r>
-      <w:bookmarkStart w:id="22" w:name="_Toc234493089"/>
+      <w:bookmarkStart w:id="21" w:name="_Toc234493089"/>
       <w:r>
         <w:t>Use Case Diagram</w:t>
       </w:r>
-      <w:bookmarkEnd w:id="22"/>
+      <w:bookmarkEnd w:id="21"/>
     </w:p>
     <w:p>
       <w:pPr>
@@ -10358,7 +11375,7 @@
           <w:szCs w:val="24"/>
         </w:rPr>
       </w:pPr>
-      <w:bookmarkStart w:id="23" w:name="_Toc234515408"/>
+      <w:bookmarkStart w:id="22" w:name="_Toc234515408"/>
       <w:r>
         <w:rPr>
           <w:sz w:val="24"/>
@@ -10452,7 +11469,7 @@
         </w:rPr>
         <w:t xml:space="preserve"> : Use Case diagram</w:t>
       </w:r>
-      <w:bookmarkEnd w:id="23"/>
+      <w:bookmarkEnd w:id="22"/>
     </w:p>
     <w:p>
       <w:pPr>
@@ -10497,12 +11514,12 @@
       <w:pPr>
         <w:pStyle w:val="Heading1"/>
       </w:pPr>
-      <w:bookmarkStart w:id="24" w:name="_Toc234493090"/>
+      <w:bookmarkStart w:id="23" w:name="_Toc234493090"/>
       <w:r>
         <w:lastRenderedPageBreak/>
         <w:t>Development</w:t>
       </w:r>
-      <w:bookmarkEnd w:id="24"/>
+      <w:bookmarkEnd w:id="23"/>
     </w:p>
     <w:p>
       <w:pPr>
@@ -10513,11 +11530,11 @@
       <w:r>
         <w:t xml:space="preserve"> </w:t>
       </w:r>
-      <w:bookmarkStart w:id="25" w:name="_Toc234493091"/>
+      <w:bookmarkStart w:id="24" w:name="_Toc234493091"/>
       <w:r>
         <w:t>Waterfall Model</w:t>
       </w:r>
-      <w:bookmarkEnd w:id="25"/>
+      <w:bookmarkEnd w:id="24"/>
     </w:p>
     <w:p>
       <w:pPr>
@@ -10874,7 +11891,7 @@
           <w:szCs w:val="24"/>
         </w:rPr>
       </w:pPr>
-      <w:bookmarkStart w:id="26" w:name="_Toc234515409"/>
+      <w:bookmarkStart w:id="25" w:name="_Toc234515409"/>
       <w:r>
         <w:rPr>
           <w:sz w:val="24"/>
@@ -10968,7 +11985,7 @@
         </w:rPr>
         <w:t xml:space="preserve"> : Waterfall Model</w:t>
       </w:r>
-      <w:bookmarkEnd w:id="26"/>
+      <w:bookmarkEnd w:id="25"/>
     </w:p>
     <w:p>
       <w:pPr>
@@ -11332,11 +12349,11 @@
         <w:lastRenderedPageBreak/>
         <w:t xml:space="preserve"> </w:t>
       </w:r>
-      <w:bookmarkStart w:id="27" w:name="_Toc234493092"/>
+      <w:bookmarkStart w:id="26" w:name="_Toc234493092"/>
       <w:r>
         <w:t>Gantt Chart</w:t>
       </w:r>
-      <w:bookmarkEnd w:id="27"/>
+      <w:bookmarkEnd w:id="26"/>
     </w:p>
     <w:p>
       <w:pPr>
@@ -11414,7 +12431,7 @@
           <w:szCs w:val="24"/>
         </w:rPr>
       </w:pPr>
-      <w:bookmarkStart w:id="28" w:name="_Toc234515410"/>
+      <w:bookmarkStart w:id="27" w:name="_Toc234515410"/>
       <w:r>
         <w:rPr>
           <w:sz w:val="24"/>
@@ -11508,7 +12525,7 @@
         </w:rPr>
         <w:t xml:space="preserve"> : Gantt Chart</w:t>
       </w:r>
-      <w:bookmarkEnd w:id="28"/>
+      <w:bookmarkEnd w:id="27"/>
     </w:p>
     <w:p>
       <w:pPr>
@@ -11520,7 +12537,7 @@
       <w:r>
         <w:br w:type="page"/>
       </w:r>
-      <w:bookmarkStart w:id="29" w:name="_Toc234493093"/>
+      <w:bookmarkStart w:id="28" w:name="_Toc234493093"/>
       <w:proofErr w:type="gramStart"/>
       <w:r>
         <w:lastRenderedPageBreak/>
@@ -11529,7 +12546,7 @@
       <w:r>
         <w:t>Testing</w:t>
       </w:r>
-      <w:bookmarkEnd w:id="29"/>
+      <w:bookmarkEnd w:id="28"/>
       <w:proofErr w:type="gramEnd"/>
     </w:p>
     <w:p>
@@ -11802,12 +12819,12 @@
         <w:spacing w:line="360" w:lineRule="auto"/>
         <w:ind w:left="360" w:hanging="396"/>
       </w:pPr>
-      <w:bookmarkStart w:id="30" w:name="_Toc234493094"/>
+      <w:bookmarkStart w:id="29" w:name="_Toc234493094"/>
       <w:r>
         <w:lastRenderedPageBreak/>
         <w:t>Test Case 1 (User Registration)</w:t>
       </w:r>
-      <w:bookmarkEnd w:id="30"/>
+      <w:bookmarkEnd w:id="29"/>
     </w:p>
     <w:tbl>
       <w:tblPr>
@@ -12154,11 +13171,11 @@
         <w:spacing w:line="360" w:lineRule="auto"/>
         <w:ind w:left="360" w:hanging="360"/>
       </w:pPr>
-      <w:bookmarkStart w:id="31" w:name="_Toc234493095"/>
+      <w:bookmarkStart w:id="30" w:name="_Toc234493095"/>
       <w:r>
         <w:t>Test Case 2 (User Login)</w:t>
       </w:r>
-      <w:bookmarkEnd w:id="31"/>
+      <w:bookmarkEnd w:id="30"/>
     </w:p>
     <w:tbl>
       <w:tblPr>
@@ -12502,11 +13519,11 @@
           <w:lang w:val="en-US"/>
         </w:rPr>
       </w:pPr>
-      <w:bookmarkStart w:id="32" w:name="_Toc234493096"/>
+      <w:bookmarkStart w:id="31" w:name="_Toc234493096"/>
       <w:r>
         <w:t>Test Case 3 (Single Player Gameplay)</w:t>
       </w:r>
-      <w:bookmarkEnd w:id="32"/>
+      <w:bookmarkEnd w:id="31"/>
     </w:p>
     <w:tbl>
       <w:tblPr>
@@ -12867,14 +13884,14 @@
           <w:lang w:val="en-US"/>
         </w:rPr>
       </w:pPr>
-      <w:bookmarkStart w:id="33" w:name="_Toc234493097"/>
+      <w:bookmarkStart w:id="32" w:name="_Toc234493097"/>
       <w:r>
         <w:rPr>
           <w:lang w:val="en-US"/>
         </w:rPr>
         <w:t>Test Case 4 (Multiplayer Gameplay)</w:t>
       </w:r>
-      <w:bookmarkEnd w:id="33"/>
+      <w:bookmarkEnd w:id="32"/>
     </w:p>
     <w:tbl>
       <w:tblPr>
@@ -13211,14 +14228,14 @@
           <w:lang w:val="en-US"/>
         </w:rPr>
       </w:pPr>
-      <w:bookmarkStart w:id="34" w:name="_Toc234493098"/>
+      <w:bookmarkStart w:id="33" w:name="_Toc234493098"/>
       <w:r>
         <w:rPr>
           <w:lang w:val="en-US"/>
         </w:rPr>
         <w:t>Test Case 5 (Leaderboard)</w:t>
       </w:r>
-      <w:bookmarkEnd w:id="34"/>
+      <w:bookmarkEnd w:id="33"/>
     </w:p>
     <w:tbl>
       <w:tblPr>
@@ -13559,11 +14576,11 @@
           <w:lang w:val="en-US"/>
         </w:rPr>
       </w:pPr>
-      <w:bookmarkStart w:id="35" w:name="_Toc234493099"/>
+      <w:bookmarkStart w:id="34" w:name="_Toc234493099"/>
       <w:r>
         <w:t>Requirement Traceability Matrix (RTM)</w:t>
       </w:r>
-      <w:bookmarkEnd w:id="35"/>
+      <w:bookmarkEnd w:id="34"/>
     </w:p>
     <w:tbl>
       <w:tblPr>
@@ -14747,12 +15764,12 @@
         <w:pStyle w:val="Heading2"/>
         <w:ind w:left="360" w:hanging="360"/>
       </w:pPr>
-      <w:bookmarkStart w:id="36" w:name="_Toc234493100"/>
+      <w:bookmarkStart w:id="35" w:name="_Toc234493100"/>
       <w:r>
         <w:lastRenderedPageBreak/>
         <w:t>User Acceptance Testing (UAT)</w:t>
       </w:r>
-      <w:bookmarkEnd w:id="36"/>
+      <w:bookmarkEnd w:id="35"/>
     </w:p>
     <w:tbl>
       <w:tblPr>
@@ -16166,7 +17183,7 @@
       <w:r>
         <w:br w:type="page"/>
       </w:r>
-      <w:bookmarkStart w:id="37" w:name="_Toc234493101"/>
+      <w:bookmarkStart w:id="36" w:name="_Toc234493101"/>
       <w:r>
         <w:lastRenderedPageBreak/>
         <w:t>.</w:t>
@@ -16174,7 +17191,7 @@
       <w:r>
         <w:t>Project Results</w:t>
       </w:r>
-      <w:bookmarkEnd w:id="37"/>
+      <w:bookmarkEnd w:id="36"/>
     </w:p>
     <w:p>
       <w:pPr>
@@ -16541,7 +17558,7 @@
         <w:ind w:left="360" w:hanging="360"/>
         <w:jc w:val="both"/>
       </w:pPr>
-      <w:bookmarkStart w:id="38" w:name="_Toc234493102"/>
+      <w:bookmarkStart w:id="37" w:name="_Toc234493102"/>
       <w:r>
         <w:lastRenderedPageBreak/>
         <w:t>.</w:t>
@@ -16549,7 +17566,7 @@
       <w:r>
         <w:t>Future Enhancements</w:t>
       </w:r>
-      <w:bookmarkEnd w:id="38"/>
+      <w:bookmarkEnd w:id="37"/>
     </w:p>
     <w:p>
       <w:pPr>
@@ -16874,15 +17891,13 @@
         <w:ind w:left="360" w:hanging="360"/>
         <w:jc w:val="both"/>
       </w:pPr>
-      <w:proofErr w:type="gramStart"/>
       <w:r>
         <w:lastRenderedPageBreak/>
         <w:t>.</w:t>
       </w:r>
       <w:r>
-        <w:t>Conclusion</w:t>
-      </w:r>
-      <w:proofErr w:type="gramEnd"/>
+        <w:t xml:space="preserve"> Conclusion</w:t>
+      </w:r>
     </w:p>
     <w:p>
       <w:pPr>
@@ -17004,7 +18019,7 @@
         <w:spacing w:line="360" w:lineRule="auto"/>
         <w:ind w:left="360" w:hanging="360"/>
       </w:pPr>
-      <w:bookmarkStart w:id="39" w:name="_Toc234493104"/>
+      <w:bookmarkStart w:id="38" w:name="_Toc234493104"/>
       <w:r>
         <w:lastRenderedPageBreak/>
         <w:t>.</w:t>
@@ -17012,7 +18027,7 @@
       <w:r>
         <w:t>References</w:t>
       </w:r>
-      <w:bookmarkEnd w:id="39"/>
+      <w:bookmarkEnd w:id="38"/>
     </w:p>
     <w:p>
       <w:pPr>
@@ -17408,7 +18423,7 @@
           <w:lang w:val="en-US"/>
         </w:rPr>
       </w:pPr>
-      <w:bookmarkStart w:id="40" w:name="_Toc234493105"/>
+      <w:bookmarkStart w:id="39" w:name="_Toc234493105"/>
       <w:r>
         <w:rPr>
           <w:rFonts w:eastAsia="Times New Roman"/>
@@ -17431,7 +18446,7 @@
         </w:rPr>
         <w:t>Annexures</w:t>
       </w:r>
-      <w:bookmarkEnd w:id="40"/>
+      <w:bookmarkEnd w:id="39"/>
     </w:p>
     <w:p>
       <w:pPr>
@@ -17495,7 +18510,7 @@
           <w:szCs w:val="24"/>
         </w:rPr>
       </w:pPr>
-      <w:bookmarkStart w:id="41" w:name="_Toc234515411"/>
+      <w:bookmarkStart w:id="40" w:name="_Toc234515411"/>
       <w:r>
         <w:rPr>
           <w:sz w:val="24"/>
@@ -17589,7 +18604,7 @@
         </w:rPr>
         <w:t xml:space="preserve"> : Main Menu</w:t>
       </w:r>
-      <w:bookmarkEnd w:id="41"/>
+      <w:bookmarkEnd w:id="40"/>
     </w:p>
     <w:p>
       <w:pPr>
@@ -17653,7 +18668,7 @@
           <w:szCs w:val="24"/>
         </w:rPr>
       </w:pPr>
-      <w:bookmarkStart w:id="42" w:name="_Toc234515412"/>
+      <w:bookmarkStart w:id="41" w:name="_Toc234515412"/>
       <w:r>
         <w:rPr>
           <w:sz w:val="24"/>
@@ -17747,7 +18762,7 @@
         </w:rPr>
         <w:t xml:space="preserve"> : User Registration</w:t>
       </w:r>
-      <w:bookmarkEnd w:id="42"/>
+      <w:bookmarkEnd w:id="41"/>
     </w:p>
     <w:p>
       <w:pPr>
@@ -17818,7 +18833,7 @@
           <w:szCs w:val="24"/>
         </w:rPr>
       </w:pPr>
-      <w:bookmarkStart w:id="43" w:name="_Toc234515413"/>
+      <w:bookmarkStart w:id="42" w:name="_Toc234515413"/>
       <w:r>
         <w:rPr>
           <w:sz w:val="24"/>
@@ -17912,7 +18927,7 @@
         </w:rPr>
         <w:t xml:space="preserve"> : User Login</w:t>
       </w:r>
-      <w:bookmarkEnd w:id="43"/>
+      <w:bookmarkEnd w:id="42"/>
     </w:p>
     <w:p>
       <w:pPr>
@@ -17987,7 +19002,7 @@
           <w:szCs w:val="24"/>
         </w:rPr>
       </w:pPr>
-      <w:bookmarkStart w:id="44" w:name="_Toc234515414"/>
+      <w:bookmarkStart w:id="43" w:name="_Toc234515414"/>
       <w:r>
         <w:rPr>
           <w:sz w:val="24"/>
@@ -18081,7 +19096,7 @@
         </w:rPr>
         <w:t xml:space="preserve"> : Game Dashboard</w:t>
       </w:r>
-      <w:bookmarkEnd w:id="44"/>
+      <w:bookmarkEnd w:id="43"/>
     </w:p>
     <w:p>
       <w:pPr>
@@ -18152,7 +19167,7 @@
           <w:szCs w:val="24"/>
         </w:rPr>
       </w:pPr>
-      <w:bookmarkStart w:id="45" w:name="_Toc234515415"/>
+      <w:bookmarkStart w:id="44" w:name="_Toc234515415"/>
       <w:r>
         <w:rPr>
           <w:sz w:val="24"/>
@@ -18246,7 +19261,7 @@
         </w:rPr>
         <w:t xml:space="preserve"> :  Single player Gameplay</w:t>
       </w:r>
-      <w:bookmarkEnd w:id="45"/>
+      <w:bookmarkEnd w:id="44"/>
     </w:p>
     <w:p>
       <w:pPr>
@@ -18319,7 +19334,7 @@
           <w:szCs w:val="24"/>
         </w:rPr>
       </w:pPr>
-      <w:bookmarkStart w:id="46" w:name="_Toc234515416"/>
+      <w:bookmarkStart w:id="45" w:name="_Toc234515416"/>
       <w:r>
         <w:rPr>
           <w:sz w:val="24"/>
@@ -18413,7 +19428,7 @@
         </w:rPr>
         <w:t xml:space="preserve"> : Profile Menu</w:t>
       </w:r>
-      <w:bookmarkEnd w:id="46"/>
+      <w:bookmarkEnd w:id="45"/>
     </w:p>
     <w:p>
       <w:pPr>
@@ -18485,7 +19500,7 @@
           <w:szCs w:val="24"/>
         </w:rPr>
       </w:pPr>
-      <w:bookmarkStart w:id="47" w:name="_Toc234515417"/>
+      <w:bookmarkStart w:id="46" w:name="_Toc234515417"/>
       <w:r>
         <w:rPr>
           <w:sz w:val="24"/>
@@ -18579,7 +19594,7 @@
         </w:rPr>
         <w:t xml:space="preserve"> : Leader board</w:t>
       </w:r>
-      <w:bookmarkEnd w:id="47"/>
+      <w:bookmarkEnd w:id="46"/>
     </w:p>
     <w:p>
       <w:pPr>
@@ -18651,7 +19666,7 @@
           <w:szCs w:val="24"/>
         </w:rPr>
       </w:pPr>
-      <w:bookmarkStart w:id="48" w:name="_Toc234515418"/>
+      <w:bookmarkStart w:id="47" w:name="_Toc234515418"/>
       <w:r>
         <w:rPr>
           <w:sz w:val="24"/>
@@ -18745,7 +19760,7 @@
         </w:rPr>
         <w:t xml:space="preserve"> : View History</w:t>
       </w:r>
-      <w:bookmarkEnd w:id="48"/>
+      <w:bookmarkEnd w:id="47"/>
     </w:p>
     <w:p>
       <w:pPr>
@@ -22784,7 +23799,6 @@
   <w:style w:type="character" w:default="1" w:styleId="DefaultParagraphFont">
     <w:name w:val="Default Paragraph Font"/>
     <w:uiPriority w:val="1"/>
-    <w:semiHidden/>
     <w:unhideWhenUsed/>
   </w:style>
   <w:style w:type="table" w:default="1" w:styleId="TableNormal">
@@ -23524,7 +24538,6 @@
     <w:rsid w:val="002055E2"/>
     <w:rsid w:val="00273C3B"/>
     <w:rsid w:val="002F0AE4"/>
-    <w:rsid w:val="00314D4C"/>
     <w:rsid w:val="003212F4"/>
     <w:rsid w:val="0035202E"/>
     <w:rsid w:val="00365669"/>
@@ -23572,6 +24585,7 @@
     <w:rsid w:val="00DA309B"/>
     <w:rsid w:val="00DD3B45"/>
     <w:rsid w:val="00DF390D"/>
+    <w:rsid w:val="00E540E3"/>
     <w:rsid w:val="00E64B65"/>
     <w:rsid w:val="00E7419B"/>
     <w:rsid w:val="00ED5739"/>

</xml_diff>

<commit_message>
added ppt and updated document diagrams
</commit_message>
<xml_diff>
--- a/final project report.docx
+++ b/final project report.docx
@@ -1,6 +1,6 @@
 
 <file path=word/document.xml><?xml version="1.0" encoding="utf-8"?>
-<w:document xmlns:wpc="http://schemas.microsoft.com/office/word/2010/wordprocessingCanvas" xmlns:mc="http://schemas.openxmlformats.org/markup-compatibility/2006" xmlns:o="urn:schemas-microsoft-com:office:office" xmlns:r="http://schemas.openxmlformats.org/officeDocument/2006/relationships" xmlns:m="http://schemas.openxmlformats.org/officeDocument/2006/math" xmlns:v="urn:schemas-microsoft-com:vml" xmlns:wp14="http://schemas.microsoft.com/office/word/2010/wordprocessingDrawing" xmlns:wp="http://schemas.openxmlformats.org/drawingml/2006/wordprocessingDrawing" xmlns:w10="urn:schemas-microsoft-com:office:word" xmlns:w="http://schemas.openxmlformats.org/wordprocessingml/2006/main" xmlns:w14="http://schemas.microsoft.com/office/word/2010/wordml" xmlns:w15="http://schemas.microsoft.com/office/word/2012/wordml" xmlns:wpg="http://schemas.microsoft.com/office/word/2010/wordprocessingGroup" xmlns:wpi="http://schemas.microsoft.com/office/word/2010/wordprocessingInk" xmlns:wne="http://schemas.microsoft.com/office/word/2006/wordml" xmlns:wps="http://schemas.microsoft.com/office/word/2010/wordprocessingShape" mc:Ignorable="w14 w15 wp14">
+<w:document xmlns:wpc="http://schemas.microsoft.com/office/word/2010/wordprocessingCanvas" xmlns:cx="http://schemas.microsoft.com/office/drawing/2014/chartex" xmlns:cx1="http://schemas.microsoft.com/office/drawing/2015/9/8/chartex" xmlns:cx2="http://schemas.microsoft.com/office/drawing/2015/10/21/chartex" xmlns:cx3="http://schemas.microsoft.com/office/drawing/2016/5/9/chartex" xmlns:cx4="http://schemas.microsoft.com/office/drawing/2016/5/10/chartex" xmlns:cx5="http://schemas.microsoft.com/office/drawing/2016/5/11/chartex" xmlns:cx6="http://schemas.microsoft.com/office/drawing/2016/5/12/chartex" xmlns:cx7="http://schemas.microsoft.com/office/drawing/2016/5/13/chartex" xmlns:cx8="http://schemas.microsoft.com/office/drawing/2016/5/14/chartex" xmlns:mc="http://schemas.openxmlformats.org/markup-compatibility/2006" xmlns:aink="http://schemas.microsoft.com/office/drawing/2016/ink" xmlns:am3d="http://schemas.microsoft.com/office/drawing/2017/model3d" xmlns:o="urn:schemas-microsoft-com:office:office" xmlns:oel="http://schemas.microsoft.com/office/2019/extlst" xmlns:r="http://schemas.openxmlformats.org/officeDocument/2006/relationships" xmlns:m="http://schemas.openxmlformats.org/officeDocument/2006/math" xmlns:v="urn:schemas-microsoft-com:vml" xmlns:wp14="http://schemas.microsoft.com/office/word/2010/wordprocessingDrawing" xmlns:wp="http://schemas.openxmlformats.org/drawingml/2006/wordprocessingDrawing" xmlns:w10="urn:schemas-microsoft-com:office:word" xmlns:w="http://schemas.openxmlformats.org/wordprocessingml/2006/main" xmlns:w14="http://schemas.microsoft.com/office/word/2010/wordml" xmlns:w15="http://schemas.microsoft.com/office/word/2012/wordml" xmlns:w16cex="http://schemas.microsoft.com/office/word/2018/wordml/cex" xmlns:w16cid="http://schemas.microsoft.com/office/word/2016/wordml/cid" xmlns:w16="http://schemas.microsoft.com/office/word/2018/wordml" xmlns:w16du="http://schemas.microsoft.com/office/word/2023/wordml/word16du" xmlns:w16sdtdh="http://schemas.microsoft.com/office/word/2020/wordml/sdtdatahash" xmlns:w16sdtfl="http://schemas.microsoft.com/office/word/2024/wordml/sdtformatlock" xmlns:w16se="http://schemas.microsoft.com/office/word/2015/wordml/symex" xmlns:wpg="http://schemas.microsoft.com/office/word/2010/wordprocessingGroup" xmlns:wpi="http://schemas.microsoft.com/office/word/2010/wordprocessingInk" xmlns:wne="http://schemas.microsoft.com/office/word/2006/wordml" xmlns:wps="http://schemas.microsoft.com/office/word/2010/wordprocessingShape" mc:Ignorable="w14 w15 w16se w16cid w16 w16cex w16sdtdh w16sdtfl w16du wp14">
   <w:body>
     <w:p>
       <w:pPr>
@@ -379,7 +379,7 @@
               </wp:inline>
             </w:drawing>
           </mc:Choice>
-          <mc:Fallback xmlns:w16se="http://schemas.microsoft.com/office/word/2015/wordml/symex" xmlns:w16sdtfl="http://schemas.microsoft.com/office/word/2024/wordml/sdtformatlock" xmlns:w16sdtdh="http://schemas.microsoft.com/office/word/2020/wordml/sdtdatahash" xmlns:w16du="http://schemas.microsoft.com/office/word/2023/wordml/word16du" xmlns:w16="http://schemas.microsoft.com/office/word/2018/wordml" xmlns:w16cid="http://schemas.microsoft.com/office/word/2016/wordml/cid" xmlns:w16cex="http://schemas.microsoft.com/office/word/2018/wordml/cex" xmlns:oel="http://schemas.microsoft.com/office/2019/extlst" xmlns:am3d="http://schemas.microsoft.com/office/drawing/2017/model3d" xmlns:aink="http://schemas.microsoft.com/office/drawing/2016/ink" xmlns:cx8="http://schemas.microsoft.com/office/drawing/2016/5/14/chartex" xmlns:cx7="http://schemas.microsoft.com/office/drawing/2016/5/13/chartex" xmlns:cx6="http://schemas.microsoft.com/office/drawing/2016/5/12/chartex" xmlns:cx5="http://schemas.microsoft.com/office/drawing/2016/5/11/chartex" xmlns:cx4="http://schemas.microsoft.com/office/drawing/2016/5/10/chartex" xmlns:cx3="http://schemas.microsoft.com/office/drawing/2016/5/9/chartex" xmlns:cx2="http://schemas.microsoft.com/office/drawing/2015/10/21/chartex" xmlns:cx1="http://schemas.microsoft.com/office/drawing/2015/9/8/chartex" xmlns:cx="http://schemas.microsoft.com/office/drawing/2014/chartex">
+          <mc:Fallback>
             <w:pict>
               <v:group w14:anchorId="5F28FB87" id="Group 5" o:spid="_x0000_s1026" style="width:43.55pt;height:123.05pt;mso-position-horizontal-relative:char;mso-position-vertical-relative:line" coordsize="6762,16097" o:gfxdata="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">
                 <v:line id="Straight Connector 2" o:spid="_x0000_s1027" style="position:absolute;visibility:visible;mso-wrap-style:square" from="3333,0" to="3333,16097" o:connectortype="straight" o:gfxdata="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" strokecolor="black [3200]" strokeweight="2.5pt">
@@ -858,19 +858,8 @@
           <w:bCs/>
           <w:szCs w:val="24"/>
         </w:rPr>
-        <w:t>Date</w:t>
-      </w:r>
-      <w:proofErr w:type="gramStart"/>
-      <w:r>
-        <w:rPr>
-          <w:rFonts w:cs="Times New Roman"/>
-          <w:b/>
-          <w:bCs/>
-          <w:szCs w:val="24"/>
-        </w:rPr>
-        <w:t>:</w:t>
-      </w:r>
-      <w:proofErr w:type="gramEnd"/>
+        <w:t>Date:</w:t>
+      </w:r>
       <w:r>
         <w:rPr>
           <w:rFonts w:cs="Times New Roman"/>
@@ -906,17 +895,7 @@
           <w:noProof/>
           <w:szCs w:val="24"/>
         </w:rPr>
-        <w:t>12</w:t>
-      </w:r>
-      <w:r>
-        <w:rPr>
-          <w:rFonts w:cs="Times New Roman"/>
-          <w:b/>
-          <w:bCs/>
-          <w:noProof/>
-          <w:szCs w:val="24"/>
-        </w:rPr>
-        <w:t>/07/2026</w:t>
+        <w:t>10/07/2026</w:t>
       </w:r>
       <w:r>
         <w:rPr>
@@ -1117,6 +1096,7 @@
           <w:sz w:val="32"/>
           <w:szCs w:val="32"/>
         </w:rPr>
+        <w:lastRenderedPageBreak/>
         <w:t>Student</w:t>
       </w:r>
       <w:r>
@@ -1461,6 +1441,7 @@
           <w:sz w:val="32"/>
           <w:szCs w:val="32"/>
         </w:rPr>
+        <w:lastRenderedPageBreak/>
         <w:t>Supervisor Acceptance</w:t>
       </w:r>
     </w:p>
@@ -1611,6 +1592,7 @@
           <w:sz w:val="32"/>
           <w:szCs w:val="24"/>
         </w:rPr>
+        <w:lastRenderedPageBreak/>
         <w:t>Letter of Approval</w:t>
       </w:r>
     </w:p>
@@ -1897,33 +1879,8 @@
                 <w:rFonts w:cs="Times New Roman"/>
                 <w:szCs w:val="24"/>
               </w:rPr>
-              <w:t xml:space="preserve">Er. </w:t>
-            </w:r>
-            <w:proofErr w:type="spellStart"/>
-            <w:r>
-              <w:rPr>
-                <w:rFonts w:cs="Times New Roman"/>
-                <w:szCs w:val="24"/>
-              </w:rPr>
-              <w:t>Dikshan</w:t>
-            </w:r>
-            <w:proofErr w:type="spellEnd"/>
-            <w:r>
-              <w:rPr>
-                <w:rFonts w:cs="Times New Roman"/>
-                <w:szCs w:val="24"/>
-              </w:rPr>
-              <w:t xml:space="preserve"> </w:t>
-            </w:r>
-            <w:proofErr w:type="spellStart"/>
-            <w:r>
-              <w:rPr>
-                <w:rFonts w:cs="Times New Roman"/>
-                <w:szCs w:val="24"/>
-              </w:rPr>
-              <w:t>Gurung</w:t>
-            </w:r>
-            <w:proofErr w:type="spellEnd"/>
+              <w:t>Er. Dikshan Gurung</w:t>
+            </w:r>
           </w:p>
         </w:tc>
         <w:tc>
@@ -4679,6 +4636,7 @@
           <w:sz w:val="32"/>
           <w:szCs w:val="32"/>
         </w:rPr>
+        <w:lastRenderedPageBreak/>
         <w:t>List of Figures</w:t>
       </w:r>
     </w:p>
@@ -4688,12 +4646,13 @@
         <w:tabs>
           <w:tab w:val="right" w:leader="dot" w:pos="8296"/>
         </w:tabs>
-        <w:spacing w:line="360" w:lineRule="auto"/>
         <w:rPr>
           <w:rFonts w:asciiTheme="minorHAnsi" w:eastAsiaTheme="minorEastAsia" w:hAnsiTheme="minorHAnsi"/>
           <w:noProof/>
-          <w:sz w:val="22"/>
+          <w:kern w:val="2"/>
+          <w:szCs w:val="24"/>
           <w:lang w:val="en-US"/>
+          <w14:ligatures w14:val="standardContextual"/>
         </w:rPr>
       </w:pPr>
       <w:r>
@@ -4723,7 +4682,7 @@
         </w:rPr>
         <w:fldChar w:fldCharType="separate"/>
       </w:r>
-      <w:hyperlink w:anchor="_Toc234515401" w:history="1">
+      <w:hyperlink w:anchor="_Toc234601715" w:history="1">
         <w:r>
           <w:rPr>
             <w:rStyle w:val="Hyperlink"/>
@@ -4750,7 +4709,7 @@
             <w:noProof/>
             <w:webHidden/>
           </w:rPr>
-          <w:instrText xml:space="preserve"> PAGEREF _Toc234515401 \h </w:instrText>
+          <w:instrText xml:space="preserve"> PAGEREF _Toc234601715 \h </w:instrText>
         </w:r>
         <w:r>
           <w:rPr>
@@ -4787,15 +4746,16 @@
         <w:tabs>
           <w:tab w:val="right" w:leader="dot" w:pos="8296"/>
         </w:tabs>
-        <w:spacing w:line="360" w:lineRule="auto"/>
         <w:rPr>
           <w:rFonts w:asciiTheme="minorHAnsi" w:eastAsiaTheme="minorEastAsia" w:hAnsiTheme="minorHAnsi"/>
           <w:noProof/>
-          <w:sz w:val="22"/>
+          <w:kern w:val="2"/>
+          <w:szCs w:val="24"/>
           <w:lang w:val="en-US"/>
-        </w:rPr>
-      </w:pPr>
-      <w:hyperlink w:anchor="_Toc234515402" w:history="1">
+          <w14:ligatures w14:val="standardContextual"/>
+        </w:rPr>
+      </w:pPr>
+      <w:hyperlink w:anchor="_Toc234601716" w:history="1">
         <w:r>
           <w:rPr>
             <w:rStyle w:val="Hyperlink"/>
@@ -4822,7 +4782,7 @@
             <w:noProof/>
             <w:webHidden/>
           </w:rPr>
-          <w:instrText xml:space="preserve"> PAGEREF _Toc234515402 \h </w:instrText>
+          <w:instrText xml:space="preserve"> PAGEREF _Toc234601716 \h </w:instrText>
         </w:r>
         <w:r>
           <w:rPr>
@@ -4859,15 +4819,16 @@
         <w:tabs>
           <w:tab w:val="right" w:leader="dot" w:pos="8296"/>
         </w:tabs>
-        <w:spacing w:line="360" w:lineRule="auto"/>
         <w:rPr>
           <w:rFonts w:asciiTheme="minorHAnsi" w:eastAsiaTheme="minorEastAsia" w:hAnsiTheme="minorHAnsi"/>
           <w:noProof/>
-          <w:sz w:val="22"/>
+          <w:kern w:val="2"/>
+          <w:szCs w:val="24"/>
           <w:lang w:val="en-US"/>
-        </w:rPr>
-      </w:pPr>
-      <w:hyperlink w:anchor="_Toc234515403" w:history="1">
+          <w14:ligatures w14:val="standardContextual"/>
+        </w:rPr>
+      </w:pPr>
+      <w:hyperlink w:anchor="_Toc234601717" w:history="1">
         <w:r>
           <w:rPr>
             <w:rStyle w:val="Hyperlink"/>
@@ -4894,7 +4855,7 @@
             <w:noProof/>
             <w:webHidden/>
           </w:rPr>
-          <w:instrText xml:space="preserve"> PAGEREF _Toc234515403 \h </w:instrText>
+          <w:instrText xml:space="preserve"> PAGEREF _Toc234601717 \h </w:instrText>
         </w:r>
         <w:r>
           <w:rPr>
@@ -4931,15 +4892,16 @@
         <w:tabs>
           <w:tab w:val="right" w:leader="dot" w:pos="8296"/>
         </w:tabs>
-        <w:spacing w:line="360" w:lineRule="auto"/>
         <w:rPr>
           <w:rFonts w:asciiTheme="minorHAnsi" w:eastAsiaTheme="minorEastAsia" w:hAnsiTheme="minorHAnsi"/>
           <w:noProof/>
-          <w:sz w:val="22"/>
+          <w:kern w:val="2"/>
+          <w:szCs w:val="24"/>
           <w:lang w:val="en-US"/>
-        </w:rPr>
-      </w:pPr>
-      <w:hyperlink w:anchor="_Toc234515404" w:history="1">
+          <w14:ligatures w14:val="standardContextual"/>
+        </w:rPr>
+      </w:pPr>
+      <w:hyperlink w:anchor="_Toc234601718" w:history="1">
         <w:r>
           <w:rPr>
             <w:rStyle w:val="Hyperlink"/>
@@ -4966,7 +4928,7 @@
             <w:noProof/>
             <w:webHidden/>
           </w:rPr>
-          <w:instrText xml:space="preserve"> PAGEREF _Toc234515404 \h </w:instrText>
+          <w:instrText xml:space="preserve"> PAGEREF _Toc234601718 \h </w:instrText>
         </w:r>
         <w:r>
           <w:rPr>
@@ -5003,21 +4965,22 @@
         <w:tabs>
           <w:tab w:val="right" w:leader="dot" w:pos="8296"/>
         </w:tabs>
-        <w:spacing w:line="360" w:lineRule="auto"/>
         <w:rPr>
           <w:rFonts w:asciiTheme="minorHAnsi" w:eastAsiaTheme="minorEastAsia" w:hAnsiTheme="minorHAnsi"/>
           <w:noProof/>
-          <w:sz w:val="22"/>
+          <w:kern w:val="2"/>
+          <w:szCs w:val="24"/>
           <w:lang w:val="en-US"/>
-        </w:rPr>
-      </w:pPr>
-      <w:hyperlink w:anchor="_Toc234515405" w:history="1">
+          <w14:ligatures w14:val="standardContextual"/>
+        </w:rPr>
+      </w:pPr>
+      <w:hyperlink w:anchor="_Toc234601719" w:history="1">
         <w:r>
           <w:rPr>
             <w:rStyle w:val="Hyperlink"/>
             <w:noProof/>
           </w:rPr>
-          <w:t>Figure 6.5 : Single Player Gameplay</w:t>
+          <w:t>Figure 6.5 : Flowchart for Single Player Gameplay</w:t>
         </w:r>
         <w:r>
           <w:rPr>
@@ -5038,7 +5001,7 @@
             <w:noProof/>
             <w:webHidden/>
           </w:rPr>
-          <w:instrText xml:space="preserve"> PAGEREF _Toc234515405 \h </w:instrText>
+          <w:instrText xml:space="preserve"> PAGEREF _Toc234601719 \h </w:instrText>
         </w:r>
         <w:r>
           <w:rPr>
@@ -5075,21 +5038,22 @@
         <w:tabs>
           <w:tab w:val="right" w:leader="dot" w:pos="8296"/>
         </w:tabs>
-        <w:spacing w:line="360" w:lineRule="auto"/>
         <w:rPr>
           <w:rFonts w:asciiTheme="minorHAnsi" w:eastAsiaTheme="minorEastAsia" w:hAnsiTheme="minorHAnsi"/>
           <w:noProof/>
-          <w:sz w:val="22"/>
+          <w:kern w:val="2"/>
+          <w:szCs w:val="24"/>
           <w:lang w:val="en-US"/>
-        </w:rPr>
-      </w:pPr>
-      <w:hyperlink w:anchor="_Toc234515406" w:history="1">
+          <w14:ligatures w14:val="standardContextual"/>
+        </w:rPr>
+      </w:pPr>
+      <w:hyperlink w:anchor="_Toc234601720" w:history="1">
         <w:r>
           <w:rPr>
             <w:rStyle w:val="Hyperlink"/>
             <w:noProof/>
           </w:rPr>
-          <w:t>Figure 6.6 : Multiplayer Gameplay Flowchart</w:t>
+          <w:t>Figure 6.6 : Flowchart for Multiplayer Gameplay</w:t>
         </w:r>
         <w:r>
           <w:rPr>
@@ -5110,7 +5074,7 @@
             <w:noProof/>
             <w:webHidden/>
           </w:rPr>
-          <w:instrText xml:space="preserve"> PAGEREF _Toc234515406 \h </w:instrText>
+          <w:instrText xml:space="preserve"> PAGEREF _Toc234601720 \h </w:instrText>
         </w:r>
         <w:r>
           <w:rPr>
@@ -5147,15 +5111,16 @@
         <w:tabs>
           <w:tab w:val="right" w:leader="dot" w:pos="8296"/>
         </w:tabs>
-        <w:spacing w:line="360" w:lineRule="auto"/>
         <w:rPr>
           <w:rFonts w:asciiTheme="minorHAnsi" w:eastAsiaTheme="minorEastAsia" w:hAnsiTheme="minorHAnsi"/>
           <w:noProof/>
-          <w:sz w:val="22"/>
+          <w:kern w:val="2"/>
+          <w:szCs w:val="24"/>
           <w:lang w:val="en-US"/>
-        </w:rPr>
-      </w:pPr>
-      <w:hyperlink w:anchor="_Toc234515407" w:history="1">
+          <w14:ligatures w14:val="standardContextual"/>
+        </w:rPr>
+      </w:pPr>
+      <w:hyperlink w:anchor="_Toc234601721" w:history="1">
         <w:r>
           <w:rPr>
             <w:rStyle w:val="Hyperlink"/>
@@ -5182,7 +5147,7 @@
             <w:noProof/>
             <w:webHidden/>
           </w:rPr>
-          <w:instrText xml:space="preserve"> PAGEREF _Toc234515407 \h </w:instrText>
+          <w:instrText xml:space="preserve"> PAGEREF _Toc234601721 \h </w:instrText>
         </w:r>
         <w:r>
           <w:rPr>
@@ -5219,15 +5184,16 @@
         <w:tabs>
           <w:tab w:val="right" w:leader="dot" w:pos="8296"/>
         </w:tabs>
-        <w:spacing w:line="360" w:lineRule="auto"/>
         <w:rPr>
           <w:rFonts w:asciiTheme="minorHAnsi" w:eastAsiaTheme="minorEastAsia" w:hAnsiTheme="minorHAnsi"/>
           <w:noProof/>
-          <w:sz w:val="22"/>
+          <w:kern w:val="2"/>
+          <w:szCs w:val="24"/>
           <w:lang w:val="en-US"/>
-        </w:rPr>
-      </w:pPr>
-      <w:hyperlink w:anchor="_Toc234515408" w:history="1">
+          <w14:ligatures w14:val="standardContextual"/>
+        </w:rPr>
+      </w:pPr>
+      <w:hyperlink w:anchor="_Toc234601722" w:history="1">
         <w:r>
           <w:rPr>
             <w:rStyle w:val="Hyperlink"/>
@@ -5254,7 +5220,7 @@
             <w:noProof/>
             <w:webHidden/>
           </w:rPr>
-          <w:instrText xml:space="preserve"> PAGEREF _Toc234515408 \h </w:instrText>
+          <w:instrText xml:space="preserve"> PAGEREF _Toc234601722 \h </w:instrText>
         </w:r>
         <w:r>
           <w:rPr>
@@ -5291,15 +5257,16 @@
         <w:tabs>
           <w:tab w:val="right" w:leader="dot" w:pos="8296"/>
         </w:tabs>
-        <w:spacing w:line="360" w:lineRule="auto"/>
         <w:rPr>
           <w:rFonts w:asciiTheme="minorHAnsi" w:eastAsiaTheme="minorEastAsia" w:hAnsiTheme="minorHAnsi"/>
           <w:noProof/>
-          <w:sz w:val="22"/>
+          <w:kern w:val="2"/>
+          <w:szCs w:val="24"/>
           <w:lang w:val="en-US"/>
-        </w:rPr>
-      </w:pPr>
-      <w:hyperlink w:anchor="_Toc234515409" w:history="1">
+          <w14:ligatures w14:val="standardContextual"/>
+        </w:rPr>
+      </w:pPr>
+      <w:hyperlink w:anchor="_Toc234601723" w:history="1">
         <w:r>
           <w:rPr>
             <w:rStyle w:val="Hyperlink"/>
@@ -5326,7 +5293,7 @@
             <w:noProof/>
             <w:webHidden/>
           </w:rPr>
-          <w:instrText xml:space="preserve"> PAGEREF _Toc234515409 \h </w:instrText>
+          <w:instrText xml:space="preserve"> PAGEREF _Toc234601723 \h </w:instrText>
         </w:r>
         <w:r>
           <w:rPr>
@@ -5363,15 +5330,16 @@
         <w:tabs>
           <w:tab w:val="right" w:leader="dot" w:pos="8296"/>
         </w:tabs>
-        <w:spacing w:line="360" w:lineRule="auto"/>
         <w:rPr>
           <w:rFonts w:asciiTheme="minorHAnsi" w:eastAsiaTheme="minorEastAsia" w:hAnsiTheme="minorHAnsi"/>
           <w:noProof/>
-          <w:sz w:val="22"/>
+          <w:kern w:val="2"/>
+          <w:szCs w:val="24"/>
           <w:lang w:val="en-US"/>
-        </w:rPr>
-      </w:pPr>
-      <w:hyperlink w:anchor="_Toc234515410" w:history="1">
+          <w14:ligatures w14:val="standardContextual"/>
+        </w:rPr>
+      </w:pPr>
+      <w:hyperlink w:anchor="_Toc234601724" w:history="1">
         <w:r>
           <w:rPr>
             <w:rStyle w:val="Hyperlink"/>
@@ -5398,7 +5366,7 @@
             <w:noProof/>
             <w:webHidden/>
           </w:rPr>
-          <w:instrText xml:space="preserve"> PAGEREF _Toc234515410 \h </w:instrText>
+          <w:instrText xml:space="preserve"> PAGEREF _Toc234601724 \h </w:instrText>
         </w:r>
         <w:r>
           <w:rPr>
@@ -5435,15 +5403,16 @@
         <w:tabs>
           <w:tab w:val="right" w:leader="dot" w:pos="8296"/>
         </w:tabs>
-        <w:spacing w:line="360" w:lineRule="auto"/>
         <w:rPr>
           <w:rFonts w:asciiTheme="minorHAnsi" w:eastAsiaTheme="minorEastAsia" w:hAnsiTheme="minorHAnsi"/>
           <w:noProof/>
-          <w:sz w:val="22"/>
+          <w:kern w:val="2"/>
+          <w:szCs w:val="24"/>
           <w:lang w:val="en-US"/>
-        </w:rPr>
-      </w:pPr>
-      <w:hyperlink w:anchor="_Toc234515411" w:history="1">
+          <w14:ligatures w14:val="standardContextual"/>
+        </w:rPr>
+      </w:pPr>
+      <w:hyperlink w:anchor="_Toc234601725" w:history="1">
         <w:r>
           <w:rPr>
             <w:rStyle w:val="Hyperlink"/>
@@ -5470,7 +5439,7 @@
             <w:noProof/>
             <w:webHidden/>
           </w:rPr>
-          <w:instrText xml:space="preserve"> PAGEREF _Toc234515411 \h </w:instrText>
+          <w:instrText xml:space="preserve"> PAGEREF _Toc234601725 \h </w:instrText>
         </w:r>
         <w:r>
           <w:rPr>
@@ -5507,15 +5476,16 @@
         <w:tabs>
           <w:tab w:val="right" w:leader="dot" w:pos="8296"/>
         </w:tabs>
-        <w:spacing w:line="360" w:lineRule="auto"/>
         <w:rPr>
           <w:rFonts w:asciiTheme="minorHAnsi" w:eastAsiaTheme="minorEastAsia" w:hAnsiTheme="minorHAnsi"/>
           <w:noProof/>
-          <w:sz w:val="22"/>
+          <w:kern w:val="2"/>
+          <w:szCs w:val="24"/>
           <w:lang w:val="en-US"/>
-        </w:rPr>
-      </w:pPr>
-      <w:hyperlink w:anchor="_Toc234515412" w:history="1">
+          <w14:ligatures w14:val="standardContextual"/>
+        </w:rPr>
+      </w:pPr>
+      <w:hyperlink w:anchor="_Toc234601726" w:history="1">
         <w:r>
           <w:rPr>
             <w:rStyle w:val="Hyperlink"/>
@@ -5542,7 +5512,7 @@
             <w:noProof/>
             <w:webHidden/>
           </w:rPr>
-          <w:instrText xml:space="preserve"> PAGEREF _Toc234515412 \h </w:instrText>
+          <w:instrText xml:space="preserve"> PAGEREF _Toc234601726 \h </w:instrText>
         </w:r>
         <w:r>
           <w:rPr>
@@ -5579,15 +5549,16 @@
         <w:tabs>
           <w:tab w:val="right" w:leader="dot" w:pos="8296"/>
         </w:tabs>
-        <w:spacing w:line="360" w:lineRule="auto"/>
         <w:rPr>
           <w:rFonts w:asciiTheme="minorHAnsi" w:eastAsiaTheme="minorEastAsia" w:hAnsiTheme="minorHAnsi"/>
           <w:noProof/>
-          <w:sz w:val="22"/>
+          <w:kern w:val="2"/>
+          <w:szCs w:val="24"/>
           <w:lang w:val="en-US"/>
-        </w:rPr>
-      </w:pPr>
-      <w:hyperlink w:anchor="_Toc234515413" w:history="1">
+          <w14:ligatures w14:val="standardContextual"/>
+        </w:rPr>
+      </w:pPr>
+      <w:hyperlink w:anchor="_Toc234601727" w:history="1">
         <w:r>
           <w:rPr>
             <w:rStyle w:val="Hyperlink"/>
@@ -5614,7 +5585,7 @@
             <w:noProof/>
             <w:webHidden/>
           </w:rPr>
-          <w:instrText xml:space="preserve"> PAGEREF _Toc234515413 \h </w:instrText>
+          <w:instrText xml:space="preserve"> PAGEREF _Toc234601727 \h </w:instrText>
         </w:r>
         <w:r>
           <w:rPr>
@@ -5651,15 +5622,16 @@
         <w:tabs>
           <w:tab w:val="right" w:leader="dot" w:pos="8296"/>
         </w:tabs>
-        <w:spacing w:line="360" w:lineRule="auto"/>
         <w:rPr>
           <w:rFonts w:asciiTheme="minorHAnsi" w:eastAsiaTheme="minorEastAsia" w:hAnsiTheme="minorHAnsi"/>
           <w:noProof/>
-          <w:sz w:val="22"/>
+          <w:kern w:val="2"/>
+          <w:szCs w:val="24"/>
           <w:lang w:val="en-US"/>
-        </w:rPr>
-      </w:pPr>
-      <w:hyperlink w:anchor="_Toc234515414" w:history="1">
+          <w14:ligatures w14:val="standardContextual"/>
+        </w:rPr>
+      </w:pPr>
+      <w:hyperlink w:anchor="_Toc234601728" w:history="1">
         <w:r>
           <w:rPr>
             <w:rStyle w:val="Hyperlink"/>
@@ -5686,7 +5658,7 @@
             <w:noProof/>
             <w:webHidden/>
           </w:rPr>
-          <w:instrText xml:space="preserve"> PAGEREF _Toc234515414 \h </w:instrText>
+          <w:instrText xml:space="preserve"> PAGEREF _Toc234601728 \h </w:instrText>
         </w:r>
         <w:r>
           <w:rPr>
@@ -5723,15 +5695,16 @@
         <w:tabs>
           <w:tab w:val="right" w:leader="dot" w:pos="8296"/>
         </w:tabs>
-        <w:spacing w:line="360" w:lineRule="auto"/>
         <w:rPr>
           <w:rFonts w:asciiTheme="minorHAnsi" w:eastAsiaTheme="minorEastAsia" w:hAnsiTheme="minorHAnsi"/>
           <w:noProof/>
-          <w:sz w:val="22"/>
+          <w:kern w:val="2"/>
+          <w:szCs w:val="24"/>
           <w:lang w:val="en-US"/>
-        </w:rPr>
-      </w:pPr>
-      <w:hyperlink w:anchor="_Toc234515415" w:history="1">
+          <w14:ligatures w14:val="standardContextual"/>
+        </w:rPr>
+      </w:pPr>
+      <w:hyperlink w:anchor="_Toc234601729" w:history="1">
         <w:r>
           <w:rPr>
             <w:rStyle w:val="Hyperlink"/>
@@ -5758,7 +5731,7 @@
             <w:noProof/>
             <w:webHidden/>
           </w:rPr>
-          <w:instrText xml:space="preserve"> PAGEREF _Toc234515415 \h </w:instrText>
+          <w:instrText xml:space="preserve"> PAGEREF _Toc234601729 \h </w:instrText>
         </w:r>
         <w:r>
           <w:rPr>
@@ -5795,15 +5768,16 @@
         <w:tabs>
           <w:tab w:val="right" w:leader="dot" w:pos="8296"/>
         </w:tabs>
-        <w:spacing w:line="360" w:lineRule="auto"/>
         <w:rPr>
           <w:rFonts w:asciiTheme="minorHAnsi" w:eastAsiaTheme="minorEastAsia" w:hAnsiTheme="minorHAnsi"/>
           <w:noProof/>
-          <w:sz w:val="22"/>
+          <w:kern w:val="2"/>
+          <w:szCs w:val="24"/>
           <w:lang w:val="en-US"/>
-        </w:rPr>
-      </w:pPr>
-      <w:hyperlink w:anchor="_Toc234515416" w:history="1">
+          <w14:ligatures w14:val="standardContextual"/>
+        </w:rPr>
+      </w:pPr>
+      <w:hyperlink w:anchor="_Toc234601730" w:history="1">
         <w:r>
           <w:rPr>
             <w:rStyle w:val="Hyperlink"/>
@@ -5830,7 +5804,7 @@
             <w:noProof/>
             <w:webHidden/>
           </w:rPr>
-          <w:instrText xml:space="preserve"> PAGEREF _Toc234515416 \h </w:instrText>
+          <w:instrText xml:space="preserve"> PAGEREF _Toc234601730 \h </w:instrText>
         </w:r>
         <w:r>
           <w:rPr>
@@ -5867,15 +5841,16 @@
         <w:tabs>
           <w:tab w:val="right" w:leader="dot" w:pos="8296"/>
         </w:tabs>
-        <w:spacing w:line="360" w:lineRule="auto"/>
         <w:rPr>
           <w:rFonts w:asciiTheme="minorHAnsi" w:eastAsiaTheme="minorEastAsia" w:hAnsiTheme="minorHAnsi"/>
           <w:noProof/>
-          <w:sz w:val="22"/>
+          <w:kern w:val="2"/>
+          <w:szCs w:val="24"/>
           <w:lang w:val="en-US"/>
-        </w:rPr>
-      </w:pPr>
-      <w:hyperlink w:anchor="_Toc234515417" w:history="1">
+          <w14:ligatures w14:val="standardContextual"/>
+        </w:rPr>
+      </w:pPr>
+      <w:hyperlink w:anchor="_Toc234601731" w:history="1">
         <w:r>
           <w:rPr>
             <w:rStyle w:val="Hyperlink"/>
@@ -5902,7 +5877,7 @@
             <w:noProof/>
             <w:webHidden/>
           </w:rPr>
-          <w:instrText xml:space="preserve"> PAGEREF _Toc234515417 \h </w:instrText>
+          <w:instrText xml:space="preserve"> PAGEREF _Toc234601731 \h </w:instrText>
         </w:r>
         <w:r>
           <w:rPr>
@@ -5939,15 +5914,16 @@
         <w:tabs>
           <w:tab w:val="right" w:leader="dot" w:pos="8296"/>
         </w:tabs>
-        <w:spacing w:line="360" w:lineRule="auto"/>
         <w:rPr>
           <w:rFonts w:asciiTheme="minorHAnsi" w:eastAsiaTheme="minorEastAsia" w:hAnsiTheme="minorHAnsi"/>
           <w:noProof/>
-          <w:sz w:val="22"/>
+          <w:kern w:val="2"/>
+          <w:szCs w:val="24"/>
           <w:lang w:val="en-US"/>
-        </w:rPr>
-      </w:pPr>
-      <w:hyperlink w:anchor="_Toc234515418" w:history="1">
+          <w14:ligatures w14:val="standardContextual"/>
+        </w:rPr>
+      </w:pPr>
+      <w:hyperlink w:anchor="_Toc234601732" w:history="1">
         <w:r>
           <w:rPr>
             <w:rStyle w:val="Hyperlink"/>
@@ -5974,7 +5950,7 @@
             <w:noProof/>
             <w:webHidden/>
           </w:rPr>
-          <w:instrText xml:space="preserve"> PAGEREF _Toc234515418 \h </w:instrText>
+          <w:instrText xml:space="preserve"> PAGEREF _Toc234601732 \h </w:instrText>
         </w:r>
         <w:r>
           <w:rPr>
@@ -6116,6 +6092,7 @@
           <w:sz w:val="32"/>
           <w:szCs w:val="32"/>
         </w:rPr>
+        <w:lastRenderedPageBreak/>
         <w:t>Abbreviations</w:t>
       </w:r>
     </w:p>
@@ -7111,10 +7088,12 @@
     <w:p>
       <w:pPr>
         <w:pStyle w:val="Heading1"/>
+        <w:spacing w:line="360" w:lineRule="auto"/>
         <w:ind w:left="180" w:hanging="180"/>
       </w:pPr>
       <w:bookmarkStart w:id="3" w:name="_Toc234565755"/>
       <w:r>
+        <w:lastRenderedPageBreak/>
         <w:t>.</w:t>
       </w:r>
       <w:r>
@@ -7361,7 +7340,11 @@
         <w:jc w:val="both"/>
       </w:pPr>
       <w:r>
-        <w:t>This project also includes additional innovative feature such as tournament mode and streak bonus system. Tournament mode allows users to compete in multiple rounds continuously, while the streak bonus system reward users for consecutive wins. These features increase excitement and provide better gaming experience.</w:t>
+        <w:t xml:space="preserve">This project also includes additional innovative feature such as tournament mode and streak bonus system. Tournament mode allows users to compete in multiple rounds </w:t>
+      </w:r>
+      <w:r>
+        <w:lastRenderedPageBreak/>
+        <w:t>continuously, while the streak bonus system reward users for consecutive wins. These features increase excitement and provide better gaming experience.</w:t>
       </w:r>
     </w:p>
     <w:p>
@@ -7442,6 +7425,7 @@
       </w:pPr>
       <w:bookmarkStart w:id="4" w:name="_Toc234565756"/>
       <w:r>
+        <w:lastRenderedPageBreak/>
         <w:t>.</w:t>
       </w:r>
       <w:r>
@@ -7465,17 +7449,14 @@
     </w:p>
     <w:p>
       <w:pPr>
-        <w:pStyle w:val="NormalWeb"/>
-        <w:numPr>
-          <w:ilvl w:val="0"/>
-          <w:numId w:val="32"/>
-        </w:numPr>
-        <w:tabs>
-          <w:tab w:val="num" w:pos="180"/>
-        </w:tabs>
         <w:spacing w:line="360" w:lineRule="auto"/>
-        <w:ind w:left="0" w:firstLine="0"/>
-      </w:pPr>
+      </w:pPr>
+      <w:r>
+        <w:rPr>
+          <w:rStyle w:val="Strong"/>
+        </w:rPr>
+        <w:t xml:space="preserve">1. </w:t>
+      </w:r>
       <w:r>
         <w:rPr>
           <w:rStyle w:val="Strong"/>
@@ -7489,17 +7470,11 @@
     </w:p>
     <w:p>
       <w:pPr>
-        <w:pStyle w:val="NormalWeb"/>
-        <w:numPr>
-          <w:ilvl w:val="0"/>
-          <w:numId w:val="32"/>
-        </w:numPr>
-        <w:tabs>
-          <w:tab w:val="num" w:pos="180"/>
-        </w:tabs>
         <w:spacing w:line="360" w:lineRule="auto"/>
-        <w:ind w:left="0" w:firstLine="0"/>
-      </w:pPr>
+      </w:pPr>
+      <w:r>
+        <w:t xml:space="preserve">2. </w:t>
+      </w:r>
       <w:r>
         <w:rPr>
           <w:rStyle w:val="Strong"/>
@@ -7513,17 +7488,11 @@
     </w:p>
     <w:p>
       <w:pPr>
-        <w:pStyle w:val="NormalWeb"/>
-        <w:numPr>
-          <w:ilvl w:val="0"/>
-          <w:numId w:val="32"/>
-        </w:numPr>
-        <w:tabs>
-          <w:tab w:val="num" w:pos="180"/>
-        </w:tabs>
         <w:spacing w:line="360" w:lineRule="auto"/>
-        <w:ind w:left="0" w:firstLine="0"/>
-      </w:pPr>
+      </w:pPr>
+      <w:r>
+        <w:t xml:space="preserve">3. </w:t>
+      </w:r>
       <w:r>
         <w:rPr>
           <w:rStyle w:val="Strong"/>
@@ -7537,18 +7506,11 @@
     </w:p>
     <w:p>
       <w:pPr>
-        <w:pStyle w:val="NormalWeb"/>
-        <w:numPr>
-          <w:ilvl w:val="0"/>
-          <w:numId w:val="32"/>
-        </w:numPr>
-        <w:tabs>
-          <w:tab w:val="num" w:pos="180"/>
-        </w:tabs>
         <w:spacing w:line="360" w:lineRule="auto"/>
-        <w:ind w:left="0" w:firstLine="0"/>
-        <w:jc w:val="both"/>
-      </w:pPr>
+      </w:pPr>
+      <w:r>
+        <w:t xml:space="preserve">4. </w:t>
+      </w:r>
       <w:r>
         <w:rPr>
           <w:rStyle w:val="Strong"/>
@@ -7568,17 +7530,24 @@
     </w:p>
     <w:p>
       <w:pPr>
-        <w:pStyle w:val="NormalWeb"/>
+        <w:spacing w:line="360" w:lineRule="auto"/>
+        <w:rPr>
+          <w:szCs w:val="24"/>
+        </w:rPr>
+      </w:pPr>
+      <w:r>
+        <w:rPr>
+          <w:rStyle w:val="Strong"/>
+          <w:b w:val="0"/>
+        </w:rPr>
+        <w:t>To overcome these Limitations, this project develops a console-based Rock Paper Scissors Game using C programming language with user registration, login, single player and multiplayer modes, score management, match history, leaderboard, and file handling for permanent data storage.</w:t>
+      </w:r>
+    </w:p>
+    <w:p>
+      <w:pPr>
         <w:spacing w:line="360" w:lineRule="auto"/>
         <w:jc w:val="both"/>
       </w:pPr>
-      <w:r>
-        <w:rPr>
-          <w:rStyle w:val="Strong"/>
-          <w:b w:val="0"/>
-        </w:rPr>
-        <w:t>To overcome these Limitations, this project develops a console-based Rock Paper Scissors Game using C programming language with user registration, login, single player and multiplayer modes, score management, match history, leaderboard, and file handling for permanent data storage.</w:t>
-      </w:r>
     </w:p>
     <w:p>
       <w:pPr>
@@ -7589,7 +7558,6 @@
     <w:p>
       <w:pPr>
         <w:spacing w:line="360" w:lineRule="auto"/>
-        <w:jc w:val="both"/>
       </w:pPr>
     </w:p>
     <w:p>
@@ -7614,16 +7582,13 @@
     </w:p>
     <w:p>
       <w:pPr>
+        <w:pStyle w:val="Heading1"/>
         <w:spacing w:line="360" w:lineRule="auto"/>
-      </w:pPr>
-    </w:p>
-    <w:p>
-      <w:pPr>
-        <w:pStyle w:val="Heading1"/>
         <w:ind w:left="180" w:hanging="180"/>
       </w:pPr>
       <w:bookmarkStart w:id="5" w:name="_Toc234565757"/>
       <w:r>
+        <w:lastRenderedPageBreak/>
         <w:t>.</w:t>
       </w:r>
       <w:r>
@@ -7705,6 +7670,7 @@
           <w:numId w:val="27"/>
         </w:numPr>
         <w:tabs>
+          <w:tab w:val="left" w:pos="180"/>
           <w:tab w:val="left" w:pos="360"/>
         </w:tabs>
         <w:spacing w:after="0" w:line="360" w:lineRule="auto"/>
@@ -7726,14 +7692,7 @@
           <w:rFonts w:eastAsia="Times New Roman" w:cs="Times New Roman"/>
           <w:szCs w:val="24"/>
         </w:rPr>
-        <w:t>Dashboard that provides easy access to gameplay</w:t>
-      </w:r>
-      <w:r>
-        <w:rPr>
-          <w:rFonts w:eastAsia="Times New Roman" w:cs="Times New Roman"/>
-          <w:szCs w:val="24"/>
-        </w:rPr>
-        <w:t>, match history, leader</w:t>
+        <w:t>Dashboard that provides easy access to gameplay, match history, leader</w:t>
       </w:r>
       <w:r>
         <w:rPr>
@@ -7799,6 +7758,7 @@
       </w:pPr>
       <w:bookmarkStart w:id="6" w:name="_Toc234565758"/>
       <w:r>
+        <w:lastRenderedPageBreak/>
         <w:t>.</w:t>
       </w:r>
       <w:r>
@@ -7864,7 +7824,11 @@
         <w:t xml:space="preserve"> </w:t>
       </w:r>
       <w:r>
-        <w:t>This project aims to address these gaps by implementing a multi-mode Rock-Paper-Scissors game with robust data management, multiplayer capabilities, and an intuitive user interface. The motivation stems from the need to create an engaging online game platform that is accessible to users with varying levels of technical expertise, and to explore how traditional games can be adapted to modern digital environments.</w:t>
+        <w:t xml:space="preserve">This project aims to address these gaps by implementing a multi-mode Rock-Paper-Scissors game with robust data management, multiplayer capabilities, and an intuitive user interface. The motivation stems from the need to </w:t>
+      </w:r>
+      <w:r>
+        <w:lastRenderedPageBreak/>
+        <w:t>create an engaging online game platform that is accessible to users with varying levels of technical expertise, and to explore how traditional games can be adapted to modern digital environments.</w:t>
       </w:r>
       <w:r>
         <w:t xml:space="preserve"> The development process involves </w:t>
@@ -7972,10 +7936,12 @@
     <w:p>
       <w:pPr>
         <w:pStyle w:val="Heading1"/>
+        <w:spacing w:line="360" w:lineRule="auto"/>
         <w:ind w:left="180" w:hanging="180"/>
       </w:pPr>
       <w:bookmarkStart w:id="7" w:name="_Toc234565759"/>
       <w:r>
+        <w:lastRenderedPageBreak/>
         <w:t>.</w:t>
       </w:r>
       <w:r>
@@ -7999,16 +7965,20 @@
     <w:p>
       <w:pPr>
         <w:pStyle w:val="isselectedend"/>
+        <w:tabs>
+          <w:tab w:val="left" w:pos="540"/>
+        </w:tabs>
+        <w:spacing w:before="0" w:beforeAutospacing="0" w:line="360" w:lineRule="auto"/>
+        <w:jc w:val="both"/>
+      </w:pPr>
+      <w:r>
+        <w:t>The requirement gathering process involved identifying the needs of players, developers, and supervisors. These requirements were categorized into business requirements, user requirements, functional requirements, and non-functional requirements.</w:t>
+      </w:r>
+    </w:p>
+    <w:p>
+      <w:pPr>
+        <w:pStyle w:val="Heading2"/>
         <w:spacing w:line="360" w:lineRule="auto"/>
-        <w:jc w:val="both"/>
-      </w:pPr>
-      <w:r>
-        <w:t>The requirement gathering process involved identifying the needs of players, developers, and supervisors. These requirements were categorized into business requirements, user requirements, functional requirements, and non-functional requirements.</w:t>
-      </w:r>
-    </w:p>
-    <w:p>
-      <w:pPr>
-        <w:pStyle w:val="Heading2"/>
         <w:ind w:left="360" w:hanging="396"/>
       </w:pPr>
       <w:bookmarkStart w:id="8" w:name="_Toc234565760"/>
@@ -8277,22 +8247,14 @@
               <w:rPr>
                 <w:lang w:val="en-GB"/>
               </w:rPr>
-              <w:t xml:space="preserve">d </w:t>
-            </w:r>
-            <w:proofErr w:type="gramStart"/>
+              <w:t xml:space="preserve">d and  </w:t>
+            </w:r>
             <w:r>
               <w:rPr>
                 <w:lang w:val="en-GB"/>
               </w:rPr>
-              <w:t xml:space="preserve">and  </w:t>
-            </w:r>
-            <w:r>
-              <w:rPr>
-                <w:lang w:val="en-GB"/>
-              </w:rPr>
               <w:t>Authenticates</w:t>
             </w:r>
-            <w:proofErr w:type="gramEnd"/>
             <w:r>
               <w:rPr>
                 <w:lang w:val="en-GB"/>
@@ -8354,16 +8316,8 @@
               <w:rPr>
                 <w:lang w:val="en-GB"/>
               </w:rPr>
-              <w:t xml:space="preserve"> and security </w:t>
-            </w:r>
-            <w:proofErr w:type="gramStart"/>
-            <w:r>
-              <w:rPr>
-                <w:lang w:val="en-GB"/>
-              </w:rPr>
-              <w:t>feature .</w:t>
-            </w:r>
-            <w:proofErr w:type="gramEnd"/>
+              <w:t xml:space="preserve"> and security feature .</w:t>
+            </w:r>
           </w:p>
         </w:tc>
       </w:tr>
@@ -8477,6 +8431,7 @@
               <w:spacing w:before="0" w:beforeAutospacing="0" w:after="0" w:afterAutospacing="0" w:line="360" w:lineRule="auto"/>
             </w:pPr>
             <w:r>
+              <w:lastRenderedPageBreak/>
               <w:t>3.</w:t>
             </w:r>
           </w:p>
@@ -9229,6 +9184,7 @@
               <w:spacing w:before="0" w:beforeAutospacing="0" w:after="0" w:afterAutospacing="0" w:line="360" w:lineRule="auto"/>
             </w:pPr>
             <w:r>
+              <w:lastRenderedPageBreak/>
               <w:t>10.</w:t>
             </w:r>
           </w:p>
@@ -9850,10 +9806,12 @@
     <w:p>
       <w:pPr>
         <w:pStyle w:val="Heading1"/>
+        <w:spacing w:line="360" w:lineRule="auto"/>
         <w:ind w:left="180" w:hanging="180"/>
       </w:pPr>
       <w:bookmarkStart w:id="13" w:name="_Toc234565765"/>
       <w:r>
+        <w:lastRenderedPageBreak/>
         <w:t>.</w:t>
       </w:r>
       <w:r>
@@ -9876,6 +9834,7 @@
     <w:p>
       <w:pPr>
         <w:pStyle w:val="Heading2"/>
+        <w:spacing w:line="360" w:lineRule="auto"/>
         <w:ind w:left="360" w:hanging="360"/>
       </w:pPr>
       <w:bookmarkStart w:id="14" w:name="_Toc234565766"/>
@@ -9896,7 +9855,7 @@
           <w:lang w:val="en-US"/>
         </w:rPr>
         <w:drawing>
-          <wp:inline distT="0" distB="0" distL="0" distR="0" wp14:anchorId="497F33C4" wp14:editId="76476D4A">
+          <wp:inline distT="0" distB="0" distL="0" distR="0" wp14:anchorId="497F33C4" wp14:editId="48050B45">
             <wp:extent cx="5613400" cy="2372098"/>
             <wp:effectExtent l="0" t="0" r="6350" b="9525"/>
             <wp:docPr id="6" name="Picture 6"/>
@@ -9941,12 +9900,13 @@
     <w:p>
       <w:pPr>
         <w:pStyle w:val="Caption"/>
-        <w:rPr>
-          <w:sz w:val="24"/>
-          <w:szCs w:val="24"/>
-        </w:rPr>
-      </w:pPr>
-      <w:bookmarkStart w:id="15" w:name="_Toc234515401"/>
+        <w:spacing w:line="360" w:lineRule="auto"/>
+        <w:rPr>
+          <w:sz w:val="24"/>
+          <w:szCs w:val="24"/>
+        </w:rPr>
+      </w:pPr>
+      <w:bookmarkStart w:id="15" w:name="_Toc234601715"/>
       <w:r>
         <w:rPr>
           <w:sz w:val="24"/>
@@ -10050,19 +10010,12 @@
     <w:p>
       <w:pPr>
         <w:pStyle w:val="Caption"/>
+        <w:spacing w:line="360" w:lineRule="auto"/>
         <w:jc w:val="left"/>
         <w:rPr>
           <w:sz w:val="22"/>
           <w:szCs w:val="22"/>
         </w:rPr>
-      </w:pPr>
-    </w:p>
-    <w:p>
-      <w:pPr>
-        <w:pStyle w:val="Caption"/>
-        <w:keepNext/>
-        <w:spacing w:line="360" w:lineRule="auto"/>
-        <w:jc w:val="left"/>
       </w:pPr>
       <w:r>
         <w:rPr>
@@ -10071,9 +10024,9 @@
           <w:lang w:val="en-US"/>
         </w:rPr>
         <w:drawing>
-          <wp:inline distT="0" distB="0" distL="0" distR="0" wp14:anchorId="7442E6B5" wp14:editId="5EB21A7A">
-            <wp:extent cx="5899238" cy="3743960"/>
-            <wp:effectExtent l="0" t="0" r="6350" b="8890"/>
+          <wp:inline distT="0" distB="0" distL="0" distR="0" wp14:anchorId="254C76EB" wp14:editId="4FECBC6A">
+            <wp:extent cx="5274310" cy="3347398"/>
+            <wp:effectExtent l="0" t="0" r="2540" b="5715"/>
             <wp:docPr id="1" name="Picture 1"/>
             <wp:cNvGraphicFramePr>
               <a:graphicFrameLocks xmlns:a="http://schemas.openxmlformats.org/drawingml/2006/main" noChangeAspect="1"/>
@@ -10100,7 +10053,7 @@
                   <pic:spPr>
                     <a:xfrm>
                       <a:off x="0" y="0"/>
-                      <a:ext cx="5924836" cy="3760206"/>
+                      <a:ext cx="5274310" cy="3347398"/>
                     </a:xfrm>
                     <a:prstGeom prst="rect">
                       <a:avLst/>
@@ -10116,12 +10069,21 @@
     <w:p>
       <w:pPr>
         <w:pStyle w:val="Caption"/>
-        <w:rPr>
-          <w:sz w:val="24"/>
-          <w:szCs w:val="24"/>
-        </w:rPr>
-      </w:pPr>
-      <w:bookmarkStart w:id="16" w:name="_Toc234515402"/>
+        <w:keepNext/>
+        <w:spacing w:line="360" w:lineRule="auto"/>
+        <w:jc w:val="left"/>
+      </w:pPr>
+    </w:p>
+    <w:p>
+      <w:pPr>
+        <w:pStyle w:val="Caption"/>
+        <w:spacing w:line="360" w:lineRule="auto"/>
+        <w:rPr>
+          <w:sz w:val="24"/>
+          <w:szCs w:val="24"/>
+        </w:rPr>
+      </w:pPr>
+      <w:bookmarkStart w:id="16" w:name="_Toc234601716"/>
       <w:r>
         <w:rPr>
           <w:sz w:val="24"/>
@@ -10225,10 +10187,12 @@
     <w:p>
       <w:pPr>
         <w:pStyle w:val="Heading2"/>
+        <w:spacing w:line="360" w:lineRule="auto"/>
         <w:ind w:left="360" w:hanging="360"/>
       </w:pPr>
       <w:bookmarkStart w:id="17" w:name="_Toc234565767"/>
       <w:r>
+        <w:lastRenderedPageBreak/>
         <w:t>Flowchart</w:t>
       </w:r>
       <w:bookmarkEnd w:id="17"/>
@@ -10290,12 +10254,13 @@
     <w:p>
       <w:pPr>
         <w:pStyle w:val="Caption"/>
-        <w:rPr>
-          <w:sz w:val="24"/>
-          <w:szCs w:val="24"/>
-        </w:rPr>
-      </w:pPr>
-      <w:bookmarkStart w:id="18" w:name="_Toc234515403"/>
+        <w:spacing w:line="360" w:lineRule="auto"/>
+        <w:rPr>
+          <w:sz w:val="24"/>
+          <w:szCs w:val="24"/>
+        </w:rPr>
+      </w:pPr>
+      <w:bookmarkStart w:id="18" w:name="_Toc234601717"/>
       <w:r>
         <w:rPr>
           <w:sz w:val="24"/>
@@ -10482,8 +10447,9 @@
     <w:p>
       <w:pPr>
         <w:pStyle w:val="Caption"/>
-      </w:pPr>
-      <w:bookmarkStart w:id="19" w:name="_Toc234515404"/>
+        <w:spacing w:line="360" w:lineRule="auto"/>
+      </w:pPr>
+      <w:bookmarkStart w:id="19" w:name="_Toc234601718"/>
       <w:r>
         <w:t xml:space="preserve">Figure </w:t>
       </w:r>
@@ -10559,6 +10525,7 @@
           <w:szCs w:val="24"/>
           <w:lang w:val="en-US"/>
         </w:rPr>
+        <w:lastRenderedPageBreak/>
         <w:drawing>
           <wp:inline distT="0" distB="0" distL="0" distR="0" wp14:anchorId="78C41E9D" wp14:editId="5FFE4C43">
             <wp:extent cx="5274310" cy="6285230"/>
@@ -10605,12 +10572,13 @@
     <w:p>
       <w:pPr>
         <w:pStyle w:val="Caption"/>
-        <w:rPr>
-          <w:sz w:val="24"/>
-          <w:szCs w:val="24"/>
-        </w:rPr>
-      </w:pPr>
-      <w:bookmarkStart w:id="20" w:name="_Toc234515405"/>
+        <w:spacing w:line="360" w:lineRule="auto"/>
+        <w:rPr>
+          <w:sz w:val="24"/>
+          <w:szCs w:val="24"/>
+        </w:rPr>
+      </w:pPr>
+      <w:bookmarkStart w:id="20" w:name="_Toc234601719"/>
       <w:r>
         <w:rPr>
           <w:sz w:val="24"/>
@@ -10702,7 +10670,21 @@
           <w:sz w:val="24"/>
           <w:szCs w:val="24"/>
         </w:rPr>
-        <w:t xml:space="preserve"> : Single Player Gameplay</w:t>
+        <w:t xml:space="preserve"> : </w:t>
+      </w:r>
+      <w:r>
+        <w:rPr>
+          <w:sz w:val="24"/>
+          <w:szCs w:val="24"/>
+        </w:rPr>
+        <w:t xml:space="preserve">Flowchart for </w:t>
+      </w:r>
+      <w:r>
+        <w:rPr>
+          <w:sz w:val="24"/>
+          <w:szCs w:val="24"/>
+        </w:rPr>
+        <w:t>Single Player Gameplay</w:t>
       </w:r>
       <w:bookmarkEnd w:id="20"/>
     </w:p>
@@ -10769,6 +10751,7 @@
           <w:szCs w:val="24"/>
           <w:lang w:val="en-US"/>
         </w:rPr>
+        <w:lastRenderedPageBreak/>
         <w:drawing>
           <wp:inline distT="0" distB="0" distL="0" distR="0" wp14:anchorId="0C47A2B4" wp14:editId="33916B23">
             <wp:extent cx="5274310" cy="5942965"/>
@@ -10815,12 +10798,13 @@
     <w:p>
       <w:pPr>
         <w:pStyle w:val="Caption"/>
-        <w:rPr>
-          <w:sz w:val="24"/>
-          <w:szCs w:val="24"/>
-        </w:rPr>
-      </w:pPr>
-      <w:bookmarkStart w:id="21" w:name="_Toc234515406"/>
+        <w:spacing w:line="360" w:lineRule="auto"/>
+        <w:rPr>
+          <w:sz w:val="24"/>
+          <w:szCs w:val="24"/>
+        </w:rPr>
+      </w:pPr>
+      <w:bookmarkStart w:id="21" w:name="_Toc234601720"/>
       <w:r>
         <w:rPr>
           <w:sz w:val="24"/>
@@ -10912,13 +10896,35 @@
           <w:sz w:val="24"/>
           <w:szCs w:val="24"/>
         </w:rPr>
-        <w:t xml:space="preserve"> : Multiplayer Gameplay Flowchart</w:t>
+        <w:t xml:space="preserve"> : </w:t>
+      </w:r>
+      <w:r>
+        <w:rPr>
+          <w:sz w:val="24"/>
+          <w:szCs w:val="24"/>
+        </w:rPr>
+        <w:t xml:space="preserve">Flowchart for </w:t>
+      </w:r>
+      <w:r>
+        <w:rPr>
+          <w:sz w:val="24"/>
+          <w:szCs w:val="24"/>
+        </w:rPr>
+        <w:t>Multiplayer Gameplay</w:t>
       </w:r>
       <w:bookmarkEnd w:id="21"/>
+      <w:r>
+        <w:rPr>
+          <w:sz w:val="24"/>
+          <w:szCs w:val="24"/>
+        </w:rPr>
+        <w:t xml:space="preserve"> </w:t>
+      </w:r>
     </w:p>
     <w:p>
       <w:pPr>
         <w:pStyle w:val="Caption"/>
+        <w:spacing w:line="360" w:lineRule="auto"/>
       </w:pPr>
     </w:p>
     <w:p>
@@ -10963,6 +10969,7 @@
           <w:szCs w:val="24"/>
           <w:lang w:val="en-US"/>
         </w:rPr>
+        <w:lastRenderedPageBreak/>
         <w:drawing>
           <wp:inline distT="0" distB="0" distL="0" distR="0" wp14:anchorId="6B9B353F" wp14:editId="14BA536F">
             <wp:extent cx="5828306" cy="5382260"/>
@@ -11009,12 +11016,13 @@
     <w:p>
       <w:pPr>
         <w:pStyle w:val="Caption"/>
-        <w:rPr>
-          <w:sz w:val="24"/>
-          <w:szCs w:val="24"/>
-        </w:rPr>
-      </w:pPr>
-      <w:bookmarkStart w:id="22" w:name="_Toc234515407"/>
+        <w:spacing w:line="360" w:lineRule="auto"/>
+        <w:rPr>
+          <w:sz w:val="24"/>
+          <w:szCs w:val="24"/>
+        </w:rPr>
+      </w:pPr>
+      <w:bookmarkStart w:id="22" w:name="_Toc234601721"/>
       <w:r>
         <w:rPr>
           <w:sz w:val="24"/>
@@ -11139,9 +11147,11 @@
     <w:p>
       <w:pPr>
         <w:pStyle w:val="Heading2"/>
+        <w:spacing w:line="360" w:lineRule="auto"/>
         <w:ind w:left="360" w:hanging="360"/>
       </w:pPr>
       <w:r>
+        <w:lastRenderedPageBreak/>
         <w:t xml:space="preserve"> </w:t>
       </w:r>
       <w:bookmarkStart w:id="23" w:name="_Toc234565768"/>
@@ -11162,8 +11172,6 @@
         </w:rPr>
         <w:t>32</w:t>
       </w:r>
-      <w:bookmarkStart w:id="24" w:name="_GoBack"/>
-      <w:bookmarkEnd w:id="24"/>
       <w:r>
         <w:rPr>
           <w:noProof/>
@@ -11219,12 +11227,13 @@
     <w:p>
       <w:pPr>
         <w:pStyle w:val="Caption"/>
-        <w:rPr>
-          <w:sz w:val="24"/>
-          <w:szCs w:val="24"/>
-        </w:rPr>
-      </w:pPr>
-      <w:bookmarkStart w:id="25" w:name="_Toc234515408"/>
+        <w:spacing w:line="360" w:lineRule="auto"/>
+        <w:rPr>
+          <w:sz w:val="24"/>
+          <w:szCs w:val="24"/>
+        </w:rPr>
+      </w:pPr>
+      <w:bookmarkStart w:id="24" w:name="_Toc234601722"/>
       <w:r>
         <w:rPr>
           <w:sz w:val="24"/>
@@ -11318,25 +11327,13 @@
         </w:rPr>
         <w:t xml:space="preserve"> : Use Case diagram</w:t>
       </w:r>
-      <w:bookmarkEnd w:id="25"/>
-    </w:p>
-    <w:p>
-      <w:pPr>
-        <w:pStyle w:val="Caption"/>
-        <w:jc w:val="left"/>
-      </w:pPr>
+      <w:bookmarkEnd w:id="24"/>
     </w:p>
     <w:p>
       <w:pPr>
         <w:pStyle w:val="Caption"/>
         <w:spacing w:line="360" w:lineRule="auto"/>
         <w:jc w:val="left"/>
-        <w:rPr>
-          <w:i/>
-          <w:color w:val="auto"/>
-          <w:sz w:val="24"/>
-          <w:szCs w:val="24"/>
-        </w:rPr>
       </w:pPr>
     </w:p>
     <w:p>
@@ -11346,14 +11343,27 @@
         <w:jc w:val="left"/>
         <w:rPr>
           <w:i/>
-          <w:sz w:val="24"/>
-          <w:szCs w:val="24"/>
-        </w:rPr>
-      </w:pPr>
-    </w:p>
-    <w:p>
-      <w:pPr>
+          <w:color w:val="auto"/>
+          <w:sz w:val="24"/>
+          <w:szCs w:val="24"/>
+        </w:rPr>
+      </w:pPr>
+    </w:p>
+    <w:p>
+      <w:pPr>
+        <w:pStyle w:val="Caption"/>
         <w:spacing w:line="360" w:lineRule="auto"/>
+        <w:jc w:val="left"/>
+        <w:rPr>
+          <w:i/>
+          <w:sz w:val="24"/>
+          <w:szCs w:val="24"/>
+        </w:rPr>
+      </w:pPr>
+    </w:p>
+    <w:p>
+      <w:pPr>
+        <w:spacing w:line="360" w:lineRule="auto"/>
       </w:pPr>
       <w:r>
         <w:br w:type="page"/>
@@ -11362,36 +11372,36 @@
     <w:p>
       <w:pPr>
         <w:pStyle w:val="Heading1"/>
+        <w:spacing w:line="360" w:lineRule="auto"/>
         <w:ind w:left="270" w:hanging="270"/>
       </w:pPr>
-      <w:bookmarkStart w:id="26" w:name="_Toc234565769"/>
-      <w:r>
+      <w:r>
+        <w:lastRenderedPageBreak/>
         <w:t>.</w:t>
       </w:r>
       <w:r>
-        <w:t>Development</w:t>
-      </w:r>
-      <w:bookmarkEnd w:id="26"/>
+        <w:t xml:space="preserve"> Development</w:t>
+      </w:r>
     </w:p>
     <w:p>
       <w:pPr>
         <w:pStyle w:val="Heading2"/>
-        <w:spacing w:line="360" w:lineRule="auto"/>
+        <w:spacing w:before="120" w:after="0" w:line="360" w:lineRule="auto"/>
         <w:ind w:left="270" w:hanging="306"/>
         <w:jc w:val="both"/>
       </w:pPr>
       <w:r>
         <w:t xml:space="preserve"> </w:t>
       </w:r>
-      <w:bookmarkStart w:id="27" w:name="_Toc234565770"/>
+      <w:bookmarkStart w:id="25" w:name="_Toc234565770"/>
       <w:r>
         <w:t>Waterfall Model</w:t>
       </w:r>
-      <w:bookmarkEnd w:id="27"/>
-    </w:p>
-    <w:p>
-      <w:pPr>
-        <w:spacing w:after="0" w:line="360" w:lineRule="auto"/>
+      <w:bookmarkEnd w:id="25"/>
+    </w:p>
+    <w:p>
+      <w:pPr>
+        <w:spacing w:before="120" w:after="0" w:line="360" w:lineRule="auto"/>
         <w:jc w:val="both"/>
         <w:rPr>
           <w:szCs w:val="24"/>
@@ -11413,7 +11423,19 @@
         <w:rPr>
           <w:szCs w:val="24"/>
         </w:rPr>
-        <w:t xml:space="preserve"> chosen for the development of the Rock Paper Scissor game because it is suitable for small and well defined projects. The project re</w:t>
+        <w:t xml:space="preserve"> chosen for the development of the Rock Paper Scissor game because it is suitable for small and </w:t>
+      </w:r>
+      <w:r>
+        <w:rPr>
+          <w:szCs w:val="24"/>
+        </w:rPr>
+        <w:t>well-defined</w:t>
+      </w:r>
+      <w:r>
+        <w:rPr>
+          <w:szCs w:val="24"/>
+        </w:rPr>
+        <w:t xml:space="preserve"> projects. The project re</w:t>
       </w:r>
       <w:r>
         <w:rPr>
@@ -11553,7 +11575,7 @@
           <w:tab w:val="clear" w:pos="720"/>
           <w:tab w:val="left" w:pos="180"/>
         </w:tabs>
-        <w:spacing w:before="100" w:beforeAutospacing="1" w:after="100" w:afterAutospacing="1" w:line="360" w:lineRule="auto"/>
+        <w:spacing w:after="100" w:afterAutospacing="1" w:line="360" w:lineRule="auto"/>
         <w:ind w:left="360"/>
         <w:jc w:val="both"/>
         <w:rPr>
@@ -11581,7 +11603,7 @@
           <w:tab w:val="clear" w:pos="720"/>
           <w:tab w:val="num" w:pos="180"/>
         </w:tabs>
-        <w:spacing w:before="100" w:beforeAutospacing="1" w:after="100" w:afterAutospacing="1" w:line="360" w:lineRule="auto"/>
+        <w:spacing w:after="100" w:afterAutospacing="1" w:line="360" w:lineRule="auto"/>
         <w:ind w:hanging="720"/>
         <w:jc w:val="both"/>
         <w:rPr>
@@ -11609,7 +11631,7 @@
           <w:tab w:val="clear" w:pos="720"/>
           <w:tab w:val="num" w:pos="180"/>
         </w:tabs>
-        <w:spacing w:before="100" w:beforeAutospacing="1" w:after="100" w:afterAutospacing="1" w:line="360" w:lineRule="auto"/>
+        <w:spacing w:after="100" w:afterAutospacing="1" w:line="360" w:lineRule="auto"/>
         <w:ind w:left="360"/>
         <w:jc w:val="both"/>
         <w:rPr>
@@ -11637,7 +11659,7 @@
           <w:tab w:val="clear" w:pos="720"/>
           <w:tab w:val="num" w:pos="360"/>
         </w:tabs>
-        <w:spacing w:before="100" w:beforeAutospacing="1" w:after="100" w:afterAutospacing="1" w:line="360" w:lineRule="auto"/>
+        <w:spacing w:after="100" w:afterAutospacing="1" w:line="360" w:lineRule="auto"/>
         <w:ind w:left="180" w:hanging="180"/>
         <w:jc w:val="both"/>
         <w:rPr>
@@ -11665,7 +11687,7 @@
           <w:tab w:val="clear" w:pos="720"/>
           <w:tab w:val="num" w:pos="180"/>
         </w:tabs>
-        <w:spacing w:before="100" w:beforeAutospacing="1" w:after="100" w:afterAutospacing="1" w:line="360" w:lineRule="auto"/>
+        <w:spacing w:after="100" w:afterAutospacing="1" w:line="360" w:lineRule="auto"/>
         <w:ind w:hanging="720"/>
         <w:jc w:val="both"/>
         <w:rPr>
@@ -11739,12 +11761,13 @@
     <w:p>
       <w:pPr>
         <w:pStyle w:val="Caption"/>
-        <w:rPr>
-          <w:sz w:val="24"/>
-          <w:szCs w:val="24"/>
-        </w:rPr>
-      </w:pPr>
-      <w:bookmarkStart w:id="28" w:name="_Toc234515409"/>
+        <w:spacing w:line="360" w:lineRule="auto"/>
+        <w:rPr>
+          <w:sz w:val="24"/>
+          <w:szCs w:val="24"/>
+        </w:rPr>
+      </w:pPr>
+      <w:bookmarkStart w:id="26" w:name="_Toc234601723"/>
       <w:r>
         <w:rPr>
           <w:sz w:val="24"/>
@@ -11838,7 +11861,7 @@
         </w:rPr>
         <w:t xml:space="preserve"> : Waterfall Model</w:t>
       </w:r>
-      <w:bookmarkEnd w:id="28"/>
+      <w:bookmarkEnd w:id="26"/>
     </w:p>
     <w:p>
       <w:pPr>
@@ -11874,6 +11897,7 @@
         <w:spacing w:before="0" w:beforeAutospacing="0" w:after="0" w:afterAutospacing="0" w:line="360" w:lineRule="auto"/>
       </w:pPr>
       <w:r>
+        <w:lastRenderedPageBreak/>
         <w:t>Finally, most importantly, the chart of work assignment.</w:t>
       </w:r>
     </w:p>
@@ -11971,13 +11995,8 @@
               <w:pStyle w:val="NormalWeb"/>
               <w:spacing w:before="0" w:beforeAutospacing="0" w:after="0" w:afterAutospacing="0" w:line="360" w:lineRule="auto"/>
             </w:pPr>
-            <w:proofErr w:type="spellStart"/>
-            <w:r>
-              <w:t>Divya</w:t>
-            </w:r>
-            <w:proofErr w:type="spellEnd"/>
-            <w:r>
-              <w:t xml:space="preserve"> Sharma</w:t>
+            <w:r>
+              <w:t>Divya Sharma</w:t>
             </w:r>
           </w:p>
         </w:tc>
@@ -12046,13 +12065,8 @@
               <w:spacing w:before="0" w:beforeAutospacing="0" w:after="0" w:afterAutospacing="0" w:line="360" w:lineRule="auto"/>
               <w:ind w:left="346"/>
             </w:pPr>
-            <w:proofErr w:type="gramStart"/>
-            <w:r>
-              <w:t>system</w:t>
-            </w:r>
-            <w:proofErr w:type="gramEnd"/>
-            <w:r>
-              <w:t xml:space="preserve"> design.</w:t>
+            <w:r>
+              <w:t>system design.</w:t>
             </w:r>
           </w:p>
         </w:tc>
@@ -12093,13 +12107,8 @@
               <w:spacing w:before="0" w:beforeAutospacing="0" w:after="0" w:afterAutospacing="0" w:line="360" w:lineRule="auto"/>
             </w:pPr>
             <w:r>
-              <w:t xml:space="preserve">Sabina </w:t>
-            </w:r>
-            <w:proofErr w:type="spellStart"/>
-            <w:r>
-              <w:t>Puwanli</w:t>
-            </w:r>
-            <w:proofErr w:type="spellEnd"/>
+              <w:t>Sabina Puwanli</w:t>
+            </w:r>
           </w:p>
         </w:tc>
         <w:tc>
@@ -12213,19 +12222,21 @@
         <w:tabs>
           <w:tab w:val="left" w:pos="270"/>
         </w:tabs>
+        <w:spacing w:after="0" w:line="360" w:lineRule="auto"/>
         <w:ind w:left="360" w:hanging="396"/>
       </w:pPr>
       <w:r>
+        <w:lastRenderedPageBreak/>
         <w:t xml:space="preserve"> </w:t>
       </w:r>
-      <w:bookmarkStart w:id="29" w:name="_Toc234565771"/>
+      <w:bookmarkStart w:id="27" w:name="_Toc234565771"/>
       <w:r>
         <w:t xml:space="preserve">Gantt </w:t>
       </w:r>
       <w:r>
         <w:t>chart</w:t>
       </w:r>
-      <w:bookmarkEnd w:id="29"/>
+      <w:bookmarkEnd w:id="27"/>
     </w:p>
     <w:p>
       <w:pPr>
@@ -12298,12 +12309,13 @@
     <w:p>
       <w:pPr>
         <w:pStyle w:val="Caption"/>
-        <w:rPr>
-          <w:sz w:val="24"/>
-          <w:szCs w:val="24"/>
-        </w:rPr>
-      </w:pPr>
-      <w:bookmarkStart w:id="30" w:name="_Toc234515410"/>
+        <w:spacing w:line="360" w:lineRule="auto"/>
+        <w:rPr>
+          <w:sz w:val="24"/>
+          <w:szCs w:val="24"/>
+        </w:rPr>
+      </w:pPr>
+      <w:bookmarkStart w:id="28" w:name="_Toc234601724"/>
       <w:r>
         <w:rPr>
           <w:sz w:val="24"/>
@@ -12395,18 +12407,9 @@
           <w:sz w:val="24"/>
           <w:szCs w:val="24"/>
         </w:rPr>
-        <w:t xml:space="preserve"> : Gantt </w:t>
-      </w:r>
-      <w:proofErr w:type="gramStart"/>
-      <w:r>
-        <w:rPr>
-          <w:sz w:val="24"/>
-          <w:szCs w:val="24"/>
-        </w:rPr>
-        <w:t>Chart</w:t>
-      </w:r>
-      <w:bookmarkEnd w:id="30"/>
-      <w:proofErr w:type="gramEnd"/>
+        <w:t xml:space="preserve"> : Gantt Chart</w:t>
+      </w:r>
+      <w:bookmarkEnd w:id="28"/>
     </w:p>
     <w:p>
       <w:pPr>
@@ -12418,14 +12421,15 @@
       <w:r>
         <w:br w:type="page"/>
       </w:r>
-      <w:bookmarkStart w:id="31" w:name="_Toc234565772"/>
-      <w:r>
+      <w:bookmarkStart w:id="29" w:name="_Toc234565772"/>
+      <w:r>
+        <w:lastRenderedPageBreak/>
         <w:t>.</w:t>
       </w:r>
       <w:r>
         <w:t>Testing</w:t>
       </w:r>
-      <w:bookmarkEnd w:id="31"/>
+      <w:bookmarkEnd w:id="29"/>
     </w:p>
     <w:p>
       <w:pPr>
@@ -12598,21 +12602,7 @@
         <w:rPr>
           <w:lang w:val="en-US"/>
         </w:rPr>
-        <w:t xml:space="preserve">The application was compiled and executed using the </w:t>
-      </w:r>
-      <w:proofErr w:type="spellStart"/>
-      <w:r>
-        <w:rPr>
-          <w:lang w:val="en-US"/>
-        </w:rPr>
-        <w:t>Dev</w:t>
-      </w:r>
-      <w:proofErr w:type="spellEnd"/>
-      <w:r>
-        <w:rPr>
-          <w:lang w:val="en-US"/>
-        </w:rPr>
-        <w:t>-C++ compiler on Windows. The binary data file (</w:t>
+        <w:t>The application was compiled and executed using the Dev-C++ compiler on Windows. The binary data file (</w:t>
       </w:r>
       <w:r>
         <w:rPr>
@@ -12711,11 +12701,12 @@
         <w:spacing w:line="360" w:lineRule="auto"/>
         <w:ind w:left="270" w:hanging="396"/>
       </w:pPr>
-      <w:bookmarkStart w:id="32" w:name="_Toc234565773"/>
-      <w:r>
+      <w:bookmarkStart w:id="30" w:name="_Toc234565773"/>
+      <w:r>
+        <w:lastRenderedPageBreak/>
         <w:t>Test Case 1 (User Registration)</w:t>
       </w:r>
-      <w:bookmarkEnd w:id="32"/>
+      <w:bookmarkEnd w:id="30"/>
     </w:p>
     <w:tbl>
       <w:tblPr>
@@ -13000,19 +12991,11 @@
                 <w:lang w:val="en-US"/>
               </w:rPr>
             </w:pPr>
-            <w:proofErr w:type="spellStart"/>
-            <w:r>
-              <w:rPr>
-                <w:lang w:val="en-US"/>
-              </w:rPr>
-              <w:t>Divya</w:t>
-            </w:r>
-            <w:proofErr w:type="spellEnd"/>
-            <w:r>
-              <w:rPr>
-                <w:lang w:val="en-US"/>
-              </w:rPr>
-              <w:t xml:space="preserve"> Sharma</w:t>
+            <w:r>
+              <w:rPr>
+                <w:lang w:val="en-US"/>
+              </w:rPr>
+              <w:t>Divya Sharma</w:t>
             </w:r>
           </w:p>
         </w:tc>
@@ -13058,16 +13041,8 @@
               <w:rPr>
                 <w:lang w:val="en-US"/>
               </w:rPr>
-              <w:t xml:space="preserve">Sabina </w:t>
-            </w:r>
-            <w:proofErr w:type="spellStart"/>
-            <w:r>
-              <w:rPr>
-                <w:lang w:val="en-US"/>
-              </w:rPr>
-              <w:t>Puwanli</w:t>
-            </w:r>
-            <w:proofErr w:type="spellEnd"/>
+              <w:t>Sabina Puwanli</w:t>
+            </w:r>
           </w:p>
         </w:tc>
       </w:tr>
@@ -13078,11 +13053,11 @@
         <w:spacing w:line="360" w:lineRule="auto"/>
         <w:ind w:left="360" w:hanging="360"/>
       </w:pPr>
-      <w:bookmarkStart w:id="33" w:name="_Toc234565774"/>
+      <w:bookmarkStart w:id="31" w:name="_Toc234565774"/>
       <w:r>
         <w:t>Test Case 2 (User Login)</w:t>
       </w:r>
-      <w:bookmarkEnd w:id="33"/>
+      <w:bookmarkEnd w:id="31"/>
     </w:p>
     <w:tbl>
       <w:tblPr>
@@ -13365,16 +13340,8 @@
               <w:rPr>
                 <w:lang w:val="en-US"/>
               </w:rPr>
-              <w:t xml:space="preserve">Sabina </w:t>
-            </w:r>
-            <w:proofErr w:type="spellStart"/>
-            <w:r>
-              <w:rPr>
-                <w:lang w:val="en-US"/>
-              </w:rPr>
-              <w:t>Puwanli</w:t>
-            </w:r>
-            <w:proofErr w:type="spellEnd"/>
+              <w:t>Sabina Puwanli</w:t>
+            </w:r>
           </w:p>
         </w:tc>
       </w:tr>
@@ -13415,19 +13382,11 @@
                 <w:lang w:val="en-US"/>
               </w:rPr>
             </w:pPr>
-            <w:proofErr w:type="spellStart"/>
-            <w:r>
-              <w:rPr>
-                <w:lang w:val="en-US"/>
-              </w:rPr>
-              <w:t>Divya</w:t>
-            </w:r>
-            <w:proofErr w:type="spellEnd"/>
-            <w:r>
-              <w:rPr>
-                <w:lang w:val="en-US"/>
-              </w:rPr>
-              <w:t xml:space="preserve"> Sharma</w:t>
+            <w:r>
+              <w:rPr>
+                <w:lang w:val="en-US"/>
+              </w:rPr>
+              <w:t>Divya Sharma</w:t>
             </w:r>
           </w:p>
         </w:tc>
@@ -13442,11 +13401,11 @@
           <w:lang w:val="en-US"/>
         </w:rPr>
       </w:pPr>
-      <w:bookmarkStart w:id="34" w:name="_Toc234565775"/>
+      <w:bookmarkStart w:id="32" w:name="_Toc234565775"/>
       <w:r>
         <w:t>Test Case 3 (Single Player Gameplay)</w:t>
       </w:r>
-      <w:bookmarkEnd w:id="34"/>
+      <w:bookmarkEnd w:id="32"/>
     </w:p>
     <w:tbl>
       <w:tblPr>
@@ -13571,6 +13530,7 @@
                 <w:bCs/>
                 <w:lang w:val="en-US"/>
               </w:rPr>
+              <w:lastRenderedPageBreak/>
               <w:t>Expected Result</w:t>
             </w:r>
           </w:p>
@@ -13725,19 +13685,11 @@
                 <w:lang w:val="en-US"/>
               </w:rPr>
             </w:pPr>
-            <w:proofErr w:type="spellStart"/>
-            <w:r>
-              <w:rPr>
-                <w:lang w:val="en-US"/>
-              </w:rPr>
-              <w:t>Divya</w:t>
-            </w:r>
-            <w:proofErr w:type="spellEnd"/>
-            <w:r>
-              <w:rPr>
-                <w:lang w:val="en-US"/>
-              </w:rPr>
-              <w:t xml:space="preserve"> Sharma</w:t>
+            <w:r>
+              <w:rPr>
+                <w:lang w:val="en-US"/>
+              </w:rPr>
+              <w:t>Divya Sharma</w:t>
             </w:r>
           </w:p>
         </w:tc>
@@ -13789,16 +13741,8 @@
               <w:rPr>
                 <w:lang w:val="en-US"/>
               </w:rPr>
-              <w:t xml:space="preserve">abina </w:t>
-            </w:r>
-            <w:proofErr w:type="spellStart"/>
-            <w:r>
-              <w:rPr>
-                <w:lang w:val="en-US"/>
-              </w:rPr>
-              <w:t>Puwanli</w:t>
-            </w:r>
-            <w:proofErr w:type="spellEnd"/>
+              <w:t>abina Puwanli</w:t>
+            </w:r>
           </w:p>
         </w:tc>
       </w:tr>
@@ -13822,14 +13766,14 @@
           <w:lang w:val="en-US"/>
         </w:rPr>
       </w:pPr>
-      <w:bookmarkStart w:id="35" w:name="_Toc234565776"/>
+      <w:bookmarkStart w:id="33" w:name="_Toc234565776"/>
       <w:r>
         <w:rPr>
           <w:lang w:val="en-US"/>
         </w:rPr>
         <w:t>Test Case 4 (Multiplayer Gameplay)</w:t>
       </w:r>
-      <w:bookmarkEnd w:id="35"/>
+      <w:bookmarkEnd w:id="33"/>
     </w:p>
     <w:tbl>
       <w:tblPr>
@@ -14108,19 +14052,11 @@
                 <w:lang w:val="en-US"/>
               </w:rPr>
             </w:pPr>
-            <w:proofErr w:type="spellStart"/>
-            <w:r>
-              <w:rPr>
-                <w:lang w:val="en-US"/>
-              </w:rPr>
-              <w:t>Divya</w:t>
-            </w:r>
-            <w:proofErr w:type="spellEnd"/>
-            <w:r>
-              <w:rPr>
-                <w:lang w:val="en-US"/>
-              </w:rPr>
-              <w:t xml:space="preserve"> Sharma</w:t>
+            <w:r>
+              <w:rPr>
+                <w:lang w:val="en-US"/>
+              </w:rPr>
+              <w:t>Divya Sharma</w:t>
             </w:r>
           </w:p>
         </w:tc>
@@ -14174,14 +14110,14 @@
           <w:lang w:val="en-US"/>
         </w:rPr>
       </w:pPr>
-      <w:bookmarkStart w:id="36" w:name="_Toc234565777"/>
+      <w:bookmarkStart w:id="34" w:name="_Toc234565777"/>
       <w:r>
         <w:rPr>
           <w:lang w:val="en-US"/>
         </w:rPr>
         <w:t>Test Case 5 (Leaderboard)</w:t>
       </w:r>
-      <w:bookmarkEnd w:id="36"/>
+      <w:bookmarkEnd w:id="34"/>
     </w:p>
     <w:tbl>
       <w:tblPr>
@@ -14300,6 +14236,7 @@
                 <w:bCs/>
                 <w:lang w:val="en-US"/>
               </w:rPr>
+              <w:lastRenderedPageBreak/>
               <w:t>Expected Result</w:t>
             </w:r>
           </w:p>
@@ -14452,16 +14389,8 @@
               <w:rPr>
                 <w:lang w:val="en-US"/>
               </w:rPr>
-              <w:t xml:space="preserve">Sabina </w:t>
-            </w:r>
-            <w:proofErr w:type="spellStart"/>
-            <w:r>
-              <w:rPr>
-                <w:lang w:val="en-US"/>
-              </w:rPr>
-              <w:t>Puwanli</w:t>
-            </w:r>
-            <w:proofErr w:type="spellEnd"/>
+              <w:t>Sabina Puwanli</w:t>
+            </w:r>
           </w:p>
         </w:tc>
       </w:tr>
@@ -14500,19 +14429,11 @@
                 <w:lang w:val="en-US"/>
               </w:rPr>
             </w:pPr>
-            <w:proofErr w:type="spellStart"/>
-            <w:r>
-              <w:rPr>
-                <w:lang w:val="en-US"/>
-              </w:rPr>
-              <w:t>Divya</w:t>
-            </w:r>
-            <w:proofErr w:type="spellEnd"/>
-            <w:r>
-              <w:rPr>
-                <w:lang w:val="en-US"/>
-              </w:rPr>
-              <w:t xml:space="preserve"> Sharma</w:t>
+            <w:r>
+              <w:rPr>
+                <w:lang w:val="en-US"/>
+              </w:rPr>
+              <w:t>Divya Sharma</w:t>
             </w:r>
           </w:p>
         </w:tc>
@@ -14537,11 +14458,11 @@
           <w:lang w:val="en-US"/>
         </w:rPr>
       </w:pPr>
-      <w:bookmarkStart w:id="37" w:name="_Toc234565778"/>
+      <w:bookmarkStart w:id="35" w:name="_Toc234565778"/>
       <w:r>
         <w:t>Requirement Traceability Matrix (RTM)</w:t>
       </w:r>
-      <w:bookmarkEnd w:id="37"/>
+      <w:bookmarkEnd w:id="35"/>
     </w:p>
     <w:tbl>
       <w:tblPr>
@@ -15511,6 +15432,7 @@
               <w:rPr>
                 <w:lang w:val="en-US"/>
               </w:rPr>
+              <w:lastRenderedPageBreak/>
               <w:t>109</w:t>
             </w:r>
           </w:p>
@@ -15722,13 +15644,15 @@
     <w:p>
       <w:pPr>
         <w:pStyle w:val="Heading2"/>
+        <w:spacing w:line="360" w:lineRule="auto"/>
         <w:ind w:left="360" w:hanging="360"/>
       </w:pPr>
-      <w:bookmarkStart w:id="38" w:name="_Toc234565779"/>
-      <w:r>
+      <w:bookmarkStart w:id="36" w:name="_Toc234565779"/>
+      <w:r>
+        <w:lastRenderedPageBreak/>
         <w:t>User Acceptance Testing (UAT)</w:t>
       </w:r>
-      <w:bookmarkEnd w:id="38"/>
+      <w:bookmarkEnd w:id="36"/>
     </w:p>
     <w:tbl>
       <w:tblPr>
@@ -16717,23 +16641,13 @@
                 <w:szCs w:val="24"/>
               </w:rPr>
             </w:pPr>
-            <w:proofErr w:type="spellStart"/>
             <w:r>
               <w:rPr>
                 <w:rFonts w:eastAsiaTheme="majorEastAsia" w:cs="Times New Roman"/>
                 <w:bCs/>
                 <w:szCs w:val="24"/>
               </w:rPr>
-              <w:t>Leaderboard</w:t>
-            </w:r>
-            <w:proofErr w:type="spellEnd"/>
-            <w:r>
-              <w:rPr>
-                <w:rFonts w:eastAsiaTheme="majorEastAsia" w:cs="Times New Roman"/>
-                <w:bCs/>
-                <w:szCs w:val="24"/>
-              </w:rPr>
-              <w:t xml:space="preserve"> displays rankings correctly.</w:t>
+              <w:t>Leaderboard displays rankings correctly.</w:t>
             </w:r>
           </w:p>
         </w:tc>
@@ -17152,14 +17066,15 @@
       <w:r>
         <w:br w:type="page"/>
       </w:r>
-      <w:bookmarkStart w:id="39" w:name="_Toc234565780"/>
-      <w:r>
+      <w:bookmarkStart w:id="37" w:name="_Toc234565780"/>
+      <w:r>
+        <w:lastRenderedPageBreak/>
         <w:t>.</w:t>
       </w:r>
       <w:r>
         <w:t>Project Results</w:t>
       </w:r>
-      <w:bookmarkEnd w:id="39"/>
+      <w:bookmarkEnd w:id="37"/>
     </w:p>
     <w:p>
       <w:pPr>
@@ -17497,6 +17412,7 @@
           <w:szCs w:val="24"/>
           <w:lang w:val="en-US"/>
         </w:rPr>
+        <w:lastRenderedPageBreak/>
         <w:t>Working as a team helped us improve our communication, coordination, and problem-solving skills. We learned how to divide tasks, support each other during development, and solve programming challenges together. Overall, this project provided valuable practical experience and increased our confidence in developing real-world software applications using C programming.</w:t>
       </w:r>
     </w:p>
@@ -17525,14 +17441,15 @@
         <w:ind w:left="360" w:hanging="360"/>
         <w:jc w:val="both"/>
       </w:pPr>
-      <w:bookmarkStart w:id="40" w:name="_Toc234565781"/>
-      <w:r>
+      <w:bookmarkStart w:id="38" w:name="_Toc234565781"/>
+      <w:r>
+        <w:lastRenderedPageBreak/>
         <w:t>.</w:t>
       </w:r>
       <w:r>
         <w:t>Future Enhancements</w:t>
       </w:r>
-      <w:bookmarkEnd w:id="40"/>
+      <w:bookmarkEnd w:id="38"/>
     </w:p>
     <w:p>
       <w:pPr>
@@ -17853,22 +17770,23 @@
     <w:p>
       <w:pPr>
         <w:pStyle w:val="Heading1"/>
-        <w:spacing w:line="360" w:lineRule="auto"/>
+        <w:spacing w:before="0" w:line="360" w:lineRule="auto"/>
         <w:ind w:left="360" w:hanging="360"/>
         <w:jc w:val="both"/>
       </w:pPr>
-      <w:bookmarkStart w:id="41" w:name="_Toc234565782"/>
-      <w:r>
+      <w:bookmarkStart w:id="39" w:name="_Toc234565782"/>
+      <w:r>
+        <w:lastRenderedPageBreak/>
         <w:t>.</w:t>
       </w:r>
       <w:r>
         <w:t xml:space="preserve"> Conclusion</w:t>
       </w:r>
-      <w:bookmarkEnd w:id="41"/>
-    </w:p>
-    <w:p>
-      <w:pPr>
-        <w:spacing w:before="100" w:beforeAutospacing="1" w:after="100" w:afterAutospacing="1" w:line="360" w:lineRule="auto"/>
+      <w:bookmarkEnd w:id="39"/>
+    </w:p>
+    <w:p>
+      <w:pPr>
+        <w:spacing w:after="100" w:afterAutospacing="1" w:line="360" w:lineRule="auto"/>
         <w:jc w:val="both"/>
         <w:rPr>
           <w:rFonts w:eastAsia="Times New Roman" w:cs="Times New Roman"/>
@@ -17887,7 +17805,7 @@
     </w:p>
     <w:p>
       <w:pPr>
-        <w:spacing w:before="100" w:beforeAutospacing="1" w:after="100" w:afterAutospacing="1" w:line="360" w:lineRule="auto"/>
+        <w:spacing w:after="100" w:afterAutospacing="1" w:line="360" w:lineRule="auto"/>
         <w:jc w:val="both"/>
         <w:rPr>
           <w:rFonts w:eastAsia="Times New Roman" w:cs="Times New Roman"/>
@@ -17986,14 +17904,13 @@
         <w:spacing w:line="360" w:lineRule="auto"/>
         <w:ind w:left="360" w:hanging="360"/>
       </w:pPr>
-      <w:bookmarkStart w:id="42" w:name="_Toc234565783"/>
-      <w:r>
+      <w:r>
+        <w:lastRenderedPageBreak/>
         <w:t>.</w:t>
       </w:r>
       <w:r>
-        <w:t>References</w:t>
-      </w:r>
-      <w:bookmarkEnd w:id="42"/>
+        <w:t xml:space="preserve"> References</w:t>
+      </w:r>
     </w:p>
     <w:p>
       <w:pPr>
@@ -18025,15 +17942,67 @@
         <w:t>th</w:t>
       </w:r>
       <w:r>
+        <w:t xml:space="preserve"> ed.). McGraw Hill Education.</w:t>
+      </w:r>
+    </w:p>
+    <w:p>
+      <w:pPr>
+        <w:spacing w:line="360" w:lineRule="auto"/>
+        <w:rPr>
+          <w:b/>
+        </w:rPr>
+      </w:pPr>
+      <w:r>
+        <w:t xml:space="preserve">2. </w:t>
+      </w:r>
+      <w:r>
+        <w:t xml:space="preserve">Prata, S. (2014). </w:t>
+      </w:r>
+      <w:r>
+        <w:rPr>
+          <w:rStyle w:val="Emphasis"/>
+          <w:szCs w:val="24"/>
+        </w:rPr>
+        <w:t>C Primer Plus</w:t>
+      </w:r>
+      <w:r>
+        <w:t xml:space="preserve"> (6</w:t>
+      </w:r>
+      <w:r>
+        <w:rPr>
+          <w:vertAlign w:val="superscript"/>
+        </w:rPr>
+        <w:t>th</w:t>
+      </w:r>
+      <w:r>
+        <w:t xml:space="preserve"> ed.). Pearson </w:t>
+      </w:r>
+      <w:r>
+        <w:t>Education.</w:t>
+      </w:r>
+      <w:r>
+        <w:rPr>
+          <w:color w:val="000000" w:themeColor="text1"/>
+        </w:rPr>
+        <w:t xml:space="preserve"> Retrieved</w:t>
+      </w:r>
+      <w:r>
+        <w:rPr>
+          <w:color w:val="000000" w:themeColor="text1"/>
+        </w:rPr>
+        <w:t xml:space="preserve"> from</w:t>
+      </w:r>
+      <w:r>
+        <w:rPr>
+          <w:u w:val="single"/>
+        </w:rPr>
         <w:t xml:space="preserve"> </w:t>
       </w:r>
-      <w:proofErr w:type="gramStart"/>
-      <w:r>
-        <w:t>ed</w:t>
-      </w:r>
-      <w:proofErr w:type="gramEnd"/>
-      <w:r>
-        <w:t>.). McGraw Hill Education.</w:t>
+      <w:r>
+        <w:rPr>
+          <w:u w:val="single"/>
+        </w:rPr>
+        <w:t>https://www.pearson.com/en-us/subject-catalog/p/c-primer-plus/P200000003370</w:t>
       </w:r>
     </w:p>
     <w:p>
@@ -18041,40 +18010,54 @@
         <w:spacing w:line="360" w:lineRule="auto"/>
         <w:rPr>
           <w:b/>
-        </w:rPr>
-      </w:pPr>
-      <w:r>
-        <w:t xml:space="preserve">2. </w:t>
-      </w:r>
-      <w:r>
-        <w:t xml:space="preserve">Prata, S. (2014). </w:t>
+          <w:u w:val="single"/>
+        </w:rPr>
+      </w:pPr>
+      <w:r>
+        <w:t xml:space="preserve">3. </w:t>
+      </w:r>
+      <w:r>
+        <w:t xml:space="preserve">Kernighan, B. W., &amp; Ritchie, D. M. (1988). </w:t>
       </w:r>
       <w:r>
         <w:rPr>
           <w:rStyle w:val="Emphasis"/>
           <w:szCs w:val="24"/>
         </w:rPr>
-        <w:t>C Primer Plus</w:t>
-      </w:r>
-      <w:r>
-        <w:t xml:space="preserve"> (6</w:t>
+        <w:t>The C Programming Language</w:t>
+      </w:r>
+      <w:r>
+        <w:t xml:space="preserve"> (2</w:t>
       </w:r>
       <w:r>
         <w:rPr>
           <w:vertAlign w:val="superscript"/>
         </w:rPr>
-        <w:t>th</w:t>
-      </w:r>
-      <w:r>
+        <w:t>nd</w:t>
+      </w:r>
+      <w:r>
+        <w:t xml:space="preserve"> ed.). Prentice Hall.</w:t>
+      </w:r>
+      <w:r>
+        <w:rPr>
+          <w:color w:val="000000" w:themeColor="text1"/>
+        </w:rPr>
         <w:t xml:space="preserve"> </w:t>
       </w:r>
-      <w:proofErr w:type="gramStart"/>
-      <w:r>
-        <w:t>ed</w:t>
-      </w:r>
-      <w:proofErr w:type="gramEnd"/>
-      <w:r>
-        <w:t>.). Pearson Education.</w:t>
+      <w:r>
+        <w:rPr>
+          <w:color w:val="000000" w:themeColor="text1"/>
+        </w:rPr>
+        <w:t>Retrieved from</w:t>
+      </w:r>
+      <w:r>
+        <w:t xml:space="preserve"> </w:t>
+      </w:r>
+      <w:r>
+        <w:rPr>
+          <w:u w:val="single"/>
+        </w:rPr>
+        <w:t>https://www.pearson.com/en-us/subject-catalog/p/the-c-programming-language/P200000003088 Mermaid. (n.d.). *Mermaid Diagram Syntax*. https://mermaid.js.org/</w:t>
       </w:r>
     </w:p>
     <w:p>
@@ -18082,64 +18065,45 @@
         <w:spacing w:line="360" w:lineRule="auto"/>
         <w:rPr>
           <w:b/>
-        </w:rPr>
-      </w:pPr>
-      <w:r>
-        <w:t xml:space="preserve">3. </w:t>
-      </w:r>
-      <w:r>
-        <w:t xml:space="preserve">Kernighan, B. W., &amp; Ritchie, D. M. (1988). </w:t>
+          <w:u w:val="single"/>
+        </w:rPr>
+      </w:pPr>
+      <w:r>
+        <w:t xml:space="preserve">4. </w:t>
+      </w:r>
+      <w:r>
+        <w:t xml:space="preserve">Pokhara University. (Latest Edition). </w:t>
       </w:r>
       <w:r>
         <w:rPr>
           <w:rStyle w:val="Emphasis"/>
           <w:szCs w:val="24"/>
         </w:rPr>
-        <w:t>The C Programming Language</w:t>
-      </w:r>
-      <w:r>
-        <w:t xml:space="preserve"> (2</w:t>
-      </w:r>
-      <w:r>
-        <w:rPr>
-          <w:vertAlign w:val="superscript"/>
-        </w:rPr>
-        <w:t>nd</w:t>
-      </w:r>
-      <w:r>
-        <w:t xml:space="preserve"> </w:t>
-      </w:r>
-      <w:proofErr w:type="gramStart"/>
-      <w:r>
-        <w:t>ed</w:t>
-      </w:r>
-      <w:proofErr w:type="gramEnd"/>
-      <w:r>
-        <w:t>.). Prentice Hall.</w:t>
-      </w:r>
-    </w:p>
-    <w:p>
-      <w:pPr>
-        <w:spacing w:line="360" w:lineRule="auto"/>
-        <w:rPr>
-          <w:b/>
-        </w:rPr>
-      </w:pPr>
-      <w:r>
-        <w:t xml:space="preserve">4. </w:t>
-      </w:r>
-      <w:r>
-        <w:t xml:space="preserve">Pokhara University. (Latest Edition). </w:t>
-      </w:r>
-      <w:r>
-        <w:rPr>
-          <w:rStyle w:val="Emphasis"/>
-          <w:szCs w:val="24"/>
-        </w:rPr>
         <w:t>Bachelor of Computer Application (BCA) Curriculum</w:t>
       </w:r>
       <w:r>
-        <w:t>. Pokhara University.</w:t>
+        <w:t xml:space="preserve">. Pokhara </w:t>
+      </w:r>
+      <w:r>
+        <w:t>University.</w:t>
+      </w:r>
+      <w:r>
+        <w:rPr>
+          <w:color w:val="000000" w:themeColor="text1"/>
+        </w:rPr>
+        <w:t xml:space="preserve"> Retrieved</w:t>
+      </w:r>
+      <w:r>
+        <w:rPr>
+          <w:color w:val="000000" w:themeColor="text1"/>
+        </w:rPr>
+        <w:t xml:space="preserve"> from </w:t>
+      </w:r>
+      <w:r>
+        <w:rPr>
+          <w:u w:val="single"/>
+        </w:rPr>
+        <w:t>https://pu.edu.np/curriculum-syllabus/</w:t>
       </w:r>
     </w:p>
     <w:p>
@@ -18224,63 +18188,28 @@
         </w:rPr>
       </w:pPr>
       <w:r>
-        <w:t xml:space="preserve">7. </w:t>
-      </w:r>
-      <w:r>
-        <w:rPr>
-          <w:color w:val="000000" w:themeColor="text1"/>
-        </w:rPr>
-        <w:t xml:space="preserve">Programiz. (n.d.). </w:t>
+        <w:rPr>
+          <w:b/>
+        </w:rPr>
+        <w:t>7.</w:t>
+      </w:r>
+      <w:r>
+        <w:t xml:space="preserve"> </w:t>
+      </w:r>
+      <w:r>
+        <w:t xml:space="preserve">Mermaid Chart. (n.d.). </w:t>
       </w:r>
       <w:r>
         <w:rPr>
           <w:rStyle w:val="Emphasis"/>
-          <w:color w:val="000000" w:themeColor="text1"/>
-          <w:szCs w:val="24"/>
-        </w:rPr>
-        <w:t>Learn C Programming</w:t>
-      </w:r>
-      <w:r>
-        <w:rPr>
-          <w:color w:val="000000" w:themeColor="text1"/>
-        </w:rPr>
+          <w:szCs w:val="24"/>
+        </w:rPr>
+        <w:t>Mermaid Diagram Syntax</w:t>
+      </w:r>
+      <w:r>
         <w:t xml:space="preserve">. Retrieved from </w:t>
       </w:r>
       <w:hyperlink r:id="rId25" w:history="1">
-        <w:r>
-          <w:rPr>
-            <w:rStyle w:val="Hyperlink"/>
-            <w:color w:val="000000" w:themeColor="text1"/>
-            <w:szCs w:val="24"/>
-          </w:rPr>
-          <w:t>https://www.programiz.com/c-programming</w:t>
-        </w:r>
-      </w:hyperlink>
-    </w:p>
-    <w:p>
-      <w:pPr>
-        <w:spacing w:line="360" w:lineRule="auto"/>
-        <w:rPr>
-          <w:b/>
-        </w:rPr>
-      </w:pPr>
-      <w:r>
-        <w:t xml:space="preserve">8. </w:t>
-      </w:r>
-      <w:r>
-        <w:t xml:space="preserve">Mermaid Chart. (n.d.). </w:t>
-      </w:r>
-      <w:r>
-        <w:rPr>
-          <w:rStyle w:val="Emphasis"/>
-          <w:szCs w:val="24"/>
-        </w:rPr>
-        <w:t>Mermaid Diagram Syntax</w:t>
-      </w:r>
-      <w:r>
-        <w:t xml:space="preserve">. Retrieved from </w:t>
-      </w:r>
-      <w:hyperlink r:id="rId26" w:history="1">
         <w:r>
           <w:rPr>
             <w:rStyle w:val="Hyperlink"/>
@@ -18303,7 +18232,13 @@
         <w:rPr>
           <w:color w:val="000000" w:themeColor="text1"/>
         </w:rPr>
-        <w:t xml:space="preserve">9. </w:t>
+        <w:t>8</w:t>
+      </w:r>
+      <w:r>
+        <w:rPr>
+          <w:color w:val="000000" w:themeColor="text1"/>
+        </w:rPr>
+        <w:t xml:space="preserve">. </w:t>
       </w:r>
       <w:r>
         <w:rPr>
@@ -18325,11 +18260,11 @@
         </w:rPr>
         <w:t xml:space="preserve">. Retrieved from </w:t>
       </w:r>
-      <w:hyperlink r:id="rId27" w:history="1">
+      <w:hyperlink r:id="rId26" w:history="1">
         <w:r>
           <w:rPr>
             <w:rStyle w:val="Hyperlink"/>
-            <w:color w:val="000000" w:themeColor="text1"/>
+            <w:color w:val="auto"/>
             <w:szCs w:val="24"/>
           </w:rPr>
           <w:t>https://learn.microsoft.com/cpp/c-language/</w:t>
@@ -18340,47 +18275,6 @@
       <w:pPr>
         <w:spacing w:line="360" w:lineRule="auto"/>
         <w:rPr>
-          <w:b/>
-          <w:color w:val="000000" w:themeColor="text1"/>
-        </w:rPr>
-      </w:pPr>
-      <w:r>
-        <w:t xml:space="preserve">10. </w:t>
-      </w:r>
-      <w:r>
-        <w:t xml:space="preserve">GitHub. (n.d.). </w:t>
-      </w:r>
-      <w:r>
-        <w:rPr>
-          <w:rStyle w:val="Emphasis"/>
-          <w:szCs w:val="24"/>
-        </w:rPr>
-        <w:t>GitHub Documentation</w:t>
-      </w:r>
-      <w:r>
-        <w:t xml:space="preserve">. Retrieved </w:t>
-      </w:r>
-      <w:r>
-        <w:rPr>
-          <w:color w:val="000000" w:themeColor="text1"/>
-        </w:rPr>
-        <w:t xml:space="preserve">from </w:t>
-      </w:r>
-      <w:hyperlink r:id="rId28" w:history="1">
-        <w:r>
-          <w:rPr>
-            <w:rStyle w:val="Hyperlink"/>
-            <w:color w:val="000000" w:themeColor="text1"/>
-            <w:szCs w:val="24"/>
-          </w:rPr>
-          <w:t>https://docs.github.com/</w:t>
-        </w:r>
-      </w:hyperlink>
-    </w:p>
-    <w:p>
-      <w:pPr>
-        <w:spacing w:line="360" w:lineRule="auto"/>
-        <w:rPr>
           <w:rFonts w:eastAsia="Times New Roman"/>
           <w:b/>
           <w:lang w:val="en-US"/>
@@ -18413,12 +18307,13 @@
           <w:lang w:val="en-US"/>
         </w:rPr>
       </w:pPr>
-      <w:bookmarkStart w:id="43" w:name="_Toc234565784"/>
+      <w:bookmarkStart w:id="40" w:name="_Toc234565784"/>
       <w:r>
         <w:rPr>
           <w:rFonts w:eastAsia="Times New Roman"/>
           <w:lang w:val="en-US"/>
         </w:rPr>
+        <w:lastRenderedPageBreak/>
         <w:t>.</w:t>
       </w:r>
       <w:r>
@@ -18435,7 +18330,7 @@
         </w:rPr>
         <w:t>Annexures</w:t>
       </w:r>
-      <w:bookmarkEnd w:id="43"/>
+      <w:bookmarkEnd w:id="40"/>
     </w:p>
     <w:p>
       <w:pPr>
@@ -18448,7 +18343,7 @@
           <w:lang w:val="en-US"/>
         </w:rPr>
         <w:drawing>
-          <wp:inline distT="0" distB="0" distL="0" distR="0" wp14:anchorId="245838BC" wp14:editId="5D73CA8C">
+          <wp:inline distT="0" distB="0" distL="0" distR="0" wp14:anchorId="245838BC" wp14:editId="014F07D9">
             <wp:extent cx="5069932" cy="1874520"/>
             <wp:effectExtent l="0" t="0" r="0" b="0"/>
             <wp:docPr id="8" name="Picture 8"/>
@@ -18463,7 +18358,7 @@
                     <pic:cNvPicPr/>
                   </pic:nvPicPr>
                   <pic:blipFill>
-                    <a:blip r:embed="rId29" cstate="print">
+                    <a:blip r:embed="rId27" cstate="print">
                       <a:extLst>
                         <a:ext uri="{28A0092B-C50C-407E-A947-70E740481C1C}">
                           <a14:useLocalDpi xmlns:a14="http://schemas.microsoft.com/office/drawing/2010/main" val="0"/>
@@ -18499,7 +18394,7 @@
           <w:szCs w:val="24"/>
         </w:rPr>
       </w:pPr>
-      <w:bookmarkStart w:id="44" w:name="_Toc234515411"/>
+      <w:bookmarkStart w:id="41" w:name="_Toc234601725"/>
       <w:r>
         <w:rPr>
           <w:sz w:val="24"/>
@@ -18593,7 +18488,7 @@
         </w:rPr>
         <w:t xml:space="preserve"> : Main Menu</w:t>
       </w:r>
-      <w:bookmarkEnd w:id="44"/>
+      <w:bookmarkEnd w:id="41"/>
     </w:p>
     <w:p>
       <w:pPr>
@@ -18621,7 +18516,7 @@
                     <pic:cNvPicPr/>
                   </pic:nvPicPr>
                   <pic:blipFill>
-                    <a:blip r:embed="rId30">
+                    <a:blip r:embed="rId28">
                       <a:extLst>
                         <a:ext uri="{28A0092B-C50C-407E-A947-70E740481C1C}">
                           <a14:useLocalDpi xmlns:a14="http://schemas.microsoft.com/office/drawing/2010/main" val="0"/>
@@ -18657,7 +18552,7 @@
           <w:szCs w:val="24"/>
         </w:rPr>
       </w:pPr>
-      <w:bookmarkStart w:id="45" w:name="_Toc234515412"/>
+      <w:bookmarkStart w:id="42" w:name="_Toc234601726"/>
       <w:r>
         <w:rPr>
           <w:sz w:val="24"/>
@@ -18751,7 +18646,7 @@
         </w:rPr>
         <w:t xml:space="preserve"> : User Registration</w:t>
       </w:r>
-      <w:bookmarkEnd w:id="45"/>
+      <w:bookmarkEnd w:id="42"/>
     </w:p>
     <w:p>
       <w:pPr>
@@ -18786,7 +18681,7 @@
                     <pic:cNvPicPr/>
                   </pic:nvPicPr>
                   <pic:blipFill>
-                    <a:blip r:embed="rId31" cstate="print">
+                    <a:blip r:embed="rId29" cstate="print">
                       <a:extLst>
                         <a:ext uri="{28A0092B-C50C-407E-A947-70E740481C1C}">
                           <a14:useLocalDpi xmlns:a14="http://schemas.microsoft.com/office/drawing/2010/main" val="0"/>
@@ -18822,7 +18717,7 @@
           <w:szCs w:val="24"/>
         </w:rPr>
       </w:pPr>
-      <w:bookmarkStart w:id="46" w:name="_Toc234515413"/>
+      <w:bookmarkStart w:id="43" w:name="_Toc234601727"/>
       <w:r>
         <w:rPr>
           <w:sz w:val="24"/>
@@ -18916,7 +18811,7 @@
         </w:rPr>
         <w:t xml:space="preserve"> : User Login</w:t>
       </w:r>
-      <w:bookmarkEnd w:id="46"/>
+      <w:bookmarkEnd w:id="43"/>
     </w:p>
     <w:p>
       <w:pPr>
@@ -18938,6 +18833,7 @@
           <w:szCs w:val="24"/>
           <w:lang w:val="en-US"/>
         </w:rPr>
+        <w:lastRenderedPageBreak/>
         <w:drawing>
           <wp:inline distT="0" distB="0" distL="0" distR="0" wp14:anchorId="384E7BBB" wp14:editId="4850A677">
             <wp:extent cx="5274310" cy="1811655"/>
@@ -18954,7 +18850,7 @@
                     <pic:cNvPicPr/>
                   </pic:nvPicPr>
                   <pic:blipFill>
-                    <a:blip r:embed="rId32">
+                    <a:blip r:embed="rId30">
                       <a:extLst>
                         <a:ext uri="{28A0092B-C50C-407E-A947-70E740481C1C}">
                           <a14:useLocalDpi xmlns:a14="http://schemas.microsoft.com/office/drawing/2010/main" val="0"/>
@@ -18990,7 +18886,7 @@
           <w:szCs w:val="24"/>
         </w:rPr>
       </w:pPr>
-      <w:bookmarkStart w:id="47" w:name="_Toc234515414"/>
+      <w:bookmarkStart w:id="44" w:name="_Toc234601728"/>
       <w:r>
         <w:rPr>
           <w:sz w:val="24"/>
@@ -19084,7 +18980,7 @@
         </w:rPr>
         <w:t xml:space="preserve"> : Game Dashboard</w:t>
       </w:r>
-      <w:bookmarkEnd w:id="47"/>
+      <w:bookmarkEnd w:id="44"/>
     </w:p>
     <w:p>
       <w:pPr>
@@ -19119,7 +19015,7 @@
                     <pic:cNvPicPr/>
                   </pic:nvPicPr>
                   <pic:blipFill>
-                    <a:blip r:embed="rId33">
+                    <a:blip r:embed="rId31">
                       <a:extLst>
                         <a:ext uri="{28A0092B-C50C-407E-A947-70E740481C1C}">
                           <a14:useLocalDpi xmlns:a14="http://schemas.microsoft.com/office/drawing/2010/main" val="0"/>
@@ -19155,7 +19051,7 @@
           <w:szCs w:val="24"/>
         </w:rPr>
       </w:pPr>
-      <w:bookmarkStart w:id="48" w:name="_Toc234515415"/>
+      <w:bookmarkStart w:id="45" w:name="_Toc234601729"/>
       <w:r>
         <w:rPr>
           <w:sz w:val="24"/>
@@ -19249,7 +19145,7 @@
         </w:rPr>
         <w:t xml:space="preserve"> :  Single player Gameplay</w:t>
       </w:r>
-      <w:bookmarkEnd w:id="48"/>
+      <w:bookmarkEnd w:id="45"/>
     </w:p>
     <w:p>
       <w:pPr>
@@ -19286,7 +19182,7 @@
                     <pic:cNvPicPr/>
                   </pic:nvPicPr>
                   <pic:blipFill>
-                    <a:blip r:embed="rId34">
+                    <a:blip r:embed="rId32">
                       <a:extLst>
                         <a:ext uri="{28A0092B-C50C-407E-A947-70E740481C1C}">
                           <a14:useLocalDpi xmlns:a14="http://schemas.microsoft.com/office/drawing/2010/main" val="0"/>
@@ -19322,7 +19218,7 @@
           <w:szCs w:val="24"/>
         </w:rPr>
       </w:pPr>
-      <w:bookmarkStart w:id="49" w:name="_Toc234515416"/>
+      <w:bookmarkStart w:id="46" w:name="_Toc234601730"/>
       <w:r>
         <w:rPr>
           <w:sz w:val="24"/>
@@ -19416,7 +19312,7 @@
         </w:rPr>
         <w:t xml:space="preserve"> : Profile Menu</w:t>
       </w:r>
-      <w:bookmarkEnd w:id="49"/>
+      <w:bookmarkEnd w:id="46"/>
     </w:p>
     <w:p>
       <w:pPr>
@@ -19435,8 +19331,9 @@
           <w:noProof/>
           <w:lang w:val="en-US"/>
         </w:rPr>
+        <w:lastRenderedPageBreak/>
         <w:drawing>
-          <wp:inline distT="0" distB="0" distL="0" distR="0" wp14:anchorId="76BB0944" wp14:editId="76C422B1">
+          <wp:inline distT="0" distB="0" distL="0" distR="0" wp14:anchorId="76BB0944" wp14:editId="738CF2E4">
             <wp:extent cx="5274310" cy="1637665"/>
             <wp:effectExtent l="0" t="0" r="2540" b="635"/>
             <wp:docPr id="21" name="Picture 21"/>
@@ -19451,7 +19348,7 @@
                     <pic:cNvPicPr/>
                   </pic:nvPicPr>
                   <pic:blipFill>
-                    <a:blip r:embed="rId35" cstate="print">
+                    <a:blip r:embed="rId33" cstate="print">
                       <a:extLst>
                         <a:ext uri="{28A0092B-C50C-407E-A947-70E740481C1C}">
                           <a14:useLocalDpi xmlns:a14="http://schemas.microsoft.com/office/drawing/2010/main" val="0"/>
@@ -19487,7 +19384,7 @@
           <w:szCs w:val="24"/>
         </w:rPr>
       </w:pPr>
-      <w:bookmarkStart w:id="50" w:name="_Toc234515417"/>
+      <w:bookmarkStart w:id="47" w:name="_Toc234601731"/>
       <w:r>
         <w:rPr>
           <w:sz w:val="24"/>
@@ -19581,7 +19478,7 @@
         </w:rPr>
         <w:t xml:space="preserve"> : Leader board</w:t>
       </w:r>
-      <w:bookmarkEnd w:id="50"/>
+      <w:bookmarkEnd w:id="47"/>
     </w:p>
     <w:p>
       <w:pPr>
@@ -19617,7 +19514,7 @@
                     <pic:cNvPicPr/>
                   </pic:nvPicPr>
                   <pic:blipFill>
-                    <a:blip r:embed="rId36" cstate="print">
+                    <a:blip r:embed="rId34" cstate="print">
                       <a:extLst>
                         <a:ext uri="{28A0092B-C50C-407E-A947-70E740481C1C}">
                           <a14:useLocalDpi xmlns:a14="http://schemas.microsoft.com/office/drawing/2010/main" val="0"/>
@@ -19653,7 +19550,7 @@
           <w:szCs w:val="24"/>
         </w:rPr>
       </w:pPr>
-      <w:bookmarkStart w:id="51" w:name="_Toc234515418"/>
+      <w:bookmarkStart w:id="48" w:name="_Toc234601732"/>
       <w:r>
         <w:rPr>
           <w:sz w:val="24"/>
@@ -19747,7 +19644,7 @@
         </w:rPr>
         <w:t xml:space="preserve"> : View History</w:t>
       </w:r>
-      <w:bookmarkEnd w:id="51"/>
+      <w:bookmarkEnd w:id="48"/>
     </w:p>
     <w:p>
       <w:pPr>
@@ -19767,7 +19664,7 @@
 </file>
 
 <file path=word/endnotes.xml><?xml version="1.0" encoding="utf-8"?>
-<w:endnotes xmlns:wpc="http://schemas.microsoft.com/office/word/2010/wordprocessingCanvas" xmlns:mc="http://schemas.openxmlformats.org/markup-compatibility/2006" xmlns:o="urn:schemas-microsoft-com:office:office" xmlns:r="http://schemas.openxmlformats.org/officeDocument/2006/relationships" xmlns:m="http://schemas.openxmlformats.org/officeDocument/2006/math" xmlns:v="urn:schemas-microsoft-com:vml" xmlns:wp14="http://schemas.microsoft.com/office/word/2010/wordprocessingDrawing" xmlns:wp="http://schemas.openxmlformats.org/drawingml/2006/wordprocessingDrawing" xmlns:w10="urn:schemas-microsoft-com:office:word" xmlns:w="http://schemas.openxmlformats.org/wordprocessingml/2006/main" xmlns:w14="http://schemas.microsoft.com/office/word/2010/wordml" xmlns:w15="http://schemas.microsoft.com/office/word/2012/wordml" xmlns:wpg="http://schemas.microsoft.com/office/word/2010/wordprocessingGroup" xmlns:wpi="http://schemas.microsoft.com/office/word/2010/wordprocessingInk" xmlns:wne="http://schemas.microsoft.com/office/word/2006/wordml" xmlns:wps="http://schemas.microsoft.com/office/word/2010/wordprocessingShape" mc:Ignorable="w14 w15 wp14">
+<w:endnotes xmlns:wpc="http://schemas.microsoft.com/office/word/2010/wordprocessingCanvas" xmlns:cx="http://schemas.microsoft.com/office/drawing/2014/chartex" xmlns:cx1="http://schemas.microsoft.com/office/drawing/2015/9/8/chartex" xmlns:cx2="http://schemas.microsoft.com/office/drawing/2015/10/21/chartex" xmlns:cx3="http://schemas.microsoft.com/office/drawing/2016/5/9/chartex" xmlns:cx4="http://schemas.microsoft.com/office/drawing/2016/5/10/chartex" xmlns:cx5="http://schemas.microsoft.com/office/drawing/2016/5/11/chartex" xmlns:cx6="http://schemas.microsoft.com/office/drawing/2016/5/12/chartex" xmlns:cx7="http://schemas.microsoft.com/office/drawing/2016/5/13/chartex" xmlns:cx8="http://schemas.microsoft.com/office/drawing/2016/5/14/chartex" xmlns:mc="http://schemas.openxmlformats.org/markup-compatibility/2006" xmlns:aink="http://schemas.microsoft.com/office/drawing/2016/ink" xmlns:am3d="http://schemas.microsoft.com/office/drawing/2017/model3d" xmlns:o="urn:schemas-microsoft-com:office:office" xmlns:oel="http://schemas.microsoft.com/office/2019/extlst" xmlns:r="http://schemas.openxmlformats.org/officeDocument/2006/relationships" xmlns:m="http://schemas.openxmlformats.org/officeDocument/2006/math" xmlns:v="urn:schemas-microsoft-com:vml" xmlns:wp14="http://schemas.microsoft.com/office/word/2010/wordprocessingDrawing" xmlns:wp="http://schemas.openxmlformats.org/drawingml/2006/wordprocessingDrawing" xmlns:w10="urn:schemas-microsoft-com:office:word" xmlns:w="http://schemas.openxmlformats.org/wordprocessingml/2006/main" xmlns:w14="http://schemas.microsoft.com/office/word/2010/wordml" xmlns:w15="http://schemas.microsoft.com/office/word/2012/wordml" xmlns:w16cex="http://schemas.microsoft.com/office/word/2018/wordml/cex" xmlns:w16cid="http://schemas.microsoft.com/office/word/2016/wordml/cid" xmlns:w16="http://schemas.microsoft.com/office/word/2018/wordml" xmlns:w16du="http://schemas.microsoft.com/office/word/2023/wordml/word16du" xmlns:w16sdtdh="http://schemas.microsoft.com/office/word/2020/wordml/sdtdatahash" xmlns:w16sdtfl="http://schemas.microsoft.com/office/word/2024/wordml/sdtformatlock" xmlns:w16se="http://schemas.microsoft.com/office/word/2015/wordml/symex" xmlns:wpg="http://schemas.microsoft.com/office/word/2010/wordprocessingGroup" xmlns:wpi="http://schemas.microsoft.com/office/word/2010/wordprocessingInk" xmlns:wne="http://schemas.microsoft.com/office/word/2006/wordml" xmlns:wps="http://schemas.microsoft.com/office/word/2010/wordprocessingShape" mc:Ignorable="w14 w15 w16se w16cid w16 w16cex w16sdtdh w16sdtfl w16du wp14">
   <w:endnote w:type="separator" w:id="-1">
     <w:p>
       <w:pPr>
@@ -19792,7 +19689,7 @@
 </file>
 
 <file path=word/footer1.xml><?xml version="1.0" encoding="utf-8"?>
-<w:ftr xmlns:wpc="http://schemas.microsoft.com/office/word/2010/wordprocessingCanvas" xmlns:mc="http://schemas.openxmlformats.org/markup-compatibility/2006" xmlns:o="urn:schemas-microsoft-com:office:office" xmlns:r="http://schemas.openxmlformats.org/officeDocument/2006/relationships" xmlns:m="http://schemas.openxmlformats.org/officeDocument/2006/math" xmlns:v="urn:schemas-microsoft-com:vml" xmlns:wp14="http://schemas.microsoft.com/office/word/2010/wordprocessingDrawing" xmlns:wp="http://schemas.openxmlformats.org/drawingml/2006/wordprocessingDrawing" xmlns:w10="urn:schemas-microsoft-com:office:word" xmlns:w="http://schemas.openxmlformats.org/wordprocessingml/2006/main" xmlns:w14="http://schemas.microsoft.com/office/word/2010/wordml" xmlns:w15="http://schemas.microsoft.com/office/word/2012/wordml" xmlns:wpg="http://schemas.microsoft.com/office/word/2010/wordprocessingGroup" xmlns:wpi="http://schemas.microsoft.com/office/word/2010/wordprocessingInk" xmlns:wne="http://schemas.microsoft.com/office/word/2006/wordml" xmlns:wps="http://schemas.microsoft.com/office/word/2010/wordprocessingShape" mc:Ignorable="w14 w15 wp14">
+<w:ftr xmlns:wpc="http://schemas.microsoft.com/office/word/2010/wordprocessingCanvas" xmlns:cx="http://schemas.microsoft.com/office/drawing/2014/chartex" xmlns:cx1="http://schemas.microsoft.com/office/drawing/2015/9/8/chartex" xmlns:cx2="http://schemas.microsoft.com/office/drawing/2015/10/21/chartex" xmlns:cx3="http://schemas.microsoft.com/office/drawing/2016/5/9/chartex" xmlns:cx4="http://schemas.microsoft.com/office/drawing/2016/5/10/chartex" xmlns:cx5="http://schemas.microsoft.com/office/drawing/2016/5/11/chartex" xmlns:cx6="http://schemas.microsoft.com/office/drawing/2016/5/12/chartex" xmlns:cx7="http://schemas.microsoft.com/office/drawing/2016/5/13/chartex" xmlns:cx8="http://schemas.microsoft.com/office/drawing/2016/5/14/chartex" xmlns:mc="http://schemas.openxmlformats.org/markup-compatibility/2006" xmlns:aink="http://schemas.microsoft.com/office/drawing/2016/ink" xmlns:am3d="http://schemas.microsoft.com/office/drawing/2017/model3d" xmlns:o="urn:schemas-microsoft-com:office:office" xmlns:oel="http://schemas.microsoft.com/office/2019/extlst" xmlns:r="http://schemas.openxmlformats.org/officeDocument/2006/relationships" xmlns:m="http://schemas.openxmlformats.org/officeDocument/2006/math" xmlns:v="urn:schemas-microsoft-com:vml" xmlns:wp14="http://schemas.microsoft.com/office/word/2010/wordprocessingDrawing" xmlns:wp="http://schemas.openxmlformats.org/drawingml/2006/wordprocessingDrawing" xmlns:w10="urn:schemas-microsoft-com:office:word" xmlns:w="http://schemas.openxmlformats.org/wordprocessingml/2006/main" xmlns:w14="http://schemas.microsoft.com/office/word/2010/wordml" xmlns:w15="http://schemas.microsoft.com/office/word/2012/wordml" xmlns:w16cex="http://schemas.microsoft.com/office/word/2018/wordml/cex" xmlns:w16cid="http://schemas.microsoft.com/office/word/2016/wordml/cid" xmlns:w16="http://schemas.microsoft.com/office/word/2018/wordml" xmlns:w16du="http://schemas.microsoft.com/office/word/2023/wordml/word16du" xmlns:w16sdtdh="http://schemas.microsoft.com/office/word/2020/wordml/sdtdatahash" xmlns:w16sdtfl="http://schemas.microsoft.com/office/word/2024/wordml/sdtformatlock" xmlns:w16se="http://schemas.microsoft.com/office/word/2015/wordml/symex" xmlns:wpg="http://schemas.microsoft.com/office/word/2010/wordprocessingGroup" xmlns:wpi="http://schemas.microsoft.com/office/word/2010/wordprocessingInk" xmlns:wne="http://schemas.microsoft.com/office/word/2006/wordml" xmlns:wps="http://schemas.microsoft.com/office/word/2010/wordprocessingShape" mc:Ignorable="w14 w15 w16se w16cid w16 w16cex w16sdtdh w16sdtfl w16du wp14">
   <w:sdt>
     <w:sdtPr>
       <w:id w:val="1016117153"/>
@@ -19845,7 +19742,7 @@
 </file>
 
 <file path=word/footnotes.xml><?xml version="1.0" encoding="utf-8"?>
-<w:footnotes xmlns:wpc="http://schemas.microsoft.com/office/word/2010/wordprocessingCanvas" xmlns:mc="http://schemas.openxmlformats.org/markup-compatibility/2006" xmlns:o="urn:schemas-microsoft-com:office:office" xmlns:r="http://schemas.openxmlformats.org/officeDocument/2006/relationships" xmlns:m="http://schemas.openxmlformats.org/officeDocument/2006/math" xmlns:v="urn:schemas-microsoft-com:vml" xmlns:wp14="http://schemas.microsoft.com/office/word/2010/wordprocessingDrawing" xmlns:wp="http://schemas.openxmlformats.org/drawingml/2006/wordprocessingDrawing" xmlns:w10="urn:schemas-microsoft-com:office:word" xmlns:w="http://schemas.openxmlformats.org/wordprocessingml/2006/main" xmlns:w14="http://schemas.microsoft.com/office/word/2010/wordml" xmlns:w15="http://schemas.microsoft.com/office/word/2012/wordml" xmlns:wpg="http://schemas.microsoft.com/office/word/2010/wordprocessingGroup" xmlns:wpi="http://schemas.microsoft.com/office/word/2010/wordprocessingInk" xmlns:wne="http://schemas.microsoft.com/office/word/2006/wordml" xmlns:wps="http://schemas.microsoft.com/office/word/2010/wordprocessingShape" mc:Ignorable="w14 w15 wp14">
+<w:footnotes xmlns:wpc="http://schemas.microsoft.com/office/word/2010/wordprocessingCanvas" xmlns:cx="http://schemas.microsoft.com/office/drawing/2014/chartex" xmlns:cx1="http://schemas.microsoft.com/office/drawing/2015/9/8/chartex" xmlns:cx2="http://schemas.microsoft.com/office/drawing/2015/10/21/chartex" xmlns:cx3="http://schemas.microsoft.com/office/drawing/2016/5/9/chartex" xmlns:cx4="http://schemas.microsoft.com/office/drawing/2016/5/10/chartex" xmlns:cx5="http://schemas.microsoft.com/office/drawing/2016/5/11/chartex" xmlns:cx6="http://schemas.microsoft.com/office/drawing/2016/5/12/chartex" xmlns:cx7="http://schemas.microsoft.com/office/drawing/2016/5/13/chartex" xmlns:cx8="http://schemas.microsoft.com/office/drawing/2016/5/14/chartex" xmlns:mc="http://schemas.openxmlformats.org/markup-compatibility/2006" xmlns:aink="http://schemas.microsoft.com/office/drawing/2016/ink" xmlns:am3d="http://schemas.microsoft.com/office/drawing/2017/model3d" xmlns:o="urn:schemas-microsoft-com:office:office" xmlns:oel="http://schemas.microsoft.com/office/2019/extlst" xmlns:r="http://schemas.openxmlformats.org/officeDocument/2006/relationships" xmlns:m="http://schemas.openxmlformats.org/officeDocument/2006/math" xmlns:v="urn:schemas-microsoft-com:vml" xmlns:wp14="http://schemas.microsoft.com/office/word/2010/wordprocessingDrawing" xmlns:wp="http://schemas.openxmlformats.org/drawingml/2006/wordprocessingDrawing" xmlns:w10="urn:schemas-microsoft-com:office:word" xmlns:w="http://schemas.openxmlformats.org/wordprocessingml/2006/main" xmlns:w14="http://schemas.microsoft.com/office/word/2010/wordml" xmlns:w15="http://schemas.microsoft.com/office/word/2012/wordml" xmlns:w16cex="http://schemas.microsoft.com/office/word/2018/wordml/cex" xmlns:w16cid="http://schemas.microsoft.com/office/word/2016/wordml/cid" xmlns:w16="http://schemas.microsoft.com/office/word/2018/wordml" xmlns:w16du="http://schemas.microsoft.com/office/word/2023/wordml/word16du" xmlns:w16sdtdh="http://schemas.microsoft.com/office/word/2020/wordml/sdtdatahash" xmlns:w16sdtfl="http://schemas.microsoft.com/office/word/2024/wordml/sdtformatlock" xmlns:w16se="http://schemas.microsoft.com/office/word/2015/wordml/symex" xmlns:wpg="http://schemas.microsoft.com/office/word/2010/wordprocessingGroup" xmlns:wpi="http://schemas.microsoft.com/office/word/2010/wordprocessingInk" xmlns:wne="http://schemas.microsoft.com/office/word/2006/wordml" xmlns:wps="http://schemas.microsoft.com/office/word/2010/wordprocessingShape" mc:Ignorable="w14 w15 w16se w16cid w16 w16cex w16sdtdh w16sdtfl w16du wp14">
   <w:footnote w:type="separator" w:id="-1">
     <w:p>
       <w:pPr>
@@ -19870,8 +19767,8 @@
 </file>
 
 <file path=word/numbering.xml><?xml version="1.0" encoding="utf-8"?>
-<w:numbering xmlns:wpc="http://schemas.microsoft.com/office/word/2010/wordprocessingCanvas" xmlns:mc="http://schemas.openxmlformats.org/markup-compatibility/2006" xmlns:o="urn:schemas-microsoft-com:office:office" xmlns:r="http://schemas.openxmlformats.org/officeDocument/2006/relationships" xmlns:m="http://schemas.openxmlformats.org/officeDocument/2006/math" xmlns:v="urn:schemas-microsoft-com:vml" xmlns:wp14="http://schemas.microsoft.com/office/word/2010/wordprocessingDrawing" xmlns:wp="http://schemas.openxmlformats.org/drawingml/2006/wordprocessingDrawing" xmlns:w10="urn:schemas-microsoft-com:office:word" xmlns:w="http://schemas.openxmlformats.org/wordprocessingml/2006/main" xmlns:w14="http://schemas.microsoft.com/office/word/2010/wordml" xmlns:w15="http://schemas.microsoft.com/office/word/2012/wordml" xmlns:wpg="http://schemas.microsoft.com/office/word/2010/wordprocessingGroup" xmlns:wpi="http://schemas.microsoft.com/office/word/2010/wordprocessingInk" xmlns:wne="http://schemas.microsoft.com/office/word/2006/wordml" xmlns:wps="http://schemas.microsoft.com/office/word/2010/wordprocessingShape" mc:Ignorable="w14 w15 wp14">
-  <w:abstractNum w:abstractNumId="0">
+<w:numbering xmlns:wpc="http://schemas.microsoft.com/office/word/2010/wordprocessingCanvas" xmlns:cx="http://schemas.microsoft.com/office/drawing/2014/chartex" xmlns:cx1="http://schemas.microsoft.com/office/drawing/2015/9/8/chartex" xmlns:cx2="http://schemas.microsoft.com/office/drawing/2015/10/21/chartex" xmlns:cx3="http://schemas.microsoft.com/office/drawing/2016/5/9/chartex" xmlns:cx4="http://schemas.microsoft.com/office/drawing/2016/5/10/chartex" xmlns:cx5="http://schemas.microsoft.com/office/drawing/2016/5/11/chartex" xmlns:cx6="http://schemas.microsoft.com/office/drawing/2016/5/12/chartex" xmlns:cx7="http://schemas.microsoft.com/office/drawing/2016/5/13/chartex" xmlns:cx8="http://schemas.microsoft.com/office/drawing/2016/5/14/chartex" xmlns:mc="http://schemas.openxmlformats.org/markup-compatibility/2006" xmlns:aink="http://schemas.microsoft.com/office/drawing/2016/ink" xmlns:am3d="http://schemas.microsoft.com/office/drawing/2017/model3d" xmlns:o="urn:schemas-microsoft-com:office:office" xmlns:oel="http://schemas.microsoft.com/office/2019/extlst" xmlns:r="http://schemas.openxmlformats.org/officeDocument/2006/relationships" xmlns:m="http://schemas.openxmlformats.org/officeDocument/2006/math" xmlns:v="urn:schemas-microsoft-com:vml" xmlns:wp14="http://schemas.microsoft.com/office/word/2010/wordprocessingDrawing" xmlns:wp="http://schemas.openxmlformats.org/drawingml/2006/wordprocessingDrawing" xmlns:w10="urn:schemas-microsoft-com:office:word" xmlns:w="http://schemas.openxmlformats.org/wordprocessingml/2006/main" xmlns:w14="http://schemas.microsoft.com/office/word/2010/wordml" xmlns:w15="http://schemas.microsoft.com/office/word/2012/wordml" xmlns:w16cex="http://schemas.microsoft.com/office/word/2018/wordml/cex" xmlns:w16cid="http://schemas.microsoft.com/office/word/2016/wordml/cid" xmlns:w16="http://schemas.microsoft.com/office/word/2018/wordml" xmlns:w16du="http://schemas.microsoft.com/office/word/2023/wordml/word16du" xmlns:w16sdtdh="http://schemas.microsoft.com/office/word/2020/wordml/sdtdatahash" xmlns:w16sdtfl="http://schemas.microsoft.com/office/word/2024/wordml/sdtformatlock" xmlns:w16se="http://schemas.microsoft.com/office/word/2015/wordml/symex" xmlns:wpg="http://schemas.microsoft.com/office/word/2010/wordprocessingGroup" xmlns:wpi="http://schemas.microsoft.com/office/word/2010/wordprocessingInk" xmlns:wne="http://schemas.microsoft.com/office/word/2006/wordml" xmlns:wps="http://schemas.microsoft.com/office/word/2010/wordprocessingShape" mc:Ignorable="w14 w15 w16se w16cid w16 w16cex w16sdtdh w16sdtfl w16du wp14">
+  <w:abstractNum w:abstractNumId="0" w15:restartNumberingAfterBreak="0">
     <w:nsid w:val="02AF2FA9"/>
     <w:multiLevelType w:val="hybridMultilevel"/>
     <w:tmpl w:val="31B8EED2"/>
@@ -19984,7 +19881,7 @@
       </w:rPr>
     </w:lvl>
   </w:abstractNum>
-  <w:abstractNum w:abstractNumId="1">
+  <w:abstractNum w:abstractNumId="1" w15:restartNumberingAfterBreak="0">
     <w:nsid w:val="08F018C5"/>
     <w:multiLevelType w:val="hybridMultilevel"/>
     <w:tmpl w:val="F5F20FAA"/>
@@ -20097,7 +19994,7 @@
       </w:rPr>
     </w:lvl>
   </w:abstractNum>
-  <w:abstractNum w:abstractNumId="2">
+  <w:abstractNum w:abstractNumId="2" w15:restartNumberingAfterBreak="0">
     <w:nsid w:val="126C7F9B"/>
     <w:multiLevelType w:val="hybridMultilevel"/>
     <w:tmpl w:val="98543CF0"/>
@@ -20183,7 +20080,7 @@
       </w:pPr>
     </w:lvl>
   </w:abstractNum>
-  <w:abstractNum w:abstractNumId="3">
+  <w:abstractNum w:abstractNumId="3" w15:restartNumberingAfterBreak="0">
     <w:nsid w:val="147A33EE"/>
     <w:multiLevelType w:val="hybridMultilevel"/>
     <w:tmpl w:val="016A8426"/>
@@ -20269,7 +20166,7 @@
       </w:pPr>
     </w:lvl>
   </w:abstractNum>
-  <w:abstractNum w:abstractNumId="4">
+  <w:abstractNum w:abstractNumId="4" w15:restartNumberingAfterBreak="0">
     <w:nsid w:val="1AB84912"/>
     <w:multiLevelType w:val="multilevel"/>
     <w:tmpl w:val="B6489DF0"/>
@@ -20387,7 +20284,7 @@
       </w:rPr>
     </w:lvl>
   </w:abstractNum>
-  <w:abstractNum w:abstractNumId="5">
+  <w:abstractNum w:abstractNumId="5" w15:restartNumberingAfterBreak="0">
     <w:nsid w:val="1BA83479"/>
     <w:multiLevelType w:val="hybridMultilevel"/>
     <w:tmpl w:val="0B1E00C2"/>
@@ -20476,7 +20373,7 @@
       </w:pPr>
     </w:lvl>
   </w:abstractNum>
-  <w:abstractNum w:abstractNumId="6">
+  <w:abstractNum w:abstractNumId="6" w15:restartNumberingAfterBreak="0">
     <w:nsid w:val="297A7ABE"/>
     <w:multiLevelType w:val="hybridMultilevel"/>
     <w:tmpl w:val="3886E33C"/>
@@ -20589,7 +20486,7 @@
       </w:rPr>
     </w:lvl>
   </w:abstractNum>
-  <w:abstractNum w:abstractNumId="7">
+  <w:abstractNum w:abstractNumId="7" w15:restartNumberingAfterBreak="0">
     <w:nsid w:val="32D26C7C"/>
     <w:multiLevelType w:val="hybridMultilevel"/>
     <w:tmpl w:val="2C0070A2"/>
@@ -20675,7 +20572,7 @@
       </w:pPr>
     </w:lvl>
   </w:abstractNum>
-  <w:abstractNum w:abstractNumId="8">
+  <w:abstractNum w:abstractNumId="8" w15:restartNumberingAfterBreak="0">
     <w:nsid w:val="3860748C"/>
     <w:multiLevelType w:val="hybridMultilevel"/>
     <w:tmpl w:val="24A6702E"/>
@@ -20788,7 +20685,7 @@
       </w:rPr>
     </w:lvl>
   </w:abstractNum>
-  <w:abstractNum w:abstractNumId="9">
+  <w:abstractNum w:abstractNumId="9" w15:restartNumberingAfterBreak="0">
     <w:nsid w:val="3C0559D8"/>
     <w:multiLevelType w:val="hybridMultilevel"/>
     <w:tmpl w:val="137A88AE"/>
@@ -20874,7 +20771,7 @@
       </w:pPr>
     </w:lvl>
   </w:abstractNum>
-  <w:abstractNum w:abstractNumId="10">
+  <w:abstractNum w:abstractNumId="10" w15:restartNumberingAfterBreak="0">
     <w:nsid w:val="3C943632"/>
     <w:multiLevelType w:val="hybridMultilevel"/>
     <w:tmpl w:val="FF34FF66"/>
@@ -20963,7 +20860,7 @@
       </w:pPr>
     </w:lvl>
   </w:abstractNum>
-  <w:abstractNum w:abstractNumId="11">
+  <w:abstractNum w:abstractNumId="11" w15:restartNumberingAfterBreak="0">
     <w:nsid w:val="3CAA7D00"/>
     <w:multiLevelType w:val="hybridMultilevel"/>
     <w:tmpl w:val="7FAE95B6"/>
@@ -21076,7 +20973,7 @@
       </w:rPr>
     </w:lvl>
   </w:abstractNum>
-  <w:abstractNum w:abstractNumId="12">
+  <w:abstractNum w:abstractNumId="12" w15:restartNumberingAfterBreak="0">
     <w:nsid w:val="49160F70"/>
     <w:multiLevelType w:val="multilevel"/>
     <w:tmpl w:val="D3701A08"/>
@@ -21189,7 +21086,7 @@
       </w:pPr>
     </w:lvl>
   </w:abstractNum>
-  <w:abstractNum w:abstractNumId="13">
+  <w:abstractNum w:abstractNumId="13" w15:restartNumberingAfterBreak="0">
     <w:nsid w:val="49F3349E"/>
     <w:multiLevelType w:val="hybridMultilevel"/>
     <w:tmpl w:val="9EA25E2A"/>
@@ -21275,7 +21172,7 @@
       </w:pPr>
     </w:lvl>
   </w:abstractNum>
-  <w:abstractNum w:abstractNumId="14">
+  <w:abstractNum w:abstractNumId="14" w15:restartNumberingAfterBreak="0">
     <w:nsid w:val="4BDB53A4"/>
     <w:multiLevelType w:val="hybridMultilevel"/>
     <w:tmpl w:val="26BA23C2"/>
@@ -21388,7 +21285,7 @@
       </w:rPr>
     </w:lvl>
   </w:abstractNum>
-  <w:abstractNum w:abstractNumId="15">
+  <w:abstractNum w:abstractNumId="15" w15:restartNumberingAfterBreak="0">
     <w:nsid w:val="4E2400E2"/>
     <w:multiLevelType w:val="hybridMultilevel"/>
     <w:tmpl w:val="25C44E24"/>
@@ -21474,7 +21371,7 @@
       </w:pPr>
     </w:lvl>
   </w:abstractNum>
-  <w:abstractNum w:abstractNumId="16">
+  <w:abstractNum w:abstractNumId="16" w15:restartNumberingAfterBreak="0">
     <w:nsid w:val="4EA2597E"/>
     <w:multiLevelType w:val="hybridMultilevel"/>
     <w:tmpl w:val="48DA49D0"/>
@@ -21564,7 +21461,7 @@
       </w:pPr>
     </w:lvl>
   </w:abstractNum>
-  <w:abstractNum w:abstractNumId="17">
+  <w:abstractNum w:abstractNumId="17" w15:restartNumberingAfterBreak="0">
     <w:nsid w:val="50BA3788"/>
     <w:multiLevelType w:val="hybridMultilevel"/>
     <w:tmpl w:val="37006102"/>
@@ -21653,7 +21550,7 @@
       </w:pPr>
     </w:lvl>
   </w:abstractNum>
-  <w:abstractNum w:abstractNumId="18">
+  <w:abstractNum w:abstractNumId="18" w15:restartNumberingAfterBreak="0">
     <w:nsid w:val="550B44E6"/>
     <w:multiLevelType w:val="hybridMultilevel"/>
     <w:tmpl w:val="BA029364"/>
@@ -21739,7 +21636,7 @@
       </w:pPr>
     </w:lvl>
   </w:abstractNum>
-  <w:abstractNum w:abstractNumId="19">
+  <w:abstractNum w:abstractNumId="19" w15:restartNumberingAfterBreak="0">
     <w:nsid w:val="5D7F116E"/>
     <w:multiLevelType w:val="multilevel"/>
     <w:tmpl w:val="07EC278C"/>
@@ -21834,7 +21731,7 @@
       </w:pPr>
     </w:lvl>
   </w:abstractNum>
-  <w:abstractNum w:abstractNumId="20">
+  <w:abstractNum w:abstractNumId="20" w15:restartNumberingAfterBreak="0">
     <w:nsid w:val="5EE54FC1"/>
     <w:multiLevelType w:val="hybridMultilevel"/>
     <w:tmpl w:val="E58CBECA"/>
@@ -21947,7 +21844,7 @@
       </w:rPr>
     </w:lvl>
   </w:abstractNum>
-  <w:abstractNum w:abstractNumId="21">
+  <w:abstractNum w:abstractNumId="21" w15:restartNumberingAfterBreak="0">
     <w:nsid w:val="603F09E5"/>
     <w:multiLevelType w:val="multilevel"/>
     <w:tmpl w:val="62A83186"/>
@@ -22065,7 +21962,7 @@
       </w:rPr>
     </w:lvl>
   </w:abstractNum>
-  <w:abstractNum w:abstractNumId="22">
+  <w:abstractNum w:abstractNumId="22" w15:restartNumberingAfterBreak="0">
     <w:nsid w:val="63131FC7"/>
     <w:multiLevelType w:val="hybridMultilevel"/>
     <w:tmpl w:val="AE3A8B1A"/>
@@ -22178,7 +22075,7 @@
       </w:rPr>
     </w:lvl>
   </w:abstractNum>
-  <w:abstractNum w:abstractNumId="23">
+  <w:abstractNum w:abstractNumId="23" w15:restartNumberingAfterBreak="0">
     <w:nsid w:val="63FE5D78"/>
     <w:multiLevelType w:val="hybridMultilevel"/>
     <w:tmpl w:val="E5FA6A30"/>
@@ -22291,7 +22188,7 @@
       </w:rPr>
     </w:lvl>
   </w:abstractNum>
-  <w:abstractNum w:abstractNumId="24">
+  <w:abstractNum w:abstractNumId="24" w15:restartNumberingAfterBreak="0">
     <w:nsid w:val="692E515B"/>
     <w:multiLevelType w:val="multilevel"/>
     <w:tmpl w:val="F2F40ED2"/>
@@ -22440,7 +22337,7 @@
       </w:rPr>
     </w:lvl>
   </w:abstractNum>
-  <w:abstractNum w:abstractNumId="25">
+  <w:abstractNum w:abstractNumId="25" w15:restartNumberingAfterBreak="0">
     <w:nsid w:val="69CA3B02"/>
     <w:multiLevelType w:val="hybridMultilevel"/>
     <w:tmpl w:val="F642E598"/>
@@ -22553,7 +22450,7 @@
       </w:rPr>
     </w:lvl>
   </w:abstractNum>
-  <w:abstractNum w:abstractNumId="26">
+  <w:abstractNum w:abstractNumId="26" w15:restartNumberingAfterBreak="0">
     <w:nsid w:val="6FD17BD5"/>
     <w:multiLevelType w:val="hybridMultilevel"/>
     <w:tmpl w:val="B7663A94"/>
@@ -22639,7 +22536,7 @@
       </w:pPr>
     </w:lvl>
   </w:abstractNum>
-  <w:abstractNum w:abstractNumId="27">
+  <w:abstractNum w:abstractNumId="27" w15:restartNumberingAfterBreak="0">
     <w:nsid w:val="708618D4"/>
     <w:multiLevelType w:val="hybridMultilevel"/>
     <w:tmpl w:val="794CEC38"/>
@@ -22725,7 +22622,7 @@
       </w:pPr>
     </w:lvl>
   </w:abstractNum>
-  <w:abstractNum w:abstractNumId="28">
+  <w:abstractNum w:abstractNumId="28" w15:restartNumberingAfterBreak="0">
     <w:nsid w:val="729C1A8F"/>
     <w:multiLevelType w:val="hybridMultilevel"/>
     <w:tmpl w:val="49909FA6"/>
@@ -22811,7 +22708,7 @@
       </w:pPr>
     </w:lvl>
   </w:abstractNum>
-  <w:abstractNum w:abstractNumId="29">
+  <w:abstractNum w:abstractNumId="29" w15:restartNumberingAfterBreak="0">
     <w:nsid w:val="7381730C"/>
     <w:multiLevelType w:val="hybridMultilevel"/>
     <w:tmpl w:val="A822957E"/>
@@ -22897,7 +22794,7 @@
       </w:pPr>
     </w:lvl>
   </w:abstractNum>
-  <w:abstractNum w:abstractNumId="30">
+  <w:abstractNum w:abstractNumId="30" w15:restartNumberingAfterBreak="0">
     <w:nsid w:val="76BC5C1C"/>
     <w:multiLevelType w:val="multilevel"/>
     <w:tmpl w:val="72BE6714"/>
@@ -23046,7 +22943,7 @@
       </w:rPr>
     </w:lvl>
   </w:abstractNum>
-  <w:abstractNum w:abstractNumId="31">
+  <w:abstractNum w:abstractNumId="31" w15:restartNumberingAfterBreak="0">
     <w:nsid w:val="78FD57A9"/>
     <w:multiLevelType w:val="hybridMultilevel"/>
     <w:tmpl w:val="792A9F40"/>
@@ -23159,100 +23056,100 @@
       </w:rPr>
     </w:lvl>
   </w:abstractNum>
-  <w:num w:numId="1">
+  <w:num w:numId="1" w16cid:durableId="932278651">
     <w:abstractNumId w:val="11"/>
   </w:num>
-  <w:num w:numId="2">
+  <w:num w:numId="2" w16cid:durableId="1969580869">
     <w:abstractNumId w:val="1"/>
   </w:num>
-  <w:num w:numId="3">
+  <w:num w:numId="3" w16cid:durableId="374699040">
     <w:abstractNumId w:val="0"/>
   </w:num>
-  <w:num w:numId="4">
+  <w:num w:numId="4" w16cid:durableId="861239686">
     <w:abstractNumId w:val="31"/>
   </w:num>
-  <w:num w:numId="5">
+  <w:num w:numId="5" w16cid:durableId="1899509072">
     <w:abstractNumId w:val="20"/>
   </w:num>
-  <w:num w:numId="6">
+  <w:num w:numId="6" w16cid:durableId="1655181339">
     <w:abstractNumId w:val="24"/>
   </w:num>
-  <w:num w:numId="7">
+  <w:num w:numId="7" w16cid:durableId="825317134">
     <w:abstractNumId w:val="4"/>
   </w:num>
-  <w:num w:numId="8">
+  <w:num w:numId="8" w16cid:durableId="1776947111">
     <w:abstractNumId w:val="30"/>
   </w:num>
-  <w:num w:numId="9">
+  <w:num w:numId="9" w16cid:durableId="404762775">
     <w:abstractNumId w:val="14"/>
   </w:num>
-  <w:num w:numId="10">
+  <w:num w:numId="10" w16cid:durableId="1192650461">
     <w:abstractNumId w:val="6"/>
   </w:num>
-  <w:num w:numId="11">
+  <w:num w:numId="11" w16cid:durableId="1318994485">
     <w:abstractNumId w:val="18"/>
   </w:num>
-  <w:num w:numId="12">
+  <w:num w:numId="12" w16cid:durableId="1164591808">
     <w:abstractNumId w:val="25"/>
   </w:num>
-  <w:num w:numId="13">
+  <w:num w:numId="13" w16cid:durableId="429930262">
     <w:abstractNumId w:val="10"/>
   </w:num>
-  <w:num w:numId="14">
+  <w:num w:numId="14" w16cid:durableId="680934908">
     <w:abstractNumId w:val="17"/>
   </w:num>
-  <w:num w:numId="15">
+  <w:num w:numId="15" w16cid:durableId="577521133">
     <w:abstractNumId w:val="16"/>
   </w:num>
-  <w:num w:numId="16">
+  <w:num w:numId="16" w16cid:durableId="1050543868">
     <w:abstractNumId w:val="5"/>
   </w:num>
-  <w:num w:numId="17">
+  <w:num w:numId="17" w16cid:durableId="1163006199">
     <w:abstractNumId w:val="8"/>
   </w:num>
-  <w:num w:numId="18">
+  <w:num w:numId="18" w16cid:durableId="2106876670">
     <w:abstractNumId w:val="23"/>
   </w:num>
-  <w:num w:numId="19">
+  <w:num w:numId="19" w16cid:durableId="1674257108">
     <w:abstractNumId w:val="21"/>
   </w:num>
-  <w:num w:numId="20">
+  <w:num w:numId="20" w16cid:durableId="2144037413">
     <w:abstractNumId w:val="15"/>
   </w:num>
-  <w:num w:numId="21">
+  <w:num w:numId="21" w16cid:durableId="1659141835">
     <w:abstractNumId w:val="13"/>
   </w:num>
-  <w:num w:numId="22">
+  <w:num w:numId="22" w16cid:durableId="1846818870">
     <w:abstractNumId w:val="26"/>
   </w:num>
-  <w:num w:numId="23">
+  <w:num w:numId="23" w16cid:durableId="1463841435">
     <w:abstractNumId w:val="9"/>
   </w:num>
-  <w:num w:numId="24">
+  <w:num w:numId="24" w16cid:durableId="906720392">
     <w:abstractNumId w:val="28"/>
   </w:num>
-  <w:num w:numId="25">
+  <w:num w:numId="25" w16cid:durableId="1692800578">
     <w:abstractNumId w:val="7"/>
   </w:num>
-  <w:num w:numId="26">
+  <w:num w:numId="26" w16cid:durableId="595670451">
     <w:abstractNumId w:val="29"/>
   </w:num>
-  <w:num w:numId="27">
+  <w:num w:numId="27" w16cid:durableId="199392852">
     <w:abstractNumId w:val="22"/>
   </w:num>
-  <w:num w:numId="28">
+  <w:num w:numId="28" w16cid:durableId="2110811955">
     <w:abstractNumId w:val="27"/>
   </w:num>
-  <w:num w:numId="29">
+  <w:num w:numId="29" w16cid:durableId="1332027228">
     <w:abstractNumId w:val="2"/>
   </w:num>
-  <w:num w:numId="30">
+  <w:num w:numId="30" w16cid:durableId="271863891">
     <w:abstractNumId w:val="19"/>
   </w:num>
-  <w:num w:numId="31">
+  <w:num w:numId="31" w16cid:durableId="351032376">
     <w:abstractNumId w:val="3"/>
   </w:num>
-  <w:num w:numId="32">
+  <w:num w:numId="32" w16cid:durableId="1944413797">
     <w:abstractNumId w:val="12"/>
   </w:num>
   <w:numIdMacAtCleanup w:val="11"/>
@@ -23260,7 +23157,7 @@
 </file>
 
 <file path=word/styles.xml><?xml version="1.0" encoding="utf-8"?>
-<w:styles xmlns:mc="http://schemas.openxmlformats.org/markup-compatibility/2006" xmlns:r="http://schemas.openxmlformats.org/officeDocument/2006/relationships" xmlns:w="http://schemas.openxmlformats.org/wordprocessingml/2006/main" xmlns:w14="http://schemas.microsoft.com/office/word/2010/wordml" xmlns:w15="http://schemas.microsoft.com/office/word/2012/wordml" mc:Ignorable="w14 w15">
+<w:styles xmlns:mc="http://schemas.openxmlformats.org/markup-compatibility/2006" xmlns:r="http://schemas.openxmlformats.org/officeDocument/2006/relationships" xmlns:w="http://schemas.openxmlformats.org/wordprocessingml/2006/main" xmlns:w14="http://schemas.microsoft.com/office/word/2010/wordml" xmlns:w15="http://schemas.microsoft.com/office/word/2012/wordml" xmlns:w16cex="http://schemas.microsoft.com/office/word/2018/wordml/cex" xmlns:w16cid="http://schemas.microsoft.com/office/word/2016/wordml/cid" xmlns:w16="http://schemas.microsoft.com/office/word/2018/wordml" xmlns:w16du="http://schemas.microsoft.com/office/word/2023/wordml/word16du" xmlns:w16sdtdh="http://schemas.microsoft.com/office/word/2020/wordml/sdtdatahash" xmlns:w16sdtfl="http://schemas.microsoft.com/office/word/2024/wordml/sdtformatlock" xmlns:w16se="http://schemas.microsoft.com/office/word/2015/wordml/symex" mc:Ignorable="w14 w15 w16se w16cid w16 w16cex w16sdtdh w16sdtfl w16du">
   <w:docDefaults>
     <w:rPrDefault>
       <w:rPr>
@@ -23276,7 +23173,7 @@
       </w:pPr>
     </w:pPrDefault>
   </w:docDefaults>
-  <w:latentStyles w:defLockedState="0" w:defUIPriority="99" w:defSemiHidden="0" w:defUnhideWhenUsed="0" w:defQFormat="0" w:count="371">
+  <w:latentStyles w:defLockedState="0" w:defUIPriority="99" w:defSemiHidden="0" w:defUnhideWhenUsed="0" w:defQFormat="0" w:count="376">
     <w:lsdException w:name="Normal" w:uiPriority="0" w:qFormat="1"/>
     <w:lsdException w:name="heading 1" w:uiPriority="9" w:qFormat="1"/>
     <w:lsdException w:name="heading 2" w:semiHidden="1" w:uiPriority="9" w:unhideWhenUsed="1" w:qFormat="1"/>
@@ -23648,6 +23545,11 @@
     <w:lsdException w:name="List Table 5 Dark Accent 6" w:uiPriority="50"/>
     <w:lsdException w:name="List Table 6 Colorful Accent 6" w:uiPriority="51"/>
     <w:lsdException w:name="List Table 7 Colorful Accent 6" w:uiPriority="52"/>
+    <w:lsdException w:name="Mention" w:semiHidden="1" w:unhideWhenUsed="1"/>
+    <w:lsdException w:name="Smart Hyperlink" w:semiHidden="1" w:unhideWhenUsed="1"/>
+    <w:lsdException w:name="Hashtag" w:semiHidden="1" w:unhideWhenUsed="1"/>
+    <w:lsdException w:name="Unresolved Mention" w:semiHidden="1" w:unhideWhenUsed="1"/>
+    <w:lsdException w:name="Smart Link" w:semiHidden="1" w:unhideWhenUsed="1"/>
   </w:latentStyles>
   <w:style w:type="paragraph" w:default="1" w:styleId="Normal">
     <w:name w:val="Normal"/>
@@ -23897,7 +23799,6 @@
   <w:style w:type="character" w:default="1" w:styleId="DefaultParagraphFont">
     <w:name w:val="Default Paragraph Font"/>
     <w:uiPriority w:val="1"/>
-    <w:semiHidden/>
     <w:unhideWhenUsed/>
   </w:style>
   <w:style w:type="table" w:default="1" w:styleId="TableNormal">
@@ -23930,7 +23831,6 @@
       <w:spacing w:after="0" w:line="240" w:lineRule="auto"/>
     </w:pPr>
     <w:tblPr>
-      <w:tblInd w:w="0" w:type="dxa"/>
       <w:tblBorders>
         <w:top w:val="single" w:sz="4" w:space="0" w:color="auto"/>
         <w:left w:val="single" w:sz="4" w:space="0" w:color="auto"/>
@@ -23939,12 +23839,6 @@
         <w:insideH w:val="single" w:sz="4" w:space="0" w:color="auto"/>
         <w:insideV w:val="single" w:sz="4" w:space="0" w:color="auto"/>
       </w:tblBorders>
-      <w:tblCellMar>
-        <w:top w:w="0" w:type="dxa"/>
-        <w:left w:w="108" w:type="dxa"/>
-        <w:bottom w:w="0" w:type="dxa"/>
-        <w:right w:w="108" w:type="dxa"/>
-      </w:tblCellMar>
     </w:tblPr>
   </w:style>
   <w:style w:type="character" w:styleId="PlaceholderText">
@@ -24134,19 +24028,12 @@
     <w:tblPr>
       <w:tblStyleRowBandSize w:val="1"/>
       <w:tblStyleColBandSize w:val="1"/>
-      <w:tblInd w:w="0" w:type="dxa"/>
       <w:tblBorders>
         <w:top w:val="single" w:sz="4" w:space="0" w:color="000000" w:themeColor="text1"/>
         <w:left w:val="single" w:sz="4" w:space="0" w:color="000000" w:themeColor="text1"/>
         <w:bottom w:val="single" w:sz="4" w:space="0" w:color="000000" w:themeColor="text1"/>
         <w:right w:val="single" w:sz="4" w:space="0" w:color="000000" w:themeColor="text1"/>
       </w:tblBorders>
-      <w:tblCellMar>
-        <w:top w:w="0" w:type="dxa"/>
-        <w:left w:w="108" w:type="dxa"/>
-        <w:bottom w:w="0" w:type="dxa"/>
-        <w:right w:w="108" w:type="dxa"/>
-      </w:tblCellMar>
     </w:tblPr>
     <w:tblStylePr w:type="firstRow">
       <w:rPr>
@@ -24265,7 +24152,6 @@
     <w:tblPr>
       <w:tblStyleRowBandSize w:val="1"/>
       <w:tblStyleColBandSize w:val="1"/>
-      <w:tblInd w:w="0" w:type="dxa"/>
       <w:tblBorders>
         <w:top w:val="single" w:sz="4" w:space="0" w:color="999999" w:themeColor="text1" w:themeTint="66"/>
         <w:left w:val="single" w:sz="4" w:space="0" w:color="999999" w:themeColor="text1" w:themeTint="66"/>
@@ -24274,12 +24160,6 @@
         <w:insideH w:val="single" w:sz="4" w:space="0" w:color="999999" w:themeColor="text1" w:themeTint="66"/>
         <w:insideV w:val="single" w:sz="4" w:space="0" w:color="999999" w:themeColor="text1" w:themeTint="66"/>
       </w:tblBorders>
-      <w:tblCellMar>
-        <w:top w:w="0" w:type="dxa"/>
-        <w:left w:w="108" w:type="dxa"/>
-        <w:bottom w:w="0" w:type="dxa"/>
-        <w:right w:w="108" w:type="dxa"/>
-      </w:tblCellMar>
     </w:tblPr>
     <w:tblStylePr w:type="firstRow">
       <w:rPr>
@@ -24535,11 +24415,23 @@
       <w:lang w:val="en-GB"/>
     </w:rPr>
   </w:style>
+  <w:style w:type="character" w:styleId="UnresolvedMention">
+    <w:name w:val="Unresolved Mention"/>
+    <w:basedOn w:val="DefaultParagraphFont"/>
+    <w:uiPriority w:val="99"/>
+    <w:semiHidden/>
+    <w:unhideWhenUsed/>
+    <w:rsid w:val="00D36C00"/>
+    <w:rPr>
+      <w:color w:val="605E5C"/>
+      <w:shd w:val="clear" w:color="auto" w:fill="E1DFDD"/>
+    </w:rPr>
+  </w:style>
 </w:styles>
 </file>
 
 <file path=word/glossary/document.xml><?xml version="1.0" encoding="utf-8"?>
-<w:glossaryDocument xmlns:wpc="http://schemas.microsoft.com/office/word/2010/wordprocessingCanvas" xmlns:mc="http://schemas.openxmlformats.org/markup-compatibility/2006" xmlns:o="urn:schemas-microsoft-com:office:office" xmlns:r="http://schemas.openxmlformats.org/officeDocument/2006/relationships" xmlns:m="http://schemas.openxmlformats.org/officeDocument/2006/math" xmlns:v="urn:schemas-microsoft-com:vml" xmlns:wp14="http://schemas.microsoft.com/office/word/2010/wordprocessingDrawing" xmlns:wp="http://schemas.openxmlformats.org/drawingml/2006/wordprocessingDrawing" xmlns:w10="urn:schemas-microsoft-com:office:word" xmlns:w="http://schemas.openxmlformats.org/wordprocessingml/2006/main" xmlns:w14="http://schemas.microsoft.com/office/word/2010/wordml" xmlns:w15="http://schemas.microsoft.com/office/word/2012/wordml" xmlns:wpg="http://schemas.microsoft.com/office/word/2010/wordprocessingGroup" xmlns:wpi="http://schemas.microsoft.com/office/word/2010/wordprocessingInk" xmlns:wne="http://schemas.microsoft.com/office/word/2006/wordml" xmlns:wps="http://schemas.microsoft.com/office/word/2010/wordprocessingShape" mc:Ignorable="w14 w15 wp14">
+<w:glossaryDocument xmlns:wpc="http://schemas.microsoft.com/office/word/2010/wordprocessingCanvas" xmlns:cx="http://schemas.microsoft.com/office/drawing/2014/chartex" xmlns:cx1="http://schemas.microsoft.com/office/drawing/2015/9/8/chartex" xmlns:cx2="http://schemas.microsoft.com/office/drawing/2015/10/21/chartex" xmlns:cx3="http://schemas.microsoft.com/office/drawing/2016/5/9/chartex" xmlns:cx4="http://schemas.microsoft.com/office/drawing/2016/5/10/chartex" xmlns:cx5="http://schemas.microsoft.com/office/drawing/2016/5/11/chartex" xmlns:cx6="http://schemas.microsoft.com/office/drawing/2016/5/12/chartex" xmlns:cx7="http://schemas.microsoft.com/office/drawing/2016/5/13/chartex" xmlns:cx8="http://schemas.microsoft.com/office/drawing/2016/5/14/chartex" xmlns:mc="http://schemas.openxmlformats.org/markup-compatibility/2006" xmlns:aink="http://schemas.microsoft.com/office/drawing/2016/ink" xmlns:am3d="http://schemas.microsoft.com/office/drawing/2017/model3d" xmlns:o="urn:schemas-microsoft-com:office:office" xmlns:oel="http://schemas.microsoft.com/office/2019/extlst" xmlns:r="http://schemas.openxmlformats.org/officeDocument/2006/relationships" xmlns:m="http://schemas.openxmlformats.org/officeDocument/2006/math" xmlns:v="urn:schemas-microsoft-com:vml" xmlns:wp14="http://schemas.microsoft.com/office/word/2010/wordprocessingDrawing" xmlns:wp="http://schemas.openxmlformats.org/drawingml/2006/wordprocessingDrawing" xmlns:w10="urn:schemas-microsoft-com:office:word" xmlns:w="http://schemas.openxmlformats.org/wordprocessingml/2006/main" xmlns:w14="http://schemas.microsoft.com/office/word/2010/wordml" xmlns:w15="http://schemas.microsoft.com/office/word/2012/wordml" xmlns:w16cex="http://schemas.microsoft.com/office/word/2018/wordml/cex" xmlns:w16cid="http://schemas.microsoft.com/office/word/2016/wordml/cid" xmlns:w16="http://schemas.microsoft.com/office/word/2018/wordml" xmlns:w16du="http://schemas.microsoft.com/office/word/2023/wordml/word16du" xmlns:w16sdtdh="http://schemas.microsoft.com/office/word/2020/wordml/sdtdatahash" xmlns:w16sdtfl="http://schemas.microsoft.com/office/word/2024/wordml/sdtformatlock" xmlns:w16se="http://schemas.microsoft.com/office/word/2015/wordml/symex" xmlns:wpg="http://schemas.microsoft.com/office/word/2010/wordprocessingGroup" xmlns:wpi="http://schemas.microsoft.com/office/word/2010/wordprocessingInk" xmlns:wne="http://schemas.microsoft.com/office/word/2006/wordml" xmlns:wps="http://schemas.microsoft.com/office/word/2010/wordprocessingShape" mc:Ignorable="w14 w15 w16se w16cid w16 w16cex w16sdtdh w16sdtfl w16du wp14">
   <w:docParts>
     <w:docPart>
       <w:docPartPr>
@@ -24575,7 +24467,7 @@
 </file>
 
 <file path=word/glossary/fontTable.xml><?xml version="1.0" encoding="utf-8"?>
-<w:fonts xmlns:mc="http://schemas.openxmlformats.org/markup-compatibility/2006" xmlns:r="http://schemas.openxmlformats.org/officeDocument/2006/relationships" xmlns:w="http://schemas.openxmlformats.org/wordprocessingml/2006/main" xmlns:w14="http://schemas.microsoft.com/office/word/2010/wordml" xmlns:w15="http://schemas.microsoft.com/office/word/2012/wordml" mc:Ignorable="w14 w15">
+<w:fonts xmlns:mc="http://schemas.openxmlformats.org/markup-compatibility/2006" xmlns:r="http://schemas.openxmlformats.org/officeDocument/2006/relationships" xmlns:w="http://schemas.openxmlformats.org/wordprocessingml/2006/main" xmlns:w14="http://schemas.microsoft.com/office/word/2010/wordml" xmlns:w15="http://schemas.microsoft.com/office/word/2012/wordml" xmlns:w16cex="http://schemas.microsoft.com/office/word/2018/wordml/cex" xmlns:w16cid="http://schemas.microsoft.com/office/word/2016/wordml/cid" xmlns:w16="http://schemas.microsoft.com/office/word/2018/wordml" xmlns:w16du="http://schemas.microsoft.com/office/word/2023/wordml/word16du" xmlns:w16sdtdh="http://schemas.microsoft.com/office/word/2020/wordml/sdtdatahash" xmlns:w16sdtfl="http://schemas.microsoft.com/office/word/2024/wordml/sdtformatlock" xmlns:w16se="http://schemas.microsoft.com/office/word/2015/wordml/symex" mc:Ignorable="w14 w15 w16se w16cid w16 w16cex w16sdtdh w16sdtfl w16du">
   <w:font w:name="Times New Roman">
     <w:panose1 w:val="02020603050405020304"/>
     <w:charset w:val="00"/>
@@ -24636,7 +24528,7 @@
 </file>
 
 <file path=word/glossary/settings.xml><?xml version="1.0" encoding="utf-8"?>
-<w:settings xmlns:mc="http://schemas.openxmlformats.org/markup-compatibility/2006" xmlns:o="urn:schemas-microsoft-com:office:office" xmlns:r="http://schemas.openxmlformats.org/officeDocument/2006/relationships" xmlns:m="http://schemas.openxmlformats.org/officeDocument/2006/math" xmlns:v="urn:schemas-microsoft-com:vml" xmlns:w10="urn:schemas-microsoft-com:office:word" xmlns:w="http://schemas.openxmlformats.org/wordprocessingml/2006/main" xmlns:w14="http://schemas.microsoft.com/office/word/2010/wordml" xmlns:w15="http://schemas.microsoft.com/office/word/2012/wordml" xmlns:sl="http://schemas.openxmlformats.org/schemaLibrary/2006/main" mc:Ignorable="w14 w15">
+<w:settings xmlns:mc="http://schemas.openxmlformats.org/markup-compatibility/2006" xmlns:o="urn:schemas-microsoft-com:office:office" xmlns:r="http://schemas.openxmlformats.org/officeDocument/2006/relationships" xmlns:m="http://schemas.openxmlformats.org/officeDocument/2006/math" xmlns:v="urn:schemas-microsoft-com:vml" xmlns:w10="urn:schemas-microsoft-com:office:word" xmlns:w="http://schemas.openxmlformats.org/wordprocessingml/2006/main" xmlns:w14="http://schemas.microsoft.com/office/word/2010/wordml" xmlns:w15="http://schemas.microsoft.com/office/word/2012/wordml" xmlns:w16cex="http://schemas.microsoft.com/office/word/2018/wordml/cex" xmlns:w16cid="http://schemas.microsoft.com/office/word/2016/wordml/cid" xmlns:w16="http://schemas.microsoft.com/office/word/2018/wordml" xmlns:w16du="http://schemas.microsoft.com/office/word/2023/wordml/word16du" xmlns:w16sdtdh="http://schemas.microsoft.com/office/word/2020/wordml/sdtdatahash" xmlns:w16sdtfl="http://schemas.microsoft.com/office/word/2024/wordml/sdtformatlock" xmlns:w16se="http://schemas.microsoft.com/office/word/2015/wordml/symex" xmlns:sl="http://schemas.openxmlformats.org/schemaLibrary/2006/main" mc:Ignorable="w14 w15 w16se w16cid w16 w16cex w16sdtdh w16sdtfl w16du">
   <w:view w:val="normal"/>
   <w:defaultTabStop w:val="720"/>
   <w:characterSpacingControl w:val="doNotCompress"/>
@@ -24646,6 +24538,7 @@
     <w:compatSetting w:name="overrideTableStyleFontSizeAndJustification" w:uri="http://schemas.microsoft.com/office/word" w:val="1"/>
     <w:compatSetting w:name="enableOpenTypeFeatures" w:uri="http://schemas.microsoft.com/office/word" w:val="1"/>
     <w:compatSetting w:name="doNotFlipMirrorIndents" w:uri="http://schemas.microsoft.com/office/word" w:val="1"/>
+    <w:compatSetting w:name="useWord2013TrackBottomHyphenation" w:uri="http://schemas.microsoft.com/office/word" w:val="1"/>
   </w:compat>
   <w:rsids>
     <w:rsidRoot w:val="001B1BB0"/>
@@ -24665,6 +24558,7 @@
     <w:rsid w:val="003834D8"/>
     <w:rsid w:val="003A7737"/>
     <w:rsid w:val="003D3336"/>
+    <w:rsid w:val="004139A8"/>
     <w:rsid w:val="004F23A3"/>
     <w:rsid w:val="005047B6"/>
     <w:rsid w:val="00572B42"/>
@@ -24682,6 +24576,7 @@
     <w:rsid w:val="008A5352"/>
     <w:rsid w:val="009308D6"/>
     <w:rsid w:val="00931747"/>
+    <w:rsid w:val="009C79D6"/>
     <w:rsid w:val="00A141E9"/>
     <w:rsid w:val="00A41DD8"/>
     <w:rsid w:val="00A5724F"/>
@@ -24742,7 +24637,7 @@
 </file>
 
 <file path=word/glossary/styles.xml><?xml version="1.0" encoding="utf-8"?>
-<w:styles xmlns:mc="http://schemas.openxmlformats.org/markup-compatibility/2006" xmlns:r="http://schemas.openxmlformats.org/officeDocument/2006/relationships" xmlns:w="http://schemas.openxmlformats.org/wordprocessingml/2006/main" xmlns:w14="http://schemas.microsoft.com/office/word/2010/wordml" xmlns:w15="http://schemas.microsoft.com/office/word/2012/wordml" mc:Ignorable="w14 w15">
+<w:styles xmlns:mc="http://schemas.openxmlformats.org/markup-compatibility/2006" xmlns:r="http://schemas.openxmlformats.org/officeDocument/2006/relationships" xmlns:w="http://schemas.openxmlformats.org/wordprocessingml/2006/main" xmlns:w14="http://schemas.microsoft.com/office/word/2010/wordml" xmlns:w15="http://schemas.microsoft.com/office/word/2012/wordml" xmlns:w16cex="http://schemas.microsoft.com/office/word/2018/wordml/cex" xmlns:w16cid="http://schemas.microsoft.com/office/word/2016/wordml/cid" xmlns:w16="http://schemas.microsoft.com/office/word/2018/wordml" xmlns:w16du="http://schemas.microsoft.com/office/word/2023/wordml/word16du" xmlns:w16sdtdh="http://schemas.microsoft.com/office/word/2020/wordml/sdtdatahash" xmlns:w16sdtfl="http://schemas.microsoft.com/office/word/2024/wordml/sdtformatlock" xmlns:w16se="http://schemas.microsoft.com/office/word/2015/wordml/symex" mc:Ignorable="w14 w15 w16se w16cid w16 w16cex w16sdtdh w16sdtfl w16du">
   <w:docDefaults>
     <w:rPrDefault>
       <w:rPr>
@@ -24758,7 +24653,7 @@
       </w:pPr>
     </w:pPrDefault>
   </w:docDefaults>
-  <w:latentStyles w:defLockedState="0" w:defUIPriority="99" w:defSemiHidden="0" w:defUnhideWhenUsed="0" w:defQFormat="0" w:count="371">
+  <w:latentStyles w:defLockedState="0" w:defUIPriority="99" w:defSemiHidden="0" w:defUnhideWhenUsed="0" w:defQFormat="0" w:count="376">
     <w:lsdException w:name="Normal" w:uiPriority="0" w:qFormat="1"/>
     <w:lsdException w:name="heading 1" w:uiPriority="9" w:qFormat="1"/>
     <w:lsdException w:name="heading 2" w:semiHidden="1" w:uiPriority="9" w:unhideWhenUsed="1" w:qFormat="1"/>
@@ -25130,6 +25025,11 @@
     <w:lsdException w:name="List Table 5 Dark Accent 6" w:uiPriority="50"/>
     <w:lsdException w:name="List Table 6 Colorful Accent 6" w:uiPriority="51"/>
     <w:lsdException w:name="List Table 7 Colorful Accent 6" w:uiPriority="52"/>
+    <w:lsdException w:name="Mention" w:semiHidden="1" w:unhideWhenUsed="1"/>
+    <w:lsdException w:name="Smart Hyperlink" w:semiHidden="1" w:unhideWhenUsed="1"/>
+    <w:lsdException w:name="Hashtag" w:semiHidden="1" w:unhideWhenUsed="1"/>
+    <w:lsdException w:name="Unresolved Mention" w:semiHidden="1" w:unhideWhenUsed="1"/>
+    <w:lsdException w:name="Smart Link" w:semiHidden="1" w:unhideWhenUsed="1"/>
   </w:latentStyles>
   <w:style w:type="paragraph" w:default="1" w:styleId="Normal">
     <w:name w:val="Normal"/>
@@ -25180,7 +25080,7 @@
 </file>
 
 <file path=word/glossary/webSettings.xml><?xml version="1.0" encoding="utf-8"?>
-<w:webSettings xmlns:mc="http://schemas.openxmlformats.org/markup-compatibility/2006" xmlns:r="http://schemas.openxmlformats.org/officeDocument/2006/relationships" xmlns:w="http://schemas.openxmlformats.org/wordprocessingml/2006/main" xmlns:w14="http://schemas.microsoft.com/office/word/2010/wordml" xmlns:w15="http://schemas.microsoft.com/office/word/2012/wordml" mc:Ignorable="w14 w15">
+<w:webSettings xmlns:mc="http://schemas.openxmlformats.org/markup-compatibility/2006" xmlns:r="http://schemas.openxmlformats.org/officeDocument/2006/relationships" xmlns:w="http://schemas.openxmlformats.org/wordprocessingml/2006/main" xmlns:w14="http://schemas.microsoft.com/office/word/2010/wordml" xmlns:w15="http://schemas.microsoft.com/office/word/2012/wordml" xmlns:w16cex="http://schemas.microsoft.com/office/word/2018/wordml/cex" xmlns:w16cid="http://schemas.microsoft.com/office/word/2016/wordml/cid" xmlns:w16="http://schemas.microsoft.com/office/word/2018/wordml" xmlns:w16du="http://schemas.microsoft.com/office/word/2023/wordml/word16du" xmlns:w16sdtdh="http://schemas.microsoft.com/office/word/2020/wordml/sdtdatahash" xmlns:w16sdtfl="http://schemas.microsoft.com/office/word/2024/wordml/sdtformatlock" xmlns:w16se="http://schemas.microsoft.com/office/word/2015/wordml/symex" mc:Ignorable="w14 w15 w16se w16cid w16 w16cex w16sdtdh w16sdtfl w16du">
   <w:optimizeForBrowser/>
   <w:allowPNG/>
 </w:webSettings>
@@ -25482,15 +25382,6 @@
 </file>
 
 <file path=customXml/item1.xml><?xml version="1.0" encoding="utf-8"?>
-<?mso-contentType ?>
-<FormTemplates xmlns="http://schemas.microsoft.com/sharepoint/v3/contenttype/forms">
-  <Display>DocumentLibraryForm</Display>
-  <Edit>DocumentLibraryForm</Edit>
-  <New>DocumentLibraryForm</New>
-</FormTemplates>
-</file>
-
-<file path=customXml/item2.xml><?xml version="1.0" encoding="utf-8"?>
 <ct:contentTypeSchema xmlns:ct="http://schemas.microsoft.com/office/2006/metadata/contentType" xmlns:ma="http://schemas.microsoft.com/office/2006/metadata/properties/metaAttributes" ct:_="" ma:_="" ma:contentTypeName="Document" ma:contentTypeID="0x01010021A59588BC0053418FC88F40861DA871" ma:contentTypeVersion="10" ma:contentTypeDescription="Create a new document." ma:contentTypeScope="" ma:versionID="3673c1cf7550c71788a22a838bb0d9c0">
   <xsd:schema xmlns:xsd="http://www.w3.org/2001/XMLSchema" xmlns:xs="http://www.w3.org/2001/XMLSchema" xmlns:p="http://schemas.microsoft.com/office/2006/metadata/properties" xmlns:ns2="22f4eba5-1bf1-421f-a001-fd7acca9760c" targetNamespace="http://schemas.microsoft.com/office/2006/metadata/properties" ma:root="true" ma:fieldsID="ac330b6bfa0f539d41f40e8181b11b47" ns2:_="">
     <xsd:import namespace="22f4eba5-1bf1-421f-a001-fd7acca9760c"/>
@@ -25674,25 +25565,26 @@
 </ct:contentTypeSchema>
 </file>
 
+<file path=customXml/item2.xml><?xml version="1.0" encoding="utf-8"?>
+<?mso-contentType ?>
+<FormTemplates xmlns="http://schemas.microsoft.com/sharepoint/v3/contenttype/forms">
+  <Display>DocumentLibraryForm</Display>
+  <Edit>DocumentLibraryForm</Edit>
+  <New>DocumentLibraryForm</New>
+</FormTemplates>
+</file>
+
 <file path=customXml/item3.xml><?xml version="1.0" encoding="utf-8"?>
+<b:Sources xmlns:b="http://schemas.openxmlformats.org/officeDocument/2006/bibliography" xmlns="http://schemas.openxmlformats.org/officeDocument/2006/bibliography" SelectedStyle="\APASixthEditionOfficeOnline.xsl" StyleName="APA" Version="6"/>
+</file>
+
+<file path=customXml/item4.xml><?xml version="1.0" encoding="utf-8"?>
 <p:properties xmlns:p="http://schemas.microsoft.com/office/2006/metadata/properties" xmlns:xsi="http://www.w3.org/2001/XMLSchema-instance" xmlns:pc="http://schemas.microsoft.com/office/infopath/2007/PartnerControls">
   <documentManagement/>
 </p:properties>
 </file>
 
-<file path=customXml/item4.xml><?xml version="1.0" encoding="utf-8"?>
-<b:Sources xmlns:b="http://schemas.openxmlformats.org/officeDocument/2006/bibliography" xmlns="http://schemas.openxmlformats.org/officeDocument/2006/bibliography" SelectedStyle="\APASixthEditionOfficeOnline.xsl" StyleName="APA" Version="6"/>
-</file>
-
 <file path=customXml/itemProps1.xml><?xml version="1.0" encoding="utf-8"?>
-<ds:datastoreItem xmlns:ds="http://schemas.openxmlformats.org/officeDocument/2006/customXml" ds:itemID="{56C44748-5791-4773-80AF-F953C3055353}">
-  <ds:schemaRefs>
-    <ds:schemaRef ds:uri="http://schemas.microsoft.com/sharepoint/v3/contenttype/forms"/>
-  </ds:schemaRefs>
-</ds:datastoreItem>
-</file>
-
-<file path=customXml/itemProps2.xml><?xml version="1.0" encoding="utf-8"?>
 <ds:datastoreItem xmlns:ds="http://schemas.openxmlformats.org/officeDocument/2006/customXml" ds:itemID="{65E5B5D4-677A-455F-8552-96943537CE77}">
   <ds:schemaRefs>
     <ds:schemaRef ds:uri="http://schemas.microsoft.com/office/2006/metadata/contentType"/>
@@ -25710,19 +25602,27 @@
 </ds:datastoreItem>
 </file>
 
+<file path=customXml/itemProps2.xml><?xml version="1.0" encoding="utf-8"?>
+<ds:datastoreItem xmlns:ds="http://schemas.openxmlformats.org/officeDocument/2006/customXml" ds:itemID="{56C44748-5791-4773-80AF-F953C3055353}">
+  <ds:schemaRefs>
+    <ds:schemaRef ds:uri="http://schemas.microsoft.com/sharepoint/v3/contenttype/forms"/>
+  </ds:schemaRefs>
+</ds:datastoreItem>
+</file>
+
 <file path=customXml/itemProps3.xml><?xml version="1.0" encoding="utf-8"?>
+<ds:datastoreItem xmlns:ds="http://schemas.openxmlformats.org/officeDocument/2006/customXml" ds:itemID="{7CC63E90-B778-4AE3-82CA-431F5B4D7D7F}">
+  <ds:schemaRefs>
+    <ds:schemaRef ds:uri="http://schemas.openxmlformats.org/officeDocument/2006/bibliography"/>
+  </ds:schemaRefs>
+</ds:datastoreItem>
+</file>
+
+<file path=customXml/itemProps4.xml><?xml version="1.0" encoding="utf-8"?>
 <ds:datastoreItem xmlns:ds="http://schemas.openxmlformats.org/officeDocument/2006/customXml" ds:itemID="{279A32A1-94B8-4C38-AF26-42DBFF0B0D86}">
   <ds:schemaRefs>
     <ds:schemaRef ds:uri="http://schemas.microsoft.com/office/2006/metadata/properties"/>
     <ds:schemaRef ds:uri="http://schemas.microsoft.com/office/infopath/2007/PartnerControls"/>
   </ds:schemaRefs>
 </ds:datastoreItem>
-</file>
-
-<file path=customXml/itemProps4.xml><?xml version="1.0" encoding="utf-8"?>
-<ds:datastoreItem xmlns:ds="http://schemas.openxmlformats.org/officeDocument/2006/customXml" ds:itemID="{7CC63E90-B778-4AE3-82CA-431F5B4D7D7F}">
-  <ds:schemaRefs>
-    <ds:schemaRef ds:uri="http://schemas.openxmlformats.org/officeDocument/2006/bibliography"/>
-  </ds:schemaRefs>
-</ds:datastoreItem>
 </file>
</xml_diff>

<commit_message>
chnage in documentation and powerpoint
</commit_message>
<xml_diff>
--- a/final project report.docx
+++ b/final project report.docx
@@ -1,6 +1,6 @@
 
 <file path=word/document.xml><?xml version="1.0" encoding="utf-8"?>
-<w:document xmlns:wpc="http://schemas.microsoft.com/office/word/2010/wordprocessingCanvas" xmlns:mc="http://schemas.openxmlformats.org/markup-compatibility/2006" xmlns:o="urn:schemas-microsoft-com:office:office" xmlns:r="http://schemas.openxmlformats.org/officeDocument/2006/relationships" xmlns:m="http://schemas.openxmlformats.org/officeDocument/2006/math" xmlns:v="urn:schemas-microsoft-com:vml" xmlns:wp14="http://schemas.microsoft.com/office/word/2010/wordprocessingDrawing" xmlns:wp="http://schemas.openxmlformats.org/drawingml/2006/wordprocessingDrawing" xmlns:w10="urn:schemas-microsoft-com:office:word" xmlns:w="http://schemas.openxmlformats.org/wordprocessingml/2006/main" xmlns:w14="http://schemas.microsoft.com/office/word/2010/wordml" xmlns:w15="http://schemas.microsoft.com/office/word/2012/wordml" xmlns:wpg="http://schemas.microsoft.com/office/word/2010/wordprocessingGroup" xmlns:wpi="http://schemas.microsoft.com/office/word/2010/wordprocessingInk" xmlns:wne="http://schemas.microsoft.com/office/word/2006/wordml" xmlns:wps="http://schemas.microsoft.com/office/word/2010/wordprocessingShape" mc:Ignorable="w14 w15 wp14">
+<w:document xmlns:wpc="http://schemas.microsoft.com/office/word/2010/wordprocessingCanvas" xmlns:cx="http://schemas.microsoft.com/office/drawing/2014/chartex" xmlns:cx1="http://schemas.microsoft.com/office/drawing/2015/9/8/chartex" xmlns:cx2="http://schemas.microsoft.com/office/drawing/2015/10/21/chartex" xmlns:cx3="http://schemas.microsoft.com/office/drawing/2016/5/9/chartex" xmlns:cx4="http://schemas.microsoft.com/office/drawing/2016/5/10/chartex" xmlns:cx5="http://schemas.microsoft.com/office/drawing/2016/5/11/chartex" xmlns:cx6="http://schemas.microsoft.com/office/drawing/2016/5/12/chartex" xmlns:cx7="http://schemas.microsoft.com/office/drawing/2016/5/13/chartex" xmlns:cx8="http://schemas.microsoft.com/office/drawing/2016/5/14/chartex" xmlns:mc="http://schemas.openxmlformats.org/markup-compatibility/2006" xmlns:aink="http://schemas.microsoft.com/office/drawing/2016/ink" xmlns:am3d="http://schemas.microsoft.com/office/drawing/2017/model3d" xmlns:o="urn:schemas-microsoft-com:office:office" xmlns:oel="http://schemas.microsoft.com/office/2019/extlst" xmlns:r="http://schemas.openxmlformats.org/officeDocument/2006/relationships" xmlns:m="http://schemas.openxmlformats.org/officeDocument/2006/math" xmlns:v="urn:schemas-microsoft-com:vml" xmlns:wp14="http://schemas.microsoft.com/office/word/2010/wordprocessingDrawing" xmlns:wp="http://schemas.openxmlformats.org/drawingml/2006/wordprocessingDrawing" xmlns:w10="urn:schemas-microsoft-com:office:word" xmlns:w="http://schemas.openxmlformats.org/wordprocessingml/2006/main" xmlns:w14="http://schemas.microsoft.com/office/word/2010/wordml" xmlns:w15="http://schemas.microsoft.com/office/word/2012/wordml" xmlns:w16cex="http://schemas.microsoft.com/office/word/2018/wordml/cex" xmlns:w16cid="http://schemas.microsoft.com/office/word/2016/wordml/cid" xmlns:w16="http://schemas.microsoft.com/office/word/2018/wordml" xmlns:w16du="http://schemas.microsoft.com/office/word/2023/wordml/word16du" xmlns:w16sdtdh="http://schemas.microsoft.com/office/word/2020/wordml/sdtdatahash" xmlns:w16sdtfl="http://schemas.microsoft.com/office/word/2024/wordml/sdtformatlock" xmlns:w16se="http://schemas.microsoft.com/office/word/2015/wordml/symex" xmlns:wpg="http://schemas.microsoft.com/office/word/2010/wordprocessingGroup" xmlns:wpi="http://schemas.microsoft.com/office/word/2010/wordprocessingInk" xmlns:wne="http://schemas.microsoft.com/office/word/2006/wordml" xmlns:wps="http://schemas.microsoft.com/office/word/2010/wordprocessingShape" mc:Ignorable="w14 w15 w16se w16cid w16 w16cex w16sdtdh w16sdtfl w16du wp14">
   <w:body>
     <w:p>
       <w:pPr>
@@ -101,7 +101,6 @@
           <w:szCs w:val="28"/>
         </w:rPr>
       </w:pPr>
-      <w:proofErr w:type="spellStart"/>
       <w:r>
         <w:rPr>
           <w:rFonts w:cs="Times New Roman"/>
@@ -110,31 +109,8 @@
           <w:sz w:val="28"/>
           <w:szCs w:val="28"/>
         </w:rPr>
-        <w:t>Simalchaur</w:t>
-      </w:r>
-      <w:proofErr w:type="spellEnd"/>
-      <w:r>
-        <w:rPr>
-          <w:rFonts w:cs="Times New Roman"/>
-          <w:b/>
-          <w:bCs/>
-          <w:sz w:val="28"/>
-          <w:szCs w:val="28"/>
-        </w:rPr>
-        <w:t xml:space="preserve">, </w:t>
-      </w:r>
-      <w:proofErr w:type="spellStart"/>
-      <w:r>
-        <w:rPr>
-          <w:rFonts w:cs="Times New Roman"/>
-          <w:b/>
-          <w:bCs/>
-          <w:sz w:val="28"/>
-          <w:szCs w:val="28"/>
-        </w:rPr>
-        <w:t>Pokhara</w:t>
-      </w:r>
-      <w:proofErr w:type="spellEnd"/>
+        <w:t>Simalchaur, Pokhara</w:t>
+      </w:r>
       <w:r>
         <w:rPr>
           <w:rFonts w:cs="Times New Roman"/>
@@ -403,7 +379,7 @@
               </wp:inline>
             </w:drawing>
           </mc:Choice>
-          <mc:Fallback xmlns:w16se="http://schemas.microsoft.com/office/word/2015/wordml/symex" xmlns:w16sdtfl="http://schemas.microsoft.com/office/word/2024/wordml/sdtformatlock" xmlns:w16sdtdh="http://schemas.microsoft.com/office/word/2020/wordml/sdtdatahash" xmlns:w16du="http://schemas.microsoft.com/office/word/2023/wordml/word16du" xmlns:w16="http://schemas.microsoft.com/office/word/2018/wordml" xmlns:w16cid="http://schemas.microsoft.com/office/word/2016/wordml/cid" xmlns:w16cex="http://schemas.microsoft.com/office/word/2018/wordml/cex" xmlns:oel="http://schemas.microsoft.com/office/2019/extlst" xmlns:am3d="http://schemas.microsoft.com/office/drawing/2017/model3d" xmlns:aink="http://schemas.microsoft.com/office/drawing/2016/ink" xmlns:cx8="http://schemas.microsoft.com/office/drawing/2016/5/14/chartex" xmlns:cx7="http://schemas.microsoft.com/office/drawing/2016/5/13/chartex" xmlns:cx6="http://schemas.microsoft.com/office/drawing/2016/5/12/chartex" xmlns:cx5="http://schemas.microsoft.com/office/drawing/2016/5/11/chartex" xmlns:cx4="http://schemas.microsoft.com/office/drawing/2016/5/10/chartex" xmlns:cx3="http://schemas.microsoft.com/office/drawing/2016/5/9/chartex" xmlns:cx2="http://schemas.microsoft.com/office/drawing/2015/10/21/chartex" xmlns:cx1="http://schemas.microsoft.com/office/drawing/2015/9/8/chartex" xmlns:cx="http://schemas.microsoft.com/office/drawing/2014/chartex">
+          <mc:Fallback>
             <w:pict>
               <v:group w14:anchorId="5F28FB87" id="Group 5" o:spid="_x0000_s1026" style="width:43.55pt;height:123.05pt;mso-position-horizontal-relative:char;mso-position-vertical-relative:line" coordsize="6762,16097" o:gfxdata="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">
                 <v:line id="Straight Connector 2" o:spid="_x0000_s1027" style="position:absolute;visibility:visible;mso-wrap-style:square" from="3333,0" to="3333,16097" o:connectortype="straight" o:gfxdata="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" strokecolor="black [3200]" strokeweight="2.5pt">
@@ -659,6 +635,7 @@
                 <w:szCs w:val="24"/>
               </w:rPr>
             </w:pPr>
+            <w:proofErr w:type="spellStart"/>
             <w:r>
               <w:rPr>
                 <w:rFonts w:cs="Times New Roman"/>
@@ -666,7 +643,17 @@
                 <w:bCs/>
                 <w:szCs w:val="24"/>
               </w:rPr>
-              <w:t>P.U. Registration Number</w:t>
+              <w:t>P.U</w:t>
+            </w:r>
+            <w:proofErr w:type="spellEnd"/>
+            <w:r>
+              <w:rPr>
+                <w:rFonts w:cs="Times New Roman"/>
+                <w:b/>
+                <w:bCs/>
+                <w:szCs w:val="24"/>
+              </w:rPr>
+              <w:t>. Registration Number</w:t>
             </w:r>
           </w:p>
         </w:tc>
@@ -875,7 +862,6 @@
           <w:szCs w:val="24"/>
         </w:rPr>
       </w:pPr>
-      <w:proofErr w:type="gramStart"/>
       <w:r>
         <w:rPr>
           <w:rFonts w:cs="Times New Roman"/>
@@ -903,7 +889,6 @@
         </w:rPr>
         <w:t>:</w:t>
       </w:r>
-      <w:proofErr w:type="gramEnd"/>
       <w:r>
         <w:rPr>
           <w:rFonts w:cs="Times New Roman"/>
@@ -1141,6 +1126,7 @@
           <w:sz w:val="32"/>
           <w:szCs w:val="32"/>
         </w:rPr>
+        <w:lastRenderedPageBreak/>
         <w:t>Student</w:t>
       </w:r>
       <w:r>
@@ -1488,6 +1474,7 @@
           <w:sz w:val="32"/>
           <w:szCs w:val="32"/>
         </w:rPr>
+        <w:lastRenderedPageBreak/>
         <w:t>Supervisor Acceptance</w:t>
       </w:r>
     </w:p>
@@ -1573,7 +1560,7 @@
           <w:rFonts w:cs="Times New Roman"/>
           <w:szCs w:val="24"/>
         </w:rPr>
-        <w:t xml:space="preserve"> Arpan Pokhrel, Lecturer</w:t>
+        <w:t>Arpan Pokhrel, Lecturer</w:t>
       </w:r>
       <w:r>
         <w:rPr>
@@ -1647,8 +1634,9 @@
           <w:szCs w:val="24"/>
           <w:lang w:val="en-US"/>
         </w:rPr>
+        <w:lastRenderedPageBreak/>
         <w:drawing>
-          <wp:anchor distT="0" distB="0" distL="114300" distR="114300" simplePos="0" relativeHeight="251659264" behindDoc="1" locked="0" layoutInCell="1" allowOverlap="1" wp14:anchorId="7036BFE8" wp14:editId="2DEB0B07">
+          <wp:anchor distT="0" distB="0" distL="114300" distR="114300" simplePos="0" relativeHeight="251659264" behindDoc="1" locked="0" layoutInCell="1" allowOverlap="1" wp14:anchorId="7036BFE8" wp14:editId="0201D005">
             <wp:simplePos x="0" y="0"/>
             <wp:positionH relativeFrom="page">
               <wp:posOffset>-182245</wp:posOffset>
@@ -4738,6 +4726,7 @@
           <w:sz w:val="32"/>
           <w:szCs w:val="32"/>
         </w:rPr>
+        <w:lastRenderedPageBreak/>
         <w:t>List of Figures</w:t>
       </w:r>
     </w:p>
@@ -6157,6 +6146,7 @@
           <w:sz w:val="32"/>
           <w:szCs w:val="32"/>
         </w:rPr>
+        <w:lastRenderedPageBreak/>
         <w:t>Abbreviations</w:t>
       </w:r>
     </w:p>
@@ -6707,6 +6697,7 @@
       </w:pPr>
       <w:bookmarkStart w:id="3" w:name="_Toc234565755"/>
       <w:r>
+        <w:lastRenderedPageBreak/>
         <w:t>.</w:t>
       </w:r>
       <w:r>
@@ -6781,21 +6772,7 @@
         <w:rPr>
           <w:szCs w:val="24"/>
         </w:rPr>
-        <w:t>(</w:t>
-      </w:r>
-      <w:proofErr w:type="spellStart"/>
-      <w:r>
-        <w:rPr>
-          <w:szCs w:val="24"/>
-        </w:rPr>
-        <w:t>Balagurusamy</w:t>
-      </w:r>
-      <w:proofErr w:type="spellEnd"/>
-      <w:r>
-        <w:rPr>
-          <w:szCs w:val="24"/>
-        </w:rPr>
-        <w:t>, 2020)</w:t>
+        <w:t>(Balagurusamy, 2020)</w:t>
       </w:r>
     </w:p>
     <w:p>
@@ -6967,7 +6944,11 @@
         <w:jc w:val="both"/>
       </w:pPr>
       <w:r>
-        <w:t>This project also includes additional innovative feature such as tournament mode and streak bonus system. Tournament mode allows users to compete in multiple rounds continuously, while the streak bonus system reward users for consecutive wins. These features increase excitement and provide better gaming experience.</w:t>
+        <w:t xml:space="preserve">This project also includes additional innovative feature such as tournament mode and streak bonus system. Tournament mode allows users to compete in multiple rounds </w:t>
+      </w:r>
+      <w:r>
+        <w:lastRenderedPageBreak/>
+        <w:t>continuously, while the streak bonus system reward users for consecutive wins. These features increase excitement and provide better gaming experience.</w:t>
       </w:r>
     </w:p>
     <w:p>
@@ -6991,21 +6972,7 @@
         <w:rPr>
           <w:szCs w:val="24"/>
         </w:rPr>
-        <w:t>(</w:t>
-      </w:r>
-      <w:proofErr w:type="spellStart"/>
-      <w:r>
-        <w:rPr>
-          <w:szCs w:val="24"/>
-        </w:rPr>
-        <w:t>Balagurusamy</w:t>
-      </w:r>
-      <w:proofErr w:type="spellEnd"/>
-      <w:r>
-        <w:rPr>
-          <w:szCs w:val="24"/>
-        </w:rPr>
-        <w:t>, 2020; Tutorials Point, n.d.)</w:t>
+        <w:t>(Balagurusamy, 2020; Tutorials Point, n.d.)</w:t>
       </w:r>
     </w:p>
     <w:p>
@@ -7062,6 +7029,7 @@
       </w:pPr>
       <w:bookmarkStart w:id="4" w:name="_Toc234565756"/>
       <w:r>
+        <w:lastRenderedPageBreak/>
         <w:t>.</w:t>
       </w:r>
       <w:r>
@@ -7251,6 +7219,7 @@
       </w:pPr>
       <w:bookmarkStart w:id="5" w:name="_Toc234565757"/>
       <w:r>
+        <w:lastRenderedPageBreak/>
         <w:t>.</w:t>
       </w:r>
       <w:r>
@@ -7420,6 +7389,7 @@
       </w:pPr>
       <w:bookmarkStart w:id="6" w:name="_Toc234565758"/>
       <w:r>
+        <w:lastRenderedPageBreak/>
         <w:t>.</w:t>
       </w:r>
       <w:r>
@@ -7436,15 +7406,7 @@
         <w:t>The evolution of game development from traditional board and hand games to digital applications has significantly enhanced user engagement and accessibility. Rock-Paper-Scissors, being one of the oldest and simplest games, has served as an ideal subject for computerization due to its straightforward rules and minimal computational requirements.</w:t>
       </w:r>
       <w:r>
-        <w:t xml:space="preserve"> (</w:t>
-      </w:r>
-      <w:proofErr w:type="spellStart"/>
-      <w:r>
-        <w:t>Balagurusamy</w:t>
-      </w:r>
-      <w:proofErr w:type="spellEnd"/>
-      <w:r>
-        <w:t>, 2020)</w:t>
+        <w:t xml:space="preserve"> (Balagurusamy, 2020)</w:t>
       </w:r>
       <w:r>
         <w:t xml:space="preserve"> Historically, computer implementations of Rock-Paper-Scissors were basic, often limited to single-player modes against the computer without persistent data storage. These implementations lacked features such as user registration, match history, and leaderboards, which are essential for fostering competitive spirit and long-term engagement.</w:t>
@@ -7487,29 +7449,17 @@
         <w:t xml:space="preserve"> Many existing systems do not support multiplayer functionality, which limits social interaction. Additionally, traditional game systems often do not include comprehensive dashboards or real-time leaderboards, which are critical for motivating players.</w:t>
       </w:r>
       <w:r>
-        <w:t xml:space="preserve"> (</w:t>
-      </w:r>
-      <w:proofErr w:type="spellStart"/>
-      <w:r>
-        <w:t>GeeksforGeeks</w:t>
-      </w:r>
-      <w:proofErr w:type="spellEnd"/>
-      <w:r>
-        <w:t xml:space="preserve">, </w:t>
-      </w:r>
-      <w:proofErr w:type="spellStart"/>
-      <w:r>
-        <w:t>n.d.</w:t>
-      </w:r>
-      <w:proofErr w:type="spellEnd"/>
-      <w:r>
-        <w:t>)</w:t>
+        <w:t xml:space="preserve"> (GeeksforGeeks, n.d.)</w:t>
       </w:r>
       <w:r>
         <w:t xml:space="preserve"> </w:t>
       </w:r>
       <w:r>
-        <w:t>This project aims to address these gaps by implementing a multi-mode Rock-Paper-Scissors game with robust data management, multiplayer capabilities, and an intuitive user interface. The motivation stems from the need to create an engaging online game platform that is accessible to users with varying levels of technical expertise, and to explore how traditional games can be adapted to modern digital environments.</w:t>
+        <w:t xml:space="preserve">This project aims to address these gaps by implementing a multi-mode Rock-Paper-Scissors game with robust data management, multiplayer capabilities, and an intuitive user interface. The motivation stems from the need to </w:t>
+      </w:r>
+      <w:r>
+        <w:lastRenderedPageBreak/>
+        <w:t>create an engaging online game platform that is accessible to users with varying levels of technical expertise, and to explore how traditional games can be adapted to modern digital environments.</w:t>
       </w:r>
       <w:r>
         <w:t xml:space="preserve"> The development process involves </w:t>
@@ -7521,15 +7471,7 @@
         <w:t xml:space="preserve"> existing systems, identifying missing features, and designing an integrated system that combines game logic with user management, data persistence, and interactive interfaces.</w:t>
       </w:r>
       <w:r>
-        <w:t xml:space="preserve"> (</w:t>
-      </w:r>
-      <w:proofErr w:type="spellStart"/>
-      <w:r>
-        <w:t>Balagurusamy</w:t>
-      </w:r>
-      <w:proofErr w:type="spellEnd"/>
-      <w:r>
-        <w:t>, 2020; Kernighan &amp; Ritchie, 1988)</w:t>
+        <w:t xml:space="preserve"> (Balagurusamy, 2020; Kernighan &amp; Ritchie, 1988)</w:t>
       </w:r>
       <w:r>
         <w:rPr>
@@ -7630,6 +7572,7 @@
       </w:pPr>
       <w:bookmarkStart w:id="7" w:name="_Toc234565759"/>
       <w:r>
+        <w:lastRenderedPageBreak/>
         <w:t>.</w:t>
       </w:r>
       <w:r>
@@ -7935,22 +7878,14 @@
               <w:rPr>
                 <w:lang w:val="en-GB"/>
               </w:rPr>
-              <w:t xml:space="preserve">d </w:t>
-            </w:r>
-            <w:proofErr w:type="gramStart"/>
+              <w:t xml:space="preserve">d and  </w:t>
+            </w:r>
             <w:r>
               <w:rPr>
                 <w:lang w:val="en-GB"/>
               </w:rPr>
-              <w:t xml:space="preserve">and  </w:t>
-            </w:r>
-            <w:r>
-              <w:rPr>
-                <w:lang w:val="en-GB"/>
-              </w:rPr>
               <w:t>Authenticates</w:t>
             </w:r>
-            <w:proofErr w:type="gramEnd"/>
             <w:r>
               <w:rPr>
                 <w:lang w:val="en-GB"/>
@@ -8012,16 +7947,8 @@
               <w:rPr>
                 <w:lang w:val="en-GB"/>
               </w:rPr>
-              <w:t xml:space="preserve"> and security </w:t>
-            </w:r>
-            <w:proofErr w:type="gramStart"/>
-            <w:r>
-              <w:rPr>
-                <w:lang w:val="en-GB"/>
-              </w:rPr>
-              <w:t>feature .</w:t>
-            </w:r>
-            <w:proofErr w:type="gramEnd"/>
+              <w:t xml:space="preserve"> and security feature .</w:t>
+            </w:r>
           </w:p>
         </w:tc>
       </w:tr>
@@ -8135,6 +8062,7 @@
               <w:spacing w:before="0" w:beforeAutospacing="0" w:after="0" w:afterAutospacing="0" w:line="360" w:lineRule="auto"/>
             </w:pPr>
             <w:r>
+              <w:lastRenderedPageBreak/>
               <w:t>3.</w:t>
             </w:r>
           </w:p>
@@ -8887,6 +8815,7 @@
               <w:spacing w:before="0" w:beforeAutospacing="0" w:after="0" w:afterAutospacing="0" w:line="360" w:lineRule="auto"/>
             </w:pPr>
             <w:r>
+              <w:lastRenderedPageBreak/>
               <w:t>10.</w:t>
             </w:r>
           </w:p>
@@ -9513,6 +9442,7 @@
       </w:pPr>
       <w:bookmarkStart w:id="13" w:name="_Toc234565765"/>
       <w:r>
+        <w:lastRenderedPageBreak/>
         <w:t>.</w:t>
       </w:r>
       <w:r>
@@ -9556,7 +9486,7 @@
           <w:lang w:val="en-US"/>
         </w:rPr>
         <w:drawing>
-          <wp:inline distT="0" distB="0" distL="0" distR="0" wp14:anchorId="497F33C4" wp14:editId="3187483D">
+          <wp:inline distT="0" distB="0" distL="0" distR="0" wp14:anchorId="497F33C4" wp14:editId="53B280BE">
             <wp:extent cx="5613400" cy="2372098"/>
             <wp:effectExtent l="0" t="0" r="6350" b="9525"/>
             <wp:docPr id="6" name="Picture 6"/>
@@ -9893,6 +9823,7 @@
       </w:pPr>
       <w:bookmarkStart w:id="17" w:name="_Toc234565767"/>
       <w:r>
+        <w:lastRenderedPageBreak/>
         <w:t>Flowchart</w:t>
       </w:r>
       <w:bookmarkEnd w:id="17"/>
@@ -10225,6 +10156,7 @@
           <w:szCs w:val="24"/>
           <w:lang w:val="en-US"/>
         </w:rPr>
+        <w:lastRenderedPageBreak/>
         <w:drawing>
           <wp:inline distT="0" distB="0" distL="0" distR="0" wp14:anchorId="78C41E9D" wp14:editId="5FFE4C43">
             <wp:extent cx="5274310" cy="6285230"/>
@@ -10450,6 +10382,7 @@
           <w:szCs w:val="24"/>
           <w:lang w:val="en-US"/>
         </w:rPr>
+        <w:lastRenderedPageBreak/>
         <w:drawing>
           <wp:inline distT="0" distB="0" distL="0" distR="0" wp14:anchorId="0C47A2B4" wp14:editId="33916B23">
             <wp:extent cx="5274310" cy="5942965"/>
@@ -10667,6 +10600,7 @@
           <w:szCs w:val="24"/>
           <w:lang w:val="en-US"/>
         </w:rPr>
+        <w:lastRenderedPageBreak/>
         <w:drawing>
           <wp:inline distT="0" distB="0" distL="0" distR="0" wp14:anchorId="6B9B353F" wp14:editId="14BA536F">
             <wp:extent cx="5828306" cy="5382260"/>
@@ -10848,6 +10782,7 @@
         <w:ind w:left="360" w:hanging="360"/>
       </w:pPr>
       <w:r>
+        <w:lastRenderedPageBreak/>
         <w:t xml:space="preserve"> </w:t>
       </w:r>
       <w:bookmarkStart w:id="23" w:name="_Toc234565768"/>
@@ -10861,14 +10796,6 @@
         <w:keepNext/>
         <w:spacing w:line="360" w:lineRule="auto"/>
       </w:pPr>
-      <w:r>
-        <w:rPr>
-          <w:noProof/>
-          <w:lang w:val="en-US"/>
-        </w:rPr>
-        <w:t>32</w:t>
-      </w:r>
-      <w:bookmarkStart w:id="24" w:name="_GoBack"/>
       <w:r>
         <w:rPr>
           <w:noProof/>
@@ -10920,7 +10847,6 @@
           </wp:inline>
         </w:drawing>
       </w:r>
-      <w:bookmarkEnd w:id="24"/>
     </w:p>
     <w:p>
       <w:pPr>
@@ -10931,7 +10857,7 @@
           <w:szCs w:val="24"/>
         </w:rPr>
       </w:pPr>
-      <w:bookmarkStart w:id="25" w:name="_Toc234667825"/>
+      <w:bookmarkStart w:id="24" w:name="_Toc234667825"/>
       <w:r>
         <w:rPr>
           <w:sz w:val="24"/>
@@ -11025,7 +10951,7 @@
         </w:rPr>
         <w:t xml:space="preserve"> : Use Case diagram</w:t>
       </w:r>
-      <w:bookmarkEnd w:id="25"/>
+      <w:bookmarkEnd w:id="24"/>
     </w:p>
     <w:p>
       <w:pPr>
@@ -11074,6 +11000,7 @@
         <w:ind w:left="270" w:hanging="270"/>
       </w:pPr>
       <w:r>
+        <w:lastRenderedPageBreak/>
         <w:t>.</w:t>
       </w:r>
       <w:r>
@@ -11090,11 +11017,11 @@
       <w:r>
         <w:t xml:space="preserve"> </w:t>
       </w:r>
-      <w:bookmarkStart w:id="26" w:name="_Toc234565770"/>
+      <w:bookmarkStart w:id="25" w:name="_Toc234565770"/>
       <w:r>
         <w:t>Waterfall Model</w:t>
       </w:r>
-      <w:bookmarkEnd w:id="26"/>
+      <w:bookmarkEnd w:id="25"/>
     </w:p>
     <w:p>
       <w:pPr>
@@ -11464,7 +11391,7 @@
           <w:szCs w:val="24"/>
         </w:rPr>
       </w:pPr>
-      <w:bookmarkStart w:id="27" w:name="_Toc234667826"/>
+      <w:bookmarkStart w:id="26" w:name="_Toc234667826"/>
       <w:r>
         <w:rPr>
           <w:sz w:val="24"/>
@@ -11558,7 +11485,7 @@
         </w:rPr>
         <w:t xml:space="preserve"> : Waterfall Model</w:t>
       </w:r>
-      <w:bookmarkEnd w:id="27"/>
+      <w:bookmarkEnd w:id="26"/>
     </w:p>
     <w:p>
       <w:pPr>
@@ -11594,6 +11521,7 @@
         <w:spacing w:before="0" w:beforeAutospacing="0" w:after="0" w:afterAutospacing="0" w:line="360" w:lineRule="auto"/>
       </w:pPr>
       <w:r>
+        <w:lastRenderedPageBreak/>
         <w:t>Finally, most importantly, the chart of work assignment.</w:t>
       </w:r>
     </w:p>
@@ -11619,8 +11547,13 @@
               <w:pStyle w:val="NormalWeb"/>
               <w:spacing w:before="0" w:beforeAutospacing="0" w:after="0" w:afterAutospacing="0" w:line="360" w:lineRule="auto"/>
             </w:pPr>
-            <w:r>
-              <w:t>S.N.</w:t>
+            <w:proofErr w:type="spellStart"/>
+            <w:r>
+              <w:t>S.N</w:t>
+            </w:r>
+            <w:proofErr w:type="spellEnd"/>
+            <w:r>
+              <w:t>.</w:t>
             </w:r>
           </w:p>
         </w:tc>
@@ -11925,16 +11858,17 @@
         <w:ind w:left="360" w:hanging="396"/>
       </w:pPr>
       <w:r>
+        <w:lastRenderedPageBreak/>
         <w:t xml:space="preserve"> </w:t>
       </w:r>
-      <w:bookmarkStart w:id="28" w:name="_Toc234565771"/>
+      <w:bookmarkStart w:id="27" w:name="_Toc234565771"/>
       <w:r>
         <w:t xml:space="preserve">Gantt </w:t>
       </w:r>
       <w:r>
         <w:t>chart</w:t>
       </w:r>
-      <w:bookmarkEnd w:id="28"/>
+      <w:bookmarkEnd w:id="27"/>
     </w:p>
     <w:p>
       <w:pPr>
@@ -12013,7 +11947,7 @@
           <w:szCs w:val="24"/>
         </w:rPr>
       </w:pPr>
-      <w:bookmarkStart w:id="29" w:name="_Toc234667827"/>
+      <w:bookmarkStart w:id="28" w:name="_Toc234667827"/>
       <w:r>
         <w:rPr>
           <w:sz w:val="24"/>
@@ -12107,7 +12041,7 @@
         </w:rPr>
         <w:t xml:space="preserve"> : Gantt Chart</w:t>
       </w:r>
-      <w:bookmarkEnd w:id="29"/>
+      <w:bookmarkEnd w:id="28"/>
     </w:p>
     <w:p>
       <w:pPr>
@@ -12119,14 +12053,15 @@
       <w:r>
         <w:br w:type="page"/>
       </w:r>
-      <w:bookmarkStart w:id="30" w:name="_Toc234565772"/>
-      <w:r>
+      <w:bookmarkStart w:id="29" w:name="_Toc234565772"/>
+      <w:r>
+        <w:lastRenderedPageBreak/>
         <w:t>.</w:t>
       </w:r>
       <w:r>
         <w:t>Testing</w:t>
       </w:r>
-      <w:bookmarkEnd w:id="30"/>
+      <w:bookmarkEnd w:id="29"/>
     </w:p>
     <w:p>
       <w:pPr>
@@ -12398,11 +12333,12 @@
         <w:spacing w:line="360" w:lineRule="auto"/>
         <w:ind w:left="270" w:hanging="396"/>
       </w:pPr>
-      <w:bookmarkStart w:id="31" w:name="_Toc234565773"/>
-      <w:r>
+      <w:bookmarkStart w:id="30" w:name="_Toc234565773"/>
+      <w:r>
+        <w:lastRenderedPageBreak/>
         <w:t>Test Case 1 (User Registration)</w:t>
       </w:r>
-      <w:bookmarkEnd w:id="31"/>
+      <w:bookmarkEnd w:id="30"/>
     </w:p>
     <w:tbl>
       <w:tblPr>
@@ -12749,11 +12685,11 @@
         <w:spacing w:line="360" w:lineRule="auto"/>
         <w:ind w:left="360" w:hanging="360"/>
       </w:pPr>
-      <w:bookmarkStart w:id="32" w:name="_Toc234565774"/>
+      <w:bookmarkStart w:id="31" w:name="_Toc234565774"/>
       <w:r>
         <w:t>Test Case 2 (User Login)</w:t>
       </w:r>
-      <w:bookmarkEnd w:id="32"/>
+      <w:bookmarkEnd w:id="31"/>
     </w:p>
     <w:tbl>
       <w:tblPr>
@@ -13097,11 +13033,11 @@
           <w:lang w:val="en-US"/>
         </w:rPr>
       </w:pPr>
-      <w:bookmarkStart w:id="33" w:name="_Toc234565775"/>
+      <w:bookmarkStart w:id="32" w:name="_Toc234565775"/>
       <w:r>
         <w:t>Test Case 3 (Single Player Gameplay)</w:t>
       </w:r>
-      <w:bookmarkEnd w:id="33"/>
+      <w:bookmarkEnd w:id="32"/>
     </w:p>
     <w:tbl>
       <w:tblPr>
@@ -13226,6 +13162,7 @@
                 <w:bCs/>
                 <w:lang w:val="en-US"/>
               </w:rPr>
+              <w:lastRenderedPageBreak/>
               <w:t>Expected Result</w:t>
             </w:r>
           </w:p>
@@ -13461,14 +13398,14 @@
           <w:lang w:val="en-US"/>
         </w:rPr>
       </w:pPr>
-      <w:bookmarkStart w:id="34" w:name="_Toc234565776"/>
+      <w:bookmarkStart w:id="33" w:name="_Toc234565776"/>
       <w:r>
         <w:rPr>
           <w:lang w:val="en-US"/>
         </w:rPr>
         <w:t>Test Case 4 (Multiplayer Gameplay)</w:t>
       </w:r>
-      <w:bookmarkEnd w:id="34"/>
+      <w:bookmarkEnd w:id="33"/>
     </w:p>
     <w:tbl>
       <w:tblPr>
@@ -13805,14 +13742,14 @@
           <w:lang w:val="en-US"/>
         </w:rPr>
       </w:pPr>
-      <w:bookmarkStart w:id="35" w:name="_Toc234565777"/>
+      <w:bookmarkStart w:id="34" w:name="_Toc234565777"/>
       <w:r>
         <w:rPr>
           <w:lang w:val="en-US"/>
         </w:rPr>
         <w:t>Test Case 5 (Leaderboard)</w:t>
       </w:r>
-      <w:bookmarkEnd w:id="35"/>
+      <w:bookmarkEnd w:id="34"/>
     </w:p>
     <w:tbl>
       <w:tblPr>
@@ -13931,6 +13868,7 @@
                 <w:bCs/>
                 <w:lang w:val="en-US"/>
               </w:rPr>
+              <w:lastRenderedPageBreak/>
               <w:t>Expected Result</w:t>
             </w:r>
           </w:p>
@@ -14152,11 +14090,11 @@
           <w:lang w:val="en-US"/>
         </w:rPr>
       </w:pPr>
-      <w:bookmarkStart w:id="36" w:name="_Toc234565778"/>
+      <w:bookmarkStart w:id="35" w:name="_Toc234565778"/>
       <w:r>
         <w:t>Requirement Traceability Matrix (RTM)</w:t>
       </w:r>
-      <w:bookmarkEnd w:id="36"/>
+      <w:bookmarkEnd w:id="35"/>
     </w:p>
     <w:tbl>
       <w:tblPr>
@@ -14186,13 +14124,23 @@
                 <w:lang w:val="en-US"/>
               </w:rPr>
             </w:pPr>
+            <w:proofErr w:type="spellStart"/>
             <w:r>
               <w:rPr>
                 <w:b/>
                 <w:bCs/>
                 <w:lang w:val="en-US"/>
               </w:rPr>
-              <w:t>S.N.</w:t>
+              <w:t>S.N</w:t>
+            </w:r>
+            <w:proofErr w:type="spellEnd"/>
+            <w:r>
+              <w:rPr>
+                <w:b/>
+                <w:bCs/>
+                <w:lang w:val="en-US"/>
+              </w:rPr>
+              <w:t>.</w:t>
             </w:r>
           </w:p>
         </w:tc>
@@ -15126,6 +15074,7 @@
               <w:rPr>
                 <w:lang w:val="en-US"/>
               </w:rPr>
+              <w:lastRenderedPageBreak/>
               <w:t>109</w:t>
             </w:r>
           </w:p>
@@ -15340,11 +15289,12 @@
         <w:spacing w:line="360" w:lineRule="auto"/>
         <w:ind w:left="360" w:hanging="360"/>
       </w:pPr>
-      <w:bookmarkStart w:id="37" w:name="_Toc234565779"/>
-      <w:r>
+      <w:bookmarkStart w:id="36" w:name="_Toc234565779"/>
+      <w:r>
+        <w:lastRenderedPageBreak/>
         <w:t>User Acceptance Testing (UAT)</w:t>
       </w:r>
-      <w:bookmarkEnd w:id="37"/>
+      <w:bookmarkEnd w:id="36"/>
     </w:p>
     <w:tbl>
       <w:tblPr>
@@ -16758,14 +16708,15 @@
       <w:r>
         <w:br w:type="page"/>
       </w:r>
-      <w:bookmarkStart w:id="38" w:name="_Toc234565780"/>
-      <w:r>
+      <w:bookmarkStart w:id="37" w:name="_Toc234565780"/>
+      <w:r>
+        <w:lastRenderedPageBreak/>
         <w:t>.</w:t>
       </w:r>
       <w:r>
         <w:t>Project Results</w:t>
       </w:r>
-      <w:bookmarkEnd w:id="38"/>
+      <w:bookmarkEnd w:id="37"/>
     </w:p>
     <w:p>
       <w:pPr>
@@ -17103,6 +17054,7 @@
           <w:szCs w:val="24"/>
           <w:lang w:val="en-US"/>
         </w:rPr>
+        <w:lastRenderedPageBreak/>
         <w:t>Working as a team helped us improve our communication, coordination, and problem-solving skills. We learned how to divide tasks, support each other during development, and solve programming challenges together. Overall, this project provided valuable practical experience and increased our confidence in developing real-world software applications using C programming.</w:t>
       </w:r>
     </w:p>
@@ -17131,14 +17083,15 @@
         <w:ind w:left="360" w:hanging="360"/>
         <w:jc w:val="both"/>
       </w:pPr>
-      <w:bookmarkStart w:id="39" w:name="_Toc234565781"/>
-      <w:r>
+      <w:bookmarkStart w:id="38" w:name="_Toc234565781"/>
+      <w:r>
+        <w:lastRenderedPageBreak/>
         <w:t>.</w:t>
       </w:r>
       <w:r>
         <w:t>Future Enhancements</w:t>
       </w:r>
-      <w:bookmarkEnd w:id="39"/>
+      <w:bookmarkEnd w:id="38"/>
     </w:p>
     <w:p>
       <w:pPr>
@@ -17463,14 +17416,15 @@
         <w:ind w:left="360" w:hanging="360"/>
         <w:jc w:val="both"/>
       </w:pPr>
-      <w:bookmarkStart w:id="40" w:name="_Toc234565782"/>
-      <w:r>
+      <w:bookmarkStart w:id="39" w:name="_Toc234565782"/>
+      <w:r>
+        <w:lastRenderedPageBreak/>
         <w:t>.</w:t>
       </w:r>
       <w:r>
         <w:t xml:space="preserve"> Conclusion</w:t>
       </w:r>
-      <w:bookmarkEnd w:id="40"/>
+      <w:bookmarkEnd w:id="39"/>
     </w:p>
     <w:p>
       <w:pPr>
@@ -17593,6 +17547,7 @@
         <w:ind w:left="360" w:hanging="360"/>
       </w:pPr>
       <w:r>
+        <w:lastRenderedPageBreak/>
         <w:t>.</w:t>
       </w:r>
       <w:r>
@@ -17785,13 +17740,8 @@
       <w:r>
         <w:t xml:space="preserve">5. </w:t>
       </w:r>
-      <w:proofErr w:type="spellStart"/>
-      <w:r>
-        <w:t>GeeksforGeeks</w:t>
-      </w:r>
-      <w:proofErr w:type="spellEnd"/>
-      <w:r>
-        <w:t xml:space="preserve">. (n.d.). </w:t>
+      <w:r>
+        <w:t xml:space="preserve">GeeksforGeeks. (n.d.). </w:t>
       </w:r>
       <w:r>
         <w:rPr>
@@ -17830,11 +17780,9 @@
       <w:r>
         <w:t xml:space="preserve">6. </w:t>
       </w:r>
-      <w:proofErr w:type="spellStart"/>
-      <w:r>
-        <w:t>TutorialsPoint</w:t>
-      </w:r>
-      <w:proofErr w:type="spellEnd"/>
+      <w:r>
+        <w:t>Tutorials Point</w:t>
+      </w:r>
       <w:r>
         <w:t xml:space="preserve">. (n.d.). </w:t>
       </w:r>
@@ -17986,12 +17934,13 @@
           <w:lang w:val="en-US"/>
         </w:rPr>
       </w:pPr>
-      <w:bookmarkStart w:id="41" w:name="_Toc234565784"/>
+      <w:bookmarkStart w:id="40" w:name="_Toc234565784"/>
       <w:r>
         <w:rPr>
           <w:rFonts w:eastAsia="Times New Roman"/>
           <w:lang w:val="en-US"/>
         </w:rPr>
+        <w:lastRenderedPageBreak/>
         <w:t>.</w:t>
       </w:r>
       <w:r>
@@ -18008,7 +17957,7 @@
         </w:rPr>
         <w:t>Annexures</w:t>
       </w:r>
-      <w:bookmarkEnd w:id="41"/>
+      <w:bookmarkEnd w:id="40"/>
     </w:p>
     <w:p>
       <w:pPr>
@@ -18081,7 +18030,7 @@
         <w:spacing w:line="360" w:lineRule="auto"/>
         <w:jc w:val="center"/>
       </w:pPr>
-      <w:bookmarkStart w:id="42" w:name="_Toc234667828"/>
+      <w:bookmarkStart w:id="41" w:name="_Toc234667828"/>
       <w:r>
         <w:rPr>
           <w:szCs w:val="24"/>
@@ -18162,7 +18111,7 @@
         </w:rPr>
         <w:t xml:space="preserve"> : Main Menu</w:t>
       </w:r>
-      <w:bookmarkEnd w:id="42"/>
+      <w:bookmarkEnd w:id="41"/>
     </w:p>
     <w:p>
       <w:pPr>
@@ -18227,7 +18176,7 @@
           <w:szCs w:val="24"/>
         </w:rPr>
       </w:pPr>
-      <w:bookmarkStart w:id="43" w:name="_Toc234667829"/>
+      <w:bookmarkStart w:id="42" w:name="_Toc234667829"/>
       <w:r>
         <w:rPr>
           <w:sz w:val="24"/>
@@ -18321,7 +18270,7 @@
         </w:rPr>
         <w:t xml:space="preserve"> : User Registration</w:t>
       </w:r>
-      <w:bookmarkEnd w:id="43"/>
+      <w:bookmarkEnd w:id="42"/>
     </w:p>
     <w:p>
       <w:pPr>
@@ -18386,7 +18335,7 @@
           <w:szCs w:val="24"/>
         </w:rPr>
       </w:pPr>
-      <w:bookmarkStart w:id="44" w:name="_Toc234667830"/>
+      <w:bookmarkStart w:id="43" w:name="_Toc234667830"/>
       <w:r>
         <w:rPr>
           <w:sz w:val="24"/>
@@ -18480,7 +18429,7 @@
         </w:rPr>
         <w:t xml:space="preserve"> : User Login</w:t>
       </w:r>
-      <w:bookmarkEnd w:id="44"/>
+      <w:bookmarkEnd w:id="43"/>
     </w:p>
     <w:p>
       <w:pPr>
@@ -18503,6 +18452,7 @@
           <w:szCs w:val="24"/>
           <w:lang w:val="en-US"/>
         </w:rPr>
+        <w:lastRenderedPageBreak/>
         <w:drawing>
           <wp:inline distT="0" distB="0" distL="0" distR="0" wp14:anchorId="384E7BBB" wp14:editId="29EE2DD3">
             <wp:extent cx="4681220" cy="1810794"/>
@@ -18555,7 +18505,7 @@
           <w:szCs w:val="24"/>
         </w:rPr>
       </w:pPr>
-      <w:bookmarkStart w:id="45" w:name="_Toc234667831"/>
+      <w:bookmarkStart w:id="44" w:name="_Toc234667831"/>
       <w:r>
         <w:rPr>
           <w:sz w:val="24"/>
@@ -18649,7 +18599,7 @@
         </w:rPr>
         <w:t xml:space="preserve"> : Game Dashboard</w:t>
       </w:r>
-      <w:bookmarkEnd w:id="45"/>
+      <w:bookmarkEnd w:id="44"/>
     </w:p>
     <w:p>
       <w:pPr>
@@ -18714,7 +18664,7 @@
           <w:szCs w:val="24"/>
         </w:rPr>
       </w:pPr>
-      <w:bookmarkStart w:id="46" w:name="_Toc234667832"/>
+      <w:bookmarkStart w:id="45" w:name="_Toc234667832"/>
       <w:r>
         <w:rPr>
           <w:sz w:val="24"/>
@@ -18808,7 +18758,7 @@
         </w:rPr>
         <w:t xml:space="preserve"> :  Single player Gameplay</w:t>
       </w:r>
-      <w:bookmarkEnd w:id="46"/>
+      <w:bookmarkEnd w:id="45"/>
     </w:p>
     <w:p>
       <w:pPr>
@@ -18875,7 +18825,7 @@
           <w:szCs w:val="24"/>
         </w:rPr>
       </w:pPr>
-      <w:bookmarkStart w:id="47" w:name="_Toc234667833"/>
+      <w:bookmarkStart w:id="46" w:name="_Toc234667833"/>
       <w:r>
         <w:rPr>
           <w:sz w:val="24"/>
@@ -18969,7 +18919,7 @@
         </w:rPr>
         <w:t xml:space="preserve"> : Profile Menu</w:t>
       </w:r>
-      <w:bookmarkEnd w:id="47"/>
+      <w:bookmarkEnd w:id="46"/>
     </w:p>
     <w:p>
       <w:pPr>
@@ -18989,6 +18939,7 @@
           <w:noProof/>
           <w:lang w:val="en-US"/>
         </w:rPr>
+        <w:lastRenderedPageBreak/>
         <w:drawing>
           <wp:inline distT="0" distB="0" distL="0" distR="0" wp14:anchorId="76BB0944" wp14:editId="3E6F6B17">
             <wp:extent cx="4791710" cy="1637661"/>
@@ -19041,7 +18992,7 @@
           <w:szCs w:val="24"/>
         </w:rPr>
       </w:pPr>
-      <w:bookmarkStart w:id="48" w:name="_Toc234667834"/>
+      <w:bookmarkStart w:id="47" w:name="_Toc234667834"/>
       <w:r>
         <w:rPr>
           <w:sz w:val="24"/>
@@ -19135,7 +19086,7 @@
         </w:rPr>
         <w:t xml:space="preserve"> : Leader board</w:t>
       </w:r>
-      <w:bookmarkEnd w:id="48"/>
+      <w:bookmarkEnd w:id="47"/>
     </w:p>
     <w:p>
       <w:pPr>
@@ -19208,7 +19159,7 @@
           <w:szCs w:val="24"/>
         </w:rPr>
       </w:pPr>
-      <w:bookmarkStart w:id="49" w:name="_Toc234667835"/>
+      <w:bookmarkStart w:id="48" w:name="_Toc234667835"/>
       <w:r>
         <w:rPr>
           <w:sz w:val="24"/>
@@ -19302,7 +19253,7 @@
         </w:rPr>
         <w:t xml:space="preserve"> : View History</w:t>
       </w:r>
-      <w:bookmarkEnd w:id="49"/>
+      <w:bookmarkEnd w:id="48"/>
     </w:p>
     <w:p>
       <w:pPr>
@@ -19322,7 +19273,7 @@
 </file>
 
 <file path=word/endnotes.xml><?xml version="1.0" encoding="utf-8"?>
-<w:endnotes xmlns:wpc="http://schemas.microsoft.com/office/word/2010/wordprocessingCanvas" xmlns:mc="http://schemas.openxmlformats.org/markup-compatibility/2006" xmlns:o="urn:schemas-microsoft-com:office:office" xmlns:r="http://schemas.openxmlformats.org/officeDocument/2006/relationships" xmlns:m="http://schemas.openxmlformats.org/officeDocument/2006/math" xmlns:v="urn:schemas-microsoft-com:vml" xmlns:wp14="http://schemas.microsoft.com/office/word/2010/wordprocessingDrawing" xmlns:wp="http://schemas.openxmlformats.org/drawingml/2006/wordprocessingDrawing" xmlns:w10="urn:schemas-microsoft-com:office:word" xmlns:w="http://schemas.openxmlformats.org/wordprocessingml/2006/main" xmlns:w14="http://schemas.microsoft.com/office/word/2010/wordml" xmlns:w15="http://schemas.microsoft.com/office/word/2012/wordml" xmlns:wpg="http://schemas.microsoft.com/office/word/2010/wordprocessingGroup" xmlns:wpi="http://schemas.microsoft.com/office/word/2010/wordprocessingInk" xmlns:wne="http://schemas.microsoft.com/office/word/2006/wordml" xmlns:wps="http://schemas.microsoft.com/office/word/2010/wordprocessingShape" mc:Ignorable="w14 w15 wp14">
+<w:endnotes xmlns:wpc="http://schemas.microsoft.com/office/word/2010/wordprocessingCanvas" xmlns:cx="http://schemas.microsoft.com/office/drawing/2014/chartex" xmlns:cx1="http://schemas.microsoft.com/office/drawing/2015/9/8/chartex" xmlns:cx2="http://schemas.microsoft.com/office/drawing/2015/10/21/chartex" xmlns:cx3="http://schemas.microsoft.com/office/drawing/2016/5/9/chartex" xmlns:cx4="http://schemas.microsoft.com/office/drawing/2016/5/10/chartex" xmlns:cx5="http://schemas.microsoft.com/office/drawing/2016/5/11/chartex" xmlns:cx6="http://schemas.microsoft.com/office/drawing/2016/5/12/chartex" xmlns:cx7="http://schemas.microsoft.com/office/drawing/2016/5/13/chartex" xmlns:cx8="http://schemas.microsoft.com/office/drawing/2016/5/14/chartex" xmlns:mc="http://schemas.openxmlformats.org/markup-compatibility/2006" xmlns:aink="http://schemas.microsoft.com/office/drawing/2016/ink" xmlns:am3d="http://schemas.microsoft.com/office/drawing/2017/model3d" xmlns:o="urn:schemas-microsoft-com:office:office" xmlns:oel="http://schemas.microsoft.com/office/2019/extlst" xmlns:r="http://schemas.openxmlformats.org/officeDocument/2006/relationships" xmlns:m="http://schemas.openxmlformats.org/officeDocument/2006/math" xmlns:v="urn:schemas-microsoft-com:vml" xmlns:wp14="http://schemas.microsoft.com/office/word/2010/wordprocessingDrawing" xmlns:wp="http://schemas.openxmlformats.org/drawingml/2006/wordprocessingDrawing" xmlns:w10="urn:schemas-microsoft-com:office:word" xmlns:w="http://schemas.openxmlformats.org/wordprocessingml/2006/main" xmlns:w14="http://schemas.microsoft.com/office/word/2010/wordml" xmlns:w15="http://schemas.microsoft.com/office/word/2012/wordml" xmlns:w16cex="http://schemas.microsoft.com/office/word/2018/wordml/cex" xmlns:w16cid="http://schemas.microsoft.com/office/word/2016/wordml/cid" xmlns:w16="http://schemas.microsoft.com/office/word/2018/wordml" xmlns:w16du="http://schemas.microsoft.com/office/word/2023/wordml/word16du" xmlns:w16sdtdh="http://schemas.microsoft.com/office/word/2020/wordml/sdtdatahash" xmlns:w16sdtfl="http://schemas.microsoft.com/office/word/2024/wordml/sdtformatlock" xmlns:w16se="http://schemas.microsoft.com/office/word/2015/wordml/symex" xmlns:wpg="http://schemas.microsoft.com/office/word/2010/wordprocessingGroup" xmlns:wpi="http://schemas.microsoft.com/office/word/2010/wordprocessingInk" xmlns:wne="http://schemas.microsoft.com/office/word/2006/wordml" xmlns:wps="http://schemas.microsoft.com/office/word/2010/wordprocessingShape" mc:Ignorable="w14 w15 w16se w16cid w16 w16cex w16sdtdh w16sdtfl w16du wp14">
   <w:endnote w:type="separator" w:id="-1">
     <w:p>
       <w:pPr>
@@ -19347,7 +19298,7 @@
 </file>
 
 <file path=word/footer1.xml><?xml version="1.0" encoding="utf-8"?>
-<w:ftr xmlns:wpc="http://schemas.microsoft.com/office/word/2010/wordprocessingCanvas" xmlns:mc="http://schemas.openxmlformats.org/markup-compatibility/2006" xmlns:o="urn:schemas-microsoft-com:office:office" xmlns:r="http://schemas.openxmlformats.org/officeDocument/2006/relationships" xmlns:m="http://schemas.openxmlformats.org/officeDocument/2006/math" xmlns:v="urn:schemas-microsoft-com:vml" xmlns:wp14="http://schemas.microsoft.com/office/word/2010/wordprocessingDrawing" xmlns:wp="http://schemas.openxmlformats.org/drawingml/2006/wordprocessingDrawing" xmlns:w10="urn:schemas-microsoft-com:office:word" xmlns:w="http://schemas.openxmlformats.org/wordprocessingml/2006/main" xmlns:w14="http://schemas.microsoft.com/office/word/2010/wordml" xmlns:w15="http://schemas.microsoft.com/office/word/2012/wordml" xmlns:wpg="http://schemas.microsoft.com/office/word/2010/wordprocessingGroup" xmlns:wpi="http://schemas.microsoft.com/office/word/2010/wordprocessingInk" xmlns:wne="http://schemas.microsoft.com/office/word/2006/wordml" xmlns:wps="http://schemas.microsoft.com/office/word/2010/wordprocessingShape" mc:Ignorable="w14 w15 wp14">
+<w:ftr xmlns:wpc="http://schemas.microsoft.com/office/word/2010/wordprocessingCanvas" xmlns:cx="http://schemas.microsoft.com/office/drawing/2014/chartex" xmlns:cx1="http://schemas.microsoft.com/office/drawing/2015/9/8/chartex" xmlns:cx2="http://schemas.microsoft.com/office/drawing/2015/10/21/chartex" xmlns:cx3="http://schemas.microsoft.com/office/drawing/2016/5/9/chartex" xmlns:cx4="http://schemas.microsoft.com/office/drawing/2016/5/10/chartex" xmlns:cx5="http://schemas.microsoft.com/office/drawing/2016/5/11/chartex" xmlns:cx6="http://schemas.microsoft.com/office/drawing/2016/5/12/chartex" xmlns:cx7="http://schemas.microsoft.com/office/drawing/2016/5/13/chartex" xmlns:cx8="http://schemas.microsoft.com/office/drawing/2016/5/14/chartex" xmlns:mc="http://schemas.openxmlformats.org/markup-compatibility/2006" xmlns:aink="http://schemas.microsoft.com/office/drawing/2016/ink" xmlns:am3d="http://schemas.microsoft.com/office/drawing/2017/model3d" xmlns:o="urn:schemas-microsoft-com:office:office" xmlns:oel="http://schemas.microsoft.com/office/2019/extlst" xmlns:r="http://schemas.openxmlformats.org/officeDocument/2006/relationships" xmlns:m="http://schemas.openxmlformats.org/officeDocument/2006/math" xmlns:v="urn:schemas-microsoft-com:vml" xmlns:wp14="http://schemas.microsoft.com/office/word/2010/wordprocessingDrawing" xmlns:wp="http://schemas.openxmlformats.org/drawingml/2006/wordprocessingDrawing" xmlns:w10="urn:schemas-microsoft-com:office:word" xmlns:w="http://schemas.openxmlformats.org/wordprocessingml/2006/main" xmlns:w14="http://schemas.microsoft.com/office/word/2010/wordml" xmlns:w15="http://schemas.microsoft.com/office/word/2012/wordml" xmlns:w16cex="http://schemas.microsoft.com/office/word/2018/wordml/cex" xmlns:w16cid="http://schemas.microsoft.com/office/word/2016/wordml/cid" xmlns:w16="http://schemas.microsoft.com/office/word/2018/wordml" xmlns:w16du="http://schemas.microsoft.com/office/word/2023/wordml/word16du" xmlns:w16sdtdh="http://schemas.microsoft.com/office/word/2020/wordml/sdtdatahash" xmlns:w16sdtfl="http://schemas.microsoft.com/office/word/2024/wordml/sdtformatlock" xmlns:w16se="http://schemas.microsoft.com/office/word/2015/wordml/symex" xmlns:wpg="http://schemas.microsoft.com/office/word/2010/wordprocessingGroup" xmlns:wpi="http://schemas.microsoft.com/office/word/2010/wordprocessingInk" xmlns:wne="http://schemas.microsoft.com/office/word/2006/wordml" xmlns:wps="http://schemas.microsoft.com/office/word/2010/wordprocessingShape" mc:Ignorable="w14 w15 w16se w16cid w16 w16cex w16sdtdh w16sdtfl w16du wp14">
   <w:sdt>
     <w:sdtPr>
       <w:id w:val="1016117153"/>
@@ -19400,7 +19351,7 @@
 </file>
 
 <file path=word/footnotes.xml><?xml version="1.0" encoding="utf-8"?>
-<w:footnotes xmlns:wpc="http://schemas.microsoft.com/office/word/2010/wordprocessingCanvas" xmlns:mc="http://schemas.openxmlformats.org/markup-compatibility/2006" xmlns:o="urn:schemas-microsoft-com:office:office" xmlns:r="http://schemas.openxmlformats.org/officeDocument/2006/relationships" xmlns:m="http://schemas.openxmlformats.org/officeDocument/2006/math" xmlns:v="urn:schemas-microsoft-com:vml" xmlns:wp14="http://schemas.microsoft.com/office/word/2010/wordprocessingDrawing" xmlns:wp="http://schemas.openxmlformats.org/drawingml/2006/wordprocessingDrawing" xmlns:w10="urn:schemas-microsoft-com:office:word" xmlns:w="http://schemas.openxmlformats.org/wordprocessingml/2006/main" xmlns:w14="http://schemas.microsoft.com/office/word/2010/wordml" xmlns:w15="http://schemas.microsoft.com/office/word/2012/wordml" xmlns:wpg="http://schemas.microsoft.com/office/word/2010/wordprocessingGroup" xmlns:wpi="http://schemas.microsoft.com/office/word/2010/wordprocessingInk" xmlns:wne="http://schemas.microsoft.com/office/word/2006/wordml" xmlns:wps="http://schemas.microsoft.com/office/word/2010/wordprocessingShape" mc:Ignorable="w14 w15 wp14">
+<w:footnotes xmlns:wpc="http://schemas.microsoft.com/office/word/2010/wordprocessingCanvas" xmlns:cx="http://schemas.microsoft.com/office/drawing/2014/chartex" xmlns:cx1="http://schemas.microsoft.com/office/drawing/2015/9/8/chartex" xmlns:cx2="http://schemas.microsoft.com/office/drawing/2015/10/21/chartex" xmlns:cx3="http://schemas.microsoft.com/office/drawing/2016/5/9/chartex" xmlns:cx4="http://schemas.microsoft.com/office/drawing/2016/5/10/chartex" xmlns:cx5="http://schemas.microsoft.com/office/drawing/2016/5/11/chartex" xmlns:cx6="http://schemas.microsoft.com/office/drawing/2016/5/12/chartex" xmlns:cx7="http://schemas.microsoft.com/office/drawing/2016/5/13/chartex" xmlns:cx8="http://schemas.microsoft.com/office/drawing/2016/5/14/chartex" xmlns:mc="http://schemas.openxmlformats.org/markup-compatibility/2006" xmlns:aink="http://schemas.microsoft.com/office/drawing/2016/ink" xmlns:am3d="http://schemas.microsoft.com/office/drawing/2017/model3d" xmlns:o="urn:schemas-microsoft-com:office:office" xmlns:oel="http://schemas.microsoft.com/office/2019/extlst" xmlns:r="http://schemas.openxmlformats.org/officeDocument/2006/relationships" xmlns:m="http://schemas.openxmlformats.org/officeDocument/2006/math" xmlns:v="urn:schemas-microsoft-com:vml" xmlns:wp14="http://schemas.microsoft.com/office/word/2010/wordprocessingDrawing" xmlns:wp="http://schemas.openxmlformats.org/drawingml/2006/wordprocessingDrawing" xmlns:w10="urn:schemas-microsoft-com:office:word" xmlns:w="http://schemas.openxmlformats.org/wordprocessingml/2006/main" xmlns:w14="http://schemas.microsoft.com/office/word/2010/wordml" xmlns:w15="http://schemas.microsoft.com/office/word/2012/wordml" xmlns:w16cex="http://schemas.microsoft.com/office/word/2018/wordml/cex" xmlns:w16cid="http://schemas.microsoft.com/office/word/2016/wordml/cid" xmlns:w16="http://schemas.microsoft.com/office/word/2018/wordml" xmlns:w16du="http://schemas.microsoft.com/office/word/2023/wordml/word16du" xmlns:w16sdtdh="http://schemas.microsoft.com/office/word/2020/wordml/sdtdatahash" xmlns:w16sdtfl="http://schemas.microsoft.com/office/word/2024/wordml/sdtformatlock" xmlns:w16se="http://schemas.microsoft.com/office/word/2015/wordml/symex" xmlns:wpg="http://schemas.microsoft.com/office/word/2010/wordprocessingGroup" xmlns:wpi="http://schemas.microsoft.com/office/word/2010/wordprocessingInk" xmlns:wne="http://schemas.microsoft.com/office/word/2006/wordml" xmlns:wps="http://schemas.microsoft.com/office/word/2010/wordprocessingShape" mc:Ignorable="w14 w15 w16se w16cid w16 w16cex w16sdtdh w16sdtfl w16du wp14">
   <w:footnote w:type="separator" w:id="-1">
     <w:p>
       <w:pPr>
@@ -19425,7 +19376,7 @@
 </file>
 
 <file path=word/header1.xml><?xml version="1.0" encoding="utf-8"?>
-<w:hdr xmlns:wpc="http://schemas.microsoft.com/office/word/2010/wordprocessingCanvas" xmlns:mc="http://schemas.openxmlformats.org/markup-compatibility/2006" xmlns:o="urn:schemas-microsoft-com:office:office" xmlns:r="http://schemas.openxmlformats.org/officeDocument/2006/relationships" xmlns:m="http://schemas.openxmlformats.org/officeDocument/2006/math" xmlns:v="urn:schemas-microsoft-com:vml" xmlns:wp14="http://schemas.microsoft.com/office/word/2010/wordprocessingDrawing" xmlns:wp="http://schemas.openxmlformats.org/drawingml/2006/wordprocessingDrawing" xmlns:w10="urn:schemas-microsoft-com:office:word" xmlns:w="http://schemas.openxmlformats.org/wordprocessingml/2006/main" xmlns:w14="http://schemas.microsoft.com/office/word/2010/wordml" xmlns:w15="http://schemas.microsoft.com/office/word/2012/wordml" xmlns:wpg="http://schemas.microsoft.com/office/word/2010/wordprocessingGroup" xmlns:wpi="http://schemas.microsoft.com/office/word/2010/wordprocessingInk" xmlns:wne="http://schemas.microsoft.com/office/word/2006/wordml" xmlns:wps="http://schemas.microsoft.com/office/word/2010/wordprocessingShape" mc:Ignorable="w14 w15 wp14">
+<w:hdr xmlns:wpc="http://schemas.microsoft.com/office/word/2010/wordprocessingCanvas" xmlns:cx="http://schemas.microsoft.com/office/drawing/2014/chartex" xmlns:cx1="http://schemas.microsoft.com/office/drawing/2015/9/8/chartex" xmlns:cx2="http://schemas.microsoft.com/office/drawing/2015/10/21/chartex" xmlns:cx3="http://schemas.microsoft.com/office/drawing/2016/5/9/chartex" xmlns:cx4="http://schemas.microsoft.com/office/drawing/2016/5/10/chartex" xmlns:cx5="http://schemas.microsoft.com/office/drawing/2016/5/11/chartex" xmlns:cx6="http://schemas.microsoft.com/office/drawing/2016/5/12/chartex" xmlns:cx7="http://schemas.microsoft.com/office/drawing/2016/5/13/chartex" xmlns:cx8="http://schemas.microsoft.com/office/drawing/2016/5/14/chartex" xmlns:mc="http://schemas.openxmlformats.org/markup-compatibility/2006" xmlns:aink="http://schemas.microsoft.com/office/drawing/2016/ink" xmlns:am3d="http://schemas.microsoft.com/office/drawing/2017/model3d" xmlns:o="urn:schemas-microsoft-com:office:office" xmlns:oel="http://schemas.microsoft.com/office/2019/extlst" xmlns:r="http://schemas.openxmlformats.org/officeDocument/2006/relationships" xmlns:m="http://schemas.openxmlformats.org/officeDocument/2006/math" xmlns:v="urn:schemas-microsoft-com:vml" xmlns:wp14="http://schemas.microsoft.com/office/word/2010/wordprocessingDrawing" xmlns:wp="http://schemas.openxmlformats.org/drawingml/2006/wordprocessingDrawing" xmlns:w10="urn:schemas-microsoft-com:office:word" xmlns:w="http://schemas.openxmlformats.org/wordprocessingml/2006/main" xmlns:w14="http://schemas.microsoft.com/office/word/2010/wordml" xmlns:w15="http://schemas.microsoft.com/office/word/2012/wordml" xmlns:w16cex="http://schemas.microsoft.com/office/word/2018/wordml/cex" xmlns:w16cid="http://schemas.microsoft.com/office/word/2016/wordml/cid" xmlns:w16="http://schemas.microsoft.com/office/word/2018/wordml" xmlns:w16du="http://schemas.microsoft.com/office/word/2023/wordml/word16du" xmlns:w16sdtdh="http://schemas.microsoft.com/office/word/2020/wordml/sdtdatahash" xmlns:w16sdtfl="http://schemas.microsoft.com/office/word/2024/wordml/sdtformatlock" xmlns:w16se="http://schemas.microsoft.com/office/word/2015/wordml/symex" xmlns:wpg="http://schemas.microsoft.com/office/word/2010/wordprocessingGroup" xmlns:wpi="http://schemas.microsoft.com/office/word/2010/wordprocessingInk" xmlns:wne="http://schemas.microsoft.com/office/word/2006/wordml" xmlns:wps="http://schemas.microsoft.com/office/word/2010/wordprocessingShape" mc:Ignorable="w14 w15 w16se w16cid w16 w16cex w16sdtdh w16sdtfl w16du wp14">
   <w:p>
     <w:pPr>
       <w:pStyle w:val="Header"/>
@@ -19435,8 +19386,8 @@
 </file>
 
 <file path=word/numbering.xml><?xml version="1.0" encoding="utf-8"?>
-<w:numbering xmlns:wpc="http://schemas.microsoft.com/office/word/2010/wordprocessingCanvas" xmlns:mc="http://schemas.openxmlformats.org/markup-compatibility/2006" xmlns:o="urn:schemas-microsoft-com:office:office" xmlns:r="http://schemas.openxmlformats.org/officeDocument/2006/relationships" xmlns:m="http://schemas.openxmlformats.org/officeDocument/2006/math" xmlns:v="urn:schemas-microsoft-com:vml" xmlns:wp14="http://schemas.microsoft.com/office/word/2010/wordprocessingDrawing" xmlns:wp="http://schemas.openxmlformats.org/drawingml/2006/wordprocessingDrawing" xmlns:w10="urn:schemas-microsoft-com:office:word" xmlns:w="http://schemas.openxmlformats.org/wordprocessingml/2006/main" xmlns:w14="http://schemas.microsoft.com/office/word/2010/wordml" xmlns:w15="http://schemas.microsoft.com/office/word/2012/wordml" xmlns:wpg="http://schemas.microsoft.com/office/word/2010/wordprocessingGroup" xmlns:wpi="http://schemas.microsoft.com/office/word/2010/wordprocessingInk" xmlns:wne="http://schemas.microsoft.com/office/word/2006/wordml" xmlns:wps="http://schemas.microsoft.com/office/word/2010/wordprocessingShape" mc:Ignorable="w14 w15 wp14">
-  <w:abstractNum w:abstractNumId="0">
+<w:numbering xmlns:wpc="http://schemas.microsoft.com/office/word/2010/wordprocessingCanvas" xmlns:cx="http://schemas.microsoft.com/office/drawing/2014/chartex" xmlns:cx1="http://schemas.microsoft.com/office/drawing/2015/9/8/chartex" xmlns:cx2="http://schemas.microsoft.com/office/drawing/2015/10/21/chartex" xmlns:cx3="http://schemas.microsoft.com/office/drawing/2016/5/9/chartex" xmlns:cx4="http://schemas.microsoft.com/office/drawing/2016/5/10/chartex" xmlns:cx5="http://schemas.microsoft.com/office/drawing/2016/5/11/chartex" xmlns:cx6="http://schemas.microsoft.com/office/drawing/2016/5/12/chartex" xmlns:cx7="http://schemas.microsoft.com/office/drawing/2016/5/13/chartex" xmlns:cx8="http://schemas.microsoft.com/office/drawing/2016/5/14/chartex" xmlns:mc="http://schemas.openxmlformats.org/markup-compatibility/2006" xmlns:aink="http://schemas.microsoft.com/office/drawing/2016/ink" xmlns:am3d="http://schemas.microsoft.com/office/drawing/2017/model3d" xmlns:o="urn:schemas-microsoft-com:office:office" xmlns:oel="http://schemas.microsoft.com/office/2019/extlst" xmlns:r="http://schemas.openxmlformats.org/officeDocument/2006/relationships" xmlns:m="http://schemas.openxmlformats.org/officeDocument/2006/math" xmlns:v="urn:schemas-microsoft-com:vml" xmlns:wp14="http://schemas.microsoft.com/office/word/2010/wordprocessingDrawing" xmlns:wp="http://schemas.openxmlformats.org/drawingml/2006/wordprocessingDrawing" xmlns:w10="urn:schemas-microsoft-com:office:word" xmlns:w="http://schemas.openxmlformats.org/wordprocessingml/2006/main" xmlns:w14="http://schemas.microsoft.com/office/word/2010/wordml" xmlns:w15="http://schemas.microsoft.com/office/word/2012/wordml" xmlns:w16cex="http://schemas.microsoft.com/office/word/2018/wordml/cex" xmlns:w16cid="http://schemas.microsoft.com/office/word/2016/wordml/cid" xmlns:w16="http://schemas.microsoft.com/office/word/2018/wordml" xmlns:w16du="http://schemas.microsoft.com/office/word/2023/wordml/word16du" xmlns:w16sdtdh="http://schemas.microsoft.com/office/word/2020/wordml/sdtdatahash" xmlns:w16sdtfl="http://schemas.microsoft.com/office/word/2024/wordml/sdtformatlock" xmlns:w16se="http://schemas.microsoft.com/office/word/2015/wordml/symex" xmlns:wpg="http://schemas.microsoft.com/office/word/2010/wordprocessingGroup" xmlns:wpi="http://schemas.microsoft.com/office/word/2010/wordprocessingInk" xmlns:wne="http://schemas.microsoft.com/office/word/2006/wordml" xmlns:wps="http://schemas.microsoft.com/office/word/2010/wordprocessingShape" mc:Ignorable="w14 w15 w16se w16cid w16 w16cex w16sdtdh w16sdtfl w16du wp14">
+  <w:abstractNum w:abstractNumId="0" w15:restartNumberingAfterBreak="0">
     <w:nsid w:val="02AF2FA9"/>
     <w:multiLevelType w:val="hybridMultilevel"/>
     <w:tmpl w:val="31B8EED2"/>
@@ -19549,7 +19500,7 @@
       </w:rPr>
     </w:lvl>
   </w:abstractNum>
-  <w:abstractNum w:abstractNumId="1">
+  <w:abstractNum w:abstractNumId="1" w15:restartNumberingAfterBreak="0">
     <w:nsid w:val="08F018C5"/>
     <w:multiLevelType w:val="hybridMultilevel"/>
     <w:tmpl w:val="F5F20FAA"/>
@@ -19662,7 +19613,7 @@
       </w:rPr>
     </w:lvl>
   </w:abstractNum>
-  <w:abstractNum w:abstractNumId="2">
+  <w:abstractNum w:abstractNumId="2" w15:restartNumberingAfterBreak="0">
     <w:nsid w:val="126C7F9B"/>
     <w:multiLevelType w:val="hybridMultilevel"/>
     <w:tmpl w:val="98543CF0"/>
@@ -19748,7 +19699,7 @@
       </w:pPr>
     </w:lvl>
   </w:abstractNum>
-  <w:abstractNum w:abstractNumId="3">
+  <w:abstractNum w:abstractNumId="3" w15:restartNumberingAfterBreak="0">
     <w:nsid w:val="147A33EE"/>
     <w:multiLevelType w:val="hybridMultilevel"/>
     <w:tmpl w:val="016A8426"/>
@@ -19834,7 +19785,7 @@
       </w:pPr>
     </w:lvl>
   </w:abstractNum>
-  <w:abstractNum w:abstractNumId="4">
+  <w:abstractNum w:abstractNumId="4" w15:restartNumberingAfterBreak="0">
     <w:nsid w:val="1AB84912"/>
     <w:multiLevelType w:val="multilevel"/>
     <w:tmpl w:val="B6489DF0"/>
@@ -19952,7 +19903,7 @@
       </w:rPr>
     </w:lvl>
   </w:abstractNum>
-  <w:abstractNum w:abstractNumId="5">
+  <w:abstractNum w:abstractNumId="5" w15:restartNumberingAfterBreak="0">
     <w:nsid w:val="1BA83479"/>
     <w:multiLevelType w:val="hybridMultilevel"/>
     <w:tmpl w:val="0B1E00C2"/>
@@ -20041,7 +19992,7 @@
       </w:pPr>
     </w:lvl>
   </w:abstractNum>
-  <w:abstractNum w:abstractNumId="6">
+  <w:abstractNum w:abstractNumId="6" w15:restartNumberingAfterBreak="0">
     <w:nsid w:val="297A7ABE"/>
     <w:multiLevelType w:val="hybridMultilevel"/>
     <w:tmpl w:val="3886E33C"/>
@@ -20154,7 +20105,7 @@
       </w:rPr>
     </w:lvl>
   </w:abstractNum>
-  <w:abstractNum w:abstractNumId="7">
+  <w:abstractNum w:abstractNumId="7" w15:restartNumberingAfterBreak="0">
     <w:nsid w:val="32D26C7C"/>
     <w:multiLevelType w:val="hybridMultilevel"/>
     <w:tmpl w:val="2C0070A2"/>
@@ -20240,7 +20191,7 @@
       </w:pPr>
     </w:lvl>
   </w:abstractNum>
-  <w:abstractNum w:abstractNumId="8">
+  <w:abstractNum w:abstractNumId="8" w15:restartNumberingAfterBreak="0">
     <w:nsid w:val="3860748C"/>
     <w:multiLevelType w:val="hybridMultilevel"/>
     <w:tmpl w:val="24A6702E"/>
@@ -20353,7 +20304,7 @@
       </w:rPr>
     </w:lvl>
   </w:abstractNum>
-  <w:abstractNum w:abstractNumId="9">
+  <w:abstractNum w:abstractNumId="9" w15:restartNumberingAfterBreak="0">
     <w:nsid w:val="3C0559D8"/>
     <w:multiLevelType w:val="hybridMultilevel"/>
     <w:tmpl w:val="137A88AE"/>
@@ -20439,7 +20390,7 @@
       </w:pPr>
     </w:lvl>
   </w:abstractNum>
-  <w:abstractNum w:abstractNumId="10">
+  <w:abstractNum w:abstractNumId="10" w15:restartNumberingAfterBreak="0">
     <w:nsid w:val="3C943632"/>
     <w:multiLevelType w:val="hybridMultilevel"/>
     <w:tmpl w:val="FF34FF66"/>
@@ -20528,7 +20479,7 @@
       </w:pPr>
     </w:lvl>
   </w:abstractNum>
-  <w:abstractNum w:abstractNumId="11">
+  <w:abstractNum w:abstractNumId="11" w15:restartNumberingAfterBreak="0">
     <w:nsid w:val="3CAA7D00"/>
     <w:multiLevelType w:val="hybridMultilevel"/>
     <w:tmpl w:val="7FAE95B6"/>
@@ -20641,7 +20592,7 @@
       </w:rPr>
     </w:lvl>
   </w:abstractNum>
-  <w:abstractNum w:abstractNumId="12">
+  <w:abstractNum w:abstractNumId="12" w15:restartNumberingAfterBreak="0">
     <w:nsid w:val="49160F70"/>
     <w:multiLevelType w:val="multilevel"/>
     <w:tmpl w:val="D3701A08"/>
@@ -20754,7 +20705,7 @@
       </w:pPr>
     </w:lvl>
   </w:abstractNum>
-  <w:abstractNum w:abstractNumId="13">
+  <w:abstractNum w:abstractNumId="13" w15:restartNumberingAfterBreak="0">
     <w:nsid w:val="49F3349E"/>
     <w:multiLevelType w:val="hybridMultilevel"/>
     <w:tmpl w:val="9EA25E2A"/>
@@ -20840,7 +20791,7 @@
       </w:pPr>
     </w:lvl>
   </w:abstractNum>
-  <w:abstractNum w:abstractNumId="14">
+  <w:abstractNum w:abstractNumId="14" w15:restartNumberingAfterBreak="0">
     <w:nsid w:val="4BDB53A4"/>
     <w:multiLevelType w:val="hybridMultilevel"/>
     <w:tmpl w:val="26BA23C2"/>
@@ -20953,7 +20904,7 @@
       </w:rPr>
     </w:lvl>
   </w:abstractNum>
-  <w:abstractNum w:abstractNumId="15">
+  <w:abstractNum w:abstractNumId="15" w15:restartNumberingAfterBreak="0">
     <w:nsid w:val="4E2400E2"/>
     <w:multiLevelType w:val="hybridMultilevel"/>
     <w:tmpl w:val="25C44E24"/>
@@ -21039,7 +20990,7 @@
       </w:pPr>
     </w:lvl>
   </w:abstractNum>
-  <w:abstractNum w:abstractNumId="16">
+  <w:abstractNum w:abstractNumId="16" w15:restartNumberingAfterBreak="0">
     <w:nsid w:val="4EA2597E"/>
     <w:multiLevelType w:val="hybridMultilevel"/>
     <w:tmpl w:val="48DA49D0"/>
@@ -21129,7 +21080,7 @@
       </w:pPr>
     </w:lvl>
   </w:abstractNum>
-  <w:abstractNum w:abstractNumId="17">
+  <w:abstractNum w:abstractNumId="17" w15:restartNumberingAfterBreak="0">
     <w:nsid w:val="50BA3788"/>
     <w:multiLevelType w:val="hybridMultilevel"/>
     <w:tmpl w:val="37006102"/>
@@ -21218,7 +21169,7 @@
       </w:pPr>
     </w:lvl>
   </w:abstractNum>
-  <w:abstractNum w:abstractNumId="18">
+  <w:abstractNum w:abstractNumId="18" w15:restartNumberingAfterBreak="0">
     <w:nsid w:val="550B44E6"/>
     <w:multiLevelType w:val="hybridMultilevel"/>
     <w:tmpl w:val="BA029364"/>
@@ -21304,7 +21255,7 @@
       </w:pPr>
     </w:lvl>
   </w:abstractNum>
-  <w:abstractNum w:abstractNumId="19">
+  <w:abstractNum w:abstractNumId="19" w15:restartNumberingAfterBreak="0">
     <w:nsid w:val="5D7F116E"/>
     <w:multiLevelType w:val="multilevel"/>
     <w:tmpl w:val="07EC278C"/>
@@ -21399,7 +21350,7 @@
       </w:pPr>
     </w:lvl>
   </w:abstractNum>
-  <w:abstractNum w:abstractNumId="20">
+  <w:abstractNum w:abstractNumId="20" w15:restartNumberingAfterBreak="0">
     <w:nsid w:val="5EE54FC1"/>
     <w:multiLevelType w:val="hybridMultilevel"/>
     <w:tmpl w:val="E58CBECA"/>
@@ -21512,7 +21463,7 @@
       </w:rPr>
     </w:lvl>
   </w:abstractNum>
-  <w:abstractNum w:abstractNumId="21">
+  <w:abstractNum w:abstractNumId="21" w15:restartNumberingAfterBreak="0">
     <w:nsid w:val="603F09E5"/>
     <w:multiLevelType w:val="multilevel"/>
     <w:tmpl w:val="62A83186"/>
@@ -21630,7 +21581,7 @@
       </w:rPr>
     </w:lvl>
   </w:abstractNum>
-  <w:abstractNum w:abstractNumId="22">
+  <w:abstractNum w:abstractNumId="22" w15:restartNumberingAfterBreak="0">
     <w:nsid w:val="63131FC7"/>
     <w:multiLevelType w:val="hybridMultilevel"/>
     <w:tmpl w:val="AE3A8B1A"/>
@@ -21743,7 +21694,7 @@
       </w:rPr>
     </w:lvl>
   </w:abstractNum>
-  <w:abstractNum w:abstractNumId="23">
+  <w:abstractNum w:abstractNumId="23" w15:restartNumberingAfterBreak="0">
     <w:nsid w:val="63FE5D78"/>
     <w:multiLevelType w:val="hybridMultilevel"/>
     <w:tmpl w:val="E5FA6A30"/>
@@ -21856,7 +21807,7 @@
       </w:rPr>
     </w:lvl>
   </w:abstractNum>
-  <w:abstractNum w:abstractNumId="24">
+  <w:abstractNum w:abstractNumId="24" w15:restartNumberingAfterBreak="0">
     <w:nsid w:val="692E515B"/>
     <w:multiLevelType w:val="multilevel"/>
     <w:tmpl w:val="F2F40ED2"/>
@@ -22005,7 +21956,7 @@
       </w:rPr>
     </w:lvl>
   </w:abstractNum>
-  <w:abstractNum w:abstractNumId="25">
+  <w:abstractNum w:abstractNumId="25" w15:restartNumberingAfterBreak="0">
     <w:nsid w:val="69CA3B02"/>
     <w:multiLevelType w:val="hybridMultilevel"/>
     <w:tmpl w:val="F642E598"/>
@@ -22118,7 +22069,7 @@
       </w:rPr>
     </w:lvl>
   </w:abstractNum>
-  <w:abstractNum w:abstractNumId="26">
+  <w:abstractNum w:abstractNumId="26" w15:restartNumberingAfterBreak="0">
     <w:nsid w:val="6FD17BD5"/>
     <w:multiLevelType w:val="hybridMultilevel"/>
     <w:tmpl w:val="B7663A94"/>
@@ -22204,7 +22155,7 @@
       </w:pPr>
     </w:lvl>
   </w:abstractNum>
-  <w:abstractNum w:abstractNumId="27">
+  <w:abstractNum w:abstractNumId="27" w15:restartNumberingAfterBreak="0">
     <w:nsid w:val="708618D4"/>
     <w:multiLevelType w:val="hybridMultilevel"/>
     <w:tmpl w:val="794CEC38"/>
@@ -22290,7 +22241,7 @@
       </w:pPr>
     </w:lvl>
   </w:abstractNum>
-  <w:abstractNum w:abstractNumId="28">
+  <w:abstractNum w:abstractNumId="28" w15:restartNumberingAfterBreak="0">
     <w:nsid w:val="729C1A8F"/>
     <w:multiLevelType w:val="hybridMultilevel"/>
     <w:tmpl w:val="49909FA6"/>
@@ -22376,7 +22327,7 @@
       </w:pPr>
     </w:lvl>
   </w:abstractNum>
-  <w:abstractNum w:abstractNumId="29">
+  <w:abstractNum w:abstractNumId="29" w15:restartNumberingAfterBreak="0">
     <w:nsid w:val="7381730C"/>
     <w:multiLevelType w:val="hybridMultilevel"/>
     <w:tmpl w:val="A822957E"/>
@@ -22462,7 +22413,7 @@
       </w:pPr>
     </w:lvl>
   </w:abstractNum>
-  <w:abstractNum w:abstractNumId="30">
+  <w:abstractNum w:abstractNumId="30" w15:restartNumberingAfterBreak="0">
     <w:nsid w:val="76BC5C1C"/>
     <w:multiLevelType w:val="multilevel"/>
     <w:tmpl w:val="72BE6714"/>
@@ -22611,7 +22562,7 @@
       </w:rPr>
     </w:lvl>
   </w:abstractNum>
-  <w:abstractNum w:abstractNumId="31">
+  <w:abstractNum w:abstractNumId="31" w15:restartNumberingAfterBreak="0">
     <w:nsid w:val="78FD57A9"/>
     <w:multiLevelType w:val="hybridMultilevel"/>
     <w:tmpl w:val="792A9F40"/>
@@ -22724,100 +22675,100 @@
       </w:rPr>
     </w:lvl>
   </w:abstractNum>
-  <w:num w:numId="1">
+  <w:num w:numId="1" w16cid:durableId="460657995">
     <w:abstractNumId w:val="11"/>
   </w:num>
-  <w:num w:numId="2">
+  <w:num w:numId="2" w16cid:durableId="1994943365">
     <w:abstractNumId w:val="1"/>
   </w:num>
-  <w:num w:numId="3">
+  <w:num w:numId="3" w16cid:durableId="1431660552">
     <w:abstractNumId w:val="0"/>
   </w:num>
-  <w:num w:numId="4">
+  <w:num w:numId="4" w16cid:durableId="1802190582">
     <w:abstractNumId w:val="31"/>
   </w:num>
-  <w:num w:numId="5">
+  <w:num w:numId="5" w16cid:durableId="516774170">
     <w:abstractNumId w:val="20"/>
   </w:num>
-  <w:num w:numId="6">
+  <w:num w:numId="6" w16cid:durableId="1862892943">
     <w:abstractNumId w:val="24"/>
   </w:num>
-  <w:num w:numId="7">
+  <w:num w:numId="7" w16cid:durableId="889803774">
     <w:abstractNumId w:val="4"/>
   </w:num>
-  <w:num w:numId="8">
+  <w:num w:numId="8" w16cid:durableId="606935625">
     <w:abstractNumId w:val="30"/>
   </w:num>
-  <w:num w:numId="9">
+  <w:num w:numId="9" w16cid:durableId="190191548">
     <w:abstractNumId w:val="14"/>
   </w:num>
-  <w:num w:numId="10">
+  <w:num w:numId="10" w16cid:durableId="2067951587">
     <w:abstractNumId w:val="6"/>
   </w:num>
-  <w:num w:numId="11">
+  <w:num w:numId="11" w16cid:durableId="2085642528">
     <w:abstractNumId w:val="18"/>
   </w:num>
-  <w:num w:numId="12">
+  <w:num w:numId="12" w16cid:durableId="623199129">
     <w:abstractNumId w:val="25"/>
   </w:num>
-  <w:num w:numId="13">
+  <w:num w:numId="13" w16cid:durableId="244539768">
     <w:abstractNumId w:val="10"/>
   </w:num>
-  <w:num w:numId="14">
+  <w:num w:numId="14" w16cid:durableId="837961607">
     <w:abstractNumId w:val="17"/>
   </w:num>
-  <w:num w:numId="15">
+  <w:num w:numId="15" w16cid:durableId="788747400">
     <w:abstractNumId w:val="16"/>
   </w:num>
-  <w:num w:numId="16">
+  <w:num w:numId="16" w16cid:durableId="69691920">
     <w:abstractNumId w:val="5"/>
   </w:num>
-  <w:num w:numId="17">
+  <w:num w:numId="17" w16cid:durableId="1056204526">
     <w:abstractNumId w:val="8"/>
   </w:num>
-  <w:num w:numId="18">
+  <w:num w:numId="18" w16cid:durableId="1337919656">
     <w:abstractNumId w:val="23"/>
   </w:num>
-  <w:num w:numId="19">
+  <w:num w:numId="19" w16cid:durableId="396316947">
     <w:abstractNumId w:val="21"/>
   </w:num>
-  <w:num w:numId="20">
+  <w:num w:numId="20" w16cid:durableId="835924017">
     <w:abstractNumId w:val="15"/>
   </w:num>
-  <w:num w:numId="21">
+  <w:num w:numId="21" w16cid:durableId="254368070">
     <w:abstractNumId w:val="13"/>
   </w:num>
-  <w:num w:numId="22">
+  <w:num w:numId="22" w16cid:durableId="182980151">
     <w:abstractNumId w:val="26"/>
   </w:num>
-  <w:num w:numId="23">
+  <w:num w:numId="23" w16cid:durableId="2058622969">
     <w:abstractNumId w:val="9"/>
   </w:num>
-  <w:num w:numId="24">
+  <w:num w:numId="24" w16cid:durableId="506678065">
     <w:abstractNumId w:val="28"/>
   </w:num>
-  <w:num w:numId="25">
+  <w:num w:numId="25" w16cid:durableId="1822579182">
     <w:abstractNumId w:val="7"/>
   </w:num>
-  <w:num w:numId="26">
+  <w:num w:numId="26" w16cid:durableId="156767942">
     <w:abstractNumId w:val="29"/>
   </w:num>
-  <w:num w:numId="27">
+  <w:num w:numId="27" w16cid:durableId="1736589273">
     <w:abstractNumId w:val="22"/>
   </w:num>
-  <w:num w:numId="28">
+  <w:num w:numId="28" w16cid:durableId="1043483012">
     <w:abstractNumId w:val="27"/>
   </w:num>
-  <w:num w:numId="29">
+  <w:num w:numId="29" w16cid:durableId="1613897951">
     <w:abstractNumId w:val="2"/>
   </w:num>
-  <w:num w:numId="30">
+  <w:num w:numId="30" w16cid:durableId="1938979896">
     <w:abstractNumId w:val="19"/>
   </w:num>
-  <w:num w:numId="31">
+  <w:num w:numId="31" w16cid:durableId="139005725">
     <w:abstractNumId w:val="3"/>
   </w:num>
-  <w:num w:numId="32">
+  <w:num w:numId="32" w16cid:durableId="1416901746">
     <w:abstractNumId w:val="12"/>
   </w:num>
   <w:numIdMacAtCleanup w:val="11"/>
@@ -22825,7 +22776,7 @@
 </file>
 
 <file path=word/styles.xml><?xml version="1.0" encoding="utf-8"?>
-<w:styles xmlns:mc="http://schemas.openxmlformats.org/markup-compatibility/2006" xmlns:r="http://schemas.openxmlformats.org/officeDocument/2006/relationships" xmlns:w="http://schemas.openxmlformats.org/wordprocessingml/2006/main" xmlns:w14="http://schemas.microsoft.com/office/word/2010/wordml" xmlns:w15="http://schemas.microsoft.com/office/word/2012/wordml" mc:Ignorable="w14 w15">
+<w:styles xmlns:mc="http://schemas.openxmlformats.org/markup-compatibility/2006" xmlns:r="http://schemas.openxmlformats.org/officeDocument/2006/relationships" xmlns:w="http://schemas.openxmlformats.org/wordprocessingml/2006/main" xmlns:w14="http://schemas.microsoft.com/office/word/2010/wordml" xmlns:w15="http://schemas.microsoft.com/office/word/2012/wordml" xmlns:w16cex="http://schemas.microsoft.com/office/word/2018/wordml/cex" xmlns:w16cid="http://schemas.microsoft.com/office/word/2016/wordml/cid" xmlns:w16="http://schemas.microsoft.com/office/word/2018/wordml" xmlns:w16du="http://schemas.microsoft.com/office/word/2023/wordml/word16du" xmlns:w16sdtdh="http://schemas.microsoft.com/office/word/2020/wordml/sdtdatahash" xmlns:w16sdtfl="http://schemas.microsoft.com/office/word/2024/wordml/sdtformatlock" xmlns:w16se="http://schemas.microsoft.com/office/word/2015/wordml/symex" mc:Ignorable="w14 w15 w16se w16cid w16 w16cex w16sdtdh w16sdtfl w16du">
   <w:docDefaults>
     <w:rPrDefault>
       <w:rPr>
@@ -22841,7 +22792,7 @@
       </w:pPr>
     </w:pPrDefault>
   </w:docDefaults>
-  <w:latentStyles w:defLockedState="0" w:defUIPriority="99" w:defSemiHidden="0" w:defUnhideWhenUsed="0" w:defQFormat="0" w:count="371">
+  <w:latentStyles w:defLockedState="0" w:defUIPriority="99" w:defSemiHidden="0" w:defUnhideWhenUsed="0" w:defQFormat="0" w:count="376">
     <w:lsdException w:name="Normal" w:uiPriority="0" w:qFormat="1"/>
     <w:lsdException w:name="heading 1" w:uiPriority="9" w:qFormat="1"/>
     <w:lsdException w:name="heading 2" w:semiHidden="1" w:uiPriority="9" w:unhideWhenUsed="1" w:qFormat="1"/>
@@ -23213,6 +23164,11 @@
     <w:lsdException w:name="List Table 5 Dark Accent 6" w:uiPriority="50"/>
     <w:lsdException w:name="List Table 6 Colorful Accent 6" w:uiPriority="51"/>
     <w:lsdException w:name="List Table 7 Colorful Accent 6" w:uiPriority="52"/>
+    <w:lsdException w:name="Mention" w:semiHidden="1" w:unhideWhenUsed="1"/>
+    <w:lsdException w:name="Smart Hyperlink" w:semiHidden="1" w:unhideWhenUsed="1"/>
+    <w:lsdException w:name="Hashtag" w:semiHidden="1" w:unhideWhenUsed="1"/>
+    <w:lsdException w:name="Unresolved Mention" w:semiHidden="1" w:unhideWhenUsed="1"/>
+    <w:lsdException w:name="Smart Link" w:semiHidden="1" w:unhideWhenUsed="1"/>
   </w:latentStyles>
   <w:style w:type="paragraph" w:default="1" w:styleId="Normal">
     <w:name w:val="Normal"/>
@@ -23495,7 +23451,6 @@
       <w:spacing w:after="0" w:line="240" w:lineRule="auto"/>
     </w:pPr>
     <w:tblPr>
-      <w:tblInd w:w="0" w:type="dxa"/>
       <w:tblBorders>
         <w:top w:val="single" w:sz="4" w:space="0" w:color="auto"/>
         <w:left w:val="single" w:sz="4" w:space="0" w:color="auto"/>
@@ -23504,12 +23459,6 @@
         <w:insideH w:val="single" w:sz="4" w:space="0" w:color="auto"/>
         <w:insideV w:val="single" w:sz="4" w:space="0" w:color="auto"/>
       </w:tblBorders>
-      <w:tblCellMar>
-        <w:top w:w="0" w:type="dxa"/>
-        <w:left w:w="108" w:type="dxa"/>
-        <w:bottom w:w="0" w:type="dxa"/>
-        <w:right w:w="108" w:type="dxa"/>
-      </w:tblCellMar>
     </w:tblPr>
   </w:style>
   <w:style w:type="character" w:styleId="PlaceholderText">
@@ -23699,19 +23648,12 @@
     <w:tblPr>
       <w:tblStyleRowBandSize w:val="1"/>
       <w:tblStyleColBandSize w:val="1"/>
-      <w:tblInd w:w="0" w:type="dxa"/>
       <w:tblBorders>
         <w:top w:val="single" w:sz="4" w:space="0" w:color="000000" w:themeColor="text1"/>
         <w:left w:val="single" w:sz="4" w:space="0" w:color="000000" w:themeColor="text1"/>
         <w:bottom w:val="single" w:sz="4" w:space="0" w:color="000000" w:themeColor="text1"/>
         <w:right w:val="single" w:sz="4" w:space="0" w:color="000000" w:themeColor="text1"/>
       </w:tblBorders>
-      <w:tblCellMar>
-        <w:top w:w="0" w:type="dxa"/>
-        <w:left w:w="108" w:type="dxa"/>
-        <w:bottom w:w="0" w:type="dxa"/>
-        <w:right w:w="108" w:type="dxa"/>
-      </w:tblCellMar>
     </w:tblPr>
     <w:tblStylePr w:type="firstRow">
       <w:rPr>
@@ -23830,7 +23772,6 @@
     <w:tblPr>
       <w:tblStyleRowBandSize w:val="1"/>
       <w:tblStyleColBandSize w:val="1"/>
-      <w:tblInd w:w="0" w:type="dxa"/>
       <w:tblBorders>
         <w:top w:val="single" w:sz="4" w:space="0" w:color="999999" w:themeColor="text1" w:themeTint="66"/>
         <w:left w:val="single" w:sz="4" w:space="0" w:color="999999" w:themeColor="text1" w:themeTint="66"/>
@@ -23839,12 +23780,6 @@
         <w:insideH w:val="single" w:sz="4" w:space="0" w:color="999999" w:themeColor="text1" w:themeTint="66"/>
         <w:insideV w:val="single" w:sz="4" w:space="0" w:color="999999" w:themeColor="text1" w:themeTint="66"/>
       </w:tblBorders>
-      <w:tblCellMar>
-        <w:top w:w="0" w:type="dxa"/>
-        <w:left w:w="108" w:type="dxa"/>
-        <w:bottom w:w="0" w:type="dxa"/>
-        <w:right w:w="108" w:type="dxa"/>
-      </w:tblCellMar>
     </w:tblPr>
     <w:tblStylePr w:type="firstRow">
       <w:rPr>
@@ -24116,7 +24051,7 @@
 </file>
 
 <file path=word/glossary/document.xml><?xml version="1.0" encoding="utf-8"?>
-<w:glossaryDocument xmlns:wpc="http://schemas.microsoft.com/office/word/2010/wordprocessingCanvas" xmlns:mc="http://schemas.openxmlformats.org/markup-compatibility/2006" xmlns:o="urn:schemas-microsoft-com:office:office" xmlns:r="http://schemas.openxmlformats.org/officeDocument/2006/relationships" xmlns:m="http://schemas.openxmlformats.org/officeDocument/2006/math" xmlns:v="urn:schemas-microsoft-com:vml" xmlns:wp14="http://schemas.microsoft.com/office/word/2010/wordprocessingDrawing" xmlns:wp="http://schemas.openxmlformats.org/drawingml/2006/wordprocessingDrawing" xmlns:w10="urn:schemas-microsoft-com:office:word" xmlns:w="http://schemas.openxmlformats.org/wordprocessingml/2006/main" xmlns:w14="http://schemas.microsoft.com/office/word/2010/wordml" xmlns:w15="http://schemas.microsoft.com/office/word/2012/wordml" xmlns:wpg="http://schemas.microsoft.com/office/word/2010/wordprocessingGroup" xmlns:wpi="http://schemas.microsoft.com/office/word/2010/wordprocessingInk" xmlns:wne="http://schemas.microsoft.com/office/word/2006/wordml" xmlns:wps="http://schemas.microsoft.com/office/word/2010/wordprocessingShape" mc:Ignorable="w14 w15 wp14">
+<w:glossaryDocument xmlns:wpc="http://schemas.microsoft.com/office/word/2010/wordprocessingCanvas" xmlns:cx="http://schemas.microsoft.com/office/drawing/2014/chartex" xmlns:cx1="http://schemas.microsoft.com/office/drawing/2015/9/8/chartex" xmlns:cx2="http://schemas.microsoft.com/office/drawing/2015/10/21/chartex" xmlns:cx3="http://schemas.microsoft.com/office/drawing/2016/5/9/chartex" xmlns:cx4="http://schemas.microsoft.com/office/drawing/2016/5/10/chartex" xmlns:cx5="http://schemas.microsoft.com/office/drawing/2016/5/11/chartex" xmlns:cx6="http://schemas.microsoft.com/office/drawing/2016/5/12/chartex" xmlns:cx7="http://schemas.microsoft.com/office/drawing/2016/5/13/chartex" xmlns:cx8="http://schemas.microsoft.com/office/drawing/2016/5/14/chartex" xmlns:mc="http://schemas.openxmlformats.org/markup-compatibility/2006" xmlns:aink="http://schemas.microsoft.com/office/drawing/2016/ink" xmlns:am3d="http://schemas.microsoft.com/office/drawing/2017/model3d" xmlns:o="urn:schemas-microsoft-com:office:office" xmlns:oel="http://schemas.microsoft.com/office/2019/extlst" xmlns:r="http://schemas.openxmlformats.org/officeDocument/2006/relationships" xmlns:m="http://schemas.openxmlformats.org/officeDocument/2006/math" xmlns:v="urn:schemas-microsoft-com:vml" xmlns:wp14="http://schemas.microsoft.com/office/word/2010/wordprocessingDrawing" xmlns:wp="http://schemas.openxmlformats.org/drawingml/2006/wordprocessingDrawing" xmlns:w10="urn:schemas-microsoft-com:office:word" xmlns:w="http://schemas.openxmlformats.org/wordprocessingml/2006/main" xmlns:w14="http://schemas.microsoft.com/office/word/2010/wordml" xmlns:w15="http://schemas.microsoft.com/office/word/2012/wordml" xmlns:w16cex="http://schemas.microsoft.com/office/word/2018/wordml/cex" xmlns:w16cid="http://schemas.microsoft.com/office/word/2016/wordml/cid" xmlns:w16="http://schemas.microsoft.com/office/word/2018/wordml" xmlns:w16du="http://schemas.microsoft.com/office/word/2023/wordml/word16du" xmlns:w16sdtdh="http://schemas.microsoft.com/office/word/2020/wordml/sdtdatahash" xmlns:w16sdtfl="http://schemas.microsoft.com/office/word/2024/wordml/sdtformatlock" xmlns:w16se="http://schemas.microsoft.com/office/word/2015/wordml/symex" xmlns:wpg="http://schemas.microsoft.com/office/word/2010/wordprocessingGroup" xmlns:wpi="http://schemas.microsoft.com/office/word/2010/wordprocessingInk" xmlns:wne="http://schemas.microsoft.com/office/word/2006/wordml" xmlns:wps="http://schemas.microsoft.com/office/word/2010/wordprocessingShape" mc:Ignorable="w14 w15 w16se w16cid w16 w16cex w16sdtdh w16sdtfl w16du wp14">
   <w:docParts>
     <w:docPart>
       <w:docPartPr>
@@ -24152,7 +24087,7 @@
 </file>
 
 <file path=word/glossary/fontTable.xml><?xml version="1.0" encoding="utf-8"?>
-<w:fonts xmlns:mc="http://schemas.openxmlformats.org/markup-compatibility/2006" xmlns:r="http://schemas.openxmlformats.org/officeDocument/2006/relationships" xmlns:w="http://schemas.openxmlformats.org/wordprocessingml/2006/main" xmlns:w14="http://schemas.microsoft.com/office/word/2010/wordml" xmlns:w15="http://schemas.microsoft.com/office/word/2012/wordml" mc:Ignorable="w14 w15">
+<w:fonts xmlns:mc="http://schemas.openxmlformats.org/markup-compatibility/2006" xmlns:r="http://schemas.openxmlformats.org/officeDocument/2006/relationships" xmlns:w="http://schemas.openxmlformats.org/wordprocessingml/2006/main" xmlns:w14="http://schemas.microsoft.com/office/word/2010/wordml" xmlns:w15="http://schemas.microsoft.com/office/word/2012/wordml" xmlns:w16cex="http://schemas.microsoft.com/office/word/2018/wordml/cex" xmlns:w16cid="http://schemas.microsoft.com/office/word/2016/wordml/cid" xmlns:w16="http://schemas.microsoft.com/office/word/2018/wordml" xmlns:w16du="http://schemas.microsoft.com/office/word/2023/wordml/word16du" xmlns:w16sdtdh="http://schemas.microsoft.com/office/word/2020/wordml/sdtdatahash" xmlns:w16sdtfl="http://schemas.microsoft.com/office/word/2024/wordml/sdtformatlock" xmlns:w16se="http://schemas.microsoft.com/office/word/2015/wordml/symex" mc:Ignorable="w14 w15 w16se w16cid w16 w16cex w16sdtdh w16sdtfl w16du">
   <w:font w:name="Times New Roman">
     <w:panose1 w:val="02020603050405020304"/>
     <w:charset w:val="00"/>
@@ -24213,7 +24148,7 @@
 </file>
 
 <file path=word/glossary/settings.xml><?xml version="1.0" encoding="utf-8"?>
-<w:settings xmlns:mc="http://schemas.openxmlformats.org/markup-compatibility/2006" xmlns:o="urn:schemas-microsoft-com:office:office" xmlns:r="http://schemas.openxmlformats.org/officeDocument/2006/relationships" xmlns:m="http://schemas.openxmlformats.org/officeDocument/2006/math" xmlns:v="urn:schemas-microsoft-com:vml" xmlns:w10="urn:schemas-microsoft-com:office:word" xmlns:w="http://schemas.openxmlformats.org/wordprocessingml/2006/main" xmlns:w14="http://schemas.microsoft.com/office/word/2010/wordml" xmlns:w15="http://schemas.microsoft.com/office/word/2012/wordml" xmlns:sl="http://schemas.openxmlformats.org/schemaLibrary/2006/main" mc:Ignorable="w14 w15">
+<w:settings xmlns:mc="http://schemas.openxmlformats.org/markup-compatibility/2006" xmlns:o="urn:schemas-microsoft-com:office:office" xmlns:r="http://schemas.openxmlformats.org/officeDocument/2006/relationships" xmlns:m="http://schemas.openxmlformats.org/officeDocument/2006/math" xmlns:v="urn:schemas-microsoft-com:vml" xmlns:w10="urn:schemas-microsoft-com:office:word" xmlns:w="http://schemas.openxmlformats.org/wordprocessingml/2006/main" xmlns:w14="http://schemas.microsoft.com/office/word/2010/wordml" xmlns:w15="http://schemas.microsoft.com/office/word/2012/wordml" xmlns:w16cex="http://schemas.microsoft.com/office/word/2018/wordml/cex" xmlns:w16cid="http://schemas.microsoft.com/office/word/2016/wordml/cid" xmlns:w16="http://schemas.microsoft.com/office/word/2018/wordml" xmlns:w16du="http://schemas.microsoft.com/office/word/2023/wordml/word16du" xmlns:w16sdtdh="http://schemas.microsoft.com/office/word/2020/wordml/sdtdatahash" xmlns:w16sdtfl="http://schemas.microsoft.com/office/word/2024/wordml/sdtformatlock" xmlns:w16se="http://schemas.microsoft.com/office/word/2015/wordml/symex" xmlns:sl="http://schemas.openxmlformats.org/schemaLibrary/2006/main" mc:Ignorable="w14 w15 w16se w16cid w16 w16cex w16sdtdh w16sdtfl w16du">
   <w:view w:val="normal"/>
   <w:defaultTabStop w:val="720"/>
   <w:characterSpacingControl w:val="doNotCompress"/>
@@ -24223,6 +24158,7 @@
     <w:compatSetting w:name="overrideTableStyleFontSizeAndJustification" w:uri="http://schemas.microsoft.com/office/word" w:val="1"/>
     <w:compatSetting w:name="enableOpenTypeFeatures" w:uri="http://schemas.microsoft.com/office/word" w:val="1"/>
     <w:compatSetting w:name="doNotFlipMirrorIndents" w:uri="http://schemas.microsoft.com/office/word" w:val="1"/>
+    <w:compatSetting w:name="useWord2013TrackBottomHyphenation" w:uri="http://schemas.microsoft.com/office/word" w:val="1"/>
   </w:compat>
   <w:rsids>
     <w:rsidRoot w:val="001B1BB0"/>
@@ -24250,6 +24186,7 @@
     <w:rsid w:val="00572B42"/>
     <w:rsid w:val="00586AAF"/>
     <w:rsid w:val="005A53D4"/>
+    <w:rsid w:val="005E5C74"/>
     <w:rsid w:val="00632E6A"/>
     <w:rsid w:val="006D28EC"/>
     <w:rsid w:val="006D4DF3"/>
@@ -24264,6 +24201,7 @@
     <w:rsid w:val="008A5352"/>
     <w:rsid w:val="009308D6"/>
     <w:rsid w:val="00931747"/>
+    <w:rsid w:val="00960C02"/>
     <w:rsid w:val="009C79D6"/>
     <w:rsid w:val="00A141E9"/>
     <w:rsid w:val="00A41DD8"/>
@@ -24275,11 +24213,13 @@
     <w:rsid w:val="00B809AA"/>
     <w:rsid w:val="00B83E20"/>
     <w:rsid w:val="00BA46AD"/>
+    <w:rsid w:val="00BF617F"/>
     <w:rsid w:val="00C0674B"/>
     <w:rsid w:val="00C11CA0"/>
     <w:rsid w:val="00C4473B"/>
     <w:rsid w:val="00C86294"/>
     <w:rsid w:val="00C93E94"/>
+    <w:rsid w:val="00CE68D9"/>
     <w:rsid w:val="00D1227E"/>
     <w:rsid w:val="00D14F8F"/>
     <w:rsid w:val="00D42747"/>
@@ -24326,7 +24266,7 @@
 </file>
 
 <file path=word/glossary/styles.xml><?xml version="1.0" encoding="utf-8"?>
-<w:styles xmlns:mc="http://schemas.openxmlformats.org/markup-compatibility/2006" xmlns:r="http://schemas.openxmlformats.org/officeDocument/2006/relationships" xmlns:w="http://schemas.openxmlformats.org/wordprocessingml/2006/main" xmlns:w14="http://schemas.microsoft.com/office/word/2010/wordml" xmlns:w15="http://schemas.microsoft.com/office/word/2012/wordml" mc:Ignorable="w14 w15">
+<w:styles xmlns:mc="http://schemas.openxmlformats.org/markup-compatibility/2006" xmlns:r="http://schemas.openxmlformats.org/officeDocument/2006/relationships" xmlns:w="http://schemas.openxmlformats.org/wordprocessingml/2006/main" xmlns:w14="http://schemas.microsoft.com/office/word/2010/wordml" xmlns:w15="http://schemas.microsoft.com/office/word/2012/wordml" xmlns:w16cex="http://schemas.microsoft.com/office/word/2018/wordml/cex" xmlns:w16cid="http://schemas.microsoft.com/office/word/2016/wordml/cid" xmlns:w16="http://schemas.microsoft.com/office/word/2018/wordml" xmlns:w16du="http://schemas.microsoft.com/office/word/2023/wordml/word16du" xmlns:w16sdtdh="http://schemas.microsoft.com/office/word/2020/wordml/sdtdatahash" xmlns:w16sdtfl="http://schemas.microsoft.com/office/word/2024/wordml/sdtformatlock" xmlns:w16se="http://schemas.microsoft.com/office/word/2015/wordml/symex" mc:Ignorable="w14 w15 w16se w16cid w16 w16cex w16sdtdh w16sdtfl w16du">
   <w:docDefaults>
     <w:rPrDefault>
       <w:rPr>
@@ -24342,7 +24282,7 @@
       </w:pPr>
     </w:pPrDefault>
   </w:docDefaults>
-  <w:latentStyles w:defLockedState="0" w:defUIPriority="99" w:defSemiHidden="0" w:defUnhideWhenUsed="0" w:defQFormat="0" w:count="371">
+  <w:latentStyles w:defLockedState="0" w:defUIPriority="99" w:defSemiHidden="0" w:defUnhideWhenUsed="0" w:defQFormat="0" w:count="376">
     <w:lsdException w:name="Normal" w:uiPriority="0" w:qFormat="1"/>
     <w:lsdException w:name="heading 1" w:uiPriority="9" w:qFormat="1"/>
     <w:lsdException w:name="heading 2" w:semiHidden="1" w:uiPriority="9" w:unhideWhenUsed="1" w:qFormat="1"/>
@@ -24714,6 +24654,11 @@
     <w:lsdException w:name="List Table 5 Dark Accent 6" w:uiPriority="50"/>
     <w:lsdException w:name="List Table 6 Colorful Accent 6" w:uiPriority="51"/>
     <w:lsdException w:name="List Table 7 Colorful Accent 6" w:uiPriority="52"/>
+    <w:lsdException w:name="Mention" w:semiHidden="1" w:unhideWhenUsed="1"/>
+    <w:lsdException w:name="Smart Hyperlink" w:semiHidden="1" w:unhideWhenUsed="1"/>
+    <w:lsdException w:name="Hashtag" w:semiHidden="1" w:unhideWhenUsed="1"/>
+    <w:lsdException w:name="Unresolved Mention" w:semiHidden="1" w:unhideWhenUsed="1"/>
+    <w:lsdException w:name="Smart Link" w:semiHidden="1" w:unhideWhenUsed="1"/>
   </w:latentStyles>
   <w:style w:type="paragraph" w:default="1" w:styleId="Normal">
     <w:name w:val="Normal"/>
@@ -24764,7 +24709,7 @@
 </file>
 
 <file path=word/glossary/webSettings.xml><?xml version="1.0" encoding="utf-8"?>
-<w:webSettings xmlns:mc="http://schemas.openxmlformats.org/markup-compatibility/2006" xmlns:r="http://schemas.openxmlformats.org/officeDocument/2006/relationships" xmlns:w="http://schemas.openxmlformats.org/wordprocessingml/2006/main" xmlns:w14="http://schemas.microsoft.com/office/word/2010/wordml" xmlns:w15="http://schemas.microsoft.com/office/word/2012/wordml" mc:Ignorable="w14 w15">
+<w:webSettings xmlns:mc="http://schemas.openxmlformats.org/markup-compatibility/2006" xmlns:r="http://schemas.openxmlformats.org/officeDocument/2006/relationships" xmlns:w="http://schemas.openxmlformats.org/wordprocessingml/2006/main" xmlns:w14="http://schemas.microsoft.com/office/word/2010/wordml" xmlns:w15="http://schemas.microsoft.com/office/word/2012/wordml" xmlns:w16cex="http://schemas.microsoft.com/office/word/2018/wordml/cex" xmlns:w16cid="http://schemas.microsoft.com/office/word/2016/wordml/cid" xmlns:w16="http://schemas.microsoft.com/office/word/2018/wordml" xmlns:w16du="http://schemas.microsoft.com/office/word/2023/wordml/word16du" xmlns:w16sdtdh="http://schemas.microsoft.com/office/word/2020/wordml/sdtdatahash" xmlns:w16sdtfl="http://schemas.microsoft.com/office/word/2024/wordml/sdtformatlock" xmlns:w16se="http://schemas.microsoft.com/office/word/2015/wordml/symex" mc:Ignorable="w14 w15 w16se w16cid w16 w16cex w16sdtdh w16sdtfl w16du">
   <w:optimizeForBrowser/>
   <w:allowPNG/>
 </w:webSettings>

</xml_diff>